<commit_message>
Đợt 7b: trả chủ xe liên kết dời sang trang kế toán
- Đợt trả chủ xe (trả gộp, trả từng phiếu) lập ở trang kế toán; phiếu bên này giữ
  bản chép "đã trả" (owner_payment_id, owner_paid, số đã trả), bỏ khoá ngoại sang
  owner_payments.
- Đường máy mới cho trang kế toán: danh sách chủ xe kèm chờ trả, phiếu chờ trả,
  đánh dấu / bỏ đánh dấu đã trả, bảng xe liên kết theo tháng.
- Công nợ chủ xe, nút trả trên phiếu bên này trả 409 "đã dời"; nút Trả chủ xe ↗
  mở màn Xe liên kết bên kế toán. Màn Xe liên kết bên này còn danh mục và hợp đồng.
- Không cho xoá phiếu đã trả chủ xe.
- Bộ kiểm: thu_chu_xe, thu_luong_api đi qua trang kế toán; thu_danh_muc_cu_moi so
  số chờ trả với đường máy. Công cụ dọn gỡ đợt trả của bộ kiểm bên sổ.
- Tài liệu luồng A → Z: bước 19 ở trang kế toán, bảng 3.1 · 3.2 · 5 · 7 · 8 · 9.

Co-Authored-By: Claude Opus 5.5 (1M context) <noreply@anthropic.com>
</commit_message>
<xml_diff>
--- a/DOCS/word/LUONG_A_Z_HAI_TRANG.docx
+++ b/DOCS/word/LUONG_A_Z_HAI_TRANG.docx
@@ -483,7 +483,16 @@
               <w:t>Phiếu chi · Phiếu thu</w:t>
             </w:r>
             <w:r>
-              <w:t xml:space="preserve"> còn in phiếu chi tạm ứng, phiếu lĩnh và giữ sổ chứng từ của phiếu. </w:t>
+              <w:t xml:space="preserve"> còn in phiếu chi tạm ứng, phiếu lĩnh và giữ sổ chứng từ của phiếu. Màn </w:t>
+            </w:r>
+            <w:r>
+              <w:rPr>
+                <w:b/>
+              </w:rPr>
+              <w:t>Xe liên kết</w:t>
+            </w:r>
+            <w:r>
+              <w:t xml:space="preserve"> chỉ còn danh mục chủ xe (điều khoản) và hợp đồng thuê xe. </w:t>
             </w:r>
             <w:r>
               <w:rPr>
@@ -492,7 +501,7 @@
               <w:t>Tạm thời vẫn giữ các màn tiền</w:t>
             </w:r>
             <w:r>
-              <w:t xml:space="preserve"> Xe liên kết, Tiền chuyến &amp; tiền nước tài xế, Tất toán tài xế, Theo dõi nhà cung cấp cho tới các phần sau của đợt 7</w:t>
+              <w:t xml:space="preserve"> Tiền chuyến &amp; tiền nước tài xế, Tất toán tài xế, Theo dõi nhà cung cấp cho tới các phần sau của đợt 7</w:t>
             </w:r>
           </w:p>
         </w:tc>
@@ -572,7 +581,7 @@
               <w:t>Tiền vận chuyển</w:t>
             </w:r>
             <w:r>
-              <w:t xml:space="preserve"> (Hóa đơn vận chuyển, Hoá đơn gộp tháng — từ đợt 7a) và </w:t>
+              <w:t xml:space="preserve"> (Hóa đơn vận chuyển, Hoá đơn gộp tháng — từ đợt 7a; Xe liên kết — trả chủ xe, từ đợt 7b) và </w:t>
             </w:r>
             <w:r>
               <w:rPr>
@@ -779,7 +788,16 @@
         <w:t>Quỹ</w:t>
       </w:r>
       <w:r>
-        <w:t xml:space="preserve"> trả chủ xe liên kết. </w:t>
+        <w:t xml:space="preserve"> trả chủ xe liên kết (cũng ở </w:t>
+      </w:r>
+      <w:r>
+        <w:rPr>
+          <w:b/>
+        </w:rPr>
+        <w:t>trang kế toán</w:t>
+      </w:r>
+      <w:r>
+        <w:t xml:space="preserve">). </w:t>
       </w:r>
       <w:r>
         <w:rPr>
@@ -842,7 +860,7 @@
         <w:t>Đường 1 — tờ sinh ở trang điều xe</w:t>
       </w:r>
       <w:r>
-        <w:t xml:space="preserve"> (DO, phiếu lĩnh, tạm ứng, phiếu chi mục IV–VI, trả chủ xe, tất toán…): nằm ở màn </w:t>
+        <w:t xml:space="preserve"> (DO, phiếu lĩnh, tạm ứng, phiếu chi mục IV–VI, tất toán…): nằm ở màn </w:t>
       </w:r>
       <w:r>
         <w:rPr>
@@ -890,6 +908,15 @@
           <w:b/>
         </w:rPr>
         <w:t>phiếu thu tiền khách PT</w:t>
+      </w:r>
+      <w:r>
+        <w:t xml:space="preserve">, từ đợt 7b </w:t>
+      </w:r>
+      <w:r>
+        <w:rPr>
+          <w:b/>
+        </w:rPr>
+        <w:t>phiếu chi trả chủ xe PC_CX</w:t>
       </w:r>
       <w:r>
         <w:t xml:space="preserve">): vào sổ </w:t>
@@ -1495,7 +1522,7 @@
           <w:p>
             <w:r/>
             <w:r>
-              <w:t>Chi mục IV, V, VI; trả chủ xe; tất toán</w:t>
+              <w:t>Chi mục IV, V, VI; tất toán</w:t>
             </w:r>
           </w:p>
         </w:tc>
@@ -1506,7 +1533,16 @@
           <w:p>
             <w:r/>
             <w:r>
-              <w:t>Xem sổ; Cấp phát (chi tạm ứng), Lệnh sửa chữa (chi), Bán hàng (ghi thu)</w:t>
+              <w:t xml:space="preserve">Xem sổ; Cấp phát (chi tạm ứng), Lệnh sửa chữa (chi), Bán hàng (ghi thu); </w:t>
+            </w:r>
+            <w:r>
+              <w:rPr>
+                <w:b/>
+              </w:rPr>
+              <w:t>Xe liên kết</w:t>
+            </w:r>
+            <w:r>
+              <w:t xml:space="preserve"> (trả chủ xe)</w:t>
             </w:r>
           </w:p>
         </w:tc>
@@ -1545,7 +1581,7 @@
           <w:p>
             <w:r/>
             <w:r>
-              <w:t>Chi mục III (dầu mua ngoài); trả chủ xe; tất toán</w:t>
+              <w:t>Chi mục III (dầu mua ngoài); tất toán</w:t>
             </w:r>
           </w:p>
         </w:tc>
@@ -1556,7 +1592,16 @@
           <w:p>
             <w:r/>
             <w:r>
-              <w:t>Xem sổ; Cấp phát (chi tạm ứng), Bán hàng (ghi thu)</w:t>
+              <w:t xml:space="preserve">Xem sổ; Cấp phát (chi tạm ứng), Bán hàng (ghi thu); </w:t>
+            </w:r>
+            <w:r>
+              <w:rPr>
+                <w:b/>
+              </w:rPr>
+              <w:t>Xe liên kết</w:t>
+            </w:r>
+            <w:r>
+              <w:t xml:space="preserve"> (trả chủ xe)</w:t>
             </w:r>
           </w:p>
         </w:tc>
@@ -2645,6 +2690,168 @@
             <w:r/>
             <w:r>
               <w:t>Số phiếu trong bảng *Dòng phiếu trong hoá đơn*</w:t>
+            </w:r>
+          </w:p>
+        </w:tc>
+        <w:tc>
+          <w:tcPr>
+            <w:tcW w:type="dxa" w:w="2880"/>
+          </w:tcPr>
+          <w:p>
+            <w:r/>
+            <w:r>
+              <w:t xml:space="preserve">Màn </w:t>
+            </w:r>
+            <w:r>
+              <w:rPr>
+                <w:b/>
+              </w:rPr>
+              <w:t>Hóa đơn vận chuyển</w:t>
+            </w:r>
+            <w:r>
+              <w:t xml:space="preserve"> của phiếu đó</w:t>
+            </w:r>
+          </w:p>
+        </w:tc>
+      </w:tr>
+      <w:tr>
+        <w:tc>
+          <w:tcPr>
+            <w:tcW w:type="dxa" w:w="2880"/>
+          </w:tcPr>
+          <w:p>
+            <w:r/>
+            <w:r>
+              <w:t xml:space="preserve">Trang điều xe → </w:t>
+            </w:r>
+            <w:r>
+              <w:rPr>
+                <w:b/>
+              </w:rPr>
+              <w:t>Phiếu xuất xe</w:t>
+            </w:r>
+            <w:r>
+              <w:t xml:space="preserve"> (phiếu xe liên kết đã khoá, vai quỹ)</w:t>
+            </w:r>
+          </w:p>
+        </w:tc>
+        <w:tc>
+          <w:tcPr>
+            <w:tcW w:type="dxa" w:w="2880"/>
+          </w:tcPr>
+          <w:p>
+            <w:r/>
+            <w:r>
+              <w:rPr>
+                <w:b/>
+              </w:rPr>
+              <w:t>Trả chủ xe · &lt;số tiền&gt; ↗</w:t>
+            </w:r>
+          </w:p>
+        </w:tc>
+        <w:tc>
+          <w:tcPr>
+            <w:tcW w:type="dxa" w:w="2880"/>
+          </w:tcPr>
+          <w:p>
+            <w:r/>
+            <w:r>
+              <w:t xml:space="preserve">Màn </w:t>
+            </w:r>
+            <w:r>
+              <w:rPr>
+                <w:b/>
+              </w:rPr>
+              <w:t>Xe liên kết</w:t>
+            </w:r>
+            <w:r>
+              <w:t xml:space="preserve"> ở trang kế toán, đúng tháng của phiếu, dòng phiếu tô sáng</w:t>
+            </w:r>
+          </w:p>
+        </w:tc>
+      </w:tr>
+      <w:tr>
+        <w:tc>
+          <w:tcPr>
+            <w:tcW w:type="dxa" w:w="2880"/>
+          </w:tcPr>
+          <w:p>
+            <w:r/>
+            <w:r>
+              <w:t xml:space="preserve">Trang điều xe → </w:t>
+            </w:r>
+            <w:r>
+              <w:rPr>
+                <w:b/>
+              </w:rPr>
+              <w:t>Vận tải → Xe liên kết</w:t>
+            </w:r>
+          </w:p>
+        </w:tc>
+        <w:tc>
+          <w:tcPr>
+            <w:tcW w:type="dxa" w:w="2880"/>
+          </w:tcPr>
+          <w:p>
+            <w:r/>
+            <w:r>
+              <w:rPr>
+                <w:b/>
+              </w:rPr>
+              <w:t>Trả chủ xe · bảng xe liên kết ↗</w:t>
+            </w:r>
+          </w:p>
+        </w:tc>
+        <w:tc>
+          <w:tcPr>
+            <w:tcW w:type="dxa" w:w="2880"/>
+          </w:tcPr>
+          <w:p>
+            <w:r/>
+            <w:r>
+              <w:t xml:space="preserve">Màn </w:t>
+            </w:r>
+            <w:r>
+              <w:rPr>
+                <w:b/>
+              </w:rPr>
+              <w:t>Xe liên kết</w:t>
+            </w:r>
+            <w:r>
+              <w:t xml:space="preserve"> ở trang kế toán</w:t>
+            </w:r>
+          </w:p>
+        </w:tc>
+      </w:tr>
+      <w:tr>
+        <w:tc>
+          <w:tcPr>
+            <w:tcW w:type="dxa" w:w="2880"/>
+          </w:tcPr>
+          <w:p>
+            <w:r/>
+            <w:r>
+              <w:t xml:space="preserve">Trang kế toán → </w:t>
+            </w:r>
+            <w:r>
+              <w:rPr>
+                <w:b/>
+              </w:rPr>
+              <w:t>Tiền vận chuyển → Xe liên kết</w:t>
+            </w:r>
+            <w:r>
+              <w:t xml:space="preserve"> → bảng *Xe liên kết*</w:t>
+            </w:r>
+          </w:p>
+        </w:tc>
+        <w:tc>
+          <w:tcPr>
+            <w:tcW w:type="dxa" w:w="2880"/>
+          </w:tcPr>
+          <w:p>
+            <w:r/>
+            <w:r>
+              <w:t>Bấm một dòng phiếu</w:t>
             </w:r>
           </w:p>
         </w:tc>
@@ -3118,52 +3325,6 @@
           <w:p>
             <w:r/>
             <w:r>
-              <w:t>Trả chủ xe, xem công nợ chủ xe</w:t>
-            </w:r>
-          </w:p>
-        </w:tc>
-        <w:tc>
-          <w:tcPr>
-            <w:tcW w:type="dxa" w:w="2160"/>
-          </w:tcPr>
-          <w:p>
-            <w:r/>
-            <w:r>
-              <w:t>Điều xe</w:t>
-            </w:r>
-          </w:p>
-        </w:tc>
-        <w:tc>
-          <w:tcPr>
-            <w:tcW w:type="dxa" w:w="2160"/>
-          </w:tcPr>
-          <w:p>
-            <w:r/>
-            <w:r>
-              <w:t>Lấy phiếu bán chủ xe mua ở quầy chờ trừ, báo "đã trừ"</w:t>
-            </w:r>
-          </w:p>
-        </w:tc>
-        <w:tc>
-          <w:tcPr>
-            <w:tcW w:type="dxa" w:w="2160"/>
-          </w:tcPr>
-          <w:p>
-            <w:r/>
-            <w:r>
-              <w:t>Chặn, báo rõ</w:t>
-            </w:r>
-          </w:p>
-        </w:tc>
-      </w:tr>
-      <w:tr>
-        <w:tc>
-          <w:tcPr>
-            <w:tcW w:type="dxa" w:w="2160"/>
-          </w:tcPr>
-          <w:p>
-            <w:r/>
-            <w:r>
               <w:t xml:space="preserve">Cấp dầu / chi tạm ứng ở </w:t>
             </w:r>
             <w:r>
@@ -3601,6 +3762,137 @@
             <w:r/>
             <w:r>
               <w:t>Chặn, báo rõ</w:t>
+            </w:r>
+          </w:p>
+        </w:tc>
+      </w:tr>
+      <w:tr>
+        <w:tc>
+          <w:tcPr>
+            <w:tcW w:type="dxa" w:w="2160"/>
+          </w:tcPr>
+          <w:p>
+            <w:r/>
+            <w:r>
+              <w:t xml:space="preserve">Mở </w:t>
+            </w:r>
+            <w:r>
+              <w:rPr>
+                <w:b/>
+              </w:rPr>
+              <w:t>Xe liên kết</w:t>
+            </w:r>
+            <w:r>
+              <w:t xml:space="preserve"> (bảng chủ xe, bảng tháng, hộp </w:t>
+            </w:r>
+            <w:r>
+              <w:rPr>
+                <w:b/>
+              </w:rPr>
+              <w:t>Trả gộp</w:t>
+            </w:r>
+            <w:r>
+              <w:t>)</w:t>
+            </w:r>
+          </w:p>
+        </w:tc>
+        <w:tc>
+          <w:tcPr>
+            <w:tcW w:type="dxa" w:w="2160"/>
+          </w:tcPr>
+          <w:p>
+            <w:r/>
+            <w:r>
+              <w:t>Kế toán</w:t>
+            </w:r>
+          </w:p>
+        </w:tc>
+        <w:tc>
+          <w:tcPr>
+            <w:tcW w:type="dxa" w:w="2160"/>
+          </w:tcPr>
+          <w:p>
+            <w:r/>
+            <w:r>
+              <w:t>Đọc danh mục chủ xe, phiếu xe liên kết và số trả chủ xe của từng phiếu (tính ở trang điều xe)</w:t>
+            </w:r>
+          </w:p>
+        </w:tc>
+        <w:tc>
+          <w:tcPr>
+            <w:tcW w:type="dxa" w:w="2160"/>
+          </w:tcPr>
+          <w:p>
+            <w:r/>
+            <w:r>
+              <w:t>Chặn, báo rõ; không hiện nửa số</w:t>
+            </w:r>
+          </w:p>
+        </w:tc>
+      </w:tr>
+      <w:tr>
+        <w:tc>
+          <w:tcPr>
+            <w:tcW w:type="dxa" w:w="2160"/>
+          </w:tcPr>
+          <w:p>
+            <w:r/>
+            <w:r>
+              <w:rPr>
+                <w:b/>
+              </w:rPr>
+              <w:t>Trả gộp</w:t>
+            </w:r>
+            <w:r>
+              <w:t xml:space="preserve">, </w:t>
+            </w:r>
+            <w:r>
+              <w:rPr>
+                <w:b/>
+              </w:rPr>
+              <w:t>Trả chủ xe</w:t>
+            </w:r>
+            <w:r>
+              <w:t xml:space="preserve">, </w:t>
+            </w:r>
+            <w:r>
+              <w:rPr>
+                <w:b/>
+              </w:rPr>
+              <w:t>Huỷ đợt trả</w:t>
+            </w:r>
+          </w:p>
+        </w:tc>
+        <w:tc>
+          <w:tcPr>
+            <w:tcW w:type="dxa" w:w="2160"/>
+          </w:tcPr>
+          <w:p>
+            <w:r/>
+            <w:r>
+              <w:t>Kế toán</w:t>
+            </w:r>
+          </w:p>
+        </w:tc>
+        <w:tc>
+          <w:tcPr>
+            <w:tcW w:type="dxa" w:w="2160"/>
+          </w:tcPr>
+          <w:p>
+            <w:r/>
+            <w:r>
+              <w:t>Kiểm lại phiếu (xe liên kết, đã khoá, chưa trả) và ghi bản chép *đã trả chủ xe* lên phiếu</w:t>
+            </w:r>
+          </w:p>
+        </w:tc>
+        <w:tc>
+          <w:tcPr>
+            <w:tcW w:type="dxa" w:w="2160"/>
+          </w:tcPr>
+          <w:p>
+            <w:r/>
+            <w:r>
+              <w:t>Chặn, báo rõ; không có đợt trả nửa vời</w:t>
             </w:r>
           </w:p>
         </w:tc>
@@ -9329,7 +9621,7 @@
         <w:pStyle w:val="Heading2"/>
       </w:pPr>
       <w:r>
-        <w:t>Bước 19. Trả chủ xe liên kết (chỉ phiếu xe thuê ngoài)</w:t>
+        <w:t>Bước 19. Trả chủ xe liên kết — trang kế toán (chỉ phiếu xe thuê ngoài)</w:t>
       </w:r>
     </w:p>
     <w:p>
@@ -9343,7 +9635,27 @@
         <w:t>Ai:</w:t>
       </w:r>
       <w:r>
-        <w:t xml:space="preserve"> Quỹ tiền mặt cảng cạn hoặc Thủ quỹ VC. </w:t>
+        <w:t xml:space="preserve"> Quỹ tiền mặt cảng cạn (</w:t>
+      </w:r>
+      <w:r>
+        <w:rPr>
+          <w:rFonts w:ascii="Consolas" w:hAnsi="Consolas"/>
+          <w:sz w:val="19"/>
+        </w:rPr>
+        <w:t>quytb</w:t>
+      </w:r>
+      <w:r>
+        <w:t>) hoặc Thủ quỹ VC (</w:t>
+      </w:r>
+      <w:r>
+        <w:rPr>
+          <w:rFonts w:ascii="Consolas" w:hAnsi="Consolas"/>
+          <w:sz w:val="19"/>
+        </w:rPr>
+        <w:t>quyvc</w:t>
+      </w:r>
+      <w:r>
+        <w:t xml:space="preserve">); Sếp cũng trả được. </w:t>
       </w:r>
       <w:r>
         <w:rPr>
@@ -9352,7 +9664,43 @@
         <w:t>Trang:</w:t>
       </w:r>
       <w:r>
-        <w:t xml:space="preserve"> điều xe.</w:t>
+        <w:t xml:space="preserve"> </w:t>
+      </w:r>
+      <w:r>
+        <w:rPr>
+          <w:b/>
+        </w:rPr>
+        <w:t>kế toán</w:t>
+      </w:r>
+      <w:r>
+        <w:t xml:space="preserve"> (từ đợt 7b). </w:t>
+      </w:r>
+      <w:r>
+        <w:rPr>
+          <w:b/>
+        </w:rPr>
+        <w:t>Màn:</w:t>
+      </w:r>
+      <w:r>
+        <w:t xml:space="preserve"> nhóm </w:t>
+      </w:r>
+      <w:r>
+        <w:rPr>
+          <w:b/>
+        </w:rPr>
+        <w:t>Tiền vận chuyển</w:t>
+      </w:r>
+      <w:r>
+        <w:t xml:space="preserve"> → </w:t>
+      </w:r>
+      <w:r>
+        <w:rPr>
+          <w:b/>
+        </w:rPr>
+        <w:t>Xe liên kết</w:t>
+      </w:r>
+      <w:r>
+        <w:t>.</w:t>
       </w:r>
     </w:p>
     <w:p>
@@ -9363,46 +9711,37 @@
         <w:rPr>
           <w:b/>
         </w:rPr>
-        <w:t>Thao tác:</w:t>
-      </w:r>
-      <w:r>
-        <w:t xml:space="preserve"> từng phiếu: mở Phiếu xuất xe đã khoá → </w:t>
-      </w:r>
-      <w:r>
-        <w:rPr>
-          <w:b/>
-        </w:rPr>
-        <w:t>Trả chủ xe · &lt;số tiền&gt;</w:t>
-      </w:r>
-      <w:r>
-        <w:t xml:space="preserve"> → đọc cách tính → xác nhận. Nhiều phiếu một lần: Vận tải → </w:t>
-      </w:r>
-      <w:r>
-        <w:rPr>
-          <w:b/>
-        </w:rPr>
-        <w:t>Xe liên kết</w:t>
-      </w:r>
-      <w:r>
-        <w:t xml:space="preserve"> → bảng </w:t>
-      </w:r>
-      <w:r>
-        <w:rPr>
-          <w:b/>
-        </w:rPr>
-        <w:t>Chủ xe liên kết</w:t>
-      </w:r>
-      <w:r>
-        <w:t xml:space="preserve"> → </w:t>
-      </w:r>
-      <w:r>
-        <w:rPr>
-          <w:b/>
-        </w:rPr>
-        <w:t>Trả gộp</w:t>
-      </w:r>
-      <w:r>
-        <w:t xml:space="preserve"> ở dòng chủ xe → chọn các phiếu → ngày, cách chi → trả.</w:t>
+        <w:t>Đi từ phiếu:</w:t>
+      </w:r>
+      <w:r>
+        <w:t xml:space="preserve"> trên trang điều xe, phiếu xe liên kết đã khoá hiện nút </w:t>
+      </w:r>
+      <w:r>
+        <w:rPr>
+          <w:b/>
+        </w:rPr>
+        <w:t>Trả chủ xe · &lt;số tiền&gt; ↗</w:t>
+      </w:r>
+      <w:r>
+        <w:t xml:space="preserve"> (chỉ vai quỹ thấy). Bấm là mở trang kế toán ở màn Xe liên kết, đúng tháng của phiếu, dòng phiếu tô sáng. Ở màn </w:t>
+      </w:r>
+      <w:r>
+        <w:rPr>
+          <w:b/>
+        </w:rPr>
+        <w:t>Vận tải → Xe liên kết</w:t>
+      </w:r>
+      <w:r>
+        <w:t xml:space="preserve"> bên điều xe (danh mục chủ xe) có nút </w:t>
+      </w:r>
+      <w:r>
+        <w:rPr>
+          <w:b/>
+        </w:rPr>
+        <w:t>Trả chủ xe · bảng xe liên kết ↗</w:t>
+      </w:r>
+      <w:r>
+        <w:t>.</w:t>
       </w:r>
     </w:p>
     <w:p>
@@ -9413,106 +9752,202 @@
         <w:rPr>
           <w:b/>
         </w:rPr>
-        <w:t>Máy tự làm:</w:t>
-      </w:r>
-      <w:r>
-        <w:t xml:space="preserve"> phải trả = tiền thuê − phí quản lý % − cắt quá tải − mọi khoản EPL đã ứng (dầu kho, đi đường…); </w:t>
-      </w:r>
-      <w:r>
-        <w:rPr>
-          <w:b/>
-        </w:rPr>
-        <w:t>tự trừ tiếp</w:t>
-      </w:r>
-      <w:r>
-        <w:t xml:space="preserve"> phiếu bán hàng chủ xe mua ở quầy chưa trừ (hỏi trang kế toán, rồi báo sang *đã trừ*); phiếu chi ghi số </w:t>
-      </w:r>
-      <w:r>
-        <w:rPr>
-          <w:b/>
-        </w:rPr>
-        <w:t>thực chi</w:t>
-      </w:r>
-      <w:r>
-        <w:t xml:space="preserve"> sau khi trừ. Một tờ </w:t>
-      </w:r>
-      <w:r>
-        <w:rPr>
-          <w:b/>
-        </w:rPr>
-        <w:t>PC_CX</w:t>
-      </w:r>
-      <w:r>
-        <w:t xml:space="preserve"> cho cả đợt.</w:t>
+        <w:t>Thao tác:</w:t>
       </w:r>
     </w:p>
     <w:p>
       <w:pPr>
-        <w:jc w:val="both"/>
-      </w:pPr>
-      <w:r>
-        <w:rPr>
-          <w:b/>
-        </w:rPr>
-        <w:t>Máy chặn:</w:t>
-      </w:r>
-      <w:r>
-        <w:t xml:space="preserve"> phiếu chưa khoá; trả hai lần; các phiếu khác tiền thuê phải tách đợt; </w:t>
-      </w:r>
-      <w:r>
-        <w:rPr>
-          <w:b/>
-        </w:rPr>
-        <w:t>trang kế toán tắt</w:t>
-      </w:r>
-      <w:r>
-        <w:t xml:space="preserve"> thì chưa lập đợt trả được.</w:t>
+        <w:pStyle w:val="ListNumber"/>
+      </w:pPr>
+      <w:r>
+        <w:t xml:space="preserve">Trang kế toán → </w:t>
+      </w:r>
+      <w:r>
+        <w:rPr>
+          <w:b/>
+        </w:rPr>
+        <w:t>Tiền vận chuyển → Xe liên kết</w:t>
+      </w:r>
+      <w:r>
+        <w:t xml:space="preserve"> → ô </w:t>
+      </w:r>
+      <w:r>
+        <w:rPr>
+          <w:b/>
+        </w:rPr>
+        <w:t>Tháng</w:t>
+      </w:r>
+      <w:r>
+        <w:t xml:space="preserve"> chọn tháng của phiếu. Màn có hai bảng: </w:t>
+      </w:r>
+      <w:r>
+        <w:rPr>
+          <w:b/>
+        </w:rPr>
+        <w:t>Chủ xe liên kết</w:t>
+      </w:r>
+      <w:r>
+        <w:t xml:space="preserve"> (điều khoản từng chủ xe, cột </w:t>
+      </w:r>
+      <w:r>
+        <w:rPr>
+          <w:b/>
+        </w:rPr>
+        <w:t>Chờ trả</w:t>
+      </w:r>
+      <w:r>
+        <w:t xml:space="preserve">) và </w:t>
+      </w:r>
+      <w:r>
+        <w:rPr>
+          <w:b/>
+        </w:rPr>
+        <w:t>Xe liên kết</w:t>
+      </w:r>
+      <w:r>
+        <w:t xml:space="preserve"> (mỗi dòng một phiếu xe ngoài: tiền thuê, cắt phí, cắt quá tải, trừ EPL đã ứng, còn phải trả chủ xe, lãi EPL).</w:t>
       </w:r>
     </w:p>
     <w:p>
       <w:pPr>
-        <w:pStyle w:val="Heading2"/>
-      </w:pPr>
-      <w:r>
-        <w:t>Bước 20. Tất toán tài xế theo tháng</w:t>
+        <w:pStyle w:val="ListNumber"/>
+      </w:pPr>
+      <w:r>
+        <w:rPr>
+          <w:b/>
+        </w:rPr>
+        <w:t>Trả từng phiếu</w:t>
+      </w:r>
+      <w:r>
+        <w:t xml:space="preserve"> (chủ xe có cách trả *Từng phiếu, sau khi khoá*): bảng </w:t>
+      </w:r>
+      <w:r>
+        <w:rPr>
+          <w:b/>
+        </w:rPr>
+        <w:t>Xe liên kết</w:t>
+      </w:r>
+      <w:r>
+        <w:t xml:space="preserve"> → dòng phiếu → cột </w:t>
+      </w:r>
+      <w:r>
+        <w:rPr>
+          <w:b/>
+        </w:rPr>
+        <w:t>Trả chủ xe</w:t>
+      </w:r>
+      <w:r>
+        <w:t xml:space="preserve"> → bấm </w:t>
+      </w:r>
+      <w:r>
+        <w:rPr>
+          <w:b/>
+        </w:rPr>
+        <w:t>Trả chủ xe</w:t>
+      </w:r>
+      <w:r>
+        <w:t xml:space="preserve">. Hộp hiện tên chủ xe, số phiếu, số tiền và cách tính (tiền thuê − phí − quá tải − EPL đã ứng) → bấm </w:t>
+      </w:r>
+      <w:r>
+        <w:rPr>
+          <w:b/>
+        </w:rPr>
+        <w:t>Trả chủ xe</w:t>
+      </w:r>
+      <w:r>
+        <w:t>.</w:t>
       </w:r>
     </w:p>
     <w:p>
       <w:pPr>
-        <w:jc w:val="both"/>
-      </w:pPr>
-      <w:r>
-        <w:rPr>
-          <w:b/>
-        </w:rPr>
-        <w:t>Ai:</w:t>
-      </w:r>
-      <w:r>
-        <w:t xml:space="preserve"> KT Chi phí VC (chốt); quỹ chi bù hoặc thu lại. </w:t>
-      </w:r>
-      <w:r>
-        <w:rPr>
-          <w:b/>
-        </w:rPr>
-        <w:t>Trang:</w:t>
-      </w:r>
-      <w:r>
-        <w:t xml:space="preserve"> điều xe. </w:t>
-      </w:r>
-      <w:r>
-        <w:rPr>
-          <w:b/>
-        </w:rPr>
-        <w:t>Màn:</w:t>
-      </w:r>
-      <w:r>
-        <w:t xml:space="preserve"> Vận tải → </w:t>
-      </w:r>
-      <w:r>
-        <w:rPr>
-          <w:b/>
-        </w:rPr>
-        <w:t>Tất toán tài xế</w:t>
+        <w:pStyle w:val="ListNumber"/>
+      </w:pPr>
+      <w:r>
+        <w:rPr>
+          <w:b/>
+        </w:rPr>
+        <w:t>Trả nhiều phiếu một lần</w:t>
+      </w:r>
+      <w:r>
+        <w:t xml:space="preserve"> (chủ xe *Gộp cuối tháng* hay *Theo đợt thoả thuận* — dòng phiếu ghi *Trả gộp ở bảng Chủ xe*): bảng </w:t>
+      </w:r>
+      <w:r>
+        <w:rPr>
+          <w:b/>
+        </w:rPr>
+        <w:t>Chủ xe liên kết</w:t>
+      </w:r>
+      <w:r>
+        <w:t xml:space="preserve"> → </w:t>
+      </w:r>
+      <w:r>
+        <w:rPr>
+          <w:b/>
+        </w:rPr>
+        <w:t>Trả gộp</w:t>
+      </w:r>
+      <w:r>
+        <w:t xml:space="preserve"> ở dòng chủ xe → tích các phiếu trả trong đợt (dòng </w:t>
+      </w:r>
+      <w:r>
+        <w:rPr>
+          <w:b/>
+        </w:rPr>
+        <w:t>Tổng</w:t>
+      </w:r>
+      <w:r>
+        <w:t xml:space="preserve"> tự tính lại) → xem khung </w:t>
+      </w:r>
+      <w:r>
+        <w:rPr>
+          <w:b/>
+        </w:rPr>
+        <w:t>Hàng mua ở quầy chờ trừ</w:t>
+      </w:r>
+      <w:r>
+        <w:t xml:space="preserve"> nếu có → điền </w:t>
+      </w:r>
+      <w:r>
+        <w:rPr>
+          <w:b/>
+        </w:rPr>
+        <w:t>Ngày thu</w:t>
+      </w:r>
+      <w:r>
+        <w:t xml:space="preserve">, </w:t>
+      </w:r>
+      <w:r>
+        <w:rPr>
+          <w:b/>
+        </w:rPr>
+        <w:t>Cách thu</w:t>
+      </w:r>
+      <w:r>
+        <w:t xml:space="preserve"> (Tiền mặt, Chuyển khoản, Cấn trừ công nợ, Khác), </w:t>
+      </w:r>
+      <w:r>
+        <w:rPr>
+          <w:b/>
+        </w:rPr>
+        <w:t>Số uỷ nhiệm chi · biên lai</w:t>
+      </w:r>
+      <w:r>
+        <w:t xml:space="preserve">, </w:t>
+      </w:r>
+      <w:r>
+        <w:rPr>
+          <w:b/>
+        </w:rPr>
+        <w:t>Ghi chú</w:t>
+      </w:r>
+      <w:r>
+        <w:t xml:space="preserve"> → bấm </w:t>
+      </w:r>
+      <w:r>
+        <w:rPr>
+          <w:b/>
+        </w:rPr>
+        <w:t>Trả chủ xe</w:t>
       </w:r>
       <w:r>
         <w:t>.</w:t>
@@ -9520,34 +9955,10 @@
     </w:p>
     <w:p>
       <w:pPr>
-        <w:jc w:val="both"/>
-      </w:pPr>
-      <w:r>
-        <w:rPr>
-          <w:b/>
-        </w:rPr>
-        <w:t>Thao tác:</w:t>
-      </w:r>
-      <w:r>
-        <w:t xml:space="preserve"> chọn tháng → xem từng tài xế: đã ứng bao nhiêu, chi thật bao nhiêu, chênh → bấm </w:t>
-      </w:r>
-      <w:r>
-        <w:rPr>
-          <w:b/>
-        </w:rPr>
-        <w:t>Tất toán</w:t>
-      </w:r>
-      <w:r>
-        <w:t xml:space="preserve">. Làm lại thì </w:t>
-      </w:r>
-      <w:r>
-        <w:rPr>
-          <w:b/>
-        </w:rPr>
-        <w:t>Bỏ chốt</w:t>
-      </w:r>
-      <w:r>
-        <w:t>.</w:t>
+        <w:pStyle w:val="ListNumber"/>
+      </w:pPr>
+      <w:r>
+        <w:t>Trả xong: dòng phiếu hiện *Đã trả chủ xe*; bên trang điều xe phiếu tự hiện đã trả, nút trả biến mất.</w:t>
       </w:r>
     </w:p>
     <w:p>
@@ -9561,33 +9972,66 @@
         <w:t>Máy tự làm:</w:t>
       </w:r>
       <w:r>
-        <w:t xml:space="preserve"> chi thật lớn hơn ứng thì công ty chi bù (</w:t>
-      </w:r>
-      <w:r>
-        <w:rPr>
-          <w:b/>
-        </w:rPr>
-        <w:t>TT_CHI</w:t>
-      </w:r>
-      <w:r>
-        <w:t>); ngược lại tài xế nộp lại (</w:t>
-      </w:r>
-      <w:r>
-        <w:rPr>
-          <w:b/>
-        </w:rPr>
-        <w:t>TT_THU</w:t>
-      </w:r>
-      <w:r>
-        <w:t>). Chốt hai lần một kỳ bị chặn.</w:t>
+        <w:t xml:space="preserve"> phải trả = tiền thuê − phí quản lý % − cắt quá tải − mọi khoản EPL đã ứng (dầu kho, đi đường…) — số tính ở trang điều xe, không gõ tay; </w:t>
+      </w:r>
+      <w:r>
+        <w:rPr>
+          <w:b/>
+        </w:rPr>
+        <w:t>tự trừ tiếp</w:t>
+      </w:r>
+      <w:r>
+        <w:t xml:space="preserve"> phiếu bán hàng chủ xe mua ở quầy chưa trừ (phiếu cũ trước, vừa tiền thì trừ), phiếu bán thành *Đã trừ*; phiếu chi ghi số </w:t>
+      </w:r>
+      <w:r>
+        <w:rPr>
+          <w:b/>
+        </w:rPr>
+        <w:t>thực chi</w:t>
+      </w:r>
+      <w:r>
+        <w:t xml:space="preserve"> sau khi trừ. Một tờ </w:t>
+      </w:r>
+      <w:r>
+        <w:rPr>
+          <w:b/>
+        </w:rPr>
+        <w:t>PC_CX</w:t>
+      </w:r>
+      <w:r>
+        <w:t xml:space="preserve"> (Nợ 4022 / Có tiền) cho cả đợt, </w:t>
+      </w:r>
+      <w:r>
+        <w:rPr>
+          <w:b/>
+        </w:rPr>
+        <w:t>vào sổ ngay</w:t>
+      </w:r>
+      <w:r>
+        <w:t xml:space="preserve"> — không còn nằm chờ đẩy ở trang điều xe.</w:t>
       </w:r>
     </w:p>
     <w:p>
       <w:pPr>
-        <w:pStyle w:val="Heading2"/>
-      </w:pPr>
-      <w:r>
-        <w:t>Bước 21. KT Thu/Chi đẩy chứng từ sang sổ</w:t>
+        <w:jc w:val="both"/>
+      </w:pPr>
+      <w:r>
+        <w:rPr>
+          <w:b/>
+        </w:rPr>
+        <w:t>Máy chặn:</w:t>
+      </w:r>
+      <w:r>
+        <w:t xml:space="preserve"> phiếu chưa khoá; phiếu xe nhà; trả hai lần; các phiếu khác tiền thuê phải tách đợt; </w:t>
+      </w:r>
+      <w:r>
+        <w:rPr>
+          <w:b/>
+        </w:rPr>
+        <w:t>trang điều xe tắt</w:t>
+      </w:r>
+      <w:r>
+        <w:t xml:space="preserve"> thì màn không hiện số, không trả được. Kế toán khác (KT Thu/Chi, KT Chi phí, KT Doanh thu, KT kho xăng dầu) xem được hai bảng nhưng không có nút trả; Bãi không có màn này.</w:t>
       </w:r>
     </w:p>
     <w:p>
@@ -9598,78 +10042,64 @@
         <w:rPr>
           <w:b/>
         </w:rPr>
-        <w:t>Ai:</w:t>
-      </w:r>
-      <w:r>
-        <w:t xml:space="preserve"> KT Thu/Chi VC (hoặc Sếp). </w:t>
-      </w:r>
-      <w:r>
-        <w:rPr>
-          <w:b/>
-        </w:rPr>
-        <w:t>Trang:</w:t>
-      </w:r>
-      <w:r>
-        <w:t xml:space="preserve"> điều xe. </w:t>
-      </w:r>
-      <w:r>
-        <w:rPr>
-          <w:b/>
-        </w:rPr>
-        <w:t>Màn:</w:t>
-      </w:r>
-      <w:r>
-        <w:t xml:space="preserve"> Vận tải → </w:t>
-      </w:r>
-      <w:r>
-        <w:rPr>
-          <w:b/>
-        </w:rPr>
-        <w:t>Phiếu chi · Phiếu thu</w:t>
-      </w:r>
-      <w:r>
-        <w:t xml:space="preserve"> → tab </w:t>
-      </w:r>
-      <w:r>
-        <w:rPr>
-          <w:b/>
-        </w:rPr>
-        <w:t>Sổ chứng từ</w:t>
-      </w:r>
-      <w:r>
-        <w:t>.</w:t>
+        <w:t>Sếp gỡ đợt trả lập nhầm:</w:t>
+      </w:r>
+      <w:r>
+        <w:t xml:space="preserve"> bảng Xe liên kết, phiếu đã trả có nút </w:t>
+      </w:r>
+      <w:r>
+        <w:rPr>
+          <w:b/>
+        </w:rPr>
+        <w:t>Huỷ đợt trả</w:t>
+      </w:r>
+      <w:r>
+        <w:t xml:space="preserve"> (chỉ </w:t>
+      </w:r>
+      <w:r>
+        <w:rPr>
+          <w:rFonts w:ascii="Consolas" w:hAnsi="Consolas"/>
+          <w:sz w:val="19"/>
+        </w:rPr>
+        <w:t>admin</w:t>
+      </w:r>
+      <w:r>
+        <w:t xml:space="preserve">) → xác nhận. Tờ PC_CX rút khỏi sổ, hàng mua ở quầy về lại chờ trừ, mọi phiếu của đợt quay lại *chưa trả*. Đợt trả có tờ PC_CX đã đẩy từ trang điều xe </w:t>
+      </w:r>
+      <w:r>
+        <w:rPr>
+          <w:b/>
+        </w:rPr>
+        <w:t>trước ngày dời (28/09)</w:t>
+      </w:r>
+      <w:r>
+        <w:t xml:space="preserve"> thì không huỷ được — ghi bút toán đảo ở </w:t>
+      </w:r>
+      <w:r>
+        <w:rPr>
+          <w:b/>
+        </w:rPr>
+        <w:t>Ghi tay</w:t>
+      </w:r>
+      <w:r>
+        <w:t xml:space="preserve">. Phiếu đã trả chủ xe thì trang điều xe </w:t>
+      </w:r>
+      <w:r>
+        <w:rPr>
+          <w:b/>
+        </w:rPr>
+        <w:t>không cho xoá phiếu</w:t>
+      </w:r>
+      <w:r>
+        <w:t>, kể cả Sếp.</w:t>
       </w:r>
     </w:p>
     <w:p>
       <w:pPr>
-        <w:jc w:val="both"/>
-      </w:pPr>
-      <w:r>
-        <w:rPr>
-          <w:b/>
-        </w:rPr>
-        <w:t>Thao tác:</w:t>
-      </w:r>
-      <w:r>
-        <w:t xml:space="preserve"> xem danh sách tờ *chưa đẩy* (lọc theo loại, theo phiếu) → bấm </w:t>
-      </w:r>
-      <w:r>
-        <w:rPr>
-          <w:b/>
-        </w:rPr>
-        <w:t>Đẩy hết tờ chưa đẩy</w:t>
-      </w:r>
-      <w:r>
-        <w:t xml:space="preserve">, hoặc </w:t>
-      </w:r>
-      <w:r>
-        <w:rPr>
-          <w:b/>
-        </w:rPr>
-        <w:t>Đẩy</w:t>
-      </w:r>
-      <w:r>
-        <w:t xml:space="preserve"> ở từng tờ. Máy báo đẩy được bao nhiêu tờ, hỏng bao nhiêu.</w:t>
+        <w:pStyle w:val="Heading2"/>
+      </w:pPr>
+      <w:r>
+        <w:t>Bước 20. Tất toán tài xế theo tháng</w:t>
       </w:r>
     </w:p>
     <w:p>
@@ -9680,10 +10110,37 @@
         <w:rPr>
           <w:b/>
         </w:rPr>
-        <w:t>Máy tự làm:</w:t>
-      </w:r>
-      <w:r>
-        <w:t xml:space="preserve"> mỗi tờ đẩy đúng một lần; sổ đã có tờ đó thì coi như xong, không gửi trùng; hỏng thì giữ tờ, ghi câu lỗi lên tờ để đẩy lại.</w:t>
+        <w:t>Ai:</w:t>
+      </w:r>
+      <w:r>
+        <w:t xml:space="preserve"> KT Chi phí VC (chốt); quỹ chi bù hoặc thu lại. </w:t>
+      </w:r>
+      <w:r>
+        <w:rPr>
+          <w:b/>
+        </w:rPr>
+        <w:t>Trang:</w:t>
+      </w:r>
+      <w:r>
+        <w:t xml:space="preserve"> điều xe. </w:t>
+      </w:r>
+      <w:r>
+        <w:rPr>
+          <w:b/>
+        </w:rPr>
+        <w:t>Màn:</w:t>
+      </w:r>
+      <w:r>
+        <w:t xml:space="preserve"> Vận tải → </w:t>
+      </w:r>
+      <w:r>
+        <w:rPr>
+          <w:b/>
+        </w:rPr>
+        <w:t>Tất toán tài xế</w:t>
+      </w:r>
+      <w:r>
+        <w:t>.</w:t>
       </w:r>
     </w:p>
     <w:p>
@@ -9694,10 +10151,28 @@
         <w:rPr>
           <w:b/>
         </w:rPr>
-        <w:t>Máy chặn:</w:t>
-      </w:r>
-      <w:r>
-        <w:t xml:space="preserve"> chưa cấu hình địa chỉ sổ kế toán thì báo rõ (Phần 3.3).</w:t>
+        <w:t>Thao tác:</w:t>
+      </w:r>
+      <w:r>
+        <w:t xml:space="preserve"> chọn tháng → xem từng tài xế: đã ứng bao nhiêu, chi thật bao nhiêu, chênh → bấm </w:t>
+      </w:r>
+      <w:r>
+        <w:rPr>
+          <w:b/>
+        </w:rPr>
+        <w:t>Tất toán</w:t>
+      </w:r>
+      <w:r>
+        <w:t xml:space="preserve">. Làm lại thì </w:t>
+      </w:r>
+      <w:r>
+        <w:rPr>
+          <w:b/>
+        </w:rPr>
+        <w:t>Bỏ chốt</w:t>
+      </w:r>
+      <w:r>
+        <w:t>.</w:t>
       </w:r>
     </w:p>
     <w:p>
@@ -9708,16 +10183,175 @@
         <w:rPr>
           <w:b/>
         </w:rPr>
+        <w:t>Máy tự làm:</w:t>
+      </w:r>
+      <w:r>
+        <w:t xml:space="preserve"> chi thật lớn hơn ứng thì công ty chi bù (</w:t>
+      </w:r>
+      <w:r>
+        <w:rPr>
+          <w:b/>
+        </w:rPr>
+        <w:t>TT_CHI</w:t>
+      </w:r>
+      <w:r>
+        <w:t>); ngược lại tài xế nộp lại (</w:t>
+      </w:r>
+      <w:r>
+        <w:rPr>
+          <w:b/>
+        </w:rPr>
+        <w:t>TT_THU</w:t>
+      </w:r>
+      <w:r>
+        <w:t>). Chốt hai lần một kỳ bị chặn.</w:t>
+      </w:r>
+    </w:p>
+    <w:p>
+      <w:pPr>
+        <w:pStyle w:val="Heading2"/>
+      </w:pPr>
+      <w:r>
+        <w:t>Bước 21. KT Thu/Chi đẩy chứng từ sang sổ</w:t>
+      </w:r>
+    </w:p>
+    <w:p>
+      <w:pPr>
+        <w:jc w:val="both"/>
+      </w:pPr>
+      <w:r>
+        <w:rPr>
+          <w:b/>
+        </w:rPr>
+        <w:t>Ai:</w:t>
+      </w:r>
+      <w:r>
+        <w:t xml:space="preserve"> KT Thu/Chi VC (hoặc Sếp). </w:t>
+      </w:r>
+      <w:r>
+        <w:rPr>
+          <w:b/>
+        </w:rPr>
+        <w:t>Trang:</w:t>
+      </w:r>
+      <w:r>
+        <w:t xml:space="preserve"> điều xe. </w:t>
+      </w:r>
+      <w:r>
+        <w:rPr>
+          <w:b/>
+        </w:rPr>
+        <w:t>Màn:</w:t>
+      </w:r>
+      <w:r>
+        <w:t xml:space="preserve"> Vận tải → </w:t>
+      </w:r>
+      <w:r>
+        <w:rPr>
+          <w:b/>
+        </w:rPr>
+        <w:t>Phiếu chi · Phiếu thu</w:t>
+      </w:r>
+      <w:r>
+        <w:t xml:space="preserve"> → tab </w:t>
+      </w:r>
+      <w:r>
+        <w:rPr>
+          <w:b/>
+        </w:rPr>
+        <w:t>Sổ chứng từ</w:t>
+      </w:r>
+      <w:r>
+        <w:t>.</w:t>
+      </w:r>
+    </w:p>
+    <w:p>
+      <w:pPr>
+        <w:jc w:val="both"/>
+      </w:pPr>
+      <w:r>
+        <w:rPr>
+          <w:b/>
+        </w:rPr>
+        <w:t>Thao tác:</w:t>
+      </w:r>
+      <w:r>
+        <w:t xml:space="preserve"> xem danh sách tờ *chưa đẩy* (lọc theo loại, theo phiếu) → bấm </w:t>
+      </w:r>
+      <w:r>
+        <w:rPr>
+          <w:b/>
+        </w:rPr>
+        <w:t>Đẩy hết tờ chưa đẩy</w:t>
+      </w:r>
+      <w:r>
+        <w:t xml:space="preserve">, hoặc </w:t>
+      </w:r>
+      <w:r>
+        <w:rPr>
+          <w:b/>
+        </w:rPr>
+        <w:t>Đẩy</w:t>
+      </w:r>
+      <w:r>
+        <w:t xml:space="preserve"> ở từng tờ. Máy báo đẩy được bao nhiêu tờ, hỏng bao nhiêu.</w:t>
+      </w:r>
+    </w:p>
+    <w:p>
+      <w:pPr>
+        <w:jc w:val="both"/>
+      </w:pPr>
+      <w:r>
+        <w:rPr>
+          <w:b/>
+        </w:rPr>
+        <w:t>Máy tự làm:</w:t>
+      </w:r>
+      <w:r>
+        <w:t xml:space="preserve"> mỗi tờ đẩy đúng một lần; sổ đã có tờ đó thì coi như xong, không gửi trùng; hỏng thì giữ tờ, ghi câu lỗi lên tờ để đẩy lại.</w:t>
+      </w:r>
+    </w:p>
+    <w:p>
+      <w:pPr>
+        <w:jc w:val="both"/>
+      </w:pPr>
+      <w:r>
+        <w:rPr>
+          <w:b/>
+        </w:rPr>
+        <w:t>Máy chặn:</w:t>
+      </w:r>
+      <w:r>
+        <w:t xml:space="preserve"> chưa cấu hình địa chỉ sổ kế toán thì báo rõ (Phần 3.3).</w:t>
+      </w:r>
+    </w:p>
+    <w:p>
+      <w:pPr>
+        <w:jc w:val="both"/>
+      </w:pPr>
+      <w:r>
+        <w:rPr>
+          <w:b/>
+        </w:rPr>
         <w:t>Lưu ý:</w:t>
       </w:r>
       <w:r>
-        <w:t xml:space="preserve"> tờ kho, tờ lệnh sửa chữa, tờ bán hàng, và từ đợt 7a </w:t>
+        <w:t xml:space="preserve"> tờ kho, tờ lệnh sửa chữa, tờ bán hàng, từ đợt 7a </w:t>
       </w:r>
       <w:r>
         <w:rPr>
           <w:b/>
         </w:rPr>
         <w:t>hoá đơn HD, phiếu thu PT</w:t>
+      </w:r>
+      <w:r>
+        <w:t xml:space="preserve"> và từ đợt 7b </w:t>
+      </w:r>
+      <w:r>
+        <w:rPr>
+          <w:b/>
+        </w:rPr>
+        <w:t>phiếu chi trả chủ xe PC_CX</w:t>
       </w:r>
       <w:r>
         <w:t xml:space="preserve"> </w:t>
@@ -10677,7 +11311,7 @@
           <w:p>
             <w:r/>
             <w:r>
-              <w:t>Hoá đơn, thu: Kế toán · Tiền vận chuyển. Trả chủ xe, tất toán: Điều xe</w:t>
+              <w:t>Hoá đơn, thu, trả chủ xe: Kế toán · Tiền vận chuyển. Tất toán: Điều xe</w:t>
             </w:r>
           </w:p>
         </w:tc>
@@ -10690,7 +11324,7 @@
           <w:p>
             <w:r/>
             <w:r>
-              <w:t>Trả chủ xe, tất toán xong</w:t>
+              <w:t>Tất toán xong</w:t>
             </w:r>
           </w:p>
         </w:tc>
@@ -11637,7 +12271,16 @@
         <w:t>điều khoản chủ xe</w:t>
       </w:r>
       <w:r>
-        <w:t xml:space="preserve"> (Vận tải → Xe liên kết).</w:t>
+        <w:t xml:space="preserve"> và </w:t>
+      </w:r>
+      <w:r>
+        <w:rPr>
+          <w:b/>
+        </w:rPr>
+        <w:t>hợp đồng thuê xe</w:t>
+      </w:r>
+      <w:r>
+        <w:t xml:space="preserve"> (Vận tải → Xe liên kết — tiền trả chủ xe ở trang kế toán, bước 19).</w:t>
       </w:r>
     </w:p>
     <w:p>
@@ -12904,7 +13547,7 @@
           <w:p>
             <w:r/>
             <w:r>
-              <w:t>Điều xe</w:t>
+              <w:t>Kế toán (từ đợt 7b)</w:t>
             </w:r>
           </w:p>
         </w:tc>
@@ -12915,7 +13558,7 @@
           <w:p>
             <w:r/>
             <w:r>
-              <w:t>Đẩy</w:t>
+              <w:t>Ngay</w:t>
             </w:r>
           </w:p>
         </w:tc>
@@ -13549,7 +14192,7 @@
           <w:p>
             <w:r/>
             <w:r>
-              <w:t>Công nợ chủ xe, lập đợt trả chủ xe</w:t>
+              <w:t>Màn Xe liên kết, trả chủ xe, huỷ đợt trả (trang kế toán)</w:t>
             </w:r>
           </w:p>
         </w:tc>
@@ -13560,7 +14203,7 @@
           <w:p>
             <w:r/>
             <w:r>
-              <w:t>Chặn, báo rõ</w:t>
+              <w:t>Chặn, báo rõ; không lưu gì</w:t>
             </w:r>
           </w:p>
         </w:tc>
@@ -13573,7 +14216,7 @@
           <w:p>
             <w:r/>
             <w:r>
-              <w:t>Danh sách chủ xe</w:t>
+              <w:t>Danh mục chủ xe, hợp đồng thuê xe (trang điều xe)</w:t>
             </w:r>
           </w:p>
         </w:tc>
@@ -13584,7 +14227,7 @@
           <w:p>
             <w:r/>
             <w:r>
-              <w:t>Vẫn mở, phần hàng mua ở quầy chờ trừ để trống</w:t>
+              <w:t>Vẫn mở — không cần trang kế toán</w:t>
             </w:r>
           </w:p>
         </w:tc>
@@ -13704,7 +14347,7 @@
           <w:p>
             <w:r/>
             <w:r>
-              <w:t>Vẫn mở — đọc bản chép *đã xuất hoá đơn · đã thu* trên phiếu</w:t>
+              <w:t>Vẫn mở — đọc bản chép *đã xuất hoá đơn · đã thu · đã trả chủ xe* trên phiếu</w:t>
             </w:r>
           </w:p>
         </w:tc>
@@ -14093,6 +14736,41 @@
           </w:p>
         </w:tc>
       </w:tr>
+      <w:tr>
+        <w:tc>
+          <w:tcPr>
+            <w:tcW w:type="dxa" w:w="2880"/>
+          </w:tcPr>
+          <w:p>
+            <w:r/>
+            <w:r>
+              <w:t>7b</w:t>
+            </w:r>
+          </w:p>
+        </w:tc>
+        <w:tc>
+          <w:tcPr>
+            <w:tcW w:type="dxa" w:w="2880"/>
+          </w:tcPr>
+          <w:p>
+            <w:r/>
+            <w:r>
+              <w:t>Xe liên kết: chờ trả theo chủ xe, Trả gộp, Trả chủ xe từng phiếu, bảng xe liên kết theo tháng; Sếp huỷ đợt trả</w:t>
+            </w:r>
+          </w:p>
+        </w:tc>
+        <w:tc>
+          <w:tcPr>
+            <w:tcW w:type="dxa" w:w="2880"/>
+          </w:tcPr>
+          <w:p>
+            <w:r/>
+            <w:r>
+              <w:t>Đợt trả ở kế toán (cùng mã); phiếu bên điều xe giữ bản chép *đã trả chủ xe*; danh mục chủ xe, hợp đồng thuê xe ở lại điều xe</w:t>
+            </w:r>
+          </w:p>
+        </w:tc>
+      </w:tr>
     </w:tbl>
     <w:p/>
     <w:p>
@@ -14106,7 +14784,7 @@
         <w:t>Phần còn lại của đợt 7:</w:t>
       </w:r>
       <w:r>
-        <w:t xml:space="preserve"> 7b Xe liên kết (đợt trả chủ xe, nút Trả chủ xe trên phiếu), 7c Tiền chuyến &amp; tiền nước tài xế và Tất toán tài xế, 7d Theo dõi nhà cung cấp — dời sang trang kế toán, dữ liệu dời hẳn. Khi đó bước 19–21 của Phần 4 cũng làm ở trang kế toán; tài liệu này sẽ cập nhật lại.</w:t>
+        <w:t xml:space="preserve"> 7c Tiền chuyến &amp; tiền nước tài xế và Tất toán tài xế, 7d Theo dõi nhà cung cấp — dời sang trang kế toán, dữ liệu dời hẳn. Khi đó bước 20–21 của Phần 4 cũng làm ở trang kế toán; tài liệu này sẽ cập nhật lại.</w:t>
       </w:r>
     </w:p>
     <w:p>

</xml_diff>

<commit_message>
Đợt 7e: dọn cuối đợt 7 — tài liệu luồng A → Z, bỏ hai thư mục hoá đơn thừa
- Tài liệu luồng A → Z (Markdown + Word): bước 18 (cấn trừ ở trang kế toán), bước 20
  (Tất toán tài xế, Tiền chuyến & tiền nước ở trang kế toán, đủ thao tác bấm), bước 21,
  mục 6.6 Theo dõi nhà cung cấp, bảng 1.1 · 2 · 3.1 · 3.2 · 5 · 7 · 8 · 9 (cái gì ở lại).
- Bỏ frontend/modules/hoa-don, hoa-don-gop (không còn ai nạp từ đợt 7a).
- thu_danh_muc_cu_moi: nhà cung cấp so khi bỏ cột tiền; phát sinh / ghi nợ của bản cũ
  so với đường máy ds_tien.

Co-Authored-By: Claude Opus 5.5 (1M context) <noreply@anthropic.com>
</commit_message>
<xml_diff>
--- a/DOCS/word/LUONG_A_Z_HAI_TRANG.docx
+++ b/DOCS/word/LUONG_A_Z_HAI_TRANG.docx
@@ -232,7 +232,7 @@
         <w:t>6.</w:t>
       </w:r>
       <w:r>
-        <w:t xml:space="preserve"> Việc ngoài chuyến: kho, lệnh sửa chữa, bán hàng, thẻ cao tốc</w:t>
+        <w:t xml:space="preserve"> Việc ngoài chuyến: kho, lệnh sửa chữa, bán hàng, nhà cung cấp, thẻ cao tốc</w:t>
       </w:r>
     </w:p>
     <w:p>
@@ -274,7 +274,7 @@
         <w:t>9.</w:t>
       </w:r>
       <w:r>
-        <w:t xml:space="preserve"> Đã dời những gì sang trang kế toán, và đợt 7 sẽ dời gì</w:t>
+        <w:t xml:space="preserve"> Đã dời những gì sang trang kế toán, cái gì ở lại</w:t>
       </w:r>
     </w:p>
     <w:p>
@@ -492,16 +492,25 @@
               <w:t>Xe liên kết</w:t>
             </w:r>
             <w:r>
-              <w:t xml:space="preserve"> chỉ còn danh mục chủ xe (điều khoản) và hợp đồng thuê xe. </w:t>
+              <w:t xml:space="preserve"> chỉ còn danh mục chủ xe (điều khoản) và hợp đồng thuê xe; màn </w:t>
             </w:r>
             <w:r>
               <w:rPr>
                 <w:b/>
               </w:rPr>
-              <w:t>Tạm thời vẫn giữ các màn tiền</w:t>
-            </w:r>
-            <w:r>
-              <w:t xml:space="preserve"> Tiền chuyến &amp; tiền nước tài xế, Tất toán tài xế, Theo dõi nhà cung cấp cho tới các phần sau của đợt 7</w:t>
+              <w:t>Nhà cung cấp</w:t>
+            </w:r>
+            <w:r>
+              <w:t xml:space="preserve"> chỉ còn danh mục nhà cung cấp. </w:t>
+            </w:r>
+            <w:r>
+              <w:rPr>
+                <w:b/>
+              </w:rPr>
+              <w:t>Không còn màn tiền nào</w:t>
+            </w:r>
+            <w:r>
+              <w:t xml:space="preserve"> — từ đợt 7 mọi màn tiền ở trang kế toán</w:t>
             </w:r>
           </w:p>
         </w:tc>
@@ -581,7 +590,7 @@
               <w:t>Tiền vận chuyển</w:t>
             </w:r>
             <w:r>
-              <w:t xml:space="preserve"> (Hóa đơn vận chuyển, Hoá đơn gộp tháng — từ đợt 7a; Xe liên kết — trả chủ xe, từ đợt 7b) và </w:t>
+              <w:t xml:space="preserve"> (Hóa đơn vận chuyển, Hoá đơn gộp tháng — đợt 7a; Xe liên kết — đợt 7b; Tiền chuyến &amp; tiền nước tài xế, Tất toán tài xế — đợt 7c; Theo dõi nhà cung cấp — đợt 7d) và </w:t>
             </w:r>
             <w:r>
               <w:rPr>
@@ -788,7 +797,16 @@
         <w:t>Quỹ</w:t>
       </w:r>
       <w:r>
-        <w:t xml:space="preserve"> trả chủ xe liên kết (cũng ở </w:t>
+        <w:t xml:space="preserve"> trả chủ xe liên kết, </w:t>
+      </w:r>
+      <w:r>
+        <w:rPr>
+          <w:b/>
+        </w:rPr>
+        <w:t>KT Chi phí</w:t>
+      </w:r>
+      <w:r>
+        <w:t xml:space="preserve"> tất toán tài xế và trả nhà cung cấp — cũng ở </w:t>
       </w:r>
       <w:r>
         <w:rPr>
@@ -797,16 +815,7 @@
         <w:t>trang kế toán</w:t>
       </w:r>
       <w:r>
-        <w:t xml:space="preserve">). </w:t>
-      </w:r>
-      <w:r>
-        <w:rPr>
-          <w:b/>
-        </w:rPr>
-        <w:t>KT Chi phí</w:t>
-      </w:r>
-      <w:r>
-        <w:t xml:space="preserve"> tất toán tài xế.</w:t>
+        <w:t>.</w:t>
       </w:r>
     </w:p>
     <w:p>
@@ -860,7 +869,7 @@
         <w:t>Đường 1 — tờ sinh ở trang điều xe</w:t>
       </w:r>
       <w:r>
-        <w:t xml:space="preserve"> (DO, phiếu lĩnh, tạm ứng, phiếu chi mục IV–VI, tất toán…): nằm ở màn </w:t>
+        <w:t xml:space="preserve"> (DO, phiếu lĩnh, phiếu tạm ứng, phiếu chi mục IV–VI): nằm ở màn </w:t>
       </w:r>
       <w:r>
         <w:rPr>
@@ -917,6 +926,24 @@
           <w:b/>
         </w:rPr>
         <w:t>phiếu chi trả chủ xe PC_CX</w:t>
+      </w:r>
+      <w:r>
+        <w:t xml:space="preserve">, từ đợt 7c </w:t>
+      </w:r>
+      <w:r>
+        <w:rPr>
+          <w:b/>
+        </w:rPr>
+        <w:t>tờ tất toán TT_CHI / TT_THU</w:t>
+      </w:r>
+      <w:r>
+        <w:t xml:space="preserve">, từ đợt 7d </w:t>
+      </w:r>
+      <w:r>
+        <w:rPr>
+          <w:b/>
+        </w:rPr>
+        <w:t>phiếu chi trả nhà cung cấp PC_NCC</w:t>
       </w:r>
       <w:r>
         <w:t xml:space="preserve">): vào sổ </w:t>
@@ -1256,7 +1283,7 @@
           <w:p>
             <w:r/>
             <w:r>
-              <w:t>Nhập giá, kiểm, ghi sổ mục IV, V, VI; tất toán tài xế; nhà cung cấp</w:t>
+              <w:t>Nhập giá, kiểm, ghi sổ mục IV, V, VI; danh mục nhà cung cấp (thêm, sửa, gắn trạm với khách)</w:t>
             </w:r>
           </w:p>
         </w:tc>
@@ -1267,7 +1294,25 @@
           <w:p>
             <w:r/>
             <w:r>
-              <w:t>Xem sổ; Lệnh sửa chữa (kiểm, ghi sổ, trả lại)</w:t>
+              <w:t xml:space="preserve">Xem sổ; Lệnh sửa chữa (kiểm, ghi sổ, trả lại); </w:t>
+            </w:r>
+            <w:r>
+              <w:rPr>
+                <w:b/>
+              </w:rPr>
+              <w:t>Tất toán tài xế</w:t>
+            </w:r>
+            <w:r>
+              <w:t xml:space="preserve"> (chốt, bỏ chốt); </w:t>
+            </w:r>
+            <w:r>
+              <w:rPr>
+                <w:b/>
+              </w:rPr>
+              <w:t>Theo dõi nhà cung cấp</w:t>
+            </w:r>
+            <w:r>
+              <w:t xml:space="preserve"> (trả); Tiền chuyến &amp; tiền nước (xem)</w:t>
             </w:r>
           </w:p>
         </w:tc>
@@ -1522,7 +1567,7 @@
           <w:p>
             <w:r/>
             <w:r>
-              <w:t>Chi mục IV, V, VI; tất toán</w:t>
+              <w:t>Chi mục IV, V, VI</w:t>
             </w:r>
           </w:p>
         </w:tc>
@@ -1542,7 +1587,25 @@
               <w:t>Xe liên kết</w:t>
             </w:r>
             <w:r>
-              <w:t xml:space="preserve"> (trả chủ xe)</w:t>
+              <w:t xml:space="preserve"> (trả chủ xe); </w:t>
+            </w:r>
+            <w:r>
+              <w:rPr>
+                <w:b/>
+              </w:rPr>
+              <w:t>Tất toán tài xế</w:t>
+            </w:r>
+            <w:r>
+              <w:t xml:space="preserve"> (chốt); </w:t>
+            </w:r>
+            <w:r>
+              <w:rPr>
+                <w:b/>
+              </w:rPr>
+              <w:t>Theo dõi nhà cung cấp</w:t>
+            </w:r>
+            <w:r>
+              <w:t xml:space="preserve"> (trả)</w:t>
             </w:r>
           </w:p>
         </w:tc>
@@ -1581,7 +1644,7 @@
           <w:p>
             <w:r/>
             <w:r>
-              <w:t>Chi mục III (dầu mua ngoài); tất toán</w:t>
+              <w:t>Chi mục III (dầu mua ngoài)</w:t>
             </w:r>
           </w:p>
         </w:tc>
@@ -1601,7 +1664,25 @@
               <w:t>Xe liên kết</w:t>
             </w:r>
             <w:r>
-              <w:t xml:space="preserve"> (trả chủ xe)</w:t>
+              <w:t xml:space="preserve"> (trả chủ xe); </w:t>
+            </w:r>
+            <w:r>
+              <w:rPr>
+                <w:b/>
+              </w:rPr>
+              <w:t>Tất toán tài xế</w:t>
+            </w:r>
+            <w:r>
+              <w:t xml:space="preserve"> (chốt); </w:t>
+            </w:r>
+            <w:r>
+              <w:rPr>
+                <w:b/>
+              </w:rPr>
+              <w:t>Theo dõi nhà cung cấp</w:t>
+            </w:r>
+            <w:r>
+              <w:t xml:space="preserve"> (trả)</w:t>
             </w:r>
           </w:p>
         </w:tc>
@@ -1640,7 +1721,7 @@
           <w:p>
             <w:r/>
             <w:r>
-              <w:t>Ghi cấn trừ tháng (Theo dõi nhà cung cấp); xem phiếu, công nợ khách</w:t>
+              <w:t>Xem phiếu, công nợ khách</w:t>
             </w:r>
           </w:p>
         </w:tc>
@@ -1669,7 +1750,16 @@
               <w:t>Hoá đơn gộp tháng</w:t>
             </w:r>
             <w:r>
-              <w:t xml:space="preserve"> (lập hoá đơn, ghi thu, xoá lần thu); Bán hàng (lập, ghi thu)</w:t>
+              <w:t xml:space="preserve"> (lập hoá đơn, ghi thu, xoá lần thu); </w:t>
+            </w:r>
+            <w:r>
+              <w:rPr>
+                <w:b/>
+              </w:rPr>
+              <w:t>Theo dõi nhà cung cấp</w:t>
+            </w:r>
+            <w:r>
+              <w:t xml:space="preserve"> (ghi cấn trừ tháng); Bán hàng (lập, ghi thu)</w:t>
             </w:r>
           </w:p>
         </w:tc>
@@ -2872,6 +2962,115 @@
             </w:r>
             <w:r>
               <w:t xml:space="preserve"> của phiếu đó</w:t>
+            </w:r>
+          </w:p>
+        </w:tc>
+      </w:tr>
+      <w:tr>
+        <w:tc>
+          <w:tcPr>
+            <w:tcW w:type="dxa" w:w="2880"/>
+          </w:tcPr>
+          <w:p>
+            <w:r/>
+            <w:r>
+              <w:t xml:space="preserve">Trang điều xe → </w:t>
+            </w:r>
+            <w:r>
+              <w:rPr>
+                <w:b/>
+              </w:rPr>
+              <w:t>Vận tải → Nhà cung cấp</w:t>
+            </w:r>
+          </w:p>
+        </w:tc>
+        <w:tc>
+          <w:tcPr>
+            <w:tcW w:type="dxa" w:w="2880"/>
+          </w:tcPr>
+          <w:p>
+            <w:r/>
+            <w:r>
+              <w:rPr>
+                <w:b/>
+              </w:rPr>
+              <w:t>Công nợ · trả nhà cung cấp · cấn trừ cuối tháng ↗</w:t>
+            </w:r>
+          </w:p>
+        </w:tc>
+        <w:tc>
+          <w:tcPr>
+            <w:tcW w:type="dxa" w:w="2880"/>
+          </w:tcPr>
+          <w:p>
+            <w:r/>
+            <w:r>
+              <w:t xml:space="preserve">Màn </w:t>
+            </w:r>
+            <w:r>
+              <w:rPr>
+                <w:b/>
+              </w:rPr>
+              <w:t>Theo dõi nhà cung cấp</w:t>
+            </w:r>
+            <w:r>
+              <w:t xml:space="preserve"> ở trang kế toán</w:t>
+            </w:r>
+          </w:p>
+        </w:tc>
+      </w:tr>
+      <w:tr>
+        <w:tc>
+          <w:tcPr>
+            <w:tcW w:type="dxa" w:w="2880"/>
+          </w:tcPr>
+          <w:p>
+            <w:r/>
+            <w:r>
+              <w:t xml:space="preserve">Trang kế toán → </w:t>
+            </w:r>
+            <w:r>
+              <w:rPr>
+                <w:b/>
+              </w:rPr>
+              <w:t>Tiền vận chuyển → Theo dõi nhà cung cấp</w:t>
+            </w:r>
+            <w:r>
+              <w:t xml:space="preserve"> (vai KT Chi phí)</w:t>
+            </w:r>
+          </w:p>
+        </w:tc>
+        <w:tc>
+          <w:tcPr>
+            <w:tcW w:type="dxa" w:w="2880"/>
+          </w:tcPr>
+          <w:p>
+            <w:r/>
+            <w:r>
+              <w:rPr>
+                <w:b/>
+              </w:rPr>
+              <w:t>Thêm · sửa nhà cung cấp ↗</w:t>
+            </w:r>
+          </w:p>
+        </w:tc>
+        <w:tc>
+          <w:tcPr>
+            <w:tcW w:type="dxa" w:w="2880"/>
+          </w:tcPr>
+          <w:p>
+            <w:r/>
+            <w:r>
+              <w:t xml:space="preserve">Màn </w:t>
+            </w:r>
+            <w:r>
+              <w:rPr>
+                <w:b/>
+              </w:rPr>
+              <w:t>Nhà cung cấp</w:t>
+            </w:r>
+            <w:r>
+              <w:t xml:space="preserve"> (danh mục) ở trang điều xe, thẻ mới</w:t>
             </w:r>
           </w:p>
         </w:tc>
@@ -3960,14 +4159,111 @@
           <w:p>
             <w:r/>
             <w:r>
+              <w:t xml:space="preserve">Mở </w:t>
+            </w:r>
+            <w:r>
+              <w:rPr>
+                <w:b/>
+              </w:rPr>
+              <w:t>Tiền chuyến &amp; tiền nước tài xế</w:t>
+            </w:r>
+            <w:r>
+              <w:t xml:space="preserve">, </w:t>
+            </w:r>
+            <w:r>
+              <w:rPr>
+                <w:b/>
+              </w:rPr>
+              <w:t>Tất toán tài xế</w:t>
+            </w:r>
+            <w:r>
+              <w:t xml:space="preserve">; </w:t>
+            </w:r>
+            <w:r>
+              <w:rPr>
+                <w:b/>
+              </w:rPr>
+              <w:t>Tất toán</w:t>
+            </w:r>
+            <w:r>
+              <w:t xml:space="preserve">, </w:t>
+            </w:r>
+            <w:r>
+              <w:rPr>
+                <w:b/>
+              </w:rPr>
+              <w:t>Bỏ chốt</w:t>
+            </w:r>
+          </w:p>
+        </w:tc>
+        <w:tc>
+          <w:tcPr>
+            <w:tcW w:type="dxa" w:w="2160"/>
+          </w:tcPr>
+          <w:p>
+            <w:r/>
+            <w:r>
+              <w:t>Kế toán</w:t>
+            </w:r>
+          </w:p>
+        </w:tc>
+        <w:tc>
+          <w:tcPr>
+            <w:tcW w:type="dxa" w:w="2160"/>
+          </w:tcPr>
+          <w:p>
+            <w:r/>
+            <w:r>
+              <w:t>Đọc số từ phiếu (phiếu tạm ứng đã cấp, dòng chi tài xế ứng, mục IV) — tính ở trang điều xe</w:t>
+            </w:r>
+          </w:p>
+        </w:tc>
+        <w:tc>
+          <w:tcPr>
+            <w:tcW w:type="dxa" w:w="2160"/>
+          </w:tcPr>
+          <w:p>
+            <w:r/>
+            <w:r>
+              <w:t>Chặn, báo rõ; không có bản chốt nửa vời</w:t>
+            </w:r>
+          </w:p>
+        </w:tc>
+      </w:tr>
+      <w:tr>
+        <w:tc>
+          <w:tcPr>
+            <w:tcW w:type="dxa" w:w="2160"/>
+          </w:tcPr>
+          <w:p>
+            <w:r/>
+            <w:r>
+              <w:t xml:space="preserve">Mở </w:t>
+            </w:r>
+            <w:r>
+              <w:rPr>
+                <w:b/>
+              </w:rPr>
+              <w:t>Theo dõi nhà cung cấp</w:t>
+            </w:r>
+            <w:r>
+              <w:t xml:space="preserve"> (công nợ, cấn trừ cuối tháng); </w:t>
+            </w:r>
+            <w:r>
+              <w:rPr>
+                <w:b/>
+              </w:rPr>
+              <w:t>Trả nhà cung cấp</w:t>
+            </w:r>
+            <w:r>
+              <w:t xml:space="preserve">, </w:t>
+            </w:r>
+            <w:r>
               <w:rPr>
                 <w:b/>
               </w:rPr>
               <w:t>Ghi cấn trừ tháng</w:t>
             </w:r>
-            <w:r>
-              <w:t xml:space="preserve"> (Theo dõi nhà cung cấp)</w:t>
-            </w:r>
           </w:p>
         </w:tc>
         <w:tc>
@@ -3977,7 +4273,7 @@
           <w:p>
             <w:r/>
             <w:r>
-              <w:t>Điều xe</w:t>
+              <w:t>Kế toán</w:t>
             </w:r>
           </w:p>
         </w:tc>
@@ -3988,7 +4284,7 @@
           <w:p>
             <w:r/>
             <w:r>
-              <w:t>Trang kế toán ghi phiếu thu cấn trừ vào hoá đơn của khách</w:t>
+              <w:t>Đọc danh mục nhà cung cấp, phần phát sinh từ phiếu, bảng cấn trừ (cước · thẻ cao tốc khách · trạm dầu VN)</w:t>
             </w:r>
           </w:p>
         </w:tc>
@@ -3999,7 +4295,7 @@
           <w:p>
             <w:r/>
             <w:r>
-              <w:t>Chặn, báo rõ</w:t>
+              <w:t>Chặn, báo rõ; không lưu gì</w:t>
             </w:r>
           </w:p>
         </w:tc>
@@ -4012,7 +4308,7 @@
           <w:p>
             <w:r/>
             <w:r>
-              <w:t>Bảng Cấn trừ cuối tháng</w:t>
+              <w:t>Báo cáo cấn trừ bên điều xe (chỉ đọc)</w:t>
             </w:r>
           </w:p>
         </w:tc>
@@ -4045,7 +4341,7 @@
           <w:p>
             <w:r/>
             <w:r>
-              <w:t>Vẫn mở; ô *đã ghi* để trống, nút ghi ẩn</w:t>
+              <w:t>Vẫn mở; ô *đã ghi* để trống</w:t>
             </w:r>
           </w:p>
         </w:tc>
@@ -9450,25 +9746,25 @@
         <w:rPr>
           <w:b/>
         </w:rPr>
-        <w:t>Cấn trừ cuối tháng:</w:t>
-      </w:r>
-      <w:r>
-        <w:t xml:space="preserve"> vẫn bấm ở </w:t>
-      </w:r>
-      <w:r>
-        <w:rPr>
-          <w:b/>
-        </w:rPr>
-        <w:t>trang điều xe</w:t>
-      </w:r>
-      <w:r>
-        <w:t xml:space="preserve"> → Vận tải → </w:t>
-      </w:r>
-      <w:r>
-        <w:rPr>
-          <w:b/>
-        </w:rPr>
-        <w:t>Theo dõi nhà cung cấp</w:t>
+        <w:t>Cấn trừ cuối tháng</w:t>
+      </w:r>
+      <w:r>
+        <w:t xml:space="preserve"> (từ đợt 7d ở </w:t>
+      </w:r>
+      <w:r>
+        <w:rPr>
+          <w:b/>
+        </w:rPr>
+        <w:t>trang kế toán</w:t>
+      </w:r>
+      <w:r>
+        <w:t xml:space="preserve">): </w:t>
+      </w:r>
+      <w:r>
+        <w:rPr>
+          <w:b/>
+        </w:rPr>
+        <w:t>Tiền vận chuyển → Theo dõi nhà cung cấp</w:t>
       </w:r>
       <w:r>
         <w:t xml:space="preserve"> → khung </w:t>
@@ -9480,7 +9776,25 @@
         <w:t>Cấn trừ cuối tháng</w:t>
       </w:r>
       <w:r>
-        <w:t xml:space="preserve"> → </w:t>
+        <w:t xml:space="preserve"> → ô </w:t>
+      </w:r>
+      <w:r>
+        <w:rPr>
+          <w:b/>
+        </w:rPr>
+        <w:t>Tháng</w:t>
+      </w:r>
+      <w:r>
+        <w:t xml:space="preserve"> → ở dòng khách còn phần chưa ghi, bấm </w:t>
+      </w:r>
+      <w:r>
+        <w:rPr>
+          <w:b/>
+        </w:rPr>
+        <w:t>Ghi cấn trừ tháng · &lt;số&gt; LAK</w:t>
+      </w:r>
+      <w:r>
+        <w:t xml:space="preserve"> → hộp hỏi đúng tên khách và số → bấm </w:t>
       </w:r>
       <w:r>
         <w:rPr>
@@ -9489,7 +9803,17 @@
         <w:t>Ghi cấn trừ tháng</w:t>
       </w:r>
       <w:r>
-        <w:t xml:space="preserve"> ở dòng khách. Máy tính phần khách đã trả hộ (thẻ cao tốc của khách, trạm dầu Việt Nam ghi nợ) rồi nhờ trang kế toán ghi thành phiếu thu cách thu *cấn trừ*: hoá đơn gộp cũ trước, rồi hoá đơn lẻ cũ trước.</w:t>
+        <w:t xml:space="preserve">. Máy tính phần khách đã trả hộ (thẻ cao tốc của khách, trạm dầu Việt Nam ghi nợ — số lấy từ trang điều xe) rồi ghi thành phiếu thu cách thu *cấn trừ* (ref </w:t>
+      </w:r>
+      <w:r>
+        <w:rPr>
+          <w:rFonts w:ascii="Consolas" w:hAnsi="Consolas"/>
+          <w:sz w:val="19"/>
+        </w:rPr>
+        <w:t>CT-YYYYMM</w:t>
+      </w:r>
+      <w:r>
+        <w:t>): hoá đơn gộp cũ trước, rồi hoá đơn lẻ cũ trước; không còn hoá đơn để bù thì phần dư để lại tháng sau. Ghi xong, ô *đã ghi phiếu thu* hiện ngay dưới số tổng cấn trừ; ghi lại lần hai bị chặn.</w:t>
       </w:r>
     </w:p>
     <w:p>
@@ -10099,7 +10423,7 @@
         <w:pStyle w:val="Heading2"/>
       </w:pPr>
       <w:r>
-        <w:t>Bước 20. Tất toán tài xế theo tháng</w:t>
+        <w:t>Bước 20. Tất toán tài xế theo tháng — trang kế toán</w:t>
       </w:r>
     </w:p>
     <w:p>
@@ -10113,7 +10437,46 @@
         <w:t>Ai:</w:t>
       </w:r>
       <w:r>
-        <w:t xml:space="preserve"> KT Chi phí VC (chốt); quỹ chi bù hoặc thu lại. </w:t>
+        <w:t xml:space="preserve"> KT Chi phí VC (</w:t>
+      </w:r>
+      <w:r>
+        <w:rPr>
+          <w:rFonts w:ascii="Consolas" w:hAnsi="Consolas"/>
+          <w:sz w:val="19"/>
+        </w:rPr>
+        <w:t>ketoancp</w:t>
+      </w:r>
+      <w:r>
+        <w:t>) chốt; Quỹ tiền mặt cảng cạn (</w:t>
+      </w:r>
+      <w:r>
+        <w:rPr>
+          <w:rFonts w:ascii="Consolas" w:hAnsi="Consolas"/>
+          <w:sz w:val="19"/>
+        </w:rPr>
+        <w:t>quytb</w:t>
+      </w:r>
+      <w:r>
+        <w:t>), Thủ quỹ VC (</w:t>
+      </w:r>
+      <w:r>
+        <w:rPr>
+          <w:rFonts w:ascii="Consolas" w:hAnsi="Consolas"/>
+          <w:sz w:val="19"/>
+        </w:rPr>
+        <w:t>quyvc</w:t>
+      </w:r>
+      <w:r>
+        <w:t xml:space="preserve">) cũng chốt được; </w:t>
+      </w:r>
+      <w:r>
+        <w:rPr>
+          <w:b/>
+        </w:rPr>
+        <w:t>bỏ chốt</w:t>
+      </w:r>
+      <w:r>
+        <w:t xml:space="preserve"> chỉ KT Chi phí và Sếp. </w:t>
       </w:r>
       <w:r>
         <w:rPr>
@@ -10122,7 +10485,16 @@
         <w:t>Trang:</w:t>
       </w:r>
       <w:r>
-        <w:t xml:space="preserve"> điều xe. </w:t>
+        <w:t xml:space="preserve"> </w:t>
+      </w:r>
+      <w:r>
+        <w:rPr>
+          <w:b/>
+        </w:rPr>
+        <w:t>kế toán</w:t>
+      </w:r>
+      <w:r>
+        <w:t xml:space="preserve"> (từ đợt 7c). </w:t>
       </w:r>
       <w:r>
         <w:rPr>
@@ -10131,7 +10503,16 @@
         <w:t>Màn:</w:t>
       </w:r>
       <w:r>
-        <w:t xml:space="preserve"> Vận tải → </w:t>
+        <w:t xml:space="preserve"> nhóm </w:t>
+      </w:r>
+      <w:r>
+        <w:rPr>
+          <w:b/>
+        </w:rPr>
+        <w:t>Tiền vận chuyển</w:t>
+      </w:r>
+      <w:r>
+        <w:t xml:space="preserve"> → </w:t>
       </w:r>
       <w:r>
         <w:rPr>
@@ -10153,113 +10534,170 @@
         </w:rPr>
         <w:t>Thao tác:</w:t>
       </w:r>
-      <w:r>
-        <w:t xml:space="preserve"> chọn tháng → xem từng tài xế: đã ứng bao nhiêu, chi thật bao nhiêu, chênh → bấm </w:t>
-      </w:r>
-      <w:r>
-        <w:rPr>
-          <w:b/>
-        </w:rPr>
-        <w:t>Tất toán</w:t>
-      </w:r>
-      <w:r>
-        <w:t xml:space="preserve">. Làm lại thì </w:t>
-      </w:r>
-      <w:r>
-        <w:rPr>
-          <w:b/>
-        </w:rPr>
-        <w:t>Bỏ chốt</w:t>
-      </w:r>
-      <w:r>
-        <w:t>.</w:t>
-      </w:r>
     </w:p>
     <w:p>
       <w:pPr>
-        <w:jc w:val="both"/>
-      </w:pPr>
-      <w:r>
-        <w:rPr>
-          <w:b/>
-        </w:rPr>
-        <w:t>Máy tự làm:</w:t>
-      </w:r>
-      <w:r>
-        <w:t xml:space="preserve"> chi thật lớn hơn ứng thì công ty chi bù (</w:t>
-      </w:r>
-      <w:r>
-        <w:rPr>
-          <w:b/>
-        </w:rPr>
-        <w:t>TT_CHI</w:t>
-      </w:r>
-      <w:r>
-        <w:t>); ngược lại tài xế nộp lại (</w:t>
-      </w:r>
-      <w:r>
-        <w:rPr>
-          <w:b/>
-        </w:rPr>
-        <w:t>TT_THU</w:t>
-      </w:r>
-      <w:r>
-        <w:t>). Chốt hai lần một kỳ bị chặn.</w:t>
+        <w:pStyle w:val="ListNumber"/>
+      </w:pPr>
+      <w:r>
+        <w:t xml:space="preserve">Trang kế toán → </w:t>
+      </w:r>
+      <w:r>
+        <w:rPr>
+          <w:b/>
+        </w:rPr>
+        <w:t>Tiền vận chuyển → Tất toán tài xế</w:t>
+      </w:r>
+      <w:r>
+        <w:t xml:space="preserve">. Màn mở sẵn ở tháng có phiếu mới nhất (theo ngày xe đi); đổi ở ô </w:t>
+      </w:r>
+      <w:r>
+        <w:rPr>
+          <w:b/>
+        </w:rPr>
+        <w:t>Kỳ (tháng)</w:t>
+      </w:r>
+      <w:r>
+        <w:t>.</w:t>
       </w:r>
     </w:p>
     <w:p>
       <w:pPr>
-        <w:pStyle w:val="Heading2"/>
-      </w:pPr>
-      <w:r>
-        <w:t>Bước 21. KT Thu/Chi đẩy chứng từ sang sổ</w:t>
+        <w:pStyle w:val="ListNumber"/>
+      </w:pPr>
+      <w:r>
+        <w:t xml:space="preserve">Bốn ô trên cùng: </w:t>
+      </w:r>
+      <w:r>
+        <w:rPr>
+          <w:b/>
+        </w:rPr>
+        <w:t>Đã ứng</w:t>
+      </w:r>
+      <w:r>
+        <w:t xml:space="preserve">, </w:t>
+      </w:r>
+      <w:r>
+        <w:rPr>
+          <w:b/>
+        </w:rPr>
+        <w:t>Đã chi thật</w:t>
+      </w:r>
+      <w:r>
+        <w:t xml:space="preserve">, </w:t>
+      </w:r>
+      <w:r>
+        <w:rPr>
+          <w:b/>
+        </w:rPr>
+        <w:t>Công ty chi bù</w:t>
+      </w:r>
+      <w:r>
+        <w:t xml:space="preserve">, </w:t>
+      </w:r>
+      <w:r>
+        <w:rPr>
+          <w:b/>
+        </w:rPr>
+        <w:t>Tài xế nộp lại</w:t>
+      </w:r>
+      <w:r>
+        <w:t xml:space="preserve"> (LAK). Bảng dưới: mỗi tài xế một dòng — </w:t>
+      </w:r>
+      <w:r>
+        <w:rPr>
+          <w:b/>
+        </w:rPr>
+        <w:t>Phiếu trong kỳ</w:t>
+      </w:r>
+      <w:r>
+        <w:t xml:space="preserve">, </w:t>
+      </w:r>
+      <w:r>
+        <w:rPr>
+          <w:b/>
+        </w:rPr>
+        <w:t>Đã ứng</w:t>
+      </w:r>
+      <w:r>
+        <w:t xml:space="preserve">, </w:t>
+      </w:r>
+      <w:r>
+        <w:rPr>
+          <w:b/>
+        </w:rPr>
+        <w:t>Đã chi thật</w:t>
+      </w:r>
+      <w:r>
+        <w:t xml:space="preserve">, </w:t>
+      </w:r>
+      <w:r>
+        <w:rPr>
+          <w:b/>
+        </w:rPr>
+        <w:t>Chênh lệch</w:t>
+      </w:r>
+      <w:r>
+        <w:t xml:space="preserve"> (kèm chữ *Công ty chi bù* / *Tài xế nộp lại* / *Vừa đủ*), </w:t>
+      </w:r>
+      <w:r>
+        <w:rPr>
+          <w:b/>
+        </w:rPr>
+        <w:t>Trạng thái</w:t>
+      </w:r>
+      <w:r>
+        <w:t xml:space="preserve"> (*Chờ cấp* hay *Đã tất toán*).</w:t>
       </w:r>
     </w:p>
     <w:p>
       <w:pPr>
-        <w:jc w:val="both"/>
-      </w:pPr>
-      <w:r>
-        <w:rPr>
-          <w:b/>
-        </w:rPr>
-        <w:t>Ai:</w:t>
-      </w:r>
-      <w:r>
-        <w:t xml:space="preserve"> KT Thu/Chi VC (hoặc Sếp). </w:t>
-      </w:r>
-      <w:r>
-        <w:rPr>
-          <w:b/>
-        </w:rPr>
-        <w:t>Trang:</w:t>
-      </w:r>
-      <w:r>
-        <w:t xml:space="preserve"> điều xe. </w:t>
-      </w:r>
-      <w:r>
-        <w:rPr>
-          <w:b/>
-        </w:rPr>
-        <w:t>Màn:</w:t>
-      </w:r>
-      <w:r>
-        <w:t xml:space="preserve"> Vận tải → </w:t>
-      </w:r>
-      <w:r>
-        <w:rPr>
-          <w:b/>
-        </w:rPr>
-        <w:t>Phiếu chi · Phiếu thu</w:t>
-      </w:r>
-      <w:r>
-        <w:t xml:space="preserve"> → tab </w:t>
-      </w:r>
-      <w:r>
-        <w:rPr>
-          <w:b/>
-        </w:rPr>
-        <w:t>Sổ chứng từ</w:t>
+        <w:pStyle w:val="ListNumber"/>
+      </w:pPr>
+      <w:r>
+        <w:t xml:space="preserve">Bấm vào một dòng → khung dưới cùng liệt kê các phiếu của tài xế đó trong kỳ: </w:t>
+      </w:r>
+      <w:r>
+        <w:rPr>
+          <w:b/>
+        </w:rPr>
+        <w:t>Số phiếu</w:t>
+      </w:r>
+      <w:r>
+        <w:t xml:space="preserve">, </w:t>
+      </w:r>
+      <w:r>
+        <w:rPr>
+          <w:b/>
+        </w:rPr>
+        <w:t>Ngày xe đi</w:t>
+      </w:r>
+      <w:r>
+        <w:t xml:space="preserve">, </w:t>
+      </w:r>
+      <w:r>
+        <w:rPr>
+          <w:b/>
+        </w:rPr>
+        <w:t>Số xe</w:t>
+      </w:r>
+      <w:r>
+        <w:t xml:space="preserve">, </w:t>
+      </w:r>
+      <w:r>
+        <w:rPr>
+          <w:b/>
+        </w:rPr>
+        <w:t>Tuyến đường</w:t>
+      </w:r>
+      <w:r>
+        <w:t xml:space="preserve">, </w:t>
+      </w:r>
+      <w:r>
+        <w:rPr>
+          <w:b/>
+        </w:rPr>
+        <w:t>Đã chi thật</w:t>
       </w:r>
       <w:r>
         <w:t>.</w:t>
@@ -10267,48 +10705,45 @@
     </w:p>
     <w:p>
       <w:pPr>
-        <w:jc w:val="both"/>
-      </w:pPr>
-      <w:r>
-        <w:rPr>
-          <w:b/>
-        </w:rPr>
-        <w:t>Thao tác:</w:t>
-      </w:r>
-      <w:r>
-        <w:t xml:space="preserve"> xem danh sách tờ *chưa đẩy* (lọc theo loại, theo phiếu) → bấm </w:t>
-      </w:r>
-      <w:r>
-        <w:rPr>
-          <w:b/>
-        </w:rPr>
-        <w:t>Đẩy hết tờ chưa đẩy</w:t>
-      </w:r>
-      <w:r>
-        <w:t xml:space="preserve">, hoặc </w:t>
-      </w:r>
-      <w:r>
-        <w:rPr>
-          <w:b/>
-        </w:rPr>
-        <w:t>Đẩy</w:t>
-      </w:r>
-      <w:r>
-        <w:t xml:space="preserve"> ở từng tờ. Máy báo đẩy được bao nhiêu tờ, hỏng bao nhiêu.</w:t>
+        <w:pStyle w:val="ListNumber"/>
+      </w:pPr>
+      <w:r>
+        <w:t xml:space="preserve">Bấm </w:t>
+      </w:r>
+      <w:r>
+        <w:rPr>
+          <w:b/>
+        </w:rPr>
+        <w:t>Tất toán</w:t>
+      </w:r>
+      <w:r>
+        <w:t xml:space="preserve"> ở dòng tài xế → hộp *Tất toán kỳ … cho …?* nói số chênh → bấm </w:t>
+      </w:r>
+      <w:r>
+        <w:rPr>
+          <w:b/>
+        </w:rPr>
+        <w:t>Tất toán</w:t>
+      </w:r>
+      <w:r>
+        <w:t>. Dòng chuyển *Đã tất toán*.</w:t>
       </w:r>
     </w:p>
     <w:p>
       <w:pPr>
-        <w:jc w:val="both"/>
-      </w:pPr>
-      <w:r>
-        <w:rPr>
-          <w:b/>
-        </w:rPr>
-        <w:t>Máy tự làm:</w:t>
-      </w:r>
-      <w:r>
-        <w:t xml:space="preserve"> mỗi tờ đẩy đúng một lần; sổ đã có tờ đó thì coi như xong, không gửi trùng; hỏng thì giữ tờ, ghi câu lỗi lên tờ để đẩy lại.</w:t>
+        <w:pStyle w:val="ListNumber"/>
+      </w:pPr>
+      <w:r>
+        <w:t xml:space="preserve">Chốt nhầm: bấm </w:t>
+      </w:r>
+      <w:r>
+        <w:rPr>
+          <w:b/>
+        </w:rPr>
+        <w:t>Bỏ chốt</w:t>
+      </w:r>
+      <w:r>
+        <w:t xml:space="preserve"> ở dòng đó → xác nhận → chốt lại sau khi sửa phiếu.</w:t>
       </w:r>
     </w:p>
     <w:p>
@@ -10319,10 +10754,127 @@
         <w:rPr>
           <w:b/>
         </w:rPr>
-        <w:t>Máy chặn:</w:t>
-      </w:r>
-      <w:r>
-        <w:t xml:space="preserve"> chưa cấu hình địa chỉ sổ kế toán thì báo rõ (Phần 3.3).</w:t>
+        <w:t>Xem tiền chuyến trả cùng lương:</w:t>
+      </w:r>
+      <w:r>
+        <w:t xml:space="preserve"> </w:t>
+      </w:r>
+      <w:r>
+        <w:rPr>
+          <w:b/>
+        </w:rPr>
+        <w:t>Tiền vận chuyển → Tiền chuyến &amp; tiền nước tài xế</w:t>
+      </w:r>
+      <w:r>
+        <w:t xml:space="preserve"> → ô </w:t>
+      </w:r>
+      <w:r>
+        <w:rPr>
+          <w:b/>
+        </w:rPr>
+        <w:t>Tháng</w:t>
+      </w:r>
+      <w:r>
+        <w:t xml:space="preserve"> → bảng theo tài xế: </w:t>
+      </w:r>
+      <w:r>
+        <w:rPr>
+          <w:b/>
+        </w:rPr>
+        <w:t>Chuyến</w:t>
+      </w:r>
+      <w:r>
+        <w:t xml:space="preserve">, </w:t>
+      </w:r>
+      <w:r>
+        <w:rPr>
+          <w:b/>
+        </w:rPr>
+        <w:t>Tiền chuyến</w:t>
+      </w:r>
+      <w:r>
+        <w:t xml:space="preserve">, </w:t>
+      </w:r>
+      <w:r>
+        <w:rPr>
+          <w:b/>
+        </w:rPr>
+        <w:t>Tiền nước</w:t>
+      </w:r>
+      <w:r>
+        <w:t xml:space="preserve">, </w:t>
+      </w:r>
+      <w:r>
+        <w:rPr>
+          <w:b/>
+        </w:rPr>
+        <w:t>Điện thoại</w:t>
+      </w:r>
+      <w:r>
+        <w:t xml:space="preserve">, </w:t>
+      </w:r>
+      <w:r>
+        <w:rPr>
+          <w:b/>
+        </w:rPr>
+        <w:t>Chi phí VN</w:t>
+      </w:r>
+      <w:r>
+        <w:t xml:space="preserve">, </w:t>
+      </w:r>
+      <w:r>
+        <w:rPr>
+          <w:b/>
+        </w:rPr>
+        <w:t>Tiền ăn tài xế</w:t>
+      </w:r>
+      <w:r>
+        <w:t xml:space="preserve">, </w:t>
+      </w:r>
+      <w:r>
+        <w:rPr>
+          <w:b/>
+        </w:rPr>
+        <w:t>Tổng (LAK)</w:t>
+      </w:r>
+      <w:r>
+        <w:t xml:space="preserve">, </w:t>
+      </w:r>
+      <w:r>
+        <w:rPr>
+          <w:b/>
+        </w:rPr>
+        <w:t>Kênh chi</w:t>
+      </w:r>
+      <w:r>
+        <w:t xml:space="preserve"> (*Trả theo chuyến cùng lương*), </w:t>
+      </w:r>
+      <w:r>
+        <w:rPr>
+          <w:b/>
+        </w:rPr>
+        <w:t>Trạng thái</w:t>
+      </w:r>
+      <w:r>
+        <w:t xml:space="preserve"> chi mục IV. Bấm </w:t>
+      </w:r>
+      <w:r>
+        <w:rPr>
+          <w:b/>
+        </w:rPr>
+        <w:t>In</w:t>
+      </w:r>
+      <w:r>
+        <w:t xml:space="preserve"> → bản in trong hộp → bấm </w:t>
+      </w:r>
+      <w:r>
+        <w:rPr>
+          <w:b/>
+        </w:rPr>
+        <w:t>In</w:t>
+      </w:r>
+      <w:r>
+        <w:t xml:space="preserve"> trong hộp. KT Thu/Chi, KT Doanh thu, KT kho xăng dầu, hai quỹ và KT Chi phí xem được; Bãi không có màn này.</w:t>
       </w:r>
     </w:p>
     <w:p>
@@ -10333,10 +10885,228 @@
         <w:rPr>
           <w:b/>
         </w:rPr>
+        <w:t>Máy tự làm:</w:t>
+      </w:r>
+      <w:r>
+        <w:t xml:space="preserve"> chênh lệch = đã chi thật − đã ứng. *Đã ứng* là các phiếu tạm ứng </w:t>
+      </w:r>
+      <w:r>
+        <w:rPr>
+          <w:b/>
+        </w:rPr>
+        <w:t>đã cấp</w:t>
+      </w:r>
+      <w:r>
+        <w:t xml:space="preserve"> trong kỳ; *đã chi thật* là các dòng chi EPL ứng tài xế móc túi trả (dầu mua ngoài dọc đường, mục IV, mục VI) — </w:t>
+      </w:r>
+      <w:r>
+        <w:rPr>
+          <w:b/>
+        </w:rPr>
+        <w:t>không</w:t>
+      </w:r>
+      <w:r>
+        <w:t xml:space="preserve"> tính khoản công ty trả thẳng nhà cung cấp theo đợt (chipping, thẻ cao tốc…). Số tính từ phiếu bên trang điều xe, không gõ tay. Chênh dương → tờ </w:t>
+      </w:r>
+      <w:r>
+        <w:rPr>
+          <w:b/>
+        </w:rPr>
+        <w:t>TT_CHI</w:t>
+      </w:r>
+      <w:r>
+        <w:t xml:space="preserve"> (Nợ 625 / Có tiền mặt Kíp 1011); âm → </w:t>
+      </w:r>
+      <w:r>
+        <w:rPr>
+          <w:b/>
+        </w:rPr>
+        <w:t>TT_THU</w:t>
+      </w:r>
+      <w:r>
+        <w:t xml:space="preserve"> (Nợ 1011 / Có 625); dưới 1 Kíp là vừa đủ, không sinh tờ. Tờ </w:t>
+      </w:r>
+      <w:r>
+        <w:rPr>
+          <w:b/>
+        </w:rPr>
+        <w:t>vào sổ ngay</w:t>
+      </w:r>
+      <w:r>
+        <w:t>. Bỏ chốt thì tờ rút khỏi sổ.</w:t>
+      </w:r>
+    </w:p>
+    <w:p>
+      <w:pPr>
+        <w:jc w:val="both"/>
+      </w:pPr>
+      <w:r>
+        <w:rPr>
+          <w:b/>
+        </w:rPr>
+        <w:t>Máy chặn:</w:t>
+      </w:r>
+      <w:r>
+        <w:t xml:space="preserve"> chốt hai lần một kỳ; kỳ tài xế không có phiếu; </w:t>
+      </w:r>
+      <w:r>
+        <w:rPr>
+          <w:b/>
+        </w:rPr>
+        <w:t>trang điều xe tắt</w:t>
+      </w:r>
+      <w:r>
+        <w:t xml:space="preserve"> thì màn không hiện số, không chốt được. Kỳ có tờ tất toán đã đẩy từ trang điều xe </w:t>
+      </w:r>
+      <w:r>
+        <w:rPr>
+          <w:b/>
+        </w:rPr>
+        <w:t>trước ngày dời (28/09)</w:t>
+      </w:r>
+      <w:r>
+        <w:t xml:space="preserve"> thì không bỏ chốt được — ghi bút toán đảo ở </w:t>
+      </w:r>
+      <w:r>
+        <w:rPr>
+          <w:b/>
+        </w:rPr>
+        <w:t>Ghi tay</w:t>
+      </w:r>
+      <w:r>
+        <w:t>. KT Thu/Chi, KT Doanh thu, Bãi không có màn Tất toán.</w:t>
+      </w:r>
+    </w:p>
+    <w:p>
+      <w:pPr>
+        <w:pStyle w:val="Heading2"/>
+      </w:pPr>
+      <w:r>
+        <w:t>Bước 21. KT Thu/Chi đẩy chứng từ sang sổ</w:t>
+      </w:r>
+    </w:p>
+    <w:p>
+      <w:pPr>
+        <w:jc w:val="both"/>
+      </w:pPr>
+      <w:r>
+        <w:rPr>
+          <w:b/>
+        </w:rPr>
+        <w:t>Ai:</w:t>
+      </w:r>
+      <w:r>
+        <w:t xml:space="preserve"> KT Thu/Chi VC (hoặc Sếp). </w:t>
+      </w:r>
+      <w:r>
+        <w:rPr>
+          <w:b/>
+        </w:rPr>
+        <w:t>Trang:</w:t>
+      </w:r>
+      <w:r>
+        <w:t xml:space="preserve"> điều xe. </w:t>
+      </w:r>
+      <w:r>
+        <w:rPr>
+          <w:b/>
+        </w:rPr>
+        <w:t>Màn:</w:t>
+      </w:r>
+      <w:r>
+        <w:t xml:space="preserve"> Vận tải → </w:t>
+      </w:r>
+      <w:r>
+        <w:rPr>
+          <w:b/>
+        </w:rPr>
+        <w:t>Phiếu chi · Phiếu thu</w:t>
+      </w:r>
+      <w:r>
+        <w:t xml:space="preserve"> → tab </w:t>
+      </w:r>
+      <w:r>
+        <w:rPr>
+          <w:b/>
+        </w:rPr>
+        <w:t>Sổ chứng từ</w:t>
+      </w:r>
+      <w:r>
+        <w:t>.</w:t>
+      </w:r>
+    </w:p>
+    <w:p>
+      <w:pPr>
+        <w:jc w:val="both"/>
+      </w:pPr>
+      <w:r>
+        <w:rPr>
+          <w:b/>
+        </w:rPr>
+        <w:t>Thao tác:</w:t>
+      </w:r>
+      <w:r>
+        <w:t xml:space="preserve"> xem danh sách tờ *chưa đẩy* (lọc theo loại, theo phiếu) → bấm </w:t>
+      </w:r>
+      <w:r>
+        <w:rPr>
+          <w:b/>
+        </w:rPr>
+        <w:t>Đẩy hết tờ chưa đẩy</w:t>
+      </w:r>
+      <w:r>
+        <w:t xml:space="preserve">, hoặc </w:t>
+      </w:r>
+      <w:r>
+        <w:rPr>
+          <w:b/>
+        </w:rPr>
+        <w:t>Đẩy</w:t>
+      </w:r>
+      <w:r>
+        <w:t xml:space="preserve"> ở từng tờ. Máy báo đẩy được bao nhiêu tờ, hỏng bao nhiêu.</w:t>
+      </w:r>
+    </w:p>
+    <w:p>
+      <w:pPr>
+        <w:jc w:val="both"/>
+      </w:pPr>
+      <w:r>
+        <w:rPr>
+          <w:b/>
+        </w:rPr>
+        <w:t>Máy tự làm:</w:t>
+      </w:r>
+      <w:r>
+        <w:t xml:space="preserve"> mỗi tờ đẩy đúng một lần; sổ đã có tờ đó thì coi như xong, không gửi trùng; hỏng thì giữ tờ, ghi câu lỗi lên tờ để đẩy lại.</w:t>
+      </w:r>
+    </w:p>
+    <w:p>
+      <w:pPr>
+        <w:jc w:val="both"/>
+      </w:pPr>
+      <w:r>
+        <w:rPr>
+          <w:b/>
+        </w:rPr>
+        <w:t>Máy chặn:</w:t>
+      </w:r>
+      <w:r>
+        <w:t xml:space="preserve"> chưa cấu hình địa chỉ sổ kế toán thì báo rõ (Phần 3.3).</w:t>
+      </w:r>
+    </w:p>
+    <w:p>
+      <w:pPr>
+        <w:jc w:val="both"/>
+      </w:pPr>
+      <w:r>
+        <w:rPr>
+          <w:b/>
+        </w:rPr>
         <w:t>Lưu ý:</w:t>
       </w:r>
       <w:r>
-        <w:t xml:space="preserve"> tờ kho, tờ lệnh sửa chữa, tờ bán hàng, từ đợt 7a </w:t>
+        <w:t xml:space="preserve"> tờ kho, tờ lệnh sửa chữa, tờ bán hàng, và mọi tờ tiền vận chuyển — </w:t>
       </w:r>
       <w:r>
         <w:rPr>
@@ -10345,16 +11115,34 @@
         <w:t>hoá đơn HD, phiếu thu PT</w:t>
       </w:r>
       <w:r>
-        <w:t xml:space="preserve"> và từ đợt 7b </w:t>
-      </w:r>
-      <w:r>
-        <w:rPr>
-          <w:b/>
-        </w:rPr>
-        <w:t>phiếu chi trả chủ xe PC_CX</w:t>
-      </w:r>
-      <w:r>
-        <w:t xml:space="preserve"> </w:t>
+        <w:t xml:space="preserve"> (7a), </w:t>
+      </w:r>
+      <w:r>
+        <w:rPr>
+          <w:b/>
+        </w:rPr>
+        <w:t>PC_CX</w:t>
+      </w:r>
+      <w:r>
+        <w:t xml:space="preserve"> (7b), </w:t>
+      </w:r>
+      <w:r>
+        <w:rPr>
+          <w:b/>
+        </w:rPr>
+        <w:t>TT_CHI · TT_THU</w:t>
+      </w:r>
+      <w:r>
+        <w:t xml:space="preserve"> (7c), </w:t>
+      </w:r>
+      <w:r>
+        <w:rPr>
+          <w:b/>
+        </w:rPr>
+        <w:t>PC_NCC</w:t>
+      </w:r>
+      <w:r>
+        <w:t xml:space="preserve"> (7d) — </w:t>
       </w:r>
       <w:r>
         <w:rPr>
@@ -11300,7 +12088,7 @@
           <w:p>
             <w:r/>
             <w:r>
-              <w:t>KT Doanh thu (hoá đơn, thu); Quỹ (trả chủ xe); KT Chi phí (tất toán)</w:t>
+              <w:t>KT Doanh thu (hoá đơn, thu); Quỹ (trả chủ xe); KT Chi phí (tất toán cuối tháng)</w:t>
             </w:r>
           </w:p>
         </w:tc>
@@ -11311,7 +12099,7 @@
           <w:p>
             <w:r/>
             <w:r>
-              <w:t>Hoá đơn, thu, trả chủ xe: Kế toán · Tiền vận chuyển. Tất toán: Điều xe</w:t>
+              <w:t>Kế toán · Tiền vận chuyển</w:t>
             </w:r>
           </w:p>
         </w:tc>
@@ -11324,7 +12112,7 @@
           <w:p>
             <w:r/>
             <w:r>
-              <w:t>Tất toán xong</w:t>
+              <w:t>Quỹ chi mục IV–VI, phiếu có tờ DO, phiếu lĩnh, tạm ứng</w:t>
             </w:r>
           </w:p>
         </w:tc>
@@ -12202,44 +12990,406 @@
         <w:pStyle w:val="Heading2"/>
       </w:pPr>
       <w:r>
-        <w:t>6.6. Việc còn ở trang điều xe</w:t>
+        <w:t>6.6. Theo dõi nhà cung cấp — trang kế toán, Tiền vận chuyển → Theo dõi nhà cung cấp</w:t>
       </w:r>
     </w:p>
     <w:p>
       <w:pPr>
-        <w:pStyle w:val="ListBullet"/>
-      </w:pPr>
-      <w:r>
-        <w:rPr>
-          <w:b/>
-        </w:rPr>
-        <w:t>Thẻ cao tốc</w:t>
-      </w:r>
-      <w:r>
-        <w:t xml:space="preserve"> (Danh mục → Thẻ cao tốc): KT Thu/Chi lập thẻ (của khách hay của EPL), quỹ / kế toán nạp tiền; thẻ trừ đúng một lần lúc ghi sổ mục IV; thẻ của khách cuối tháng cấn trừ vào cước khách đó. Điều chỉnh số dư phải có lý do.</w:t>
+        <w:pStyle w:val="ListNumber"/>
+      </w:pPr>
+      <w:r>
+        <w:rPr>
+          <w:b/>
+        </w:rPr>
+        <w:t>Xem công nợ</w:t>
+      </w:r>
+      <w:r>
+        <w:t xml:space="preserve"> (các vai kế toán, hai quỹ; Bãi không): bảng mỗi nhà cung cấp một dòng — </w:t>
+      </w:r>
+      <w:r>
+        <w:rPr>
+          <w:b/>
+        </w:rPr>
+        <w:t>Nhà cung cấp</w:t>
+      </w:r>
+      <w:r>
+        <w:t xml:space="preserve">, </w:t>
+      </w:r>
+      <w:r>
+        <w:rPr>
+          <w:b/>
+        </w:rPr>
+        <w:t>Dịch vụ</w:t>
+      </w:r>
+      <w:r>
+        <w:t xml:space="preserve">, </w:t>
+      </w:r>
+      <w:r>
+        <w:rPr>
+          <w:b/>
+        </w:rPr>
+        <w:t>Mã kế toán</w:t>
+      </w:r>
+      <w:r>
+        <w:t xml:space="preserve">, </w:t>
+      </w:r>
+      <w:r>
+        <w:rPr>
+          <w:b/>
+        </w:rPr>
+        <w:t>Chuyến</w:t>
+      </w:r>
+      <w:r>
+        <w:t xml:space="preserve"> (số dòng chi trên phiếu), </w:t>
+      </w:r>
+      <w:r>
+        <w:rPr>
+          <w:b/>
+        </w:rPr>
+        <w:t>Phát sinh (LAK)</w:t>
+      </w:r>
+      <w:r>
+        <w:t xml:space="preserve">, </w:t>
+      </w:r>
+      <w:r>
+        <w:rPr>
+          <w:b/>
+        </w:rPr>
+        <w:t>Ghi nợ tại trạm</w:t>
+      </w:r>
+      <w:r>
+        <w:t xml:space="preserve">, </w:t>
+      </w:r>
+      <w:r>
+        <w:rPr>
+          <w:b/>
+        </w:rPr>
+        <w:t>Cấn trừ vào cước khách</w:t>
+      </w:r>
+      <w:r>
+        <w:t xml:space="preserve">, </w:t>
+      </w:r>
+      <w:r>
+        <w:rPr>
+          <w:b/>
+        </w:rPr>
+        <w:t>Đã trả</w:t>
+      </w:r>
+      <w:r>
+        <w:t xml:space="preserve">, </w:t>
+      </w:r>
+      <w:r>
+        <w:rPr>
+          <w:b/>
+        </w:rPr>
+        <w:t>Còn nợ</w:t>
+      </w:r>
+      <w:r>
+        <w:t xml:space="preserve">, </w:t>
+      </w:r>
+      <w:r>
+        <w:rPr>
+          <w:b/>
+        </w:rPr>
+        <w:t>Điều kiện</w:t>
+      </w:r>
+      <w:r>
+        <w:t xml:space="preserve">; dòng </w:t>
+      </w:r>
+      <w:r>
+        <w:rPr>
+          <w:b/>
+        </w:rPr>
+        <w:t>Tổng</w:t>
+      </w:r>
+      <w:r>
+        <w:t xml:space="preserve"> cuối bảng. Phát sinh tính từ phiếu bên trang điều xe (dòng chi EPL ứng đúng khoản mục, hoặc dầu </w:t>
+      </w:r>
+      <w:r>
+        <w:rPr>
+          <w:b/>
+        </w:rPr>
+        <w:t>ghi nợ tại trạm</w:t>
+      </w:r>
+      <w:r>
+        <w:t xml:space="preserve"> của nhà cung cấp đó); còn nợ = phát sinh − đã trả.</w:t>
       </w:r>
     </w:p>
     <w:p>
       <w:pPr>
+        <w:pStyle w:val="ListNumber"/>
+      </w:pPr>
+      <w:r>
+        <w:rPr>
+          <w:b/>
+        </w:rPr>
+        <w:t>Trả nhà cung cấp</w:t>
+      </w:r>
+      <w:r>
+        <w:t xml:space="preserve"> (KT Chi phí, hai quỹ): bấm </w:t>
+      </w:r>
+      <w:r>
+        <w:rPr>
+          <w:b/>
+        </w:rPr>
+        <w:t>Trả nhà cung cấp</w:t>
+      </w:r>
+      <w:r>
+        <w:t xml:space="preserve"> ở dòng → hộp </w:t>
+      </w:r>
+      <w:r>
+        <w:rPr>
+          <w:b/>
+        </w:rPr>
+        <w:t>Ngày thu</w:t>
+      </w:r>
+      <w:r>
+        <w:t xml:space="preserve"> (hôm nay), </w:t>
+      </w:r>
+      <w:r>
+        <w:rPr>
+          <w:b/>
+        </w:rPr>
+        <w:t>Thành tiền (LAK)</w:t>
+      </w:r>
+      <w:r>
+        <w:t xml:space="preserve"> (điền sẵn số còn nợ, sửa được — trả theo đợt), </w:t>
+      </w:r>
+      <w:r>
+        <w:rPr>
+          <w:b/>
+        </w:rPr>
+        <w:t>Ghi chú</w:t>
+      </w:r>
+      <w:r>
+        <w:t xml:space="preserve"> → </w:t>
+      </w:r>
+      <w:r>
+        <w:rPr>
+          <w:b/>
+        </w:rPr>
+        <w:t>Lưu</w:t>
+      </w:r>
+      <w:r>
+        <w:t xml:space="preserve">. Sinh tờ </w:t>
+      </w:r>
+      <w:r>
+        <w:rPr>
+          <w:b/>
+        </w:rPr>
+        <w:t>PC_NCC</w:t>
+      </w:r>
+      <w:r>
+        <w:t xml:space="preserve"> (Nợ 4021 / Có tiền mặt Kíp 1011), vào sổ ngay; đã trả, còn nợ đổi ngay.</w:t>
+      </w:r>
+    </w:p>
+    <w:p>
+      <w:pPr>
+        <w:pStyle w:val="ListNumber"/>
+      </w:pPr>
+      <w:r>
+        <w:rPr>
+          <w:b/>
+        </w:rPr>
+        <w:t>Các lần trả</w:t>
+      </w:r>
+      <w:r>
+        <w:t xml:space="preserve"> ở dòng → khung dưới liệt kê ngày, số tiền, ghi chú, người chi tiền; </w:t>
+      </w:r>
+      <w:r>
+        <w:rPr>
+          <w:b/>
+        </w:rPr>
+        <w:t>Đóng</w:t>
+      </w:r>
+      <w:r>
+        <w:t xml:space="preserve"> để ẩn.</w:t>
+      </w:r>
+    </w:p>
+    <w:p>
+      <w:pPr>
+        <w:pStyle w:val="ListNumber"/>
+      </w:pPr>
+      <w:r>
+        <w:rPr>
+          <w:b/>
+        </w:rPr>
+        <w:t>Cấn trừ cuối tháng</w:t>
+      </w:r>
+      <w:r>
+        <w:t xml:space="preserve"> (khung dưới, KT Doanh thu ghi): xem bước 18.</w:t>
+      </w:r>
+    </w:p>
+    <w:p>
+      <w:pPr>
+        <w:pStyle w:val="ListNumber"/>
+      </w:pPr>
+      <w:r>
+        <w:rPr>
+          <w:b/>
+        </w:rPr>
+        <w:t>Danh mục</w:t>
+      </w:r>
+      <w:r>
+        <w:t xml:space="preserve"> (thêm, sửa, gắn trạm dầu Việt Nam với khách được cấn trừ) vẫn ở </w:t>
+      </w:r>
+      <w:r>
+        <w:rPr>
+          <w:b/>
+        </w:rPr>
+        <w:t>trang điều xe → Vận tải → Nhà cung cấp</w:t>
+      </w:r>
+      <w:r>
+        <w:t xml:space="preserve"> (KT Chi phí): bấm </w:t>
+      </w:r>
+      <w:r>
+        <w:rPr>
+          <w:b/>
+        </w:rPr>
+        <w:t>Thêm · sửa nhà cung cấp ↗</w:t>
+      </w:r>
+      <w:r>
+        <w:t xml:space="preserve"> để mở. Hộp </w:t>
+      </w:r>
+      <w:r>
+        <w:rPr>
+          <w:b/>
+        </w:rPr>
+        <w:t>Thêm</w:t>
+      </w:r>
+      <w:r>
+        <w:t xml:space="preserve"> / </w:t>
+      </w:r>
+      <w:r>
+        <w:rPr>
+          <w:b/>
+        </w:rPr>
+        <w:t>Sửa</w:t>
+      </w:r>
+      <w:r>
+        <w:t xml:space="preserve">: </w:t>
+      </w:r>
+      <w:r>
+        <w:rPr>
+          <w:b/>
+        </w:rPr>
+        <w:t>Nhà cung cấp</w:t>
+      </w:r>
+      <w:r>
+        <w:t xml:space="preserve">, </w:t>
+      </w:r>
+      <w:r>
+        <w:rPr>
+          <w:b/>
+        </w:rPr>
+        <w:t>Dịch vụ</w:t>
+      </w:r>
+      <w:r>
+        <w:t xml:space="preserve">, </w:t>
+      </w:r>
+      <w:r>
+        <w:rPr>
+          <w:b/>
+        </w:rPr>
+        <w:t>Mã kế toán</w:t>
+      </w:r>
+      <w:r>
+        <w:t xml:space="preserve">, </w:t>
+      </w:r>
+      <w:r>
+        <w:rPr>
+          <w:b/>
+        </w:rPr>
+        <w:t>Điều kiện</w:t>
+      </w:r>
+      <w:r>
+        <w:t xml:space="preserve">, </w:t>
+      </w:r>
+      <w:r>
+        <w:rPr>
+          <w:b/>
+        </w:rPr>
+        <w:t>Cấn trừ vào cước khách</w:t>
+      </w:r>
+      <w:r>
+        <w:t xml:space="preserve">, </w:t>
+      </w:r>
+      <w:r>
+        <w:rPr>
+          <w:b/>
+        </w:rPr>
+        <w:t>Ghi chú</w:t>
+      </w:r>
+      <w:r>
+        <w:t>.</w:t>
+      </w:r>
+    </w:p>
+    <w:p>
+      <w:pPr>
+        <w:jc w:val="both"/>
+      </w:pPr>
+      <w:r>
+        <w:rPr>
+          <w:b/>
+        </w:rPr>
+        <w:t>Máy chặn:</w:t>
+      </w:r>
+      <w:r>
+        <w:t xml:space="preserve"> số tiền không phải số hoặc bằng 0; ngày sai dạng; </w:t>
+      </w:r>
+      <w:r>
+        <w:rPr>
+          <w:b/>
+        </w:rPr>
+        <w:t>trang điều xe tắt</w:t>
+      </w:r>
+      <w:r>
+        <w:t xml:space="preserve"> thì chặn, không lưu gì. Lần trả không có nút xoá (như trước khi dời) — trả nhầm thì ghi bút toán đảo ở </w:t>
+      </w:r>
+      <w:r>
+        <w:rPr>
+          <w:b/>
+        </w:rPr>
+        <w:t>Ghi tay</w:t>
+      </w:r>
+      <w:r>
+        <w:t>.</w:t>
+      </w:r>
+    </w:p>
+    <w:p>
+      <w:pPr>
+        <w:pStyle w:val="Heading2"/>
+      </w:pPr>
+      <w:r>
+        <w:t>6.7. Việc còn ở trang điều xe</w:t>
+      </w:r>
+    </w:p>
+    <w:p>
+      <w:pPr>
         <w:pStyle w:val="ListBullet"/>
       </w:pPr>
       <w:r>
         <w:rPr>
           <w:b/>
         </w:rPr>
-        <w:t>Trạm dầu Việt Nam ghi nợ, trả nhà cung cấp</w:t>
-      </w:r>
-      <w:r>
-        <w:t xml:space="preserve"> (Vận tải → Theo dõi nhà cung cấp): gắn trạm với khách được cấn trừ; cuối tháng trả trạm (</w:t>
-      </w:r>
-      <w:r>
-        <w:rPr>
-          <w:b/>
-        </w:rPr>
-        <w:t>PC_NCC</w:t>
-      </w:r>
-      <w:r>
-        <w:t>) hoặc cấn trừ vào cước khách.</w:t>
+        <w:t>Thẻ cao tốc</w:t>
+      </w:r>
+      <w:r>
+        <w:t xml:space="preserve"> (Danh mục → Thẻ cao tốc): KT Thu/Chi lập thẻ (của khách hay của EPL), quỹ / kế toán nạp tiền; thẻ trừ đúng một lần lúc ghi sổ mục IV; thẻ của khách cuối tháng cấn trừ vào cước khách đó. Điều chỉnh số dư phải có lý do.</w:t>
+      </w:r>
+    </w:p>
+    <w:p>
+      <w:pPr>
+        <w:pStyle w:val="ListBullet"/>
+      </w:pPr>
+      <w:r>
+        <w:rPr>
+          <w:b/>
+        </w:rPr>
+        <w:t>Danh mục nhà cung cấp</w:t>
+      </w:r>
+      <w:r>
+        <w:t xml:space="preserve"> (Vận tải → Nhà cung cấp): KT Chi phí thêm, sửa, gắn trạm dầu Việt Nam với khách được cấn trừ; Bãi xem danh sách, số dòng, kỳ trả (không có tiền). Trả trạm và cấn trừ vào cước khách làm ở trang kế toán (6.6, bước 18).</w:t>
       </w:r>
     </w:p>
     <w:p>
@@ -13615,7 +14765,7 @@
           <w:p>
             <w:r/>
             <w:r>
-              <w:t>Điều xe</w:t>
+              <w:t>Kế toán (từ đợt 7c)</w:t>
             </w:r>
           </w:p>
         </w:tc>
@@ -13626,7 +14776,7 @@
           <w:p>
             <w:r/>
             <w:r>
-              <w:t>Đẩy</w:t>
+              <w:t>Ngay</w:t>
             </w:r>
           </w:p>
         </w:tc>
@@ -13637,7 +14787,7 @@
           <w:p>
             <w:r/>
             <w:r>
-              <w:t>Chi bù / thu lại</w:t>
+              <w:t>Chi bù: Nợ 625 / Có tiền · nộp lại: Nợ tiền / Có 625</w:t>
             </w:r>
           </w:p>
         </w:tc>
@@ -13683,7 +14833,7 @@
           <w:p>
             <w:r/>
             <w:r>
-              <w:t>Điều xe</w:t>
+              <w:t>Kế toán (từ đợt 7d)</w:t>
             </w:r>
           </w:p>
         </w:tc>
@@ -13694,7 +14844,7 @@
           <w:p>
             <w:r/>
             <w:r>
-              <w:t>Đẩy</w:t>
+              <w:t>Ngay</w:t>
             </w:r>
           </w:p>
         </w:tc>
@@ -14312,7 +15462,7 @@
           <w:p>
             <w:r/>
             <w:r>
-              <w:t>Công nợ khách, ghi cấn trừ tháng (trang điều xe)</w:t>
+              <w:t>Tiền chuyến &amp; tiền nước, Tất toán tài xế: chốt, bỏ chốt (trang kế toán)</w:t>
             </w:r>
           </w:p>
         </w:tc>
@@ -14323,7 +15473,7 @@
           <w:p>
             <w:r/>
             <w:r>
-              <w:t>Chặn, báo rõ</w:t>
+              <w:t>Chặn, báo rõ; không lưu gì</w:t>
             </w:r>
           </w:p>
         </w:tc>
@@ -14336,7 +15486,79 @@
           <w:p>
             <w:r/>
             <w:r>
-              <w:t>Bảng cấn trừ, phiếu, báo cáo bên điều xe</w:t>
+              <w:t>Theo dõi nhà cung cấp: công nợ, trả, cấn trừ, ghi cấn trừ tháng (trang kế toán)</w:t>
+            </w:r>
+          </w:p>
+        </w:tc>
+        <w:tc>
+          <w:tcPr>
+            <w:tcW w:type="dxa" w:w="4320"/>
+          </w:tcPr>
+          <w:p>
+            <w:r/>
+            <w:r>
+              <w:t>Chặn, báo rõ; không lưu gì</w:t>
+            </w:r>
+          </w:p>
+        </w:tc>
+      </w:tr>
+      <w:tr>
+        <w:tc>
+          <w:tcPr>
+            <w:tcW w:type="dxa" w:w="4320"/>
+          </w:tcPr>
+          <w:p>
+            <w:r/>
+            <w:r>
+              <w:t>Danh mục nhà cung cấp (trang điều xe)</w:t>
+            </w:r>
+          </w:p>
+        </w:tc>
+        <w:tc>
+          <w:tcPr>
+            <w:tcW w:type="dxa" w:w="4320"/>
+          </w:tcPr>
+          <w:p>
+            <w:r/>
+            <w:r>
+              <w:t>Vẫn mở — không cần trang kế toán</w:t>
+            </w:r>
+          </w:p>
+        </w:tc>
+      </w:tr>
+      <w:tr>
+        <w:tc>
+          <w:tcPr>
+            <w:tcW w:type="dxa" w:w="4320"/>
+          </w:tcPr>
+          <w:p>
+            <w:r/>
+            <w:r>
+              <w:t>Công nợ khách (trang điều xe → Khách hàng)</w:t>
+            </w:r>
+          </w:p>
+        </w:tc>
+        <w:tc>
+          <w:tcPr>
+            <w:tcW w:type="dxa" w:w="4320"/>
+          </w:tcPr>
+          <w:p>
+            <w:r/>
+            <w:r>
+              <w:t>Chặn, báo rõ</w:t>
+            </w:r>
+          </w:p>
+        </w:tc>
+      </w:tr>
+      <w:tr>
+        <w:tc>
+          <w:tcPr>
+            <w:tcW w:type="dxa" w:w="4320"/>
+          </w:tcPr>
+          <w:p>
+            <w:r/>
+            <w:r>
+              <w:t>Phiếu, báo cáo bên điều xe</w:t>
             </w:r>
           </w:p>
         </w:tc>
@@ -14386,7 +15608,7 @@
         <w:rPr>
           <w:color w:val="145C4A"/>
         </w:rPr>
-        <w:t>9. Đã dời những gì, và đợt 7 sẽ dời gì</w:t>
+        <w:t>9. Đã dời những gì, cái gì ở lại</w:t>
       </w:r>
     </w:p>
     <w:tbl>
@@ -14771,6 +15993,76 @@
           </w:p>
         </w:tc>
       </w:tr>
+      <w:tr>
+        <w:tc>
+          <w:tcPr>
+            <w:tcW w:type="dxa" w:w="2880"/>
+          </w:tcPr>
+          <w:p>
+            <w:r/>
+            <w:r>
+              <w:t>7c</w:t>
+            </w:r>
+          </w:p>
+        </w:tc>
+        <w:tc>
+          <w:tcPr>
+            <w:tcW w:type="dxa" w:w="2880"/>
+          </w:tcPr>
+          <w:p>
+            <w:r/>
+            <w:r>
+              <w:t>Tiền chuyến &amp; tiền nước tài xế; Tất toán tài xế (chốt, bỏ chốt)</w:t>
+            </w:r>
+          </w:p>
+        </w:tc>
+        <w:tc>
+          <w:tcPr>
+            <w:tcW w:type="dxa" w:w="2880"/>
+          </w:tcPr>
+          <w:p>
+            <w:r/>
+            <w:r>
+              <w:t>Bản chốt tất toán ở kế toán (cùng mã); số tính từ phiếu bên điều xe</w:t>
+            </w:r>
+          </w:p>
+        </w:tc>
+      </w:tr>
+      <w:tr>
+        <w:tc>
+          <w:tcPr>
+            <w:tcW w:type="dxa" w:w="2880"/>
+          </w:tcPr>
+          <w:p>
+            <w:r/>
+            <w:r>
+              <w:t>7d</w:t>
+            </w:r>
+          </w:p>
+        </w:tc>
+        <w:tc>
+          <w:tcPr>
+            <w:tcW w:type="dxa" w:w="2880"/>
+          </w:tcPr>
+          <w:p>
+            <w:r/>
+            <w:r>
+              <w:t>Theo dõi nhà cung cấp: công nợ, trả nhà cung cấp, cấn trừ cuối tháng</w:t>
+            </w:r>
+          </w:p>
+        </w:tc>
+        <w:tc>
+          <w:tcPr>
+            <w:tcW w:type="dxa" w:w="2880"/>
+          </w:tcPr>
+          <w:p>
+            <w:r/>
+            <w:r>
+              <w:t>Các lần trả ở kế toán (cùng mã); phát sinh tính từ phiếu, danh mục nhà cung cấp ở lại điều xe</w:t>
+            </w:r>
+          </w:p>
+        </w:tc>
+      </w:tr>
     </w:tbl>
     <w:p/>
     <w:p>
@@ -14781,10 +16073,37 @@
         <w:rPr>
           <w:b/>
         </w:rPr>
-        <w:t>Phần còn lại của đợt 7:</w:t>
-      </w:r>
-      <w:r>
-        <w:t xml:space="preserve"> 7c Tiền chuyến &amp; tiền nước tài xế và Tất toán tài xế, 7d Theo dõi nhà cung cấp — dời sang trang kế toán, dữ liệu dời hẳn. Khi đó bước 20–21 của Phần 4 cũng làm ở trang kế toán; tài liệu này sẽ cập nhật lại.</w:t>
+        <w:t>Đợt 7 xong (7e dọn cuối):</w:t>
+      </w:r>
+      <w:r>
+        <w:t xml:space="preserve"> mọi màn kho và tiền đã ở trang kế toán. </w:t>
+      </w:r>
+      <w:r>
+        <w:rPr>
+          <w:b/>
+        </w:rPr>
+        <w:t>Ở lại trang điều xe</w:t>
+      </w:r>
+      <w:r>
+        <w:t xml:space="preserve"> đúng như anh chốt: kiểm và duyệt từng mục ngay trên phiếu xuất xe; in phiếu chi tạm ứng, phiếu lĩnh; </w:t>
+      </w:r>
+      <w:r>
+        <w:rPr>
+          <w:b/>
+        </w:rPr>
+        <w:t>Sổ chứng từ</w:t>
+      </w:r>
+      <w:r>
+        <w:t xml:space="preserve"> và nút đẩy sang sổ; danh mục khách hàng (bảng giá khách × tuyến), chủ xe (điều khoản), nhà cung cấp; hợp đồng thuê xe; thẻ cao tốc; tỷ giá. Các con số tiền mà trang kế toán hiện (phát sinh nhà cung cấp, tất toán, trả chủ xe, cước) vẫn </w:t>
+      </w:r>
+      <w:r>
+        <w:rPr>
+          <w:b/>
+        </w:rPr>
+        <w:t>tính từ phiếu</w:t>
+      </w:r>
+      <w:r>
+        <w:t xml:space="preserve"> bên điều xe — hai trang không giữ hai bản số.</w:t>
       </w:r>
     </w:p>
     <w:p>

</xml_diff>

<commit_message>
Thêm xe · rơ-moóc · tài xế mẫu qua API (tools/them_xe_tai_xe.py)
- 12 đầu kéo xe nhà 343–354, 2 xe liên kết ຮ່ວມ-08, ຮ່ວມ-09, 18 rơ-moóc (14 cái lắp
  vào xe mới, 4 cái để rời, 1 đang sửa), 14 tài xế có bằng lái và xe thường lái.
- Đi qua API của trang điều xe (máy chủ kiểm như nhập tay); cái đã có thì bỏ qua,
  chạy thử mặc định, 'that' mới ghi. Vài giấy tờ cố ý sắp / đã hết hạn để thử cờ.
- Tài liệu luồng A → Z mục 10.0: kể dữ liệu mẫu mới.

Co-Authored-By: Claude Opus 5.5 (1M context) <noreply@anthropic.com>
</commit_message>
<xml_diff>
--- a/DOCS/word/LUONG_A_Z_HAI_TRANG.docx
+++ b/DOCS/word/LUONG_A_Z_HAI_TRANG.docx
@@ -17303,7 +17303,16 @@
         <w:t>342</w:t>
       </w:r>
       <w:r>
-        <w:t xml:space="preserve">; xe liên kết </w:t>
+        <w:t xml:space="preserve"> và 12 đầu kéo thêm ngày 29/09 </w:t>
+      </w:r>
+      <w:r>
+        <w:rPr>
+          <w:b/>
+        </w:rPr>
+        <w:t>343–354</w:t>
+      </w:r>
+      <w:r>
+        <w:t xml:space="preserve"> (HOWO, SHACMAN, SITRAK, FAW — mỗi xe đã lắp một rơ-moóc, có tài xế thường lái DRV-03 … DRV-14); xe liên kết </w:t>
       </w:r>
       <w:r>
         <w:rPr>
@@ -17312,6 +17321,24 @@
         <w:t>ຮ່ວມ-07</w:t>
       </w:r>
       <w:r>
+        <w:t xml:space="preserve">, </w:t>
+      </w:r>
+      <w:r>
+        <w:rPr>
+          <w:b/>
+        </w:rPr>
+        <w:t>ຮ່ວມ-08</w:t>
+      </w:r>
+      <w:r>
+        <w:t xml:space="preserve">, </w:t>
+      </w:r>
+      <w:r>
+        <w:rPr>
+          <w:b/>
+        </w:rPr>
+        <w:t>ຮ່ວມ-09</w:t>
+      </w:r>
+      <w:r>
         <w:t xml:space="preserve"> (chủ xe </w:t>
       </w:r>
       <w:r>
@@ -17330,7 +17357,61 @@
         <w:t>Gộp cuối tháng</w:t>
       </w:r>
       <w:r>
-        <w:t xml:space="preserve">, thuê bằng LAK); khách </w:t>
+        <w:t xml:space="preserve">, thuê bằng LAK; tài xế DRV-LK-01 … 03); 4 rơ-moóc để rời </w:t>
+      </w:r>
+      <w:r>
+        <w:rPr>
+          <w:b/>
+        </w:rPr>
+        <w:t>ບອ 3501</w:t>
+      </w:r>
+      <w:r>
+        <w:t xml:space="preserve">, </w:t>
+      </w:r>
+      <w:r>
+        <w:rPr>
+          <w:b/>
+        </w:rPr>
+        <w:t>ບອ 3502</w:t>
+      </w:r>
+      <w:r>
+        <w:t xml:space="preserve">, </w:t>
+      </w:r>
+      <w:r>
+        <w:rPr>
+          <w:b/>
+        </w:rPr>
+        <w:t>ນວ 5620</w:t>
+      </w:r>
+      <w:r>
+        <w:t xml:space="preserve"> và </w:t>
+      </w:r>
+      <w:r>
+        <w:rPr>
+          <w:b/>
+        </w:rPr>
+        <w:t>ບອ 3503</w:t>
+      </w:r>
+      <w:r>
+        <w:t xml:space="preserve"> (</w:t>
+      </w:r>
+      <w:r>
+        <w:rPr>
+          <w:i/>
+        </w:rPr>
+        <w:t>đang sửa</w:t>
+      </w:r>
+      <w:r>
+        <w:t xml:space="preserve">) để thử tháo / lắp rơ-moóc ở màn </w:t>
+      </w:r>
+      <w:r>
+        <w:rPr>
+          <w:b/>
+        </w:rPr>
+        <w:t>Xe</w:t>
+      </w:r>
+      <w:r>
+        <w:t xml:space="preserve">; vài giấy tờ cố ý sắp hết hạn hay đã hết hạn (bảo hiểm xe 346, đăng kiểm xe 344, bằng lái DRV-06 sắp hết, DRV-09 đã hết) để thử cờ cảnh báo; khách </w:t>
       </w:r>
       <w:r>
         <w:rPr>

</xml_diff>

<commit_message>
Ngày xe về, km về chỉ điền khi xe về (chủ dự án duyệt 29/09)
- Màn phiếu: trước khi xe tới, ô Ngày xe về và Lúc về chỉ xem, có dòng nhỏ
  "Điền khi xe về: Báo đã về · Xe đã tới"; xe tới rồi thì sửa được như mọi ô mục I.
- Máy chủ: nút Lưu gửi giá trị mới cho hai ô khi xe chưa về → 409 CHUA_VE; hai đường
  Báo đã về và Xe đã tới · nhập cân cuối ghi như cũ.
- thu_luong_api thêm ca chặn; tài liệu A → Z bước 1, 12 và ca T01, T12.

Co-Authored-By: Claude Opus 5.5 (1M context) <noreply@anthropic.com>
</commit_message>
<xml_diff>
--- a/DOCS/word/LUONG_A_Z_HAI_TRANG.docx
+++ b/DOCS/word/LUONG_A_Z_HAI_TRANG.docx
@@ -5904,7 +5904,52 @@
         <w:t>Km về ước tính</w:t>
       </w:r>
       <w:r>
-        <w:t xml:space="preserve"> tự tính theo tuyến.</w:t>
+        <w:t xml:space="preserve"> tự tính theo tuyến. Hai ô </w:t>
+      </w:r>
+      <w:r>
+        <w:rPr>
+          <w:b/>
+        </w:rPr>
+        <w:t>Ngày xe về</w:t>
+      </w:r>
+      <w:r>
+        <w:t xml:space="preserve"> và </w:t>
+      </w:r>
+      <w:r>
+        <w:rPr>
+          <w:b/>
+        </w:rPr>
+        <w:t>Lúc về</w:t>
+      </w:r>
+      <w:r>
+        <w:t xml:space="preserve"> để xám, dưới ô ghi </w:t>
+      </w:r>
+      <w:r>
+        <w:rPr>
+          <w:i/>
+        </w:rPr>
+        <w:t>Điền khi xe về: Báo đã về · Xe đã tới</w:t>
+      </w:r>
+      <w:r>
+        <w:t xml:space="preserve"> — chúng có số ở bước 10–12, khi tài xế bấm </w:t>
+      </w:r>
+      <w:r>
+        <w:rPr>
+          <w:b/>
+        </w:rPr>
+        <w:t>Báo đã về</w:t>
+      </w:r>
+      <w:r>
+        <w:t xml:space="preserve"> hoặc Bãi bấm </w:t>
+      </w:r>
+      <w:r>
+        <w:rPr>
+          <w:b/>
+        </w:rPr>
+        <w:t>Xe đã tới · nhập cân cuối</w:t>
+      </w:r>
+      <w:r>
+        <w:t>.</w:t>
       </w:r>
     </w:p>
     <w:p>
@@ -6115,7 +6160,7 @@
         <w:t>Máy chặn:</w:t>
       </w:r>
       <w:r>
-        <w:t xml:space="preserve"> Bãi không nhập được giá cước, giá thuê xe, phí, ngưỡng tấn, số phiếu quặng.</w:t>
+        <w:t xml:space="preserve"> Bãi không nhập được giá cước, giá thuê xe, phí, ngưỡng tấn, số phiếu quặng; chưa ai nhập được ngày xe về, km về trước khi xe về.</w:t>
       </w:r>
     </w:p>
     <w:p>
@@ -8685,7 +8730,34 @@
         <w:t>Máy chặn:</w:t>
       </w:r>
       <w:r>
-        <w:t xml:space="preserve"> chưa nhận tạm ứng thì không báo tới được; </w:t>
+        <w:t xml:space="preserve"> trước bước này, ô </w:t>
+      </w:r>
+      <w:r>
+        <w:rPr>
+          <w:b/>
+        </w:rPr>
+        <w:t>Ngày xe về</w:t>
+      </w:r>
+      <w:r>
+        <w:t xml:space="preserve">, </w:t>
+      </w:r>
+      <w:r>
+        <w:rPr>
+          <w:b/>
+        </w:rPr>
+        <w:t>Lúc về</w:t>
+      </w:r>
+      <w:r>
+        <w:t xml:space="preserve"> trên phiếu chỉ xem (nút </w:t>
+      </w:r>
+      <w:r>
+        <w:rPr>
+          <w:b/>
+        </w:rPr>
+        <w:t>Lưu</w:t>
+      </w:r>
+      <w:r>
+        <w:t xml:space="preserve"> không ghi được) — xe đã tới rồi thì Bãi sửa được như mọi ô mục I; chưa nhận tạm ứng thì không báo tới được; </w:t>
       </w:r>
       <w:r>
         <w:rPr>
@@ -17870,7 +17942,31 @@
               <w:t>không thấy</w:t>
             </w:r>
             <w:r>
-              <w:t xml:space="preserve"> ô giá cước, giá thuê, tỷ giá</w:t>
+              <w:t xml:space="preserve"> ô giá cước, giá thuê, tỷ giá; ô </w:t>
+            </w:r>
+            <w:r>
+              <w:rPr>
+                <w:b/>
+              </w:rPr>
+              <w:t>Ngày xe về</w:t>
+            </w:r>
+            <w:r>
+              <w:t xml:space="preserve">, </w:t>
+            </w:r>
+            <w:r>
+              <w:rPr>
+                <w:b/>
+              </w:rPr>
+              <w:t>Lúc về</w:t>
+            </w:r>
+            <w:r>
+              <w:t xml:space="preserve"> xám, ghi </w:t>
+            </w:r>
+            <w:r>
+              <w:rPr>
+                <w:i/>
+              </w:rPr>
+              <w:t>Điền khi xe về</w:t>
             </w:r>
           </w:p>
         </w:tc>
@@ -19076,7 +19172,34 @@
           <w:p>
             <w:r/>
             <w:r>
-              <w:t xml:space="preserve">Tự có dòng hao hụt 0,4 t; trang kế toán </w:t>
+              <w:t xml:space="preserve">Tự có dòng hao hụt 0,4 t; ô </w:t>
+            </w:r>
+            <w:r>
+              <w:rPr>
+                <w:b/>
+              </w:rPr>
+              <w:t>Ngày xe về</w:t>
+            </w:r>
+            <w:r>
+              <w:t xml:space="preserve">, </w:t>
+            </w:r>
+            <w:r>
+              <w:rPr>
+                <w:b/>
+              </w:rPr>
+              <w:t>Lúc về</w:t>
+            </w:r>
+            <w:r>
+              <w:t xml:space="preserve">, </w:t>
+            </w:r>
+            <w:r>
+              <w:rPr>
+                <w:b/>
+              </w:rPr>
+              <w:t>Km chạy</w:t>
+            </w:r>
+            <w:r>
+              <w:t xml:space="preserve"> trên phiếu có số và từ giờ sửa được; trang kế toán </w:t>
             </w:r>
             <w:r>
               <w:rPr>

</xml_diff>

<commit_message>
Tài liệu A → Z bước 1, ca T01: bấm sang thẻ mục II rồi mới Lưu; nút Lưu ở góc trên phải
Co-Authored-By: Claude Opus 5.5 (1M context) <noreply@anthropic.com>
</commit_message>
<xml_diff>
--- a/DOCS/word/LUONG_A_Z_HAI_TRANG.docx
+++ b/DOCS/word/LUONG_A_Z_HAI_TRANG.docx
@@ -5957,16 +5957,25 @@
         <w:pStyle w:val="ListNumber"/>
       </w:pPr>
       <w:r>
-        <w:t xml:space="preserve">Mục II — </w:t>
-      </w:r>
-      <w:r>
-        <w:rPr>
-          <w:b/>
-        </w:rPr>
-        <w:t>Thông tin vận chuyển &amp; doanh thu</w:t>
-      </w:r>
-      <w:r>
-        <w:t xml:space="preserve">: </w:t>
+        <w:t xml:space="preserve">Bấm thẻ </w:t>
+      </w:r>
+      <w:r>
+        <w:rPr>
+          <w:b/>
+        </w:rPr>
+        <w:t>II · Thông tin vận chuyển &amp; doanh thu</w:t>
+      </w:r>
+      <w:r>
+        <w:t xml:space="preserve"> trên thanh thẻ mục (mỗi mục một thẻ; </w:t>
+      </w:r>
+      <w:r>
+        <w:rPr>
+          <w:b/>
+        </w:rPr>
+        <w:t>Toàn phiếu</w:t>
+      </w:r>
+      <w:r>
+        <w:t xml:space="preserve"> ở cuối thanh thì hiện cả 6 mục một trang): </w:t>
       </w:r>
       <w:r>
         <w:rPr>
@@ -6086,13 +6095,40 @@
         <w:t>Lưu</w:t>
       </w:r>
       <w:r>
-        <w:t xml:space="preserve">. Máy báo </w:t>
+        <w:t xml:space="preserve"> (nút xanh góc trên bên phải). Máy báo </w:t>
       </w:r>
       <w:r>
         <w:rPr>
           <w:i/>
         </w:rPr>
         <w:t>Đã lưu</w:t>
+      </w:r>
+      <w:r>
+        <w:t xml:space="preserve">; dòng </w:t>
+      </w:r>
+      <w:r>
+        <w:rPr>
+          <w:i/>
+        </w:rPr>
+        <w:t>Trạng thái phiếu</w:t>
+      </w:r>
+      <w:r>
+        <w:t xml:space="preserve"> dưới cùng không còn ghi </w:t>
+      </w:r>
+      <w:r>
+        <w:rPr>
+          <w:i/>
+        </w:rPr>
+        <w:t>Phiếu mới</w:t>
+      </w:r>
+      <w:r>
+        <w:t xml:space="preserve">, đầu mỗi mục hiện nút </w:t>
+      </w:r>
+      <w:r>
+        <w:rPr>
+          <w:b/>
+        </w:rPr>
+        <w:t>Gửi kiểm tra</w:t>
       </w:r>
       <w:r>
         <w:t>.</w:t>
@@ -17851,7 +17887,16 @@
               <w:t>Phiếu mới</w:t>
             </w:r>
             <w:r>
-              <w:t xml:space="preserve"> → Loại </w:t>
+              <w:t xml:space="preserve"> → thẻ </w:t>
+            </w:r>
+            <w:r>
+              <w:rPr>
+                <w:b/>
+              </w:rPr>
+              <w:t>I</w:t>
+            </w:r>
+            <w:r>
+              <w:t xml:space="preserve">: Loại </w:t>
             </w:r>
             <w:r>
               <w:rPr>
@@ -17870,12 +17915,21 @@
               <w:t>tx01</w:t>
             </w:r>
             <w:r>
-              <w:t xml:space="preserve">, tuyến ກາສີ → ກາລໍ, khách ຄຳຕຸ້ຍ, </w:t>
+              <w:t xml:space="preserve"> → thẻ </w:t>
             </w:r>
             <w:r>
               <w:rPr>
                 <w:b/>
               </w:rPr>
+              <w:t>II</w:t>
+            </w:r>
+            <w:r>
+              <w:t xml:space="preserve">: tuyến ກາສີ → ກາລໍ, khách ຄຳຕຸ້ຍ, </w:t>
+            </w:r>
+            <w:r>
+              <w:rPr>
+                <w:b/>
+              </w:rPr>
               <w:t>Cân đầu (tấn)</w:t>
             </w:r>
             <w:r>
@@ -17904,6 +17958,9 @@
                 <w:b/>
               </w:rPr>
               <w:t>Lưu</w:t>
+            </w:r>
+            <w:r>
+              <w:t xml:space="preserve"> (nút xanh góc trên phải)</w:t>
             </w:r>
           </w:p>
         </w:tc>

</xml_diff>

<commit_message>
Phiếu mới: ô Hợp đồng vận chuyển nói "Lưu phiếu rồi số hợp đồng còn hạn tự điền" thay cho "—"
- Hai ô hợp đồng (khách, thuê xe liên kết) trên phiếu chưa lưu hiện dòng nhắc; lưu xong
  vẫn như cũ (số hợp đồng còn hạn, hoặc "Chưa có hợp đồng").
- Tài liệu A → Z bước 1: hợp đồng lấy từ Danh mục → Khách hàng; số phiếu quặng kế toán gõ ở bước 5.

Co-Authored-By: Claude Opus 5.5 (1M context) <noreply@anthropic.com>
</commit_message>
<xml_diff>
--- a/DOCS/word/LUONG_A_Z_HAI_TRANG.docx
+++ b/DOCS/word/LUONG_A_Z_HAI_TRANG.docx
@@ -6011,7 +6011,61 @@
         <w:t>Cân đầu (tấn)</w:t>
       </w:r>
       <w:r>
-        <w:t xml:space="preserve"> 40 theo phiếu cân ở mỏ.</w:t>
+        <w:t xml:space="preserve"> 40 theo phiếu cân ở mỏ. Ô </w:t>
+      </w:r>
+      <w:r>
+        <w:rPr>
+          <w:b/>
+        </w:rPr>
+        <w:t>Hợp đồng vận chuyển</w:t>
+      </w:r>
+      <w:r>
+        <w:t xml:space="preserve"> ghi </w:t>
+      </w:r>
+      <w:r>
+        <w:rPr>
+          <w:i/>
+        </w:rPr>
+        <w:t>Lưu phiếu rồi số hợp đồng còn hạn tự điền</w:t>
+      </w:r>
+      <w:r>
+        <w:t xml:space="preserve"> — lưu xong máy điền hợp đồng còn hạn của khách lấy ở </w:t>
+      </w:r>
+      <w:r>
+        <w:rPr>
+          <w:b/>
+        </w:rPr>
+        <w:t>Danh mục → Khách hàng</w:t>
+      </w:r>
+      <w:r>
+        <w:t xml:space="preserve"> (ví dụ ຄຳຕຸ້ຍ → HDVC-2026-001), khách chưa có thì ghi </w:t>
+      </w:r>
+      <w:r>
+        <w:rPr>
+          <w:i/>
+        </w:rPr>
+        <w:t>Chưa có hợp đồng</w:t>
+      </w:r>
+      <w:r>
+        <w:t xml:space="preserve">; Bãi chỉ xem, kế toán đổi được khi kiểm mục II. Ô </w:t>
+      </w:r>
+      <w:r>
+        <w:rPr>
+          <w:b/>
+        </w:rPr>
+        <w:t>Số phiếu quặng</w:t>
+      </w:r>
+      <w:r>
+        <w:t xml:space="preserve">, </w:t>
+      </w:r>
+      <w:r>
+        <w:rPr>
+          <w:b/>
+        </w:rPr>
+        <w:t>Ngày phiếu quặng</w:t>
+      </w:r>
+      <w:r>
+        <w:t xml:space="preserve"> xám — kế toán gõ ở bước 5.</w:t>
       </w:r>
     </w:p>
     <w:p>

</xml_diff>

<commit_message>
Phiếu Gom: hàng và cân mỏ ghi khi bốc xong; cân cuối chỉ điền khi xe tới (chủ dự án duyệt 29/09)
- Cân cuối (Gom: cân tại bãi khi về · Giao: cân tại nơi giao) trước khi xe tới chỉ xem,
  dòng nhỏ "Điền khi xe tới: Xe đã tới · nhập cân cuối"; máy chủ không nhận qua nút Lưu
  (409 CHUA_VE). Xe tới rồi thì sửa được như cũ.
- Dòng nhắc Hàng trên phiếu (Gom): bốc xong ở mỏ mới ghi, theo phiếu quặng; ghi xong mới
  Gửi kiểm tra mục II.
- Tài liệu A → Z: bước 1, 4, 5 và bước mới 10b (xe bốc xong ở mỏ — ghi hàng, cân mỏ,
  gửi kiểm mục II); ca T01, T04, T05, thêm T10b (54 ca).
- thu_luong_api thêm ca chặn cân cuối trước khi xe tới.

Co-Authored-By: Claude Opus 5.5 (1M context) <noreply@anthropic.com>
</commit_message>
<xml_diff>
--- a/DOCS/word/LUONG_A_Z_HAI_TRANG.docx
+++ b/DOCS/word/LUONG_A_Z_HAI_TRANG.docx
@@ -306,7 +306,7 @@
         <w:t>10.</w:t>
       </w:r>
       <w:r>
-        <w:t xml:space="preserve"> Kịch bản test tay: chuẩn bị, rồi 53 ca theo thứ tự luồng</w:t>
+        <w:t xml:space="preserve"> Kịch bản test tay: chuẩn bị, rồi 54 ca theo thứ tự luồng</w:t>
       </w:r>
     </w:p>
     <w:p>
@@ -6002,16 +6002,43 @@
         <w:t>Loại hàng</w:t>
       </w:r>
       <w:r>
-        <w:t xml:space="preserve"> Quặng sắt; </w:t>
-      </w:r>
-      <w:r>
-        <w:rPr>
-          <w:b/>
-        </w:rPr>
-        <w:t>Cân đầu (tấn)</w:t>
-      </w:r>
-      <w:r>
-        <w:t xml:space="preserve"> 40 theo phiếu cân ở mỏ. Ô </w:t>
+        <w:t xml:space="preserve"> Quặng sắt. Phiếu </w:t>
+      </w:r>
+      <w:r>
+        <w:rPr>
+          <w:b/>
+        </w:rPr>
+        <w:t>Gom</w:t>
+      </w:r>
+      <w:r>
+        <w:t xml:space="preserve"> lúc lập </w:t>
+      </w:r>
+      <w:r>
+        <w:rPr>
+          <w:b/>
+        </w:rPr>
+        <w:t>chưa ghi hàng và cân</w:t>
+      </w:r>
+      <w:r>
+        <w:t xml:space="preserve"> — xe chưa đi thì chưa có số (tờ Excel của họ cũng để trống hai dòng cân lúc lập); ô </w:t>
+      </w:r>
+      <w:r>
+        <w:rPr>
+          <w:b/>
+        </w:rPr>
+        <w:t>Cân tại bãi khi về</w:t>
+      </w:r>
+      <w:r>
+        <w:t xml:space="preserve"> xám, ghi </w:t>
+      </w:r>
+      <w:r>
+        <w:rPr>
+          <w:i/>
+        </w:rPr>
+        <w:t>Điền khi xe tới: Xe đã tới · nhập cân cuối</w:t>
+      </w:r>
+      <w:r>
+        <w:t xml:space="preserve">. Ô </w:t>
       </w:r>
       <w:r>
         <w:rPr>
@@ -6082,34 +6109,34 @@
         <w:t>Hàng trên phiếu</w:t>
       </w:r>
       <w:r>
-        <w:t xml:space="preserve"> → </w:t>
-      </w:r>
-      <w:r>
-        <w:rPr>
-          <w:b/>
-        </w:rPr>
-        <w:t>Thêm dòng</w:t>
-      </w:r>
-      <w:r>
-        <w:t xml:space="preserve">: </w:t>
-      </w:r>
-      <w:r>
-        <w:rPr>
-          <w:b/>
-        </w:rPr>
-        <w:t>Mặt hàng</w:t>
-      </w:r>
-      <w:r>
-        <w:t xml:space="preserve"> ແຮ່ເຫຼັກ (quặng sắt), </w:t>
-      </w:r>
-      <w:r>
-        <w:rPr>
-          <w:b/>
-        </w:rPr>
-        <w:t>Số tấn</w:t>
-      </w:r>
-      <w:r>
-        <w:t xml:space="preserve"> 40.</w:t>
+        <w:t xml:space="preserve">: phiếu </w:t>
+      </w:r>
+      <w:r>
+        <w:rPr>
+          <w:b/>
+        </w:rPr>
+        <w:t>Gom</w:t>
+      </w:r>
+      <w:r>
+        <w:t xml:space="preserve"> để trống lúc lập — </w:t>
+      </w:r>
+      <w:r>
+        <w:rPr>
+          <w:b/>
+        </w:rPr>
+        <w:t>bốc xong ở mỏ</w:t>
+      </w:r>
+      <w:r>
+        <w:t xml:space="preserve"> mới ghi (bước 10b), dòng nhắc dưới khung nói đúng vậy. Phiếu </w:t>
+      </w:r>
+      <w:r>
+        <w:rPr>
+          <w:b/>
+        </w:rPr>
+        <w:t>Giao</w:t>
+      </w:r>
+      <w:r>
+        <w:t xml:space="preserve"> thì ghi ngay, vì hàng lấy từ lô trong bãi đã biết số tấn (bước 14).</w:t>
       </w:r>
     </w:p>
     <w:p>
@@ -6250,7 +6277,7 @@
         <w:t>Máy chặn:</w:t>
       </w:r>
       <w:r>
-        <w:t xml:space="preserve"> Bãi không nhập được giá cước, giá thuê xe, phí, ngưỡng tấn, số phiếu quặng; chưa ai nhập được ngày xe về, km về trước khi xe về.</w:t>
+        <w:t xml:space="preserve"> Bãi không nhập được giá cước, giá thuê xe, phí, ngưỡng tấn, số phiếu quặng; chưa ai nhập được ngày xe về, km về, cân cuối trước khi xe về.</w:t>
       </w:r>
     </w:p>
     <w:p>
@@ -6906,7 +6933,16 @@
         <w:t>Thao tác:</w:t>
       </w:r>
       <w:r>
-        <w:t xml:space="preserve"> ở đầu mỗi mục I, II, III, IV, VI bấm </w:t>
+        <w:t xml:space="preserve"> trước khi xe đi, ở đầu mỗi mục </w:t>
+      </w:r>
+      <w:r>
+        <w:rPr>
+          <w:b/>
+        </w:rPr>
+        <w:t>I, III, IV, VI</w:t>
+      </w:r>
+      <w:r>
+        <w:t xml:space="preserve"> bấm </w:t>
       </w:r>
       <w:r>
         <w:rPr>
@@ -6915,7 +6951,34 @@
         <w:t>Gửi kiểm tra</w:t>
       </w:r>
       <w:r>
-        <w:t>. Mục V là của tổ sửa chữa. Mục trống không có nút.</w:t>
+        <w:t xml:space="preserve"> — đủ để kế toán duyệt dầu và tạm ứng. </w:t>
+      </w:r>
+      <w:r>
+        <w:rPr>
+          <w:b/>
+        </w:rPr>
+        <w:t>Mục II</w:t>
+      </w:r>
+      <w:r>
+        <w:t xml:space="preserve"> của phiếu </w:t>
+      </w:r>
+      <w:r>
+        <w:rPr>
+          <w:b/>
+        </w:rPr>
+        <w:t>Gom</w:t>
+      </w:r>
+      <w:r>
+        <w:t xml:space="preserve"> gửi sau, khi đã ghi hàng và cân tại mỏ (bước 10b); phiếu </w:t>
+      </w:r>
+      <w:r>
+        <w:rPr>
+          <w:b/>
+        </w:rPr>
+        <w:t>Giao</w:t>
+      </w:r>
+      <w:r>
+        <w:t xml:space="preserve"> thì gửi luôn mục II vì hàng lấy từ lô đã có số tấn. Mục V là của tổ sửa chữa. Mục trống không có nút.</w:t>
       </w:r>
     </w:p>
     <w:p>
@@ -7168,7 +7231,7 @@
         <w:t>Xác nhận kiểm tra</w:t>
       </w:r>
       <w:r>
-        <w:t xml:space="preserve"> ở mục I và mục II. Sai thì bấm </w:t>
+        <w:t xml:space="preserve"> ở mục I (trước khi xe đi) và mục II (khi Bãi đã gửi mục II — phiếu gom là sau bước 10b, thường lúc có tờ phiếu quặng). Sai thì bấm </w:t>
       </w:r>
       <w:r>
         <w:rPr>
@@ -8319,6 +8382,267 @@
       </w:r>
       <w:r>
         <w:t>; vị trí xe hiện trên bản đồ Theo dõi tuyến.</w:t>
+      </w:r>
+    </w:p>
+    <w:p>
+      <w:pPr>
+        <w:pStyle w:val="Heading2"/>
+      </w:pPr>
+      <w:r>
+        <w:t>Bước 10b. Xe bốc xong ở mỏ — ghi hàng, cân tại mỏ, gửi kiểm mục II (phiếu GOM)</w:t>
+      </w:r>
+    </w:p>
+    <w:p>
+      <w:pPr>
+        <w:jc w:val="both"/>
+      </w:pPr>
+      <w:r>
+        <w:rPr>
+          <w:b/>
+        </w:rPr>
+        <w:t>Ai:</w:t>
+      </w:r>
+      <w:r>
+        <w:t xml:space="preserve"> Admin Thà Bốc — tài xế gọi về báo số tấn theo phiếu cân ở mỏ, hoặc mang tờ phiếu quặng về. </w:t>
+      </w:r>
+      <w:r>
+        <w:rPr>
+          <w:b/>
+        </w:rPr>
+        <w:t>Trang:</w:t>
+      </w:r>
+      <w:r>
+        <w:t xml:space="preserve"> điều xe. </w:t>
+      </w:r>
+      <w:r>
+        <w:rPr>
+          <w:b/>
+        </w:rPr>
+        <w:t>Màn:</w:t>
+      </w:r>
+      <w:r>
+        <w:t xml:space="preserve"> Phiếu xuất xe → thẻ </w:t>
+      </w:r>
+      <w:r>
+        <w:rPr>
+          <w:b/>
+        </w:rPr>
+        <w:t>II · Thông tin vận chuyển &amp; doanh thu</w:t>
+      </w:r>
+      <w:r>
+        <w:t>.</w:t>
+      </w:r>
+    </w:p>
+    <w:p>
+      <w:pPr>
+        <w:jc w:val="both"/>
+      </w:pPr>
+      <w:r>
+        <w:rPr>
+          <w:b/>
+        </w:rPr>
+        <w:t>Thao tác:</w:t>
+      </w:r>
+    </w:p>
+    <w:p>
+      <w:pPr>
+        <w:pStyle w:val="ListNumber"/>
+      </w:pPr>
+      <w:r>
+        <w:t xml:space="preserve">Khung </w:t>
+      </w:r>
+      <w:r>
+        <w:rPr>
+          <w:b/>
+        </w:rPr>
+        <w:t>Hàng trên phiếu</w:t>
+      </w:r>
+      <w:r>
+        <w:t xml:space="preserve"> → </w:t>
+      </w:r>
+      <w:r>
+        <w:rPr>
+          <w:b/>
+        </w:rPr>
+        <w:t>Thêm dòng</w:t>
+      </w:r>
+      <w:r>
+        <w:t xml:space="preserve">: </w:t>
+      </w:r>
+      <w:r>
+        <w:rPr>
+          <w:b/>
+        </w:rPr>
+        <w:t>Mặt hàng</w:t>
+      </w:r>
+      <w:r>
+        <w:t xml:space="preserve"> ແຮ່ເຫຼັກ (quặng sắt), </w:t>
+      </w:r>
+      <w:r>
+        <w:rPr>
+          <w:b/>
+        </w:rPr>
+        <w:t>Số tấn</w:t>
+      </w:r>
+      <w:r>
+        <w:t xml:space="preserve"> 40 (theo phiếu cân ở mỏ). Ô </w:t>
+      </w:r>
+      <w:r>
+        <w:rPr>
+          <w:b/>
+        </w:rPr>
+        <w:t>Cân tại mỏ (t)</w:t>
+      </w:r>
+      <w:r>
+        <w:t xml:space="preserve"> tự bằng tổng các dòng hàng.</w:t>
+      </w:r>
+    </w:p>
+    <w:p>
+      <w:pPr>
+        <w:pStyle w:val="ListNumber"/>
+      </w:pPr>
+      <w:r>
+        <w:t xml:space="preserve">Có ảnh phiếu quặng thì khung </w:t>
+      </w:r>
+      <w:r>
+        <w:rPr>
+          <w:b/>
+        </w:rPr>
+        <w:t>Phiếu quặng đính kèm</w:t>
+      </w:r>
+      <w:r>
+        <w:t xml:space="preserve"> → </w:t>
+      </w:r>
+      <w:r>
+        <w:rPr>
+          <w:b/>
+        </w:rPr>
+        <w:t>Thêm ảnh · PDF</w:t>
+      </w:r>
+      <w:r>
+        <w:t>. Không có ảnh cũng được — kế toán gõ số phiếu quặng khi nhận giấy.</w:t>
+      </w:r>
+    </w:p>
+    <w:p>
+      <w:pPr>
+        <w:pStyle w:val="ListNumber"/>
+      </w:pPr>
+      <w:r>
+        <w:t xml:space="preserve">Bấm </w:t>
+      </w:r>
+      <w:r>
+        <w:rPr>
+          <w:b/>
+        </w:rPr>
+        <w:t>Lưu</w:t>
+      </w:r>
+      <w:r>
+        <w:t xml:space="preserve">, rồi </w:t>
+      </w:r>
+      <w:r>
+        <w:rPr>
+          <w:b/>
+        </w:rPr>
+        <w:t>Gửi kiểm tra</w:t>
+      </w:r>
+      <w:r>
+        <w:t xml:space="preserve"> ở đầu mục II.</w:t>
+      </w:r>
+    </w:p>
+    <w:p>
+      <w:pPr>
+        <w:jc w:val="both"/>
+      </w:pPr>
+      <w:r>
+        <w:rPr>
+          <w:b/>
+        </w:rPr>
+        <w:t>Máy tự làm:</w:t>
+      </w:r>
+      <w:r>
+        <w:t xml:space="preserve"> cân tại mỏ = tổng tấn các dòng hàng; hàng </w:t>
+      </w:r>
+      <w:r>
+        <w:rPr>
+          <w:b/>
+        </w:rPr>
+        <w:t>chưa vào kho</w:t>
+      </w:r>
+      <w:r>
+        <w:t xml:space="preserve"> — chỉ vào kho bãi khi xe về tới (bước 12).</w:t>
+      </w:r>
+    </w:p>
+    <w:p>
+      <w:pPr>
+        <w:jc w:val="both"/>
+      </w:pPr>
+      <w:r>
+        <w:rPr>
+          <w:b/>
+        </w:rPr>
+        <w:t>Máy chặn:</w:t>
+      </w:r>
+      <w:r>
+        <w:t xml:space="preserve"> mục II đã kiểm thì phải </w:t>
+      </w:r>
+      <w:r>
+        <w:rPr>
+          <w:b/>
+        </w:rPr>
+        <w:t>Trả lại sửa</w:t>
+      </w:r>
+      <w:r>
+        <w:t xml:space="preserve"> mới sửa được dòng hàng; ô </w:t>
+      </w:r>
+      <w:r>
+        <w:rPr>
+          <w:b/>
+        </w:rPr>
+        <w:t>Cân tại bãi khi về</w:t>
+      </w:r>
+      <w:r>
+        <w:t xml:space="preserve"> vẫn xám tới bước 12.</w:t>
+      </w:r>
+    </w:p>
+    <w:p>
+      <w:pPr>
+        <w:jc w:val="both"/>
+      </w:pPr>
+      <w:r>
+        <w:rPr>
+          <w:b/>
+        </w:rPr>
+        <w:t>Ai làm tiếp:</w:t>
+      </w:r>
+      <w:r>
+        <w:t xml:space="preserve"> KT Thu/Chi kiểm mục II (bước 5): gõ </w:t>
+      </w:r>
+      <w:r>
+        <w:rPr>
+          <w:b/>
+        </w:rPr>
+        <w:t>Số phiếu quặng</w:t>
+      </w:r>
+      <w:r>
+        <w:t xml:space="preserve">, </w:t>
+      </w:r>
+      <w:r>
+        <w:rPr>
+          <w:b/>
+        </w:rPr>
+        <w:t>Ngày phiếu quặng</w:t>
+      </w:r>
+      <w:r>
+        <w:t xml:space="preserve">, </w:t>
+      </w:r>
+      <w:r>
+        <w:rPr>
+          <w:b/>
+        </w:rPr>
+        <w:t>Xác nhận kiểm tra</w:t>
+      </w:r>
+      <w:r>
+        <w:t>.</w:t>
       </w:r>
     </w:p>
     <w:p>
@@ -17978,34 +18302,16 @@
               <w:t>II</w:t>
             </w:r>
             <w:r>
-              <w:t xml:space="preserve">: tuyến ກາສີ → ກາລໍ, khách ຄຳຕຸ້ຍ, </w:t>
+              <w:t xml:space="preserve">: tuyến ກາສີ → ກາລໍ, khách ຄຳຕຸ້ຍ, loại hàng quặng sắt — </w:t>
             </w:r>
             <w:r>
               <w:rPr>
                 <w:b/>
               </w:rPr>
-              <w:t>Cân đầu (tấn)</w:t>
-            </w:r>
-            <w:r>
-              <w:t xml:space="preserve"> 40; </w:t>
-            </w:r>
-            <w:r>
-              <w:rPr>
-                <w:b/>
-              </w:rPr>
-              <w:t>Hàng trên phiếu</w:t>
-            </w:r>
-            <w:r>
-              <w:t xml:space="preserve"> → </w:t>
-            </w:r>
-            <w:r>
-              <w:rPr>
-                <w:b/>
-              </w:rPr>
-              <w:t>Thêm dòng</w:t>
-            </w:r>
-            <w:r>
-              <w:t xml:space="preserve"> 40 t → </w:t>
+              <w:t>chưa</w:t>
+            </w:r>
+            <w:r>
+              <w:t xml:space="preserve"> ghi hàng, cân → </w:t>
             </w:r>
             <w:r>
               <w:rPr>
@@ -18071,13 +18377,40 @@
               <w:t>Lúc về</w:t>
             </w:r>
             <w:r>
+              <w:t xml:space="preserve">, </w:t>
+            </w:r>
+            <w:r>
+              <w:rPr>
+                <w:b/>
+              </w:rPr>
+              <w:t>Cân tại bãi khi về</w:t>
+            </w:r>
+            <w:r>
               <w:t xml:space="preserve"> xám, ghi </w:t>
             </w:r>
             <w:r>
               <w:rPr>
                 <w:i/>
               </w:rPr>
-              <w:t>Điền khi xe về</w:t>
+              <w:t>Điền khi xe về / tới</w:t>
+            </w:r>
+            <w:r>
+              <w:t xml:space="preserve">; dòng nhắc dưới </w:t>
+            </w:r>
+            <w:r>
+              <w:rPr>
+                <w:b/>
+              </w:rPr>
+              <w:t>Hàng trên phiếu</w:t>
+            </w:r>
+            <w:r>
+              <w:t xml:space="preserve"> nói </w:t>
+            </w:r>
+            <w:r>
+              <w:rPr>
+                <w:i/>
+              </w:rPr>
+              <w:t>Bốc xong ở mỏ mới ghi</w:t>
             </w:r>
           </w:p>
         </w:tc>
@@ -18363,18 +18696,18 @@
               <w:t>Gửi kiểm tra</w:t>
             </w:r>
             <w:r>
-              <w:t xml:space="preserve"> ở mục I, II, III, IV</w:t>
-            </w:r>
-          </w:p>
-        </w:tc>
-        <w:tc>
-          <w:tcPr>
-            <w:tcW w:type="dxa" w:w="1440"/>
-          </w:tcPr>
-          <w:p>
-            <w:r/>
-            <w:r>
-              <w:t xml:space="preserve">Các mục </w:t>
+              <w:t xml:space="preserve"> ở mục I, III, IV (mục II chưa — chờ cân mỏ, ca T10b)</w:t>
+            </w:r>
+          </w:p>
+        </w:tc>
+        <w:tc>
+          <w:tcPr>
+            <w:tcW w:type="dxa" w:w="1440"/>
+          </w:tcPr>
+          <w:p>
+            <w:r/>
+            <w:r>
+              <w:t xml:space="preserve">Ba mục </w:t>
             </w:r>
             <w:r>
               <w:rPr>
@@ -18471,54 +18804,27 @@
               <w:t>Số phiếu</w:t>
             </w:r>
             <w:r>
-              <w:t xml:space="preserve">) → mục II gõ </w:t>
+              <w:t xml:space="preserve">) → </w:t>
             </w:r>
             <w:r>
               <w:rPr>
                 <w:b/>
               </w:rPr>
-              <w:t>Số phiếu quặng</w:t>
-            </w:r>
-            <w:r>
-              <w:t xml:space="preserve">, </w:t>
-            </w:r>
-            <w:r>
-              <w:rPr>
-                <w:b/>
-              </w:rPr>
-              <w:t>Ngày phiếu quặng</w:t>
-            </w:r>
-            <w:r>
-              <w:t xml:space="preserve"> → </w:t>
-            </w:r>
-            <w:r>
-              <w:rPr>
-                <w:b/>
-              </w:rPr>
-              <w:t>Lưu</w:t>
-            </w:r>
-            <w:r>
-              <w:t xml:space="preserve"> → </w:t>
-            </w:r>
-            <w:r>
-              <w:rPr>
-                <w:b/>
-              </w:rPr>
               <w:t>Xác nhận kiểm tra</w:t>
             </w:r>
             <w:r>
-              <w:t xml:space="preserve"> mục I, II</w:t>
-            </w:r>
-          </w:p>
-        </w:tc>
-        <w:tc>
-          <w:tcPr>
-            <w:tcW w:type="dxa" w:w="1440"/>
-          </w:tcPr>
-          <w:p>
-            <w:r/>
-            <w:r>
-              <w:t xml:space="preserve">Mục I, II </w:t>
+              <w:t xml:space="preserve"> mục I</w:t>
+            </w:r>
+          </w:p>
+        </w:tc>
+        <w:tc>
+          <w:tcPr>
+            <w:tcW w:type="dxa" w:w="1440"/>
+          </w:tcPr>
+          <w:p>
+            <w:r/>
+            <w:r>
+              <w:t xml:space="preserve">Mục I </w:t>
             </w:r>
             <w:r>
               <w:rPr>
@@ -18527,7 +18833,7 @@
               <w:t>Đã kiểm</w:t>
             </w:r>
             <w:r>
-              <w:t>; không cần ảnh phiếu quặng</w:t>
+              <w:t xml:space="preserve"> (mục II kiểm ở ca T10b)</w:t>
             </w:r>
           </w:p>
         </w:tc>
@@ -19070,6 +19376,193 @@
             <w:r/>
             <w:r>
               <w:t>10</w:t>
+            </w:r>
+          </w:p>
+        </w:tc>
+        <w:tc>
+          <w:tcPr>
+            <w:tcW w:type="dxa" w:w="1440"/>
+          </w:tcPr>
+          <w:p>
+            <w:r/>
+          </w:p>
+        </w:tc>
+      </w:tr>
+      <w:tr>
+        <w:tc>
+          <w:tcPr>
+            <w:tcW w:type="dxa" w:w="1440"/>
+          </w:tcPr>
+          <w:p>
+            <w:r/>
+            <w:r>
+              <w:t>T10b</w:t>
+            </w:r>
+          </w:p>
+        </w:tc>
+        <w:tc>
+          <w:tcPr>
+            <w:tcW w:type="dxa" w:w="1440"/>
+          </w:tcPr>
+          <w:p>
+            <w:r/>
+            <w:r>
+              <w:rPr>
+                <w:rFonts w:ascii="Consolas" w:hAnsi="Consolas"/>
+                <w:sz w:val="19"/>
+              </w:rPr>
+              <w:t>thabok</w:t>
+            </w:r>
+            <w:r>
+              <w:t xml:space="preserve"> → </w:t>
+            </w:r>
+            <w:r>
+              <w:rPr>
+                <w:rFonts w:ascii="Consolas" w:hAnsi="Consolas"/>
+                <w:sz w:val="19"/>
+              </w:rPr>
+              <w:t>ketoan</w:t>
+            </w:r>
+            <w:r>
+              <w:t xml:space="preserve"> · điều xe</w:t>
+            </w:r>
+          </w:p>
+        </w:tc>
+        <w:tc>
+          <w:tcPr>
+            <w:tcW w:type="dxa" w:w="1440"/>
+          </w:tcPr>
+          <w:p>
+            <w:r/>
+            <w:r>
+              <w:t xml:space="preserve">(xe bốc xong ở mỏ) Bãi: thẻ </w:t>
+            </w:r>
+            <w:r>
+              <w:rPr>
+                <w:b/>
+              </w:rPr>
+              <w:t>II</w:t>
+            </w:r>
+            <w:r>
+              <w:t xml:space="preserve"> → </w:t>
+            </w:r>
+            <w:r>
+              <w:rPr>
+                <w:b/>
+              </w:rPr>
+              <w:t>Hàng trên phiếu</w:t>
+            </w:r>
+            <w:r>
+              <w:t xml:space="preserve"> → </w:t>
+            </w:r>
+            <w:r>
+              <w:rPr>
+                <w:b/>
+              </w:rPr>
+              <w:t>Thêm dòng</w:t>
+            </w:r>
+            <w:r>
+              <w:t xml:space="preserve"> ແຮ່ເຫຼັກ 40 t → </w:t>
+            </w:r>
+            <w:r>
+              <w:rPr>
+                <w:b/>
+              </w:rPr>
+              <w:t>Lưu</w:t>
+            </w:r>
+            <w:r>
+              <w:t xml:space="preserve"> → </w:t>
+            </w:r>
+            <w:r>
+              <w:rPr>
+                <w:b/>
+              </w:rPr>
+              <w:t>Gửi kiểm tra</w:t>
+            </w:r>
+            <w:r>
+              <w:t xml:space="preserve"> mục II. Kế toán: gõ </w:t>
+            </w:r>
+            <w:r>
+              <w:rPr>
+                <w:b/>
+              </w:rPr>
+              <w:t>Số phiếu quặng</w:t>
+            </w:r>
+            <w:r>
+              <w:t xml:space="preserve">, </w:t>
+            </w:r>
+            <w:r>
+              <w:rPr>
+                <w:b/>
+              </w:rPr>
+              <w:t>Ngày phiếu quặng</w:t>
+            </w:r>
+            <w:r>
+              <w:t xml:space="preserve"> → </w:t>
+            </w:r>
+            <w:r>
+              <w:rPr>
+                <w:b/>
+              </w:rPr>
+              <w:t>Lưu</w:t>
+            </w:r>
+            <w:r>
+              <w:t xml:space="preserve"> → </w:t>
+            </w:r>
+            <w:r>
+              <w:rPr>
+                <w:b/>
+              </w:rPr>
+              <w:t>Xác nhận kiểm tra</w:t>
+            </w:r>
+            <w:r>
+              <w:t xml:space="preserve"> mục II</w:t>
+            </w:r>
+          </w:p>
+        </w:tc>
+        <w:tc>
+          <w:tcPr>
+            <w:tcW w:type="dxa" w:w="1440"/>
+          </w:tcPr>
+          <w:p>
+            <w:r/>
+            <w:r>
+              <w:rPr>
+                <w:b/>
+              </w:rPr>
+              <w:t>Cân tại mỏ</w:t>
+            </w:r>
+            <w:r>
+              <w:t xml:space="preserve"> tự = 40; mục II </w:t>
+            </w:r>
+            <w:r>
+              <w:rPr>
+                <w:i/>
+              </w:rPr>
+              <w:t>Đã kiểm</w:t>
+            </w:r>
+            <w:r>
+              <w:t xml:space="preserve">; không cần ảnh phiếu quặng; ô </w:t>
+            </w:r>
+            <w:r>
+              <w:rPr>
+                <w:b/>
+              </w:rPr>
+              <w:t>Cân tại bãi khi về</w:t>
+            </w:r>
+            <w:r>
+              <w:t xml:space="preserve"> vẫn xám</w:t>
+            </w:r>
+          </w:p>
+        </w:tc>
+        <w:tc>
+          <w:tcPr>
+            <w:tcW w:type="dxa" w:w="1440"/>
+          </w:tcPr>
+          <w:p>
+            <w:r/>
+            <w:r>
+              <w:t>10b, 5</w:t>
             </w:r>
           </w:p>
         </w:tc>

</xml_diff>

<commit_message>
Phiếu Gom: tài xế báo cân ở mỏ trên điện thoại, máy tự ghi dòng hàng (chủ dự án chốt 29/09)
- POST /api/trips/{id}/bao-can-mo (routes/can_mo.py): số tấn + ảnh phiếu cân (không bắt buộc) — ô Cân tại mỏ
  tự đầy, ảnh vào Phiếu quặng đính kèm, ghi diễn biến; gửi lại cùng mã không ghi hai lần (trips.mine_ref);
  mục II đã kiểm / xe đã tới / phiếu giao thì chặn.
- Phiếu gom một mặt hàng không còn bảng "Hàng trên phiếu": máy ghi dòng hàng từ Loại hàng + Cân tại mỏ
  (lập, sửa, cả khi màn cũ gửi bảng rỗng) — hết bẫy "có cân mỏ mà không có dòng hàng → không vào kho".
- "Xe đã tới" của phiếu gom (màn phiếu và Theo dõi tuyến) hỏi luôn Cân tại mỏ; chưa có thì chặn THIEU_CAN_MO.
- Màn tài xế: nút Báo cân ở mỏ, chạy được khi mất mạng (hàng đợi chung với ký nhận giao hàng).
- kiem/thu_can_mo.py (27 bước); tài liệu A → Z bước 1, 4, 10b, 12, mục 8, ca T01, T10b–T10d, T12, T47b.

Co-Authored-By: Claude Opus 5.5 (1M context) <noreply@anthropic.com>
</commit_message>
<xml_diff>
--- a/DOCS/word/LUONG_A_Z_HAI_TRANG.docx
+++ b/DOCS/word/LUONG_A_Z_HAI_TRANG.docx
@@ -306,7 +306,7 @@
         <w:t>10.</w:t>
       </w:r>
       <w:r>
-        <w:t xml:space="preserve"> Kịch bản test tay: chuẩn bị, rồi 54 ca theo thứ tự luồng</w:t>
+        <w:t xml:space="preserve"> Kịch bản test tay: chuẩn bị, rồi 57 ca theo thứ tự luồng</w:t>
       </w:r>
     </w:p>
     <w:p>
@@ -6017,10 +6017,28 @@
         <w:rPr>
           <w:b/>
         </w:rPr>
-        <w:t>chưa ghi hàng và cân</w:t>
-      </w:r>
-      <w:r>
-        <w:t xml:space="preserve"> — xe chưa đi thì chưa có số (tờ Excel của họ cũng để trống hai dòng cân lúc lập); ô </w:t>
+        <w:t>chưa có cân</w:t>
+      </w:r>
+      <w:r>
+        <w:t xml:space="preserve"> — xe chưa đi thì chưa có số (tờ Excel của họ cũng để trống hai dòng cân lúc lập): ô </w:t>
+      </w:r>
+      <w:r>
+        <w:rPr>
+          <w:b/>
+        </w:rPr>
+        <w:t>Cân tại mỏ (t)</w:t>
+      </w:r>
+      <w:r>
+        <w:t xml:space="preserve"> để trống, dưới ô ghi </w:t>
+      </w:r>
+      <w:r>
+        <w:rPr>
+          <w:i/>
+        </w:rPr>
+        <w:t>Bốc xong ở mỏ mới ghi: tài xế bấm Báo cân ở mỏ, hoặc Admin Thà Bốc ghi theo phiếu quặng…</w:t>
+      </w:r>
+      <w:r>
+        <w:t xml:space="preserve">; ô </w:t>
       </w:r>
       <w:r>
         <w:rPr>
@@ -6109,7 +6127,16 @@
         <w:t>Hàng trên phiếu</w:t>
       </w:r>
       <w:r>
-        <w:t xml:space="preserve">: phiếu </w:t>
+        <w:t xml:space="preserve"> chỉ có ở phiếu </w:t>
+      </w:r>
+      <w:r>
+        <w:rPr>
+          <w:b/>
+        </w:rPr>
+        <w:t>Giao</w:t>
+      </w:r>
+      <w:r>
+        <w:t xml:space="preserve"> — hàng lấy từ lô nào trong bãi, bao nhiêu tấn (bước 14). Phiếu </w:t>
       </w:r>
       <w:r>
         <w:rPr>
@@ -6118,25 +6145,34 @@
         <w:t>Gom</w:t>
       </w:r>
       <w:r>
-        <w:t xml:space="preserve"> để trống lúc lập — </w:t>
-      </w:r>
-      <w:r>
-        <w:rPr>
-          <w:b/>
-        </w:rPr>
-        <w:t>bốc xong ở mỏ</w:t>
-      </w:r>
-      <w:r>
-        <w:t xml:space="preserve"> mới ghi (bước 10b), dòng nhắc dưới khung nói đúng vậy. Phiếu </w:t>
-      </w:r>
-      <w:r>
-        <w:rPr>
-          <w:b/>
-        </w:rPr>
-        <w:t>Giao</w:t>
-      </w:r>
-      <w:r>
-        <w:t xml:space="preserve"> thì ghi ngay, vì hàng lấy từ lô trong bãi đã biết số tấn (bước 14).</w:t>
+        <w:t xml:space="preserve"> </w:t>
+      </w:r>
+      <w:r>
+        <w:rPr>
+          <w:b/>
+        </w:rPr>
+        <w:t>không có khung này</w:t>
+      </w:r>
+      <w:r>
+        <w:t xml:space="preserve"> (từ 29/09): một phiếu gom chở một mặt hàng, như một dòng trong tờ Excel của họ, nên chỉ cần </w:t>
+      </w:r>
+      <w:r>
+        <w:rPr>
+          <w:b/>
+        </w:rPr>
+        <w:t>Loại hàng</w:t>
+      </w:r>
+      <w:r>
+        <w:t xml:space="preserve"> và </w:t>
+      </w:r>
+      <w:r>
+        <w:rPr>
+          <w:b/>
+        </w:rPr>
+        <w:t>Cân tại mỏ (t)</w:t>
+      </w:r>
+      <w:r>
+        <w:t xml:space="preserve"> — máy tự ghi dòng hàng từ hai ô đó (bước 10b).</w:t>
       </w:r>
     </w:p>
     <w:p>
@@ -6263,7 +6299,25 @@
         <w:t>DO</w:t>
       </w:r>
       <w:r>
-        <w:t xml:space="preserve"> (phiếu xuất xe).</w:t>
+        <w:t xml:space="preserve"> (phiếu xuất xe). Phiếu gom: ô </w:t>
+      </w:r>
+      <w:r>
+        <w:rPr>
+          <w:b/>
+        </w:rPr>
+        <w:t>Cân tại mỏ</w:t>
+      </w:r>
+      <w:r>
+        <w:t xml:space="preserve"> có số thì máy ghi luôn một dòng hàng theo </w:t>
+      </w:r>
+      <w:r>
+        <w:rPr>
+          <w:b/>
+        </w:rPr>
+        <w:t>Loại hàng</w:t>
+      </w:r>
+      <w:r>
+        <w:t xml:space="preserve"> (đổi cân, đổi loại hàng thì dòng đổi theo).</w:t>
       </w:r>
     </w:p>
     <w:p>
@@ -6969,7 +7023,7 @@
         <w:t>Gom</w:t>
       </w:r>
       <w:r>
-        <w:t xml:space="preserve"> gửi sau, khi đã ghi hàng và cân tại mỏ (bước 10b); phiếu </w:t>
+        <w:t xml:space="preserve"> gửi sau, khi đã có cân tại mỏ (bước 10b); phiếu </w:t>
       </w:r>
       <w:r>
         <w:rPr>
@@ -8389,7 +8443,7 @@
         <w:pStyle w:val="Heading2"/>
       </w:pPr>
       <w:r>
-        <w:t>Bước 10b. Xe bốc xong ở mỏ — ghi hàng, cân tại mỏ, gửi kiểm mục II (phiếu GOM)</w:t>
+        <w:t>Bước 10b. Xe bốc xong ở mỏ — báo cân tại mỏ, gửi kiểm mục II (phiếu GOM)</w:t>
       </w:r>
     </w:p>
     <w:p>
@@ -8403,7 +8457,17 @@
         <w:t>Ai:</w:t>
       </w:r>
       <w:r>
-        <w:t xml:space="preserve"> Admin Thà Bốc — tài xế gọi về báo số tấn theo phiếu cân ở mỏ, hoặc mang tờ phiếu quặng về. </w:t>
+        <w:t xml:space="preserve"> tài xế (</w:t>
+      </w:r>
+      <w:r>
+        <w:rPr>
+          <w:rFonts w:ascii="Consolas" w:hAnsi="Consolas"/>
+          <w:sz w:val="19"/>
+        </w:rPr>
+        <w:t>tx01</w:t>
+      </w:r>
+      <w:r>
+        <w:t xml:space="preserve">) báo ngay ở mỏ trên điện thoại; Admin Thà Bốc xem lại rồi gửi kiểm. Tài xế không báo được (không có điện thoại, quên) thì Bãi gõ thay — cách 2. </w:t>
       </w:r>
       <w:r>
         <w:rPr>
@@ -8412,25 +8476,7 @@
         <w:t>Trang:</w:t>
       </w:r>
       <w:r>
-        <w:t xml:space="preserve"> điều xe. </w:t>
-      </w:r>
-      <w:r>
-        <w:rPr>
-          <w:b/>
-        </w:rPr>
-        <w:t>Màn:</w:t>
-      </w:r>
-      <w:r>
-        <w:t xml:space="preserve"> Phiếu xuất xe → thẻ </w:t>
-      </w:r>
-      <w:r>
-        <w:rPr>
-          <w:b/>
-        </w:rPr>
-        <w:t>II · Thông tin vận chuyển &amp; doanh thu</w:t>
-      </w:r>
-      <w:r>
-        <w:t>.</w:t>
+        <w:t xml:space="preserve"> điều xe.</w:t>
       </w:r>
     </w:p>
     <w:p>
@@ -8441,7 +8487,7 @@
         <w:rPr>
           <w:b/>
         </w:rPr>
-        <w:t>Thao tác:</w:t>
+        <w:t>Cách 1 — tài xế báo trên điện thoại (tiện nhất, số đi thẳng từ người cầm phiếu cân):</w:t>
       </w:r>
     </w:p>
     <w:p>
@@ -8449,52 +8495,25 @@
         <w:pStyle w:val="ListNumber"/>
       </w:pPr>
       <w:r>
-        <w:t xml:space="preserve">Khung </w:t>
-      </w:r>
-      <w:r>
-        <w:rPr>
-          <w:b/>
-        </w:rPr>
-        <w:t>Hàng trên phiếu</w:t>
-      </w:r>
-      <w:r>
-        <w:t xml:space="preserve"> → </w:t>
-      </w:r>
-      <w:r>
-        <w:rPr>
-          <w:b/>
-        </w:rPr>
-        <w:t>Thêm dòng</w:t>
-      </w:r>
-      <w:r>
-        <w:t xml:space="preserve">: </w:t>
-      </w:r>
-      <w:r>
-        <w:rPr>
-          <w:b/>
-        </w:rPr>
-        <w:t>Mặt hàng</w:t>
-      </w:r>
-      <w:r>
-        <w:t xml:space="preserve"> ແຮ່ເຫຼັກ (quặng sắt), </w:t>
-      </w:r>
-      <w:r>
-        <w:rPr>
-          <w:b/>
-        </w:rPr>
-        <w:t>Số tấn</w:t>
-      </w:r>
-      <w:r>
-        <w:t xml:space="preserve"> 40 (theo phiếu cân ở mỏ). Ô </w:t>
-      </w:r>
-      <w:r>
-        <w:rPr>
-          <w:b/>
-        </w:rPr>
-        <w:t>Cân tại mỏ (t)</w:t>
-      </w:r>
-      <w:r>
-        <w:t xml:space="preserve"> tự bằng tổng các dòng hàng.</w:t>
+        <w:t xml:space="preserve">Tài xế mở </w:t>
+      </w:r>
+      <w:r>
+        <w:rPr>
+          <w:b/>
+        </w:rPr>
+        <w:t>Phiếu của tôi</w:t>
+      </w:r>
+      <w:r>
+        <w:t xml:space="preserve"> → thẻ phiếu gom đang chạy → bấm </w:t>
+      </w:r>
+      <w:r>
+        <w:rPr>
+          <w:b/>
+        </w:rPr>
+        <w:t>Báo cân ở mỏ</w:t>
+      </w:r>
+      <w:r>
+        <w:t xml:space="preserve"> (nút xanh to, chỉ phiếu gom mới có).</w:t>
       </w:r>
     </w:p>
     <w:p>
@@ -8502,25 +8521,52 @@
         <w:pStyle w:val="ListNumber"/>
       </w:pPr>
       <w:r>
-        <w:t xml:space="preserve">Có ảnh phiếu quặng thì khung </w:t>
-      </w:r>
-      <w:r>
-        <w:rPr>
-          <w:b/>
-        </w:rPr>
-        <w:t>Phiếu quặng đính kèm</w:t>
-      </w:r>
-      <w:r>
-        <w:t xml:space="preserve"> → </w:t>
-      </w:r>
-      <w:r>
-        <w:rPr>
-          <w:b/>
-        </w:rPr>
-        <w:t>Thêm ảnh · PDF</w:t>
-      </w:r>
-      <w:r>
-        <w:t>. Không có ảnh cũng được — kế toán gõ số phiếu quặng khi nhận giấy.</w:t>
+        <w:t xml:space="preserve">Hộp </w:t>
+      </w:r>
+      <w:r>
+        <w:rPr>
+          <w:b/>
+        </w:rPr>
+        <w:t>Báo cân ở mỏ</w:t>
+      </w:r>
+      <w:r>
+        <w:t xml:space="preserve">: ô </w:t>
+      </w:r>
+      <w:r>
+        <w:rPr>
+          <w:b/>
+        </w:rPr>
+        <w:t>Cân tại mỏ (t)</w:t>
+      </w:r>
+      <w:r>
+        <w:t xml:space="preserve"> gõ 40 theo phiếu cân; ô </w:t>
+      </w:r>
+      <w:r>
+        <w:rPr>
+          <w:b/>
+        </w:rPr>
+        <w:t>Ghi chú</w:t>
+      </w:r>
+      <w:r>
+        <w:t xml:space="preserve"> nếu cần (ví dụ số phiếu cân); bấm </w:t>
+      </w:r>
+      <w:r>
+        <w:rPr>
+          <w:b/>
+        </w:rPr>
+        <w:t>Thêm ảnh phiếu cân · phiếu quặng</w:t>
+      </w:r>
+      <w:r>
+        <w:t xml:space="preserve"> để chụp tờ phiếu — không bắt buộc (phiếu nhập tay được). Bấm </w:t>
+      </w:r>
+      <w:r>
+        <w:rPr>
+          <w:b/>
+        </w:rPr>
+        <w:t>Gửi</w:t>
+      </w:r>
+      <w:r>
+        <w:t>.</w:t>
       </w:r>
     </w:p>
     <w:p>
@@ -8528,25 +8574,83 @@
         <w:pStyle w:val="ListNumber"/>
       </w:pPr>
       <w:r>
-        <w:t xml:space="preserve">Bấm </w:t>
-      </w:r>
-      <w:r>
-        <w:rPr>
-          <w:b/>
-        </w:rPr>
-        <w:t>Lưu</w:t>
-      </w:r>
-      <w:r>
-        <w:t xml:space="preserve">, rồi </w:t>
-      </w:r>
-      <w:r>
-        <w:rPr>
-          <w:b/>
-        </w:rPr>
-        <w:t>Gửi kiểm tra</w:t>
-      </w:r>
-      <w:r>
-        <w:t xml:space="preserve"> ở đầu mục II.</w:t>
+        <w:t xml:space="preserve">Máy báo </w:t>
+      </w:r>
+      <w:r>
+        <w:rPr>
+          <w:i/>
+        </w:rPr>
+        <w:t>Đã báo cân tại mỏ. Bãi sẽ xác nhận.</w:t>
+      </w:r>
+      <w:r>
+        <w:t xml:space="preserve">; trên thẻ phiếu dòng </w:t>
+      </w:r>
+      <w:r>
+        <w:rPr>
+          <w:b/>
+        </w:rPr>
+        <w:t>Cân tại mỏ (t)</w:t>
+      </w:r>
+      <w:r>
+        <w:t xml:space="preserve"> hiện 40,00 t.</w:t>
+      </w:r>
+    </w:p>
+    <w:p>
+      <w:pPr>
+        <w:pStyle w:val="ListNumber"/>
+      </w:pPr>
+      <w:r>
+        <w:rPr>
+          <w:b/>
+        </w:rPr>
+        <w:t>Mất mạng ở mỏ</w:t>
+      </w:r>
+      <w:r>
+        <w:t xml:space="preserve"> vẫn bấm Gửi được: máy báo </w:t>
+      </w:r>
+      <w:r>
+        <w:rPr>
+          <w:i/>
+        </w:rPr>
+        <w:t>Chờ gửi — tự gửi khi có mạng lại</w:t>
+      </w:r>
+      <w:r>
+        <w:t xml:space="preserve">, thẻ phiếu có dòng vàng </w:t>
+      </w:r>
+      <w:r>
+        <w:rPr>
+          <w:i/>
+        </w:rPr>
+        <w:t>Báo cân ở mỏ · Chờ gửi…</w:t>
+      </w:r>
+      <w:r>
+        <w:t xml:space="preserve"> và nút tạm ẩn. Có mạng lại (hoặc mở lại màn) máy tự gửi và báo </w:t>
+      </w:r>
+      <w:r>
+        <w:rPr>
+          <w:i/>
+        </w:rPr>
+        <w:t>Đã gửi xong 1 lần báo cân chờ gửi</w:t>
+      </w:r>
+      <w:r>
+        <w:t>.</w:t>
+      </w:r>
+    </w:p>
+    <w:p>
+      <w:pPr>
+        <w:pStyle w:val="ListNumber"/>
+      </w:pPr>
+      <w:r>
+        <w:t xml:space="preserve">Gõ nhầm thì bấm </w:t>
+      </w:r>
+      <w:r>
+        <w:rPr>
+          <w:b/>
+        </w:rPr>
+        <w:t>Báo cân ở mỏ</w:t>
+      </w:r>
+      <w:r>
+        <w:t xml:space="preserve"> lần nữa với số đúng — số mới thay số cũ, cho tới khi kế toán kiểm mục II.</w:t>
       </w:r>
     </w:p>
     <w:p>
@@ -8557,19 +8661,100 @@
         <w:rPr>
           <w:b/>
         </w:rPr>
-        <w:t>Máy tự làm:</w:t>
-      </w:r>
-      <w:r>
-        <w:t xml:space="preserve"> cân tại mỏ = tổng tấn các dòng hàng; hàng </w:t>
-      </w:r>
-      <w:r>
-        <w:rPr>
-          <w:b/>
-        </w:rPr>
-        <w:t>chưa vào kho</w:t>
-      </w:r>
-      <w:r>
-        <w:t xml:space="preserve"> — chỉ vào kho bãi khi xe về tới (bước 12).</w:t>
+        <w:t>Bãi xác nhận:</w:t>
+      </w:r>
+      <w:r>
+        <w:t xml:space="preserve"> Admin Thà Bốc mở </w:t>
+      </w:r>
+      <w:r>
+        <w:rPr>
+          <w:b/>
+        </w:rPr>
+        <w:t>Phiếu xuất xe</w:t>
+      </w:r>
+      <w:r>
+        <w:t xml:space="preserve"> → phiếu đó → thẻ </w:t>
+      </w:r>
+      <w:r>
+        <w:rPr>
+          <w:b/>
+        </w:rPr>
+        <w:t>II</w:t>
+      </w:r>
+      <w:r>
+        <w:t xml:space="preserve">: ô </w:t>
+      </w:r>
+      <w:r>
+        <w:rPr>
+          <w:b/>
+        </w:rPr>
+        <w:t>Cân tại mỏ (t)</w:t>
+      </w:r>
+      <w:r>
+        <w:t xml:space="preserve"> đã có 40; ảnh nằm ở khung </w:t>
+      </w:r>
+      <w:r>
+        <w:rPr>
+          <w:b/>
+        </w:rPr>
+        <w:t>Phiếu quặng đính kèm</w:t>
+      </w:r>
+      <w:r>
+        <w:t xml:space="preserve">; </w:t>
+      </w:r>
+      <w:r>
+        <w:rPr>
+          <w:b/>
+        </w:rPr>
+        <w:t>Theo dõi tuyến</w:t>
+      </w:r>
+      <w:r>
+        <w:t xml:space="preserve"> → xe đó → bảng diễn biến có dòng </w:t>
+      </w:r>
+      <w:r>
+        <w:rPr>
+          <w:i/>
+        </w:rPr>
+        <w:t>Báo cân tại mỏ 40 t · 1 ảnh · …</w:t>
+      </w:r>
+      <w:r>
+        <w:t xml:space="preserve">. Đúng thì bấm </w:t>
+      </w:r>
+      <w:r>
+        <w:rPr>
+          <w:b/>
+        </w:rPr>
+        <w:t>Gửi kiểm tra</w:t>
+      </w:r>
+      <w:r>
+        <w:t xml:space="preserve"> ở đầu mục II. Sai thì sửa ô </w:t>
+      </w:r>
+      <w:r>
+        <w:rPr>
+          <w:b/>
+        </w:rPr>
+        <w:t>Cân tại mỏ (t)</w:t>
+      </w:r>
+      <w:r>
+        <w:t xml:space="preserve"> → </w:t>
+      </w:r>
+      <w:r>
+        <w:rPr>
+          <w:b/>
+        </w:rPr>
+        <w:t>Lưu</w:t>
+      </w:r>
+      <w:r>
+        <w:t xml:space="preserve"> → </w:t>
+      </w:r>
+      <w:r>
+        <w:rPr>
+          <w:b/>
+        </w:rPr>
+        <w:t>Gửi kiểm tra</w:t>
+      </w:r>
+      <w:r>
+        <w:t>.</w:t>
       </w:r>
     </w:p>
     <w:p>
@@ -8580,28 +8765,64 @@
         <w:rPr>
           <w:b/>
         </w:rPr>
-        <w:t>Máy chặn:</w:t>
-      </w:r>
-      <w:r>
-        <w:t xml:space="preserve"> mục II đã kiểm thì phải </w:t>
-      </w:r>
-      <w:r>
-        <w:rPr>
-          <w:b/>
-        </w:rPr>
-        <w:t>Trả lại sửa</w:t>
-      </w:r>
-      <w:r>
-        <w:t xml:space="preserve"> mới sửa được dòng hàng; ô </w:t>
-      </w:r>
-      <w:r>
-        <w:rPr>
-          <w:b/>
-        </w:rPr>
-        <w:t>Cân tại bãi khi về</w:t>
-      </w:r>
-      <w:r>
-        <w:t xml:space="preserve"> vẫn xám tới bước 12.</w:t>
+        <w:t>Cách 2 — Bãi gõ thay</w:t>
+      </w:r>
+      <w:r>
+        <w:t xml:space="preserve"> (tài xế gọi về báo số tấn, hoặc mang tờ phiếu quặng về): thẻ </w:t>
+      </w:r>
+      <w:r>
+        <w:rPr>
+          <w:b/>
+        </w:rPr>
+        <w:t>II</w:t>
+      </w:r>
+      <w:r>
+        <w:t xml:space="preserve"> → ô </w:t>
+      </w:r>
+      <w:r>
+        <w:rPr>
+          <w:b/>
+        </w:rPr>
+        <w:t>Cân tại mỏ (t)</w:t>
+      </w:r>
+      <w:r>
+        <w:t xml:space="preserve"> gõ 40 → có ảnh thì khung </w:t>
+      </w:r>
+      <w:r>
+        <w:rPr>
+          <w:b/>
+        </w:rPr>
+        <w:t>Phiếu quặng đính kèm</w:t>
+      </w:r>
+      <w:r>
+        <w:t xml:space="preserve"> → </w:t>
+      </w:r>
+      <w:r>
+        <w:rPr>
+          <w:b/>
+        </w:rPr>
+        <w:t>Thêm ảnh · PDF</w:t>
+      </w:r>
+      <w:r>
+        <w:t xml:space="preserve"> → </w:t>
+      </w:r>
+      <w:r>
+        <w:rPr>
+          <w:b/>
+        </w:rPr>
+        <w:t>Lưu</w:t>
+      </w:r>
+      <w:r>
+        <w:t xml:space="preserve"> → </w:t>
+      </w:r>
+      <w:r>
+        <w:rPr>
+          <w:b/>
+        </w:rPr>
+        <w:t>Gửi kiểm tra</w:t>
+      </w:r>
+      <w:r>
+        <w:t xml:space="preserve"> ở đầu mục II.</w:t>
       </w:r>
     </w:p>
     <w:p>
@@ -8612,6 +8833,138 @@
         <w:rPr>
           <w:b/>
         </w:rPr>
+        <w:t>Máy tự làm:</w:t>
+      </w:r>
+      <w:r>
+        <w:t xml:space="preserve"> ô Cân tại mỏ có số thì máy ghi </w:t>
+      </w:r>
+      <w:r>
+        <w:rPr>
+          <w:b/>
+        </w:rPr>
+        <w:t>một dòng hàng</w:t>
+      </w:r>
+      <w:r>
+        <w:t xml:space="preserve"> trên phiếu: mặt hàng theo </w:t>
+      </w:r>
+      <w:r>
+        <w:rPr>
+          <w:b/>
+        </w:rPr>
+        <w:t>Loại hàng</w:t>
+      </w:r>
+      <w:r>
+        <w:t xml:space="preserve"> (Quặng sắt → ແຮ່ເຫຼັກ (quặng sắt)), số tấn = cân tại mỏ. Đổi cân hay đổi loại hàng thì dòng đổi theo. Máy gửi lại cùng một lần báo (mất mạng rồi có mạng) không ghi hai lần. Hàng </w:t>
+      </w:r>
+      <w:r>
+        <w:rPr>
+          <w:b/>
+        </w:rPr>
+        <w:t>chưa vào kho</w:t>
+      </w:r>
+      <w:r>
+        <w:t xml:space="preserve"> — chỉ vào kho bãi khi xe về tới (bước 12).</w:t>
+      </w:r>
+    </w:p>
+    <w:p>
+      <w:pPr>
+        <w:jc w:val="both"/>
+      </w:pPr>
+      <w:r>
+        <w:rPr>
+          <w:b/>
+        </w:rPr>
+        <w:t>Máy chặn:</w:t>
+      </w:r>
+      <w:r>
+        <w:t xml:space="preserve"> tài xế khác, kế toán không báo cân được; số tấn 0; phiếu giao không có nút này; mục II </w:t>
+      </w:r>
+      <w:r>
+        <w:rPr>
+          <w:b/>
+        </w:rPr>
+        <w:t>đã kiểm</w:t>
+      </w:r>
+      <w:r>
+        <w:t xml:space="preserve"> thì tài xế không đổi được nữa (máy báo </w:t>
+      </w:r>
+      <w:r>
+        <w:rPr>
+          <w:i/>
+        </w:rPr>
+        <w:t>Mục II đã kiểm với cân tại mỏ 40 t…</w:t>
+      </w:r>
+      <w:r>
+        <w:t xml:space="preserve"> — Bãi nhờ kế toán </w:t>
+      </w:r>
+      <w:r>
+        <w:rPr>
+          <w:b/>
+        </w:rPr>
+        <w:t>Trả lại sửa</w:t>
+      </w:r>
+      <w:r>
+        <w:t xml:space="preserve">); xe đã về tới bãi thì không báo cân mỏ nữa (hàng đã vào kho theo số cũ); ô </w:t>
+      </w:r>
+      <w:r>
+        <w:rPr>
+          <w:b/>
+        </w:rPr>
+        <w:t>Cân tại bãi khi về</w:t>
+      </w:r>
+      <w:r>
+        <w:t xml:space="preserve"> vẫn xám tới bước 12.</w:t>
+      </w:r>
+    </w:p>
+    <w:p>
+      <w:pPr>
+        <w:jc w:val="both"/>
+      </w:pPr>
+      <w:r>
+        <w:rPr>
+          <w:b/>
+        </w:rPr>
+        <w:t>Phiếu gom cũ có từ hai dòng hàng trở lên</w:t>
+      </w:r>
+      <w:r>
+        <w:t xml:space="preserve"> (lập trước 29/09) vẫn hiện khung </w:t>
+      </w:r>
+      <w:r>
+        <w:rPr>
+          <w:b/>
+        </w:rPr>
+        <w:t>Hàng trên phiếu</w:t>
+      </w:r>
+      <w:r>
+        <w:t xml:space="preserve"> để sửa từng dòng; nút </w:t>
+      </w:r>
+      <w:r>
+        <w:rPr>
+          <w:b/>
+        </w:rPr>
+        <w:t>Báo cân ở mỏ</w:t>
+      </w:r>
+      <w:r>
+        <w:t xml:space="preserve"> trên điện thoại báo </w:t>
+      </w:r>
+      <w:r>
+        <w:rPr>
+          <w:i/>
+        </w:rPr>
+        <w:t>Phiếu có nhiều dòng hàng — Bãi ghi số tấn từng dòng trên phiếu</w:t>
+      </w:r>
+      <w:r>
+        <w:t>.</w:t>
+      </w:r>
+    </w:p>
+    <w:p>
+      <w:pPr>
+        <w:jc w:val="both"/>
+      </w:pPr>
+      <w:r>
+        <w:rPr>
+          <w:b/>
+        </w:rPr>
         <w:t>Ai làm tiếp:</w:t>
       </w:r>
       <w:r>
@@ -9026,7 +9379,52 @@
         <w:pStyle w:val="ListNumber"/>
       </w:pPr>
       <w:r>
-        <w:t xml:space="preserve">Hộp nhập: </w:t>
+        <w:t xml:space="preserve">Hộp nhập của phiếu gom: ô </w:t>
+      </w:r>
+      <w:r>
+        <w:rPr>
+          <w:b/>
+        </w:rPr>
+        <w:t>Cân tại mỏ (t)</w:t>
+      </w:r>
+      <w:r>
+        <w:t xml:space="preserve"> ở đầu — đã có số (tài xế báo ở bước 10b, hoặc Bãi đã ghi) thì điền sẵn, chỉ xem lại; còn trống thì phải gõ theo phiếu quặng. Rồi </w:t>
+      </w:r>
+      <w:r>
+        <w:rPr>
+          <w:b/>
+        </w:rPr>
+        <w:t>Cân tại bãi khi về (t)</w:t>
+      </w:r>
+      <w:r>
+        <w:t xml:space="preserve">, ví dụ 39,6; </w:t>
+      </w:r>
+      <w:r>
+        <w:rPr>
+          <w:b/>
+        </w:rPr>
+        <w:t>Ngày xe về</w:t>
+      </w:r>
+      <w:r>
+        <w:t xml:space="preserve">; </w:t>
+      </w:r>
+      <w:r>
+        <w:rPr>
+          <w:b/>
+        </w:rPr>
+        <w:t>Km về (công-tơ-mét)</w:t>
+      </w:r>
+      <w:r>
+        <w:t xml:space="preserve">. Bấm </w:t>
+      </w:r>
+      <w:r>
+        <w:rPr>
+          <w:b/>
+        </w:rPr>
+        <w:t>Đồng ý</w:t>
+      </w:r>
+      <w:r>
+        <w:t xml:space="preserve">. (Phiếu giao thì ô đầu là </w:t>
       </w:r>
       <w:r>
         <w:rPr>
@@ -9035,43 +9433,7 @@
         <w:t>Cân cuối (tấn)</w:t>
       </w:r>
       <w:r>
-        <w:t xml:space="preserve"> — với phiếu gom là </w:t>
-      </w:r>
-      <w:r>
-        <w:rPr>
-          <w:b/>
-        </w:rPr>
-        <w:t>cân tại bãi</w:t>
-      </w:r>
-      <w:r>
-        <w:t xml:space="preserve">, ví dụ 39,6; </w:t>
-      </w:r>
-      <w:r>
-        <w:rPr>
-          <w:b/>
-        </w:rPr>
-        <w:t>Ngày xe về</w:t>
-      </w:r>
-      <w:r>
-        <w:t xml:space="preserve">; </w:t>
-      </w:r>
-      <w:r>
-        <w:rPr>
-          <w:b/>
-        </w:rPr>
-        <w:t>Km về (công-tơ-mét)</w:t>
-      </w:r>
-      <w:r>
-        <w:t xml:space="preserve">. Bấm </w:t>
-      </w:r>
-      <w:r>
-        <w:rPr>
-          <w:b/>
-        </w:rPr>
-        <w:t>Đồng ý</w:t>
-      </w:r>
-      <w:r>
-        <w:t>.</w:t>
+        <w:t>, xem bước 15.)</w:t>
       </w:r>
     </w:p>
     <w:p>
@@ -9171,7 +9533,25 @@
         <w:t>Lưu</w:t>
       </w:r>
       <w:r>
-        <w:t xml:space="preserve"> không ghi được) — xe đã tới rồi thì Bãi sửa được như mọi ô mục I; chưa nhận tạm ứng thì không báo tới được; </w:t>
+        <w:t xml:space="preserve"> không ghi được) — xe đã tới rồi thì Bãi sửa được như mọi ô mục I; phiếu gom </w:t>
+      </w:r>
+      <w:r>
+        <w:rPr>
+          <w:b/>
+        </w:rPr>
+        <w:t>chưa có cân tại mỏ</w:t>
+      </w:r>
+      <w:r>
+        <w:t xml:space="preserve"> thì không báo tới được (máy nhắc </w:t>
+      </w:r>
+      <w:r>
+        <w:rPr>
+          <w:i/>
+        </w:rPr>
+        <w:t>Cân tại mỏ (t)?</w:t>
+      </w:r>
+      <w:r>
+        <w:t xml:space="preserve">) — không có số thì hàng không có gì để vào kho; mục II đã kiểm mà gõ cân tại mỏ khác số đã kiểm thì bị chặn, phải trả lại mục II; chưa nhận tạm ứng thì không báo tới được; </w:t>
       </w:r>
       <w:r>
         <w:rPr>
@@ -16427,6 +16807,30 @@
           <w:p>
             <w:r/>
             <w:r>
+              <w:t>Tài xế báo cân ở mỏ trên điện thoại (mất sóng ở mỏ)</w:t>
+            </w:r>
+          </w:p>
+        </w:tc>
+        <w:tc>
+          <w:tcPr>
+            <w:tcW w:type="dxa" w:w="4320"/>
+          </w:tcPr>
+          <w:p>
+            <w:r/>
+            <w:r>
+              <w:t>Vẫn làm: lần báo vào hàng đợi, có mạng tự gửi; không cần trang kế toán</w:t>
+            </w:r>
+          </w:p>
+        </w:tc>
+      </w:tr>
+      <w:tr>
+        <w:tc>
+          <w:tcPr>
+            <w:tcW w:type="dxa" w:w="4320"/>
+          </w:tcPr>
+          <w:p>
+            <w:r/>
+            <w:r>
               <w:t>Lập / sửa phiếu không đụng kho (ghi chú, xe, tài xế…)</w:t>
             </w:r>
           </w:p>
@@ -18302,16 +18706,16 @@
               <w:t>II</w:t>
             </w:r>
             <w:r>
-              <w:t xml:space="preserve">: tuyến ກາສີ → ກາລໍ, khách ຄຳຕຸ້ຍ, loại hàng quặng sắt — </w:t>
-            </w:r>
-            <w:r>
-              <w:rPr>
-                <w:b/>
-              </w:rPr>
-              <w:t>chưa</w:t>
-            </w:r>
-            <w:r>
-              <w:t xml:space="preserve"> ghi hàng, cân → </w:t>
+              <w:t xml:space="preserve">: tuyến ກາສີ → ກາລໍ, khách ຄຳຕຸ້ຍ, loại hàng quặng sắt — ô </w:t>
+            </w:r>
+            <w:r>
+              <w:rPr>
+                <w:b/>
+              </w:rPr>
+              <w:t>Cân tại mỏ (t)</w:t>
+            </w:r>
+            <w:r>
+              <w:t xml:space="preserve"> để trống → </w:t>
             </w:r>
             <w:r>
               <w:rPr>
@@ -18359,7 +18763,43 @@
               <w:t>không thấy</w:t>
             </w:r>
             <w:r>
-              <w:t xml:space="preserve"> ô giá cước, giá thuê, tỷ giá; ô </w:t>
+              <w:t xml:space="preserve"> ô giá cước, giá thuê, tỷ giá; phiếu gom </w:t>
+            </w:r>
+            <w:r>
+              <w:rPr>
+                <w:b/>
+              </w:rPr>
+              <w:t>không có</w:t>
+            </w:r>
+            <w:r>
+              <w:t xml:space="preserve"> khung </w:t>
+            </w:r>
+            <w:r>
+              <w:rPr>
+                <w:b/>
+              </w:rPr>
+              <w:t>Hàng trên phiếu</w:t>
+            </w:r>
+            <w:r>
+              <w:t xml:space="preserve">; dưới ô </w:t>
+            </w:r>
+            <w:r>
+              <w:rPr>
+                <w:b/>
+              </w:rPr>
+              <w:t>Cân tại mỏ (t)</w:t>
+            </w:r>
+            <w:r>
+              <w:t xml:space="preserve"> ghi </w:t>
+            </w:r>
+            <w:r>
+              <w:rPr>
+                <w:i/>
+              </w:rPr>
+              <w:t>Bốc xong ở mỏ mới ghi…</w:t>
+            </w:r>
+            <w:r>
+              <w:t xml:space="preserve">; ô </w:t>
             </w:r>
             <w:r>
               <w:rPr>
@@ -18393,24 +18833,6 @@
                 <w:i/>
               </w:rPr>
               <w:t>Điền khi xe về / tới</w:t>
-            </w:r>
-            <w:r>
-              <w:t xml:space="preserve">; dòng nhắc dưới </w:t>
-            </w:r>
-            <w:r>
-              <w:rPr>
-                <w:b/>
-              </w:rPr>
-              <w:t>Hàng trên phiếu</w:t>
-            </w:r>
-            <w:r>
-              <w:t xml:space="preserve"> nói </w:t>
-            </w:r>
-            <w:r>
-              <w:rPr>
-                <w:i/>
-              </w:rPr>
-              <w:t>Bốc xong ở mỏ mới ghi</w:t>
             </w:r>
           </w:p>
         </w:tc>
@@ -19411,37 +19833,168 @@
                 <w:rFonts w:ascii="Consolas" w:hAnsi="Consolas"/>
                 <w:sz w:val="19"/>
               </w:rPr>
-              <w:t>thabok</w:t>
+              <w:t>tx01</w:t>
+            </w:r>
+            <w:r>
+              <w:t xml:space="preserve"> · điều xe (điện thoại)</w:t>
+            </w:r>
+          </w:p>
+        </w:tc>
+        <w:tc>
+          <w:tcPr>
+            <w:tcW w:type="dxa" w:w="1440"/>
+          </w:tcPr>
+          <w:p>
+            <w:r/>
+            <w:r>
+              <w:t xml:space="preserve">(xe bốc xong ở mỏ) </w:t>
+            </w:r>
+            <w:r>
+              <w:rPr>
+                <w:b/>
+              </w:rPr>
+              <w:t>Phiếu của tôi</w:t>
+            </w:r>
+            <w:r>
+              <w:t xml:space="preserve"> → phiếu T01 → </w:t>
+            </w:r>
+            <w:r>
+              <w:rPr>
+                <w:b/>
+              </w:rPr>
+              <w:t>Báo cân ở mỏ</w:t>
             </w:r>
             <w:r>
               <w:t xml:space="preserve"> → </w:t>
             </w:r>
+            <w:r>
+              <w:rPr>
+                <w:b/>
+              </w:rPr>
+              <w:t>Cân tại mỏ (t)</w:t>
+            </w:r>
+            <w:r>
+              <w:t xml:space="preserve"> 39,8 → </w:t>
+            </w:r>
+            <w:r>
+              <w:rPr>
+                <w:b/>
+              </w:rPr>
+              <w:t>Thêm ảnh phiếu cân · phiếu quặng</w:t>
+            </w:r>
+            <w:r>
+              <w:t xml:space="preserve"> chụp một tờ → </w:t>
+            </w:r>
+            <w:r>
+              <w:rPr>
+                <w:b/>
+              </w:rPr>
+              <w:t>Gửi</w:t>
+            </w:r>
+          </w:p>
+        </w:tc>
+        <w:tc>
+          <w:tcPr>
+            <w:tcW w:type="dxa" w:w="1440"/>
+          </w:tcPr>
+          <w:p>
+            <w:r/>
+            <w:r>
+              <w:t xml:space="preserve">Máy báo </w:t>
+            </w:r>
+            <w:r>
+              <w:rPr>
+                <w:i/>
+              </w:rPr>
+              <w:t>Đã báo cân tại mỏ. Bãi sẽ xác nhận.</w:t>
+            </w:r>
+            <w:r>
+              <w:t xml:space="preserve">; thẻ phiếu dòng </w:t>
+            </w:r>
+            <w:r>
+              <w:rPr>
+                <w:b/>
+              </w:rPr>
+              <w:t>Cân tại mỏ (t)</w:t>
+            </w:r>
+            <w:r>
+              <w:t xml:space="preserve"> 39,80 t. Phiếu giao T14 (sau này) không có nút này</w:t>
+            </w:r>
+          </w:p>
+        </w:tc>
+        <w:tc>
+          <w:tcPr>
+            <w:tcW w:type="dxa" w:w="1440"/>
+          </w:tcPr>
+          <w:p>
+            <w:r/>
+            <w:r>
+              <w:t>10b</w:t>
+            </w:r>
+          </w:p>
+        </w:tc>
+        <w:tc>
+          <w:tcPr>
+            <w:tcW w:type="dxa" w:w="1440"/>
+          </w:tcPr>
+          <w:p>
+            <w:r/>
+          </w:p>
+        </w:tc>
+      </w:tr>
+      <w:tr>
+        <w:tc>
+          <w:tcPr>
+            <w:tcW w:type="dxa" w:w="1440"/>
+          </w:tcPr>
+          <w:p>
+            <w:r/>
+            <w:r>
+              <w:t>T10c</w:t>
+            </w:r>
+          </w:p>
+        </w:tc>
+        <w:tc>
+          <w:tcPr>
+            <w:tcW w:type="dxa" w:w="1440"/>
+          </w:tcPr>
+          <w:p>
+            <w:r/>
             <w:r>
               <w:rPr>
                 <w:rFonts w:ascii="Consolas" w:hAnsi="Consolas"/>
                 <w:sz w:val="19"/>
               </w:rPr>
-              <w:t>ketoan</w:t>
-            </w:r>
-            <w:r>
-              <w:t xml:space="preserve"> · điều xe</w:t>
-            </w:r>
-          </w:p>
-        </w:tc>
-        <w:tc>
-          <w:tcPr>
-            <w:tcW w:type="dxa" w:w="1440"/>
-          </w:tcPr>
-          <w:p>
-            <w:r/>
-            <w:r>
-              <w:t xml:space="preserve">(xe bốc xong ở mỏ) Bãi: thẻ </w:t>
-            </w:r>
-            <w:r>
-              <w:rPr>
-                <w:b/>
-              </w:rPr>
-              <w:t>II</w:t>
+              <w:t>tx01</w:t>
+            </w:r>
+            <w:r>
+              <w:t xml:space="preserve"> · điều xe (điện thoại)</w:t>
+            </w:r>
+          </w:p>
+        </w:tc>
+        <w:tc>
+          <w:tcPr>
+            <w:tcW w:type="dxa" w:w="1440"/>
+          </w:tcPr>
+          <w:p>
+            <w:r/>
+            <w:r>
+              <w:t xml:space="preserve">Bật </w:t>
+            </w:r>
+            <w:r>
+              <w:rPr>
+                <w:b/>
+              </w:rPr>
+              <w:t>chế độ máy bay</w:t>
+            </w:r>
+            <w:r>
+              <w:t xml:space="preserve"> (máy tính: F12 → </w:t>
+            </w:r>
+            <w:r>
+              <w:rPr>
+                <w:b/>
+              </w:rPr>
+              <w:t>Network</w:t>
             </w:r>
             <w:r>
               <w:t xml:space="preserve"> → </w:t>
@@ -19450,43 +20003,63 @@
               <w:rPr>
                 <w:b/>
               </w:rPr>
-              <w:t>Hàng trên phiếu</w:t>
-            </w:r>
-            <w:r>
-              <w:t xml:space="preserve"> → </w:t>
-            </w:r>
-            <w:r>
-              <w:rPr>
-                <w:b/>
-              </w:rPr>
-              <w:t>Thêm dòng</w:t>
-            </w:r>
-            <w:r>
-              <w:t xml:space="preserve"> ແຮ່ເຫຼັກ 40 t → </w:t>
-            </w:r>
-            <w:r>
-              <w:rPr>
-                <w:b/>
-              </w:rPr>
-              <w:t>Lưu</w:t>
-            </w:r>
-            <w:r>
-              <w:t xml:space="preserve"> → </w:t>
-            </w:r>
-            <w:r>
-              <w:rPr>
-                <w:b/>
-              </w:rPr>
-              <w:t>Gửi kiểm tra</w:t>
-            </w:r>
-            <w:r>
-              <w:t xml:space="preserve"> mục II. Kế toán: gõ </w:t>
-            </w:r>
-            <w:r>
-              <w:rPr>
-                <w:b/>
-              </w:rPr>
-              <w:t>Số phiếu quặng</w:t>
+              <w:t>Offline</w:t>
+            </w:r>
+            <w:r>
+              <w:t xml:space="preserve">) → </w:t>
+            </w:r>
+            <w:r>
+              <w:rPr>
+                <w:b/>
+              </w:rPr>
+              <w:t>Báo cân ở mỏ</w:t>
+            </w:r>
+            <w:r>
+              <w:t xml:space="preserve"> → sửa thành 40 → </w:t>
+            </w:r>
+            <w:r>
+              <w:rPr>
+                <w:b/>
+              </w:rPr>
+              <w:t>Gửi</w:t>
+            </w:r>
+            <w:r>
+              <w:t xml:space="preserve"> → tắt chế độ máy bay</w:t>
+            </w:r>
+          </w:p>
+        </w:tc>
+        <w:tc>
+          <w:tcPr>
+            <w:tcW w:type="dxa" w:w="1440"/>
+          </w:tcPr>
+          <w:p>
+            <w:r/>
+            <w:r>
+              <w:t xml:space="preserve">Lúc mất mạng: </w:t>
+            </w:r>
+            <w:r>
+              <w:rPr>
+                <w:i/>
+              </w:rPr>
+              <w:t>Chờ gửi — tự gửi khi có mạng lại</w:t>
+            </w:r>
+            <w:r>
+              <w:t xml:space="preserve">, thẻ có dòng vàng </w:t>
+            </w:r>
+            <w:r>
+              <w:rPr>
+                <w:i/>
+              </w:rPr>
+              <w:t>Báo cân ở mỏ · Chờ gửi…</w:t>
+            </w:r>
+            <w:r>
+              <w:t xml:space="preserve">, nút tạm ẩn. Có mạng lại: </w:t>
+            </w:r>
+            <w:r>
+              <w:rPr>
+                <w:i/>
+              </w:rPr>
+              <w:t>Đã gửi xong 1 lần báo cân chờ gửi</w:t>
             </w:r>
             <w:r>
               <w:t xml:space="preserve">, </w:t>
@@ -19495,74 +20068,21 @@
               <w:rPr>
                 <w:b/>
               </w:rPr>
-              <w:t>Ngày phiếu quặng</w:t>
-            </w:r>
-            <w:r>
-              <w:t xml:space="preserve"> → </w:t>
-            </w:r>
-            <w:r>
-              <w:rPr>
-                <w:b/>
-              </w:rPr>
-              <w:t>Lưu</w:t>
-            </w:r>
-            <w:r>
-              <w:t xml:space="preserve"> → </w:t>
-            </w:r>
-            <w:r>
-              <w:rPr>
-                <w:b/>
-              </w:rPr>
-              <w:t>Xác nhận kiểm tra</w:t>
-            </w:r>
-            <w:r>
-              <w:t xml:space="preserve"> mục II</w:t>
-            </w:r>
-          </w:p>
-        </w:tc>
-        <w:tc>
-          <w:tcPr>
-            <w:tcW w:type="dxa" w:w="1440"/>
-          </w:tcPr>
-          <w:p>
-            <w:r/>
-            <w:r>
-              <w:rPr>
-                <w:b/>
-              </w:rPr>
               <w:t>Cân tại mỏ</w:t>
             </w:r>
             <w:r>
-              <w:t xml:space="preserve"> tự = 40; mục II </w:t>
-            </w:r>
-            <w:r>
-              <w:rPr>
-                <w:i/>
-              </w:rPr>
-              <w:t>Đã kiểm</w:t>
-            </w:r>
-            <w:r>
-              <w:t xml:space="preserve">; không cần ảnh phiếu quặng; ô </w:t>
-            </w:r>
-            <w:r>
-              <w:rPr>
-                <w:b/>
-              </w:rPr>
-              <w:t>Cân tại bãi khi về</w:t>
-            </w:r>
-            <w:r>
-              <w:t xml:space="preserve"> vẫn xám</w:t>
-            </w:r>
-          </w:p>
-        </w:tc>
-        <w:tc>
-          <w:tcPr>
-            <w:tcW w:type="dxa" w:w="1440"/>
-          </w:tcPr>
-          <w:p>
-            <w:r/>
-            <w:r>
-              <w:t>10b, 5</w:t>
+              <w:t xml:space="preserve"> = 40</w:t>
+            </w:r>
+          </w:p>
+        </w:tc>
+        <w:tc>
+          <w:tcPr>
+            <w:tcW w:type="dxa" w:w="1440"/>
+          </w:tcPr>
+          <w:p>
+            <w:r/>
+            <w:r>
+              <w:t>10b</w:t>
             </w:r>
           </w:p>
         </w:tc>
@@ -19583,7 +20103,7 @@
           <w:p>
             <w:r/>
             <w:r>
-              <w:t>T11</w:t>
+              <w:t>T10d</w:t>
             </w:r>
           </w:p>
         </w:tc>
@@ -19598,7 +20118,7 @@
                 <w:rFonts w:ascii="Consolas" w:hAnsi="Consolas"/>
                 <w:sz w:val="19"/>
               </w:rPr>
-              <w:t>tx01</w:t>
+              <w:t>thabok</w:t>
             </w:r>
             <w:r>
               <w:t xml:space="preserve"> → </w:t>
@@ -19608,38 +20128,118 @@
                 <w:rFonts w:ascii="Consolas" w:hAnsi="Consolas"/>
                 <w:sz w:val="19"/>
               </w:rPr>
-              <w:t>khonl</w:t>
-            </w:r>
-          </w:p>
-        </w:tc>
-        <w:tc>
-          <w:tcPr>
-            <w:tcW w:type="dxa" w:w="1440"/>
-          </w:tcPr>
-          <w:p>
-            <w:r/>
-            <w:r>
-              <w:t xml:space="preserve">Tài xế </w:t>
-            </w:r>
-            <w:r>
-              <w:rPr>
-                <w:b/>
-              </w:rPr>
-              <w:t>Khai đổ nhiên liệu</w:t>
-            </w:r>
-            <w:r>
-              <w:t xml:space="preserve"> (số lít, trạm VN) → </w:t>
+              <w:t>ketoan</w:t>
+            </w:r>
+            <w:r>
+              <w:t xml:space="preserve"> · điều xe</w:t>
+            </w:r>
+          </w:p>
+        </w:tc>
+        <w:tc>
+          <w:tcPr>
+            <w:tcW w:type="dxa" w:w="1440"/>
+          </w:tcPr>
+          <w:p>
+            <w:r/>
+            <w:r>
+              <w:t xml:space="preserve">Bãi: phiếu T01 thẻ </w:t>
+            </w:r>
+            <w:r>
+              <w:rPr>
+                <w:b/>
+              </w:rPr>
+              <w:t>II</w:t>
+            </w:r>
+            <w:r>
+              <w:t xml:space="preserve"> — xem ô </w:t>
+            </w:r>
+            <w:r>
+              <w:rPr>
+                <w:b/>
+              </w:rPr>
+              <w:t>Cân tại mỏ (t)</w:t>
+            </w:r>
+            <w:r>
+              <w:t xml:space="preserve"> 40 và ảnh ở </w:t>
+            </w:r>
+            <w:r>
+              <w:rPr>
+                <w:b/>
+              </w:rPr>
+              <w:t>Phiếu quặng đính kèm</w:t>
+            </w:r>
+            <w:r>
+              <w:t xml:space="preserve"> → </w:t>
+            </w:r>
+            <w:r>
+              <w:rPr>
+                <w:b/>
+              </w:rPr>
+              <w:t>Gửi kiểm tra</w:t>
+            </w:r>
+            <w:r>
+              <w:t xml:space="preserve"> mục II. Kế toán: gõ </w:t>
+            </w:r>
+            <w:r>
+              <w:rPr>
+                <w:b/>
+              </w:rPr>
+              <w:t>Số phiếu quặng</w:t>
+            </w:r>
+            <w:r>
+              <w:t xml:space="preserve">, </w:t>
+            </w:r>
+            <w:r>
+              <w:rPr>
+                <w:b/>
+              </w:rPr>
+              <w:t>Ngày phiếu quặng</w:t>
+            </w:r>
+            <w:r>
+              <w:t xml:space="preserve"> → </w:t>
+            </w:r>
+            <w:r>
+              <w:rPr>
+                <w:b/>
+              </w:rPr>
+              <w:t>Lưu</w:t>
+            </w:r>
+            <w:r>
+              <w:t xml:space="preserve"> → </w:t>
+            </w:r>
+            <w:r>
+              <w:rPr>
+                <w:b/>
+              </w:rPr>
+              <w:t>Xác nhận kiểm tra</w:t>
+            </w:r>
+            <w:r>
+              <w:t xml:space="preserve"> mục II. Rồi </w:t>
             </w:r>
             <w:r>
               <w:rPr>
                 <w:rFonts w:ascii="Consolas" w:hAnsi="Consolas"/>
                 <w:sz w:val="19"/>
               </w:rPr>
-              <w:t>khonl</w:t>
-            </w:r>
-            <w:r>
-              <w:t xml:space="preserve"> </w:t>
-            </w:r>
+              <w:t>tx01</w:t>
+            </w:r>
+            <w:r>
+              <w:t xml:space="preserve"> tải lại </w:t>
+            </w:r>
+            <w:r>
+              <w:rPr>
+                <w:b/>
+              </w:rPr>
+              <w:t>Phiếu của tôi</w:t>
+            </w:r>
+          </w:p>
+        </w:tc>
+        <w:tc>
+          <w:tcPr>
+            <w:tcW w:type="dxa" w:w="1440"/>
+          </w:tcPr>
+          <w:p>
+            <w:r/>
             <w:r>
               <w:rPr>
                 <w:b/>
@@ -19647,39 +20247,177 @@
               <w:t>Theo dõi tuyến</w:t>
             </w:r>
             <w:r>
-              <w:t xml:space="preserve"> → sự cố → </w:t>
-            </w:r>
-            <w:r>
-              <w:rPr>
-                <w:b/>
-              </w:rPr>
-              <w:t>Duyệt</w:t>
-            </w:r>
-          </w:p>
-        </w:tc>
-        <w:tc>
-          <w:tcPr>
-            <w:tcW w:type="dxa" w:w="1440"/>
-          </w:tcPr>
-          <w:p>
-            <w:r/>
-            <w:r>
-              <w:t xml:space="preserve">Thành dòng mục III nguồn mua, mục III mở lại </w:t>
+              <w:t xml:space="preserve"> có dòng diễn biến </w:t>
             </w:r>
             <w:r>
               <w:rPr>
                 <w:i/>
               </w:rPr>
-              <w:t>Đã nhập</w:t>
-            </w:r>
-            <w:r>
-              <w:t xml:space="preserve">; </w:t>
-            </w:r>
+              <w:t>Báo cân tại mỏ 40 t (trước 39.8 t)…</w:t>
+            </w:r>
+            <w:r>
+              <w:t xml:space="preserve">; mục II </w:t>
+            </w:r>
+            <w:r>
+              <w:rPr>
+                <w:i/>
+              </w:rPr>
+              <w:t>Đã kiểm</w:t>
+            </w:r>
+            <w:r>
+              <w:t xml:space="preserve">; ô </w:t>
+            </w:r>
+            <w:r>
+              <w:rPr>
+                <w:b/>
+              </w:rPr>
+              <w:t>Cân tại bãi khi về</w:t>
+            </w:r>
+            <w:r>
+              <w:t xml:space="preserve"> vẫn xám; điện thoại tài xế </w:t>
+            </w:r>
+            <w:r>
+              <w:rPr>
+                <w:b/>
+              </w:rPr>
+              <w:t>không còn</w:t>
+            </w:r>
+            <w:r>
+              <w:t xml:space="preserve"> nút </w:t>
+            </w:r>
+            <w:r>
+              <w:rPr>
+                <w:b/>
+              </w:rPr>
+              <w:t>Báo cân ở mỏ</w:t>
+            </w:r>
+          </w:p>
+        </w:tc>
+        <w:tc>
+          <w:tcPr>
+            <w:tcW w:type="dxa" w:w="1440"/>
+          </w:tcPr>
+          <w:p>
+            <w:r/>
+            <w:r>
+              <w:t>10b, 5</w:t>
+            </w:r>
+          </w:p>
+        </w:tc>
+        <w:tc>
+          <w:tcPr>
+            <w:tcW w:type="dxa" w:w="1440"/>
+          </w:tcPr>
+          <w:p>
+            <w:r/>
+          </w:p>
+        </w:tc>
+      </w:tr>
+      <w:tr>
+        <w:tc>
+          <w:tcPr>
+            <w:tcW w:type="dxa" w:w="1440"/>
+          </w:tcPr>
+          <w:p>
+            <w:r/>
+            <w:r>
+              <w:t>T11</w:t>
+            </w:r>
+          </w:p>
+        </w:tc>
+        <w:tc>
+          <w:tcPr>
+            <w:tcW w:type="dxa" w:w="1440"/>
+          </w:tcPr>
+          <w:p>
+            <w:r/>
             <w:r>
               <w:rPr>
                 <w:rFonts w:ascii="Consolas" w:hAnsi="Consolas"/>
                 <w:sz w:val="19"/>
               </w:rPr>
+              <w:t>tx01</w:t>
+            </w:r>
+            <w:r>
+              <w:t xml:space="preserve"> → </w:t>
+            </w:r>
+            <w:r>
+              <w:rPr>
+                <w:rFonts w:ascii="Consolas" w:hAnsi="Consolas"/>
+                <w:sz w:val="19"/>
+              </w:rPr>
+              <w:t>khonl</w:t>
+            </w:r>
+          </w:p>
+        </w:tc>
+        <w:tc>
+          <w:tcPr>
+            <w:tcW w:type="dxa" w:w="1440"/>
+          </w:tcPr>
+          <w:p>
+            <w:r/>
+            <w:r>
+              <w:t xml:space="preserve">Tài xế </w:t>
+            </w:r>
+            <w:r>
+              <w:rPr>
+                <w:b/>
+              </w:rPr>
+              <w:t>Khai đổ nhiên liệu</w:t>
+            </w:r>
+            <w:r>
+              <w:t xml:space="preserve"> (số lít, trạm VN) → </w:t>
+            </w:r>
+            <w:r>
+              <w:rPr>
+                <w:rFonts w:ascii="Consolas" w:hAnsi="Consolas"/>
+                <w:sz w:val="19"/>
+              </w:rPr>
+              <w:t>khonl</w:t>
+            </w:r>
+            <w:r>
+              <w:t xml:space="preserve"> </w:t>
+            </w:r>
+            <w:r>
+              <w:rPr>
+                <w:b/>
+              </w:rPr>
+              <w:t>Theo dõi tuyến</w:t>
+            </w:r>
+            <w:r>
+              <w:t xml:space="preserve"> → sự cố → </w:t>
+            </w:r>
+            <w:r>
+              <w:rPr>
+                <w:b/>
+              </w:rPr>
+              <w:t>Duyệt</w:t>
+            </w:r>
+          </w:p>
+        </w:tc>
+        <w:tc>
+          <w:tcPr>
+            <w:tcW w:type="dxa" w:w="1440"/>
+          </w:tcPr>
+          <w:p>
+            <w:r/>
+            <w:r>
+              <w:t xml:space="preserve">Thành dòng mục III nguồn mua, mục III mở lại </w:t>
+            </w:r>
+            <w:r>
+              <w:rPr>
+                <w:i/>
+              </w:rPr>
+              <w:t>Đã nhập</w:t>
+            </w:r>
+            <w:r>
+              <w:t xml:space="preserve">; </w:t>
+            </w:r>
+            <w:r>
+              <w:rPr>
+                <w:rFonts w:ascii="Consolas" w:hAnsi="Consolas"/>
+                <w:sz w:val="19"/>
+              </w:rPr>
               <w:t>khonl</w:t>
             </w:r>
             <w:r>
@@ -19750,13 +20488,22 @@
               <w:t>Xe đã tới · nhập cân cuối</w:t>
             </w:r>
             <w:r>
-              <w:t xml:space="preserve"> → </w:t>
-            </w:r>
-            <w:r>
-              <w:rPr>
-                <w:b/>
-              </w:rPr>
-              <w:t>Cân cuối (tấn)</w:t>
+              <w:t xml:space="preserve"> → ô </w:t>
+            </w:r>
+            <w:r>
+              <w:rPr>
+                <w:b/>
+              </w:rPr>
+              <w:t>Cân tại mỏ (t)</w:t>
+            </w:r>
+            <w:r>
+              <w:t xml:space="preserve"> đã điền sẵn 40 (không sửa) → </w:t>
+            </w:r>
+            <w:r>
+              <w:rPr>
+                <w:b/>
+              </w:rPr>
+              <w:t>Cân tại bãi khi về (t)</w:t>
             </w:r>
             <w:r>
               <w:t xml:space="preserve"> 39,6, ngày về, km về → </w:t>
@@ -24113,6 +24860,183 @@
                 <w:i/>
               </w:rPr>
               <w:t>Chưa nhận tiền tạm ứng thì chưa xuất phát</w:t>
+            </w:r>
+          </w:p>
+        </w:tc>
+        <w:tc>
+          <w:tcPr>
+            <w:tcW w:type="dxa" w:w="1728"/>
+          </w:tcPr>
+          <w:p>
+            <w:r/>
+          </w:p>
+        </w:tc>
+      </w:tr>
+      <w:tr>
+        <w:tc>
+          <w:tcPr>
+            <w:tcW w:type="dxa" w:w="1728"/>
+          </w:tcPr>
+          <w:p>
+            <w:r/>
+            <w:r>
+              <w:t>T47b</w:t>
+            </w:r>
+          </w:p>
+        </w:tc>
+        <w:tc>
+          <w:tcPr>
+            <w:tcW w:type="dxa" w:w="1728"/>
+          </w:tcPr>
+          <w:p>
+            <w:r/>
+            <w:r>
+              <w:rPr>
+                <w:rFonts w:ascii="Consolas" w:hAnsi="Consolas"/>
+                <w:sz w:val="19"/>
+              </w:rPr>
+              <w:t>thabok</w:t>
+            </w:r>
+            <w:r>
+              <w:t xml:space="preserve"> · điều xe</w:t>
+            </w:r>
+          </w:p>
+        </w:tc>
+        <w:tc>
+          <w:tcPr>
+            <w:tcW w:type="dxa" w:w="1728"/>
+          </w:tcPr>
+          <w:p>
+            <w:r/>
+            <w:r>
+              <w:t xml:space="preserve">Lập một phiếu </w:t>
+            </w:r>
+            <w:r>
+              <w:rPr>
+                <w:b/>
+              </w:rPr>
+              <w:t>Gom</w:t>
+            </w:r>
+            <w:r>
+              <w:t xml:space="preserve"> thử, để trống </w:t>
+            </w:r>
+            <w:r>
+              <w:rPr>
+                <w:b/>
+              </w:rPr>
+              <w:t>Cân tại mỏ</w:t>
+            </w:r>
+            <w:r>
+              <w:t xml:space="preserve"> → </w:t>
+            </w:r>
+            <w:r>
+              <w:rPr>
+                <w:b/>
+              </w:rPr>
+              <w:t>Lưu</w:t>
+            </w:r>
+            <w:r>
+              <w:t xml:space="preserve"> → </w:t>
+            </w:r>
+            <w:r>
+              <w:rPr>
+                <w:b/>
+              </w:rPr>
+              <w:t>Xe đã tới · nhập cân cuối</w:t>
+            </w:r>
+            <w:r>
+              <w:t xml:space="preserve"> → để trống ô </w:t>
+            </w:r>
+            <w:r>
+              <w:rPr>
+                <w:b/>
+              </w:rPr>
+              <w:t>Cân tại mỏ (t)</w:t>
+            </w:r>
+            <w:r>
+              <w:t xml:space="preserve"> → </w:t>
+            </w:r>
+            <w:r>
+              <w:rPr>
+                <w:b/>
+              </w:rPr>
+              <w:t>Đồng ý</w:t>
+            </w:r>
+            <w:r>
+              <w:t xml:space="preserve"> (cần tạm ứng đã chi, hoặc làm bằng </w:t>
+            </w:r>
+            <w:r>
+              <w:rPr>
+                <w:rFonts w:ascii="Consolas" w:hAnsi="Consolas"/>
+                <w:sz w:val="19"/>
+              </w:rPr>
+              <w:t>admin</w:t>
+            </w:r>
+            <w:r>
+              <w:t>)</w:t>
+            </w:r>
+          </w:p>
+        </w:tc>
+        <w:tc>
+          <w:tcPr>
+            <w:tcW w:type="dxa" w:w="1728"/>
+          </w:tcPr>
+          <w:p>
+            <w:r/>
+            <w:r>
+              <w:t xml:space="preserve">Máy nhắc </w:t>
+            </w:r>
+            <w:r>
+              <w:rPr>
+                <w:i/>
+              </w:rPr>
+              <w:t>Cân tại mỏ (t)?</w:t>
+            </w:r>
+            <w:r>
+              <w:t xml:space="preserve">, phiếu </w:t>
+            </w:r>
+            <w:r>
+              <w:rPr>
+                <w:b/>
+              </w:rPr>
+              <w:t>chưa</w:t>
+            </w:r>
+            <w:r>
+              <w:t xml:space="preserve"> thành </w:t>
+            </w:r>
+            <w:r>
+              <w:rPr>
+                <w:i/>
+              </w:rPr>
+              <w:t>Đã tới</w:t>
+            </w:r>
+            <w:r>
+              <w:t xml:space="preserve">; gõ cân tại mỏ rồi </w:t>
+            </w:r>
+            <w:r>
+              <w:rPr>
+                <w:b/>
+              </w:rPr>
+              <w:t>Đồng ý</w:t>
+            </w:r>
+            <w:r>
+              <w:t xml:space="preserve"> thì được và </w:t>
+            </w:r>
+            <w:r>
+              <w:rPr>
+                <w:b/>
+              </w:rPr>
+              <w:t>Kho hàng</w:t>
+            </w:r>
+            <w:r>
+              <w:t xml:space="preserve"> có lô mới. Xoá phiếu thử bằng </w:t>
+            </w:r>
+            <w:r>
+              <w:rPr>
+                <w:rFonts w:ascii="Consolas" w:hAnsi="Consolas"/>
+                <w:sz w:val="19"/>
+              </w:rPr>
+              <w:t>admin</w:t>
             </w:r>
           </w:p>
         </w:tc>

</xml_diff>

<commit_message>
Tài liệu A → Z mục 10.0: dữ liệu tiền đã dời sang trang kế toán (29/09 10:47) — số để đối chiếu khi test
Bỏ năm lệnh dời (đã chạy xong, chạy thử lại ra 0); ghi bản sao lưu mới 20260929_1046; bảng số phải thấy ở Hóa đơn vận
chuyển, Hoá đơn gộp tháng, Xe liên kết; bước 2 đổi thành khởi động lại 8020 cho bản Báo cân ở mỏ.

Co-Authored-By: Claude Opus 5.5 (1M context) <noreply@anthropic.com>
</commit_message>
<xml_diff>
--- a/DOCS/word/LUONG_A_Z_HAI_TRANG.docx
+++ b/DOCS/word/LUONG_A_Z_HAI_TRANG.docx
@@ -17887,110 +17887,184 @@
         <w:rPr>
           <w:b/>
         </w:rPr>
-        <w:t>Dời dữ liệu tiền sang trang kế toán</w:t>
-      </w:r>
-      <w:r>
-        <w:t xml:space="preserve"> (chỉ làm một lần, </w:t>
-      </w:r>
-      <w:r>
-        <w:rPr>
-          <w:b/>
-        </w:rPr>
-        <w:t>trước khi bật máy</w:t>
-      </w:r>
-      <w:r>
-        <w:t>): trong PowerShell chạy lần lượt năm lệnh dưới; lệnh nào báo lỗi thì dừng, gửi em xem.</w:t>
+        <w:t>Dữ liệu tiền đã dời sang trang kế toán — xong ngày 29/09/2026 lúc 10:47, không phải làm lại.</w:t>
+      </w:r>
+      <w:r>
+        <w:t xml:space="preserve"> Em đã sao lưu hai DB ngay trước khi dời, chạy thử, rồi chạy thật cả năm bước (hoá đơn và thu tiền, bản chép trên phiếu, chủ xe, tất toán, nhà cung cấp). Chạy thử lại lần nữa thì mọi bước ra 0, tức là không còn gì chưa dời. Số đã sang, để anh đối chiếu khi test:</w:t>
       </w:r>
     </w:p>
-    <w:p>
-      <w:pPr>
-        <w:spacing w:after="0"/>
-        <w:ind w:left="360"/>
-      </w:pPr>
-      <w:r>
-        <w:rPr>
-          <w:rFonts w:ascii="Consolas" w:hAnsi="Consolas"/>
-          <w:sz w:val="18"/>
-        </w:rPr>
-        <w:t>cd D:\Demo_Lao\EPL_KETOAN;   C:\Users\zinnn\miniconda3\envs\Auto\python.exe -X utf8 tools\doi_doanh_thu.py that</w:t>
-      </w:r>
-    </w:p>
-    <w:p>
-      <w:pPr>
-        <w:spacing w:after="0"/>
-        <w:ind w:left="360"/>
-      </w:pPr>
-      <w:r>
-        <w:rPr>
-          <w:rFonts w:ascii="Consolas" w:hAnsi="Consolas"/>
-          <w:sz w:val="18"/>
-        </w:rPr>
-        <w:t>cd D:\Demo_Lao\EPL_LAO_REAL; C:\Users\zinnn\miniconda3\envs\Auto\python.exe -X utf8 tools\ban_chep_doanh_thu.py that</w:t>
-      </w:r>
-    </w:p>
-    <w:p>
-      <w:pPr>
-        <w:spacing w:after="0"/>
-        <w:ind w:left="360"/>
-      </w:pPr>
-      <w:r>
-        <w:rPr>
-          <w:rFonts w:ascii="Consolas" w:hAnsi="Consolas"/>
-          <w:sz w:val="18"/>
-        </w:rPr>
-        <w:t>cd D:\Demo_Lao\EPL_KETOAN;   C:\Users\zinnn\miniconda3\envs\Auto\python.exe -X utf8 tools\doi_chu_xe.py that</w:t>
-      </w:r>
-    </w:p>
-    <w:p>
-      <w:pPr>
-        <w:spacing w:after="0"/>
-        <w:ind w:left="360"/>
-      </w:pPr>
-      <w:r>
-        <w:rPr>
-          <w:rFonts w:ascii="Consolas" w:hAnsi="Consolas"/>
-          <w:sz w:val="18"/>
-        </w:rPr>
-        <w:t>cd D:\Demo_Lao\EPL_KETOAN;   C:\Users\zinnn\miniconda3\envs\Auto\python.exe -X utf8 tools\doi_tat_toan.py that</w:t>
-      </w:r>
-    </w:p>
-    <w:p>
-      <w:pPr>
-        <w:spacing w:after="0"/>
-        <w:ind w:left="360"/>
-      </w:pPr>
-      <w:r>
-        <w:rPr>
-          <w:rFonts w:ascii="Consolas" w:hAnsi="Consolas"/>
-          <w:sz w:val="18"/>
-        </w:rPr>
-        <w:t>cd D:\Demo_Lao\EPL_KETOAN;   C:\Users\zinnn\miniconda3\envs\Auto\python.exe -X utf8 tools\doi_nha_cung_cap.py that</w:t>
-      </w:r>
-    </w:p>
-    <w:p/>
     <w:p>
       <w:pPr>
         <w:jc w:val="both"/>
       </w:pPr>
       <w:r>
-        <w:t xml:space="preserve">Bản sao lưu hai DB trước khi dời: </w:t>
+        <w:t>| Trang kế toán, màn | Phải thấy |</w:t>
+      </w:r>
+    </w:p>
+    <w:p>
+      <w:pPr>
+        <w:jc w:val="both"/>
+      </w:pPr>
+      <w:r>
+        <w:t>|---|---|</w:t>
+      </w:r>
+    </w:p>
+    <w:p>
+      <w:pPr>
+        <w:jc w:val="both"/>
+      </w:pPr>
+      <w:r>
+        <w:t xml:space="preserve">| </w:t>
+      </w:r>
+      <w:r>
+        <w:rPr>
+          <w:b/>
+        </w:rPr>
+        <w:t>Tiền vận chuyển → Hóa đơn vận chuyển</w:t>
+      </w:r>
+      <w:r>
+        <w:t xml:space="preserve"> (</w:t>
       </w:r>
       <w:r>
         <w:rPr>
           <w:rFonts w:ascii="Consolas" w:hAnsi="Consolas"/>
           <w:sz w:val="19"/>
         </w:rPr>
-        <w:t>D:\Demo_Lao\saoluu\saoluu_epl_lao_20260928_2208.dump</w:t>
-      </w:r>
-      <w:r>
-        <w:t xml:space="preserve"> và </w:t>
+        <w:t>doanhthu</w:t>
+      </w:r>
+      <w:r>
+        <w:t xml:space="preserve">) | 7 phiếu đã lập hoá đơn. Đã thu đủ: T4-0430-08, T4-0431-08, T4-0440-09, T4-0442-09, T4-0443-09. Thu một phần: </w:t>
+      </w:r>
+      <w:r>
+        <w:rPr>
+          <w:b/>
+        </w:rPr>
+        <w:t>T4-0441-09</w:t>
+      </w:r>
+      <w:r>
+        <w:t xml:space="preserve"> (đã thu 349,36 USD, còn 1.441,44 USD). Chưa thu đồng nào: </w:t>
+      </w:r>
+      <w:r>
+        <w:rPr>
+          <w:b/>
+        </w:rPr>
+        <w:t>T4-0446-09</w:t>
+      </w:r>
+      <w:r>
+        <w:t xml:space="preserve"> (1.689,20 USD) — dùng hai phiếu này để thử ghi thu |</w:t>
+      </w:r>
+    </w:p>
+    <w:p>
+      <w:pPr>
+        <w:jc w:val="both"/>
+      </w:pPr>
+      <w:r>
+        <w:t xml:space="preserve">| </w:t>
+      </w:r>
+      <w:r>
+        <w:rPr>
+          <w:b/>
+        </w:rPr>
+        <w:t>Tiền vận chuyển → Hoá đơn gộp tháng</w:t>
+      </w:r>
+      <w:r>
+        <w:t xml:space="preserve"> | Tờ </w:t>
+      </w:r>
+      <w:r>
+        <w:rPr>
+          <w:b/>
+        </w:rPr>
+        <w:t>HDT-202609-01</w:t>
+      </w:r>
+      <w:r>
+        <w:t>, 2 phiếu, 79.279.200 LAK; đã thu 47.567.520, còn 31.711.680 LAK |</w:t>
+      </w:r>
+    </w:p>
+    <w:p>
+      <w:pPr>
+        <w:jc w:val="both"/>
+      </w:pPr>
+      <w:r>
+        <w:t xml:space="preserve">| </w:t>
+      </w:r>
+      <w:r>
+        <w:rPr>
+          <w:b/>
+        </w:rPr>
+        <w:t>Tiền vận chuyển → Xe liên kết</w:t>
+      </w:r>
+      <w:r>
+        <w:t xml:space="preserve"> (</w:t>
       </w:r>
       <w:r>
         <w:rPr>
           <w:rFonts w:ascii="Consolas" w:hAnsi="Consolas"/>
           <w:sz w:val="19"/>
         </w:rPr>
-        <w:t>saoluu_epl_ketoan_20260928_2208.dump</w:t>
+        <w:t>ketoan</w:t>
+      </w:r>
+      <w:r>
+        <w:t>) | Một đợt trả ngày 23/09 cho ທ້າວ ຄຳຫລ້າ: 1.269,47 USD (tổng 1.297,65, 1 phiếu) |</w:t>
+      </w:r>
+    </w:p>
+    <w:p>
+      <w:pPr>
+        <w:jc w:val="both"/>
+      </w:pPr>
+      <w:r>
+        <w:t xml:space="preserve">| </w:t>
+      </w:r>
+      <w:r>
+        <w:rPr>
+          <w:b/>
+        </w:rPr>
+        <w:t>Tất toán tài xế</w:t>
+      </w:r>
+      <w:r>
+        <w:t xml:space="preserve">, </w:t>
+      </w:r>
+      <w:r>
+        <w:rPr>
+          <w:b/>
+        </w:rPr>
+        <w:t>Theo dõi nhà cung cấp</w:t>
+      </w:r>
+      <w:r>
+        <w:t xml:space="preserve"> | Chưa có kỳ chốt, chưa có lần trả — DB thật trước đây chưa ai chốt hay trả |</w:t>
+      </w:r>
+    </w:p>
+    <w:p>
+      <w:pPr>
+        <w:jc w:val="both"/>
+      </w:pPr>
+      <w:r>
+        <w:t xml:space="preserve">Trên trang điều xe, các phiếu đó vẫn hiện </w:t>
+      </w:r>
+      <w:r>
+        <w:rPr>
+          <w:i/>
+        </w:rPr>
+        <w:t>đã thu · còn lại</w:t>
+      </w:r>
+      <w:r>
+        <w:t xml:space="preserve"> đúng như trên (bản chép). Bản sao lưu ngay trước khi dời: </w:t>
+      </w:r>
+      <w:r>
+        <w:rPr>
+          <w:rFonts w:ascii="Consolas" w:hAnsi="Consolas"/>
+          <w:sz w:val="19"/>
+        </w:rPr>
+        <w:t>D:\Demo_Lao\saoluu\saoluu_epl_lao_20260929_1046.dump</w:t>
+      </w:r>
+      <w:r>
+        <w:t xml:space="preserve"> và </w:t>
+      </w:r>
+      <w:r>
+        <w:rPr>
+          <w:rFonts w:ascii="Consolas" w:hAnsi="Consolas"/>
+          <w:sz w:val="19"/>
+        </w:rPr>
+        <w:t>saoluu_epl_ketoan_20260929_1046.dump</w:t>
       </w:r>
       <w:r>
         <w:t>.</w:t>
@@ -18001,16 +18075,31 @@
         <w:pStyle w:val="ListNumber"/>
       </w:pPr>
       <w:r>
-        <w:t xml:space="preserve">Bật máy </w:t>
-      </w:r>
-      <w:r>
-        <w:rPr>
-          <w:b/>
-        </w:rPr>
-        <w:t>8020</w:t>
-      </w:r>
-      <w:r>
-        <w:t xml:space="preserve"> (trang điều xe) và </w:t>
+        <w:rPr>
+          <w:b/>
+        </w:rPr>
+        <w:t>Khởi động lại máy 8020</w:t>
+      </w:r>
+      <w:r>
+        <w:t xml:space="preserve"> (trang điều xe) để nhận bản có </w:t>
+      </w:r>
+      <w:r>
+        <w:rPr>
+          <w:b/>
+        </w:rPr>
+        <w:t>Báo cân ở mỏ</w:t>
+      </w:r>
+      <w:r>
+        <w:t xml:space="preserve"> (bước 10b), rồi </w:t>
+      </w:r>
+      <w:r>
+        <w:rPr>
+          <w:b/>
+        </w:rPr>
+        <w:t>Ctrl+F5</w:t>
+      </w:r>
+      <w:r>
+        <w:t xml:space="preserve"> trên trình duyệt. Máy </w:t>
       </w:r>
       <w:r>
         <w:rPr>
@@ -18019,7 +18108,7 @@
         <w:t>8030</w:t>
       </w:r>
       <w:r>
-        <w:t xml:space="preserve"> (trang kế toán) như thường lệ.</w:t>
+        <w:t xml:space="preserve"> không cần khởi động lại.</w:t>
       </w:r>
     </w:p>
     <w:p>

</xml_diff>

<commit_message>
Tài liệu A → Z: phần 1.2 và 3.4 nhắc Báo cân ở mỏ (việc ngoài hiện trường có hàng đợi)
Co-Authored-By: Claude Opus 5.5 (1M context) <noreply@anthropic.com>
</commit_message>
<xml_diff>
--- a/DOCS/word/LUONG_A_Z_HAI_TRANG.docx
+++ b/DOCS/word/LUONG_A_Z_HAI_TRANG.docx
@@ -796,7 +796,16 @@
         <w:t>Tài xế</w:t>
       </w:r>
       <w:r>
-        <w:t xml:space="preserve"> xuất phát, báo mốc, đổ dầu dọc đường, báo hỏng, giao hàng và ký nhận trên điện thoại.</w:t>
+        <w:t xml:space="preserve"> xuất phát, báo mốc, </w:t>
+      </w:r>
+      <w:r>
+        <w:rPr>
+          <w:b/>
+        </w:rPr>
+        <w:t>báo cân ở mỏ</w:t>
+      </w:r>
+      <w:r>
+        <w:t xml:space="preserve"> (phiếu gom), đổ dầu dọc đường, báo hỏng, giao hàng và ký nhận trên điện thoại.</w:t>
       </w:r>
     </w:p>
     <w:p>
@@ -4861,7 +4870,7 @@
         <w:t>không đụng kho, tiền</w:t>
       </w:r>
       <w:r>
-        <w:t xml:space="preserve"> vẫn chạy bình thường. Hai ngoại lệ dùng ngoài hiện trường được giữ hàng đợi trong máy: </w:t>
+        <w:t xml:space="preserve"> vẫn chạy bình thường. Ba việc ngoài hiện trường được giữ hàng đợi trong máy: </w:t>
       </w:r>
       <w:r>
         <w:rPr>
@@ -4870,13 +4879,22 @@
         <w:t>Cấp phát</w:t>
       </w:r>
       <w:r>
-        <w:t xml:space="preserve"> ở kho dầu và </w:t>
+        <w:t xml:space="preserve"> ở kho dầu, </w:t>
       </w:r>
       <w:r>
         <w:rPr>
           <w:b/>
         </w:rPr>
         <w:t>ký nhận giao hàng</w:t>
+      </w:r>
+      <w:r>
+        <w:t xml:space="preserve"> và </w:t>
+      </w:r>
+      <w:r>
+        <w:rPr>
+          <w:b/>
+        </w:rPr>
+        <w:t>báo cân ở mỏ</w:t>
       </w:r>
       <w:r>
         <w:t xml:space="preserve"> trên điện thoại tài xế. Bảng đầy đủ ở Phần 8.</w:t>

</xml_diff>

<commit_message>
Tài liệu A → Z bước 3: SL là số lượng (lượt, lần, ngày), không phải tiền; Bãi không thấy đơn giá nên dòng Tổng trống
Co-Authored-By: Claude Opus 5.5 (1M context) <noreply@anthropic.com>
</commit_message>
<xml_diff>
--- a/DOCS/word/LUONG_A_Z_HAI_TRANG.docx
+++ b/DOCS/word/LUONG_A_Z_HAI_TRANG.docx
@@ -6811,6 +6811,42 @@
           <w:b/>
         </w:rPr>
         <w:t>Khác (tự gõ)…</w:t>
+      </w:r>
+      <w:r>
+        <w:t xml:space="preserve">. </w:t>
+      </w:r>
+      <w:r>
+        <w:rPr>
+          <w:b/>
+        </w:rPr>
+        <w:t>SL là số lượng, không phải tiền</w:t>
+      </w:r>
+      <w:r>
+        <w:t xml:space="preserve"> — bao nhiêu lượt, lần, ngày của khoản đó (phí cao tốc 1 lượt qua trạm, phí đỗ xe 1 lần, tiền ăn 3 ngày…). Tiền = SL × </w:t>
+      </w:r>
+      <w:r>
+        <w:rPr>
+          <w:b/>
+        </w:rPr>
+        <w:t>Đơn giá</w:t>
+      </w:r>
+      <w:r>
+        <w:t xml:space="preserve">; Bãi không thấy cột đơn giá, thành tiền, nên dòng </w:t>
+      </w:r>
+      <w:r>
+        <w:rPr>
+          <w:b/>
+        </w:rPr>
+        <w:t>Tổng</w:t>
+      </w:r>
+      <w:r>
+        <w:t xml:space="preserve"> bên Bãi để trống — KT Chi phí nhập đơn giá ở bước 7. Mục III cũng vậy: SL là </w:t>
+      </w:r>
+      <w:r>
+        <w:rPr>
+          <w:b/>
+        </w:rPr>
+        <w:t>lít</w:t>
       </w:r>
       <w:r>
         <w:t>.</w:t>

</xml_diff>

<commit_message>
Tuyến có Km chiều về; ô Lúc đi tự điền theo công-tơ-mét xe; 5 tuyến mẫu có chiều về (chủ dự án chốt 29/09)
- routes.return_km: xe quay lại điểm đi (gom chạy rỗng lên mỏ, giao chạy rỗng về bãi). Km về ước tính trên phiếu và
  cảnh báo KM_LECH lúc khoá tính theo chiều đi + chiều về. Màn Tuyến đường: cột, dòng ↩ trên khung chi tiết, ô nhập
  kèm nút "= … km" chép tổng chiều đi; ô chọn tuyến trên phiếu ghi "· ↩ … km".
- Phiếu mới chọn xe thì ô Lúc đi điền sẵn công-tơ-mét của xe (km về chuyến trước), vẫn sửa được, đã gõ tay thì
  không đè; Phiếu mới nạp lại danh sách xe để lấy số mới nhất.
- tools/them_tuyen.py (chạy thử mặc định, 'that' mới ghi, qua API): 2 tuyến gom + 3 tuyến giao có chiều về, giá cước
  cho 3 khách; cần máy chủ bản có chiều về.
- kiem/thu_chieu_ve.py; tài liệu A → Z: 4.0, bước 1, 17, mục 6.7, 10.0 (bảng tuyến mẫu), ca T00, T01, T01b, T14.

Co-Authored-By: Claude Opus 5.5 (1M context) <noreply@anthropic.com>
</commit_message>
<xml_diff>
--- a/DOCS/word/LUONG_A_Z_HAI_TRANG.docx
+++ b/DOCS/word/LUONG_A_Z_HAI_TRANG.docx
@@ -306,7 +306,7 @@
         <w:t>10.</w:t>
       </w:r>
       <w:r>
-        <w:t xml:space="preserve"> Kịch bản test tay: chuẩn bị, rồi 57 ca theo thứ tự luồng</w:t>
+        <w:t xml:space="preserve"> Kịch bản test tay: chuẩn bị, rồi 59 ca theo thứ tự luồng</w:t>
       </w:r>
     </w:p>
     <w:p>
@@ -4985,7 +4985,16 @@
         <w:t>tx01</w:t>
       </w:r>
       <w:r>
-        <w:t xml:space="preserve">, chở </w:t>
+        <w:t xml:space="preserve">, tuyến </w:t>
+      </w:r>
+      <w:r>
+        <w:rPr>
+          <w:b/>
+        </w:rPr>
+        <w:t>ກາສີ → ທ່າບົກ</w:t>
+      </w:r>
+      <w:r>
+        <w:t xml:space="preserve">: xe chạy rỗng từ bãi lên mỏ, chở </w:t>
       </w:r>
       <w:r>
         <w:rPr>
@@ -4994,7 +5003,7 @@
         <w:t>40 tấn</w:t>
       </w:r>
       <w:r>
-        <w:t xml:space="preserve"> từ mỏ (ກາສີ) về bãi Thà Bốc (ທ່າບົກ).</w:t>
+        <w:t xml:space="preserve"> từ mỏ (ກາສີ) về bãi Thà Bốc (ທ່າບົກ) — 145 km chiều hàng + 145 km chiều về.</w:t>
       </w:r>
     </w:p>
     <w:p>
@@ -5037,7 +5046,16 @@
         <w:t>tx02</w:t>
       </w:r>
       <w:r>
-        <w:t xml:space="preserve">, lấy </w:t>
+        <w:t xml:space="preserve">, tuyến </w:t>
+      </w:r>
+      <w:r>
+        <w:rPr>
+          <w:b/>
+        </w:rPr>
+        <w:t>ທ່າບົກ → ທ່າເຮືອກະລໍ</w:t>
+      </w:r>
+      <w:r>
+        <w:t xml:space="preserve">: lấy </w:t>
       </w:r>
       <w:r>
         <w:rPr>
@@ -5046,7 +5064,7 @@
         <w:t>25 tấn</w:t>
       </w:r>
       <w:r>
-        <w:t xml:space="preserve"> từ lô của phiếu gom, chở từ bãi ra cảng.</w:t>
+        <w:t xml:space="preserve"> từ lô của phiếu gom, chở từ bãi qua cửa khẩu ດ່ານ ນໍ້າພາວ ra cảng, rồi chạy rỗng về bãi — 360 km + 360 km.</w:t>
       </w:r>
     </w:p>
     <w:p>
@@ -5904,7 +5922,7 @@
         <w:t>Ngày xe đi</w:t>
       </w:r>
       <w:r>
-        <w:t xml:space="preserve">, km </w:t>
+        <w:t xml:space="preserve">. Ô </w:t>
       </w:r>
       <w:r>
         <w:rPr>
@@ -5913,7 +5931,52 @@
         <w:t>Lúc đi</w:t>
       </w:r>
       <w:r>
-        <w:t xml:space="preserve">; </w:t>
+        <w:t xml:space="preserve"> (km) </w:t>
+      </w:r>
+      <w:r>
+        <w:rPr>
+          <w:b/>
+        </w:rPr>
+        <w:t>tự điền</w:t>
+      </w:r>
+      <w:r>
+        <w:t xml:space="preserve"> ngay khi chọn xe: đúng số </w:t>
+      </w:r>
+      <w:r>
+        <w:rPr>
+          <w:b/>
+        </w:rPr>
+        <w:t>Công-tơ-mét (km)</w:t>
+      </w:r>
+      <w:r>
+        <w:t xml:space="preserve"> của xe ở màn </w:t>
+      </w:r>
+      <w:r>
+        <w:rPr>
+          <w:b/>
+        </w:rPr>
+        <w:t>Xe</w:t>
+      </w:r>
+      <w:r>
+        <w:t xml:space="preserve"> — tức km về của chuyến trước, vì mỗi lần Bãi bấm </w:t>
+      </w:r>
+      <w:r>
+        <w:rPr>
+          <w:b/>
+        </w:rPr>
+        <w:t>Xe đã tới</w:t>
+      </w:r>
+      <w:r>
+        <w:t xml:space="preserve"> máy ghi km về vào xe. Dưới ô ghi </w:t>
+      </w:r>
+      <w:r>
+        <w:rPr>
+          <w:i/>
+        </w:rPr>
+        <w:t>Điền sẵn theo công-tơ-mét của xe — sửa được</w:t>
+      </w:r>
+      <w:r>
+        <w:t xml:space="preserve">: Bãi nhìn đồng hồ xe lúc lăn bánh, khớp thì để nguyên, lệch (xe chạy ngoài chuyến, đi sửa…) thì gõ lại; đã gõ tay thì đổi xe cũng không bị đè. Xe chưa có công-tơ-mét thì ô để trống, gõ tay. </w:t>
       </w:r>
       <w:r>
         <w:rPr>
@@ -5922,7 +5985,7 @@
         <w:t>Km về ước tính</w:t>
       </w:r>
       <w:r>
-        <w:t xml:space="preserve"> tự tính theo tuyến. Hai ô </w:t>
+        <w:t xml:space="preserve"> tự tính = lúc đi + km chiều đi + km chiều về của tuyến. Hai ô </w:t>
       </w:r>
       <w:r>
         <w:rPr>
@@ -6002,7 +6065,25 @@
         <w:t>Chọn tuyến</w:t>
       </w:r>
       <w:r>
-        <w:t xml:space="preserve"> (điểm đi, điểm đến tự điền); chọn </w:t>
+        <w:t xml:space="preserve"> </w:t>
+      </w:r>
+      <w:r>
+        <w:rPr>
+          <w:b/>
+        </w:rPr>
+        <w:t>ກາສີ → ທ່າບົກ</w:t>
+      </w:r>
+      <w:r>
+        <w:t xml:space="preserve"> — ô chọn ghi </w:t>
+      </w:r>
+      <w:r>
+        <w:rPr>
+          <w:i/>
+        </w:rPr>
+        <w:t>ກາສີ → ທ່າບົກ · 145.0 km · ↩ 145.0 km</w:t>
+      </w:r>
+      <w:r>
+        <w:t xml:space="preserve"> (km chiều hàng · km chiều về); điểm đi, điểm đến tự điền; chọn </w:t>
       </w:r>
       <w:r>
         <w:rPr>
@@ -10492,7 +10573,16 @@
         <w:pStyle w:val="ListNumber"/>
       </w:pPr>
       <w:r>
-        <w:t xml:space="preserve">Máy rà và hiện danh sách cảnh báo: km về lệch ước tính quá 10 %, hao hụt quá 1,5 %, thiếu cân cuối, thiếu km về, thiếu phiếu quặng (không có cả ảnh lẫn số phiếu), mục có chi mà chưa kiểm. Đọc từng điểm; đúng thì bấm </w:t>
+        <w:t xml:space="preserve">Máy rà và hiện danh sách cảnh báo: km về lệch ước tính quá 10 % (ước tính = lúc đi + chiều đi + chiều về của tuyến; câu cảnh báo ghi rõ </w:t>
+      </w:r>
+      <w:r>
+        <w:rPr>
+          <w:i/>
+        </w:rPr>
+        <w:t>tuyến … km + … km chiều về</w:t>
+      </w:r>
+      <w:r>
+        <w:t xml:space="preserve">), hao hụt quá 1,5 %, thiếu cân cuối, thiếu km về, thiếu phiếu quặng (không có cả ảnh lẫn số phiếu), mục có chi mà chưa kiểm. Đọc từng điểm; đúng thì bấm </w:t>
       </w:r>
       <w:r>
         <w:rPr>
@@ -15053,6 +15143,155 @@
       </w:r>
       <w:r>
         <w:t xml:space="preserve"> (Vận tải → Nhà cung cấp): KT Chi phí thêm, sửa, gắn trạm dầu Việt Nam với khách được cấn trừ; Bãi xem danh sách, số dòng, kỳ trả (không có tiền). Trả trạm và cấn trừ vào cước khách làm ở trang kế toán (6.6, bước 18).</w:t>
+      </w:r>
+    </w:p>
+    <w:p>
+      <w:pPr>
+        <w:pStyle w:val="ListBullet"/>
+      </w:pPr>
+      <w:r>
+        <w:rPr>
+          <w:b/>
+        </w:rPr>
+        <w:t>Tuyến đường</w:t>
+      </w:r>
+      <w:r>
+        <w:t xml:space="preserve"> (Danh mục → Tuyến đường; Bãi và KT Thu/Chi sửa): bảng tuyến có cột </w:t>
+      </w:r>
+      <w:r>
+        <w:rPr>
+          <w:b/>
+        </w:rPr>
+        <w:t>Tổng km</w:t>
+      </w:r>
+      <w:r>
+        <w:t xml:space="preserve"> (chiều hàng đi) và </w:t>
+      </w:r>
+      <w:r>
+        <w:rPr>
+          <w:b/>
+        </w:rPr>
+        <w:t>Km chiều về</w:t>
+      </w:r>
+      <w:r>
+        <w:t xml:space="preserve">. Bấm một tuyến → khung bên phải vẽ các điểm, cuối cùng là dòng </w:t>
+      </w:r>
+      <w:r>
+        <w:rPr>
+          <w:b/>
+        </w:rPr>
+        <w:t>↩</w:t>
+      </w:r>
+      <w:r>
+        <w:t xml:space="preserve"> quay lại điểm đi kèm km chiều về, và dòng tóm tắt </w:t>
+      </w:r>
+      <w:r>
+        <w:rPr>
+          <w:i/>
+        </w:rPr>
+        <w:t>Tổng km · Km chiều về · Cả đi và về</w:t>
+      </w:r>
+      <w:r>
+        <w:t xml:space="preserve">. </w:t>
+      </w:r>
+      <w:r>
+        <w:rPr>
+          <w:b/>
+        </w:rPr>
+        <w:t>Thêm</w:t>
+      </w:r>
+      <w:r>
+        <w:t xml:space="preserve"> / </w:t>
+      </w:r>
+      <w:r>
+        <w:rPr>
+          <w:b/>
+        </w:rPr>
+        <w:t>Sửa</w:t>
+      </w:r>
+      <w:r>
+        <w:t xml:space="preserve">: </w:t>
+      </w:r>
+      <w:r>
+        <w:rPr>
+          <w:b/>
+        </w:rPr>
+        <w:t>Tên tuyến</w:t>
+      </w:r>
+      <w:r>
+        <w:t xml:space="preserve">, </w:t>
+      </w:r>
+      <w:r>
+        <w:rPr>
+          <w:b/>
+        </w:rPr>
+        <w:t>Phí cao tốc (BOT) cả tuyến</w:t>
+      </w:r>
+      <w:r>
+        <w:t xml:space="preserve">, bảng </w:t>
+      </w:r>
+      <w:r>
+        <w:rPr>
+          <w:b/>
+        </w:rPr>
+        <w:t>Các điểm trên tuyến</w:t>
+      </w:r>
+      <w:r>
+        <w:t xml:space="preserve"> (tên điểm, </w:t>
+      </w:r>
+      <w:r>
+        <w:rPr>
+          <w:b/>
+        </w:rPr>
+        <w:t>Km từ điểm trước</w:t>
+      </w:r>
+      <w:r>
+        <w:t xml:space="preserve">, toạ độ nếu có), </w:t>
+      </w:r>
+      <w:r>
+        <w:rPr>
+          <w:b/>
+        </w:rPr>
+        <w:t>Thêm điểm</w:t>
+      </w:r>
+      <w:r>
+        <w:t xml:space="preserve">, rồi ô </w:t>
+      </w:r>
+      <w:r>
+        <w:rPr>
+          <w:b/>
+        </w:rPr>
+        <w:t>Km chiều về</w:t>
+      </w:r>
+      <w:r>
+        <w:t xml:space="preserve"> — nút </w:t>
+      </w:r>
+      <w:r>
+        <w:rPr>
+          <w:b/>
+        </w:rPr>
+        <w:t>= … km</w:t>
+      </w:r>
+      <w:r>
+        <w:t xml:space="preserve"> bên cạnh chép đúng tổng chiều đi (xe về đường cũ); để trống = xe không quay về. Các điểm là đường </w:t>
+      </w:r>
+      <w:r>
+        <w:rPr>
+          <w:b/>
+        </w:rPr>
+        <w:t>hàng</w:t>
+      </w:r>
+      <w:r>
+        <w:t xml:space="preserve"> đi (mỏ → bãi, bãi → cảng); chiều về là đoạn xe chạy không hàng — phiếu gom chạy rỗng từ bãi lên mỏ trước, phiếu giao chạy rỗng về bãi sau. Tuyến có chiều về thì </w:t>
+      </w:r>
+      <w:r>
+        <w:rPr>
+          <w:b/>
+        </w:rPr>
+        <w:t>BOT</w:t>
+      </w:r>
+      <w:r>
+        <w:t xml:space="preserve"> nên ghi cả hai lượt qua trạm (phí cao tốc tự thành một dòng mục IV khi lập phiếu).</w:t>
       </w:r>
     </w:p>
     <w:p>
@@ -18501,7 +18740,175 @@
         <w:t>tx03</w:t>
       </w:r>
       <w:r>
-        <w:t xml:space="preserve"> = ທ້າວ ສົມພອນ (tài xế xe liên kết); tuyến ກາສີ → ກາລໍ, ກາສີ → ທ່າເຮືອກະລໍ.</w:t>
+        <w:t xml:space="preserve"> = ທ້າວ ສົມພອນ (tài xế xe liên kết).</w:t>
+      </w:r>
+    </w:p>
+    <w:p>
+      <w:pPr>
+        <w:jc w:val="both"/>
+      </w:pPr>
+      <w:r>
+        <w:rPr>
+          <w:b/>
+        </w:rPr>
+        <w:t>Tuyến</w:t>
+      </w:r>
+      <w:r>
+        <w:t xml:space="preserve"> (Danh mục → Tuyến đường) — năm tuyến mẫu có </w:t>
+      </w:r>
+      <w:r>
+        <w:rPr>
+          <w:b/>
+        </w:rPr>
+        <w:t>chiều về</w:t>
+      </w:r>
+      <w:r>
+        <w:t xml:space="preserve"> thêm ngày 29/09, mỗi tuyến đã có giá cước cho cả 3 khách (theo tấn, USD, tỷ lệ theo km; giá thuê xe liên kết kém 0,5 USD/t):</w:t>
+      </w:r>
+    </w:p>
+    <w:p>
+      <w:pPr>
+        <w:jc w:val="both"/>
+      </w:pPr>
+      <w:r>
+        <w:t>| Tuyến | Dùng cho | Chiều hàng | Chiều về | Cả chuyến | BOT | Giá · thuê (USD/t) |</w:t>
+      </w:r>
+    </w:p>
+    <w:p>
+      <w:pPr>
+        <w:jc w:val="both"/>
+      </w:pPr>
+      <w:r>
+        <w:t>|---|---|---|---|---|---|---|</w:t>
+      </w:r>
+    </w:p>
+    <w:p>
+      <w:pPr>
+        <w:jc w:val="both"/>
+      </w:pPr>
+      <w:r>
+        <w:t xml:space="preserve">| </w:t>
+      </w:r>
+      <w:r>
+        <w:rPr>
+          <w:b/>
+        </w:rPr>
+        <w:t>ກາສີ → ທ່າບົກ</w:t>
+      </w:r>
+      <w:r>
+        <w:t xml:space="preserve"> | Gom: mỏ ກາສີ → bãi | 145 km | 145 km | 290 km | — | 12,5 · 12 |</w:t>
+      </w:r>
+    </w:p>
+    <w:p>
+      <w:pPr>
+        <w:jc w:val="both"/>
+      </w:pPr>
+      <w:r>
+        <w:t xml:space="preserve">| </w:t>
+      </w:r>
+      <w:r>
+        <w:rPr>
+          <w:b/>
+        </w:rPr>
+        <w:t>ຊຽງຂວາງ → ທ່າບົກ</w:t>
+      </w:r>
+      <w:r>
+        <w:t xml:space="preserve"> | Gom: mỏ ຊຽງຂວາງ → bãi | 260 km | 260 km | 520 km | — | 22 · 21,5 |</w:t>
+      </w:r>
+    </w:p>
+    <w:p>
+      <w:pPr>
+        <w:jc w:val="both"/>
+      </w:pPr>
+      <w:r>
+        <w:t xml:space="preserve">| </w:t>
+      </w:r>
+      <w:r>
+        <w:rPr>
+          <w:b/>
+        </w:rPr>
+        <w:t>ທ່າບົກ → ທ່າເຮືອກະລໍ</w:t>
+      </w:r>
+      <w:r>
+        <w:t xml:space="preserve"> | Giao: bãi → ດ່ານ ນໍ້າພາວ → cảng | 360 km | 360 km | 720 km | 3.667.000 LAK (hai lượt) | 30,5 · 30 |</w:t>
+      </w:r>
+    </w:p>
+    <w:p>
+      <w:pPr>
+        <w:jc w:val="both"/>
+      </w:pPr>
+      <w:r>
+        <w:t xml:space="preserve">| </w:t>
+      </w:r>
+      <w:r>
+        <w:rPr>
+          <w:b/>
+        </w:rPr>
+        <w:t>ທ່າບົກ → ດ່ານ ນໍ້າພາວ</w:t>
+      </w:r>
+      <w:r>
+        <w:t xml:space="preserve"> | Giao: bãi → cửa khẩu | 210 km | 210 km | 420 km | — | 18 · 17,5 |</w:t>
+      </w:r>
+    </w:p>
+    <w:p>
+      <w:pPr>
+        <w:jc w:val="both"/>
+      </w:pPr>
+      <w:r>
+        <w:t xml:space="preserve">| </w:t>
+      </w:r>
+      <w:r>
+        <w:rPr>
+          <w:b/>
+        </w:rPr>
+        <w:t>ທ່າບົກ → ວຽງຈັນ</w:t>
+      </w:r>
+      <w:r>
+        <w:t xml:space="preserve"> | Giao: bãi → khách ở Viêng Chăn | 95 km | 95 km | 190 km | — | 8 · 7,5 |</w:t>
+      </w:r>
+    </w:p>
+    <w:p>
+      <w:pPr>
+        <w:jc w:val="both"/>
+      </w:pPr>
+      <w:r>
+        <w:t xml:space="preserve">Hai tuyến cũ </w:t>
+      </w:r>
+      <w:r>
+        <w:rPr>
+          <w:b/>
+        </w:rPr>
+        <w:t>ກາສີ → ກາລໍ</w:t>
+      </w:r>
+      <w:r>
+        <w:t xml:space="preserve">, </w:t>
+      </w:r>
+      <w:r>
+        <w:rPr>
+          <w:b/>
+        </w:rPr>
+        <w:t>ກາສີ → ທ່າເຮືອກະລໍ</w:t>
+      </w:r>
+      <w:r>
+        <w:t xml:space="preserve"> là tuyến </w:t>
+      </w:r>
+      <w:r>
+        <w:rPr>
+          <w:b/>
+        </w:rPr>
+        <w:t>một chặng</w:t>
+      </w:r>
+      <w:r>
+        <w:t xml:space="preserve"> mỏ → bãi → cửa khẩu → cảng (41 và 43 USD/t), chưa có chiều về — giữ như cũ để thử chuyến một chặng. Km, BOT, giá là </w:t>
+      </w:r>
+      <w:r>
+        <w:rPr>
+          <w:b/>
+        </w:rPr>
+        <w:t>số mẫu</w:t>
+      </w:r>
+      <w:r>
+        <w:t>, anh sửa ở màn Tuyến đường và bảng giá.</w:t>
       </w:r>
     </w:p>
     <w:p>
@@ -18768,7 +19175,7 @@
           <w:p>
             <w:r/>
             <w:r>
-              <w:t>T01</w:t>
+              <w:t>T00</w:t>
             </w:r>
           </w:p>
         </w:tc>
@@ -18800,7 +19207,16 @@
               <w:rPr>
                 <w:b/>
               </w:rPr>
-              <w:t>Phiếu xuất xe</w:t>
+              <w:t>Danh mục → Tuyến đường</w:t>
+            </w:r>
+            <w:r>
+              <w:t xml:space="preserve"> → bấm tuyến </w:t>
+            </w:r>
+            <w:r>
+              <w:rPr>
+                <w:b/>
+              </w:rPr>
+              <w:t>ກາສີ → ທ່າບົກ</w:t>
             </w:r>
             <w:r>
               <w:t xml:space="preserve"> → </w:t>
@@ -18809,35 +19225,151 @@
               <w:rPr>
                 <w:b/>
               </w:rPr>
-              <w:t>Phiếu mới</w:t>
-            </w:r>
-            <w:r>
-              <w:t xml:space="preserve"> → thẻ </w:t>
-            </w:r>
-            <w:r>
-              <w:rPr>
-                <w:b/>
-              </w:rPr>
-              <w:t>I</w:t>
-            </w:r>
-            <w:r>
-              <w:t xml:space="preserve">: Loại </w:t>
-            </w:r>
-            <w:r>
-              <w:rPr>
-                <w:b/>
-              </w:rPr>
-              <w:t>Gom (mỏ → bãi)</w:t>
-            </w:r>
-            <w:r>
-              <w:t xml:space="preserve">, xe 341, tài xế </w:t>
-            </w:r>
+              <w:t>Sửa</w:t>
+            </w:r>
+            <w:r>
+              <w:t xml:space="preserve"> → xem ô </w:t>
+            </w:r>
+            <w:r>
+              <w:rPr>
+                <w:b/>
+              </w:rPr>
+              <w:t>Km chiều về</w:t>
+            </w:r>
+            <w:r>
+              <w:t xml:space="preserve"> và nút </w:t>
+            </w:r>
+            <w:r>
+              <w:rPr>
+                <w:b/>
+              </w:rPr>
+              <w:t>= 145 km</w:t>
+            </w:r>
+            <w:r>
+              <w:t xml:space="preserve"> → </w:t>
+            </w:r>
+            <w:r>
+              <w:rPr>
+                <w:b/>
+              </w:rPr>
+              <w:t>Huỷ</w:t>
+            </w:r>
+          </w:p>
+        </w:tc>
+        <w:tc>
+          <w:tcPr>
+            <w:tcW w:type="dxa" w:w="1440"/>
+          </w:tcPr>
+          <w:p>
+            <w:r/>
+            <w:r>
+              <w:t xml:space="preserve">Bảng có cột </w:t>
+            </w:r>
+            <w:r>
+              <w:rPr>
+                <w:b/>
+              </w:rPr>
+              <w:t>Km chiều về</w:t>
+            </w:r>
+            <w:r>
+              <w:t xml:space="preserve"> 145; khung chi tiết có dòng </w:t>
+            </w:r>
+            <w:r>
+              <w:rPr>
+                <w:b/>
+              </w:rPr>
+              <w:t>↩ ກາສີ (ບ່ອນຂຸດແຮ່)</w:t>
+            </w:r>
+            <w:r>
+              <w:t xml:space="preserve"> </w:t>
+            </w:r>
+            <w:r>
+              <w:rPr>
+                <w:i/>
+              </w:rPr>
+              <w:t>Km chiều về +145 km</w:t>
+            </w:r>
+            <w:r>
+              <w:t xml:space="preserve"> và </w:t>
+            </w:r>
+            <w:r>
+              <w:rPr>
+                <w:i/>
+              </w:rPr>
+              <w:t>Cả đi và về: 290 km</w:t>
+            </w:r>
+          </w:p>
+        </w:tc>
+        <w:tc>
+          <w:tcPr>
+            <w:tcW w:type="dxa" w:w="1440"/>
+          </w:tcPr>
+          <w:p>
+            <w:r/>
+            <w:r>
+              <w:t>6.7</w:t>
+            </w:r>
+          </w:p>
+        </w:tc>
+        <w:tc>
+          <w:tcPr>
+            <w:tcW w:type="dxa" w:w="1440"/>
+          </w:tcPr>
+          <w:p>
+            <w:r/>
+          </w:p>
+        </w:tc>
+      </w:tr>
+      <w:tr>
+        <w:tc>
+          <w:tcPr>
+            <w:tcW w:type="dxa" w:w="1440"/>
+          </w:tcPr>
+          <w:p>
+            <w:r/>
+            <w:r>
+              <w:t>T01</w:t>
+            </w:r>
+          </w:p>
+        </w:tc>
+        <w:tc>
+          <w:tcPr>
+            <w:tcW w:type="dxa" w:w="1440"/>
+          </w:tcPr>
+          <w:p>
+            <w:r/>
             <w:r>
               <w:rPr>
                 <w:rFonts w:ascii="Consolas" w:hAnsi="Consolas"/>
                 <w:sz w:val="19"/>
               </w:rPr>
-              <w:t>tx01</w:t>
+              <w:t>thabok</w:t>
+            </w:r>
+            <w:r>
+              <w:t xml:space="preserve"> · điều xe</w:t>
+            </w:r>
+          </w:p>
+        </w:tc>
+        <w:tc>
+          <w:tcPr>
+            <w:tcW w:type="dxa" w:w="1440"/>
+          </w:tcPr>
+          <w:p>
+            <w:r/>
+            <w:r>
+              <w:rPr>
+                <w:b/>
+              </w:rPr>
+              <w:t>Phiếu xuất xe</w:t>
+            </w:r>
+            <w:r>
+              <w:t xml:space="preserve"> → </w:t>
+            </w:r>
+            <w:r>
+              <w:rPr>
+                <w:b/>
+              </w:rPr>
+              <w:t>Phiếu mới</w:t>
             </w:r>
             <w:r>
               <w:t xml:space="preserve"> → thẻ </w:t>
@@ -18846,45 +19378,91 @@
               <w:rPr>
                 <w:b/>
               </w:rPr>
-              <w:t>II</w:t>
-            </w:r>
-            <w:r>
-              <w:t xml:space="preserve">: tuyến ກາສີ → ກາລໍ, khách ຄຳຕຸ້ຍ, loại hàng quặng sắt — ô </w:t>
-            </w:r>
-            <w:r>
-              <w:rPr>
-                <w:b/>
-              </w:rPr>
-              <w:t>Cân tại mỏ (t)</w:t>
-            </w:r>
-            <w:r>
-              <w:t xml:space="preserve"> để trống → </w:t>
-            </w:r>
-            <w:r>
-              <w:rPr>
-                <w:b/>
-              </w:rPr>
-              <w:t>Lưu</w:t>
-            </w:r>
-            <w:r>
-              <w:t xml:space="preserve"> (nút xanh góc trên phải)</w:t>
-            </w:r>
-          </w:p>
-        </w:tc>
-        <w:tc>
-          <w:tcPr>
-            <w:tcW w:type="dxa" w:w="1440"/>
-          </w:tcPr>
-          <w:p>
-            <w:r/>
-            <w:r>
-              <w:t xml:space="preserve">Máy cấp số </w:t>
+              <w:t>I</w:t>
+            </w:r>
+            <w:r>
+              <w:t xml:space="preserve">: Loại </w:t>
+            </w:r>
+            <w:r>
+              <w:rPr>
+                <w:b/>
+              </w:rPr>
+              <w:t>Gom (mỏ → bãi)</w:t>
+            </w:r>
+            <w:r>
+              <w:t xml:space="preserve">, xe 341 (ô </w:t>
+            </w:r>
+            <w:r>
+              <w:rPr>
+                <w:b/>
+              </w:rPr>
+              <w:t>Lúc đi</w:t>
+            </w:r>
+            <w:r>
+              <w:t xml:space="preserve"> tự điền, xem T01b), tài xế </w:t>
             </w:r>
             <w:r>
               <w:rPr>
                 <w:rFonts w:ascii="Consolas" w:hAnsi="Consolas"/>
                 <w:sz w:val="19"/>
               </w:rPr>
+              <w:t>tx01</w:t>
+            </w:r>
+            <w:r>
+              <w:t xml:space="preserve"> → thẻ </w:t>
+            </w:r>
+            <w:r>
+              <w:rPr>
+                <w:b/>
+              </w:rPr>
+              <w:t>II</w:t>
+            </w:r>
+            <w:r>
+              <w:t xml:space="preserve">: tuyến </w:t>
+            </w:r>
+            <w:r>
+              <w:rPr>
+                <w:b/>
+              </w:rPr>
+              <w:t>ກາສີ → ທ່າບົກ</w:t>
+            </w:r>
+            <w:r>
+              <w:t xml:space="preserve">, khách ຄຳຕຸ້ຍ, loại hàng quặng sắt — ô </w:t>
+            </w:r>
+            <w:r>
+              <w:rPr>
+                <w:b/>
+              </w:rPr>
+              <w:t>Cân tại mỏ (t)</w:t>
+            </w:r>
+            <w:r>
+              <w:t xml:space="preserve"> để trống → </w:t>
+            </w:r>
+            <w:r>
+              <w:rPr>
+                <w:b/>
+              </w:rPr>
+              <w:t>Lưu</w:t>
+            </w:r>
+            <w:r>
+              <w:t xml:space="preserve"> (nút xanh góc trên phải)</w:t>
+            </w:r>
+          </w:p>
+        </w:tc>
+        <w:tc>
+          <w:tcPr>
+            <w:tcW w:type="dxa" w:w="1440"/>
+          </w:tcPr>
+          <w:p>
+            <w:r/>
+            <w:r>
+              <w:t xml:space="preserve">Máy cấp số </w:t>
+            </w:r>
+            <w:r>
+              <w:rPr>
+                <w:rFonts w:ascii="Consolas" w:hAnsi="Consolas"/>
+                <w:sz w:val="19"/>
+              </w:rPr>
               <w:t>G4-…/EPL</w:t>
             </w:r>
             <w:r>
@@ -18976,6 +19554,150 @@
                 <w:i/>
               </w:rPr>
               <w:t>Điền khi xe về / tới</w:t>
+            </w:r>
+          </w:p>
+        </w:tc>
+        <w:tc>
+          <w:tcPr>
+            <w:tcW w:type="dxa" w:w="1440"/>
+          </w:tcPr>
+          <w:p>
+            <w:r/>
+            <w:r>
+              <w:t>1</w:t>
+            </w:r>
+          </w:p>
+        </w:tc>
+        <w:tc>
+          <w:tcPr>
+            <w:tcW w:type="dxa" w:w="1440"/>
+          </w:tcPr>
+          <w:p>
+            <w:r/>
+          </w:p>
+        </w:tc>
+      </w:tr>
+      <w:tr>
+        <w:tc>
+          <w:tcPr>
+            <w:tcW w:type="dxa" w:w="1440"/>
+          </w:tcPr>
+          <w:p>
+            <w:r/>
+            <w:r>
+              <w:t>T01b</w:t>
+            </w:r>
+          </w:p>
+        </w:tc>
+        <w:tc>
+          <w:tcPr>
+            <w:tcW w:type="dxa" w:w="1440"/>
+          </w:tcPr>
+          <w:p>
+            <w:r/>
+            <w:r>
+              <w:rPr>
+                <w:rFonts w:ascii="Consolas" w:hAnsi="Consolas"/>
+                <w:sz w:val="19"/>
+              </w:rPr>
+              <w:t>thabok</w:t>
+            </w:r>
+            <w:r>
+              <w:t xml:space="preserve"> · điều xe</w:t>
+            </w:r>
+          </w:p>
+        </w:tc>
+        <w:tc>
+          <w:tcPr>
+            <w:tcW w:type="dxa" w:w="1440"/>
+          </w:tcPr>
+          <w:p>
+            <w:r/>
+            <w:r>
+              <w:t xml:space="preserve">Trên phiếu T01 (chưa lưu cũng được): nhìn ô </w:t>
+            </w:r>
+            <w:r>
+              <w:rPr>
+                <w:b/>
+              </w:rPr>
+              <w:t>Lúc đi</w:t>
+            </w:r>
+            <w:r>
+              <w:t xml:space="preserve">, rồi gõ đè một số khác, rồi đổi </w:t>
+            </w:r>
+            <w:r>
+              <w:rPr>
+                <w:b/>
+              </w:rPr>
+              <w:t>Số xe</w:t>
+            </w:r>
+            <w:r>
+              <w:t xml:space="preserve"> sang xe khác và chọn lại 341</w:t>
+            </w:r>
+          </w:p>
+        </w:tc>
+        <w:tc>
+          <w:tcPr>
+            <w:tcW w:type="dxa" w:w="1440"/>
+          </w:tcPr>
+          <w:p>
+            <w:r/>
+            <w:r>
+              <w:t xml:space="preserve">Chọn xe là ô </w:t>
+            </w:r>
+            <w:r>
+              <w:rPr>
+                <w:b/>
+              </w:rPr>
+              <w:t>Lúc đi</w:t>
+            </w:r>
+            <w:r>
+              <w:t xml:space="preserve"> có ngay số </w:t>
+            </w:r>
+            <w:r>
+              <w:rPr>
+                <w:b/>
+              </w:rPr>
+              <w:t>Công-tơ-mét (km)</w:t>
+            </w:r>
+            <w:r>
+              <w:t xml:space="preserve"> của xe 341 (như ở màn </w:t>
+            </w:r>
+            <w:r>
+              <w:rPr>
+                <w:b/>
+              </w:rPr>
+              <w:t>Xe</w:t>
+            </w:r>
+            <w:r>
+              <w:t xml:space="preserve">), dưới ô ghi </w:t>
+            </w:r>
+            <w:r>
+              <w:rPr>
+                <w:i/>
+              </w:rPr>
+              <w:t>Điền sẵn theo công-tơ-mét của xe — sửa được</w:t>
+            </w:r>
+            <w:r>
+              <w:t xml:space="preserve">; đã gõ tay thì đổi xe </w:t>
+            </w:r>
+            <w:r>
+              <w:rPr>
+                <w:b/>
+              </w:rPr>
+              <w:t>không</w:t>
+            </w:r>
+            <w:r>
+              <w:t xml:space="preserve"> đè số anh gõ. </w:t>
+            </w:r>
+            <w:r>
+              <w:rPr>
+                <w:b/>
+              </w:rPr>
+              <w:t>Km về ước tính</w:t>
+            </w:r>
+            <w:r>
+              <w:t xml:space="preserve"> = lúc đi + 290 (145 đi + 145 về)</w:t>
             </w:r>
           </w:p>
         </w:tc>
@@ -21049,7 +21771,16 @@
               <w:t>tx02</w:t>
             </w:r>
             <w:r>
-              <w:t xml:space="preserve">, tuyến ra cảng, khách ຄຳຕຸ້ຍ → </w:t>
+              <w:t xml:space="preserve">, tuyến </w:t>
+            </w:r>
+            <w:r>
+              <w:rPr>
+                <w:b/>
+              </w:rPr>
+              <w:t>ທ່າບົກ → ທ່າເຮືອກະລໍ</w:t>
+            </w:r>
+            <w:r>
+              <w:t xml:space="preserve"> (ra cảng, có chiều về), khách ຄຳຕຸ້ຍ → </w:t>
             </w:r>
             <w:r>
               <w:rPr>

</xml_diff>

<commit_message>
Tài liệu A → Z 10.0: khởi động lại 8020 còn để nhận Km chiều về và Lúc đi tự điền
Co-Authored-By: Claude Opus 5.5 (1M context) <noreply@anthropic.com>
</commit_message>
<xml_diff>
--- a/DOCS/word/LUONG_A_Z_HAI_TRANG.docx
+++ b/DOCS/word/LUONG_A_Z_HAI_TRANG.docx
@@ -18383,7 +18383,25 @@
         <w:t>Báo cân ở mỏ</w:t>
       </w:r>
       <w:r>
-        <w:t xml:space="preserve"> (bước 10b), rồi </w:t>
+        <w:t xml:space="preserve"> (bước 10b), </w:t>
+      </w:r>
+      <w:r>
+        <w:rPr>
+          <w:b/>
+        </w:rPr>
+        <w:t>Km chiều về</w:t>
+      </w:r>
+      <w:r>
+        <w:t xml:space="preserve"> của tuyến và ô </w:t>
+      </w:r>
+      <w:r>
+        <w:rPr>
+          <w:b/>
+        </w:rPr>
+        <w:t>Lúc đi</w:t>
+      </w:r>
+      <w:r>
+        <w:t xml:space="preserve"> tự điền (bước 1), rồi </w:t>
       </w:r>
       <w:r>
         <w:rPr>
@@ -18392,7 +18410,7 @@
         <w:t>Ctrl+F5</w:t>
       </w:r>
       <w:r>
-        <w:t xml:space="preserve"> trên trình duyệt. Máy </w:t>
+        <w:t xml:space="preserve"> trên trình duyệt. Năm tuyến mẫu ở mục 5 dưới đây em thêm sau khi máy 8020 chạy bản mới. Máy </w:t>
       </w:r>
       <w:r>
         <w:rPr>

</xml_diff>

<commit_message>
SL mục IV là 1 chuyến (theo Excel của họ); BOT tuyến ra cảng một chuyến 1.833.500, không nhân đôi
Tờ ໃບເບີກລົດອອກໄປຂົນສົ່ງ của khách ghi mọi khoản đi đường SL 1, đơn giá trọn chuyến, ghi chú "ຈ່າຍຕາມຖ່ຽວ". Tài liệu bước 3
bỏ ví dụ "tiền ăn 3 ngày" tự đặt, ghi đúng số và cách trả trong Excel; mục 6.7 và bảng tuyến mẫu: BOT một chuyến.
tools/them_tuyen.py sửa BOT tuyến ທ່າບົກ → ທ່າເຮືອກະລໍ về 1.833.500 (trên máy 8020 đã sửa qua màn Tuyến đường, chưa phiếu nào dùng).

Co-Authored-By: Claude Opus 5.5 (1M context) <noreply@anthropic.com>
</commit_message>
<xml_diff>
--- a/DOCS/word/LUONG_A_Z_HAI_TRANG.docx
+++ b/DOCS/word/LUONG_A_Z_HAI_TRANG.docx
@@ -6900,10 +6900,64 @@
         <w:rPr>
           <w:b/>
         </w:rPr>
-        <w:t>SL là số lượng, không phải tiền</w:t>
-      </w:r>
-      <w:r>
-        <w:t xml:space="preserve"> — bao nhiêu lượt, lần, ngày của khoản đó (phí cao tốc 1 lượt qua trạm, phí đỗ xe 1 lần, tiền ăn 3 ngày…). Tiền = SL × </w:t>
+        <w:t>SL là số lượng, không phải tiền — và theo Excel của họ, SL 1 là 1 chuyến</w:t>
+      </w:r>
+      <w:r>
+        <w:t xml:space="preserve"> (không phải ngày hay buổi): tờ </w:t>
+      </w:r>
+      <w:r>
+        <w:rPr>
+          <w:i/>
+        </w:rPr>
+        <w:t>ໃບເບີກລົດອອກໄປຂົນສົ່ງ</w:t>
+      </w:r>
+      <w:r>
+        <w:t xml:space="preserve"> mục IV ghi mọi khoản SL 1, đơn giá là </w:t>
+      </w:r>
+      <w:r>
+        <w:rPr>
+          <w:b/>
+        </w:rPr>
+        <w:t>số tiền trọn chuyến</w:t>
+      </w:r>
+      <w:r>
+        <w:t xml:space="preserve"> — tiền nước 60.000, chi phí sang Việt Nam 430.000, chipping Lào 620.000, chipping Việt 1.500.000, phí cao tốc 1.833.500, tiền chuyến 1.800.000, điện thoại 150.000 LAK — cột ghi chú nói trả thế nào: </w:t>
+      </w:r>
+      <w:r>
+        <w:rPr>
+          <w:i/>
+        </w:rPr>
+        <w:t>trả theo chuyến cùng lương</w:t>
+      </w:r>
+      <w:r>
+        <w:t xml:space="preserve"> (tiền nước, tiền chuyến), </w:t>
+      </w:r>
+      <w:r>
+        <w:rPr>
+          <w:i/>
+        </w:rPr>
+        <w:t>trả ngay khi tài xế xuất xe</w:t>
+      </w:r>
+      <w:r>
+        <w:t xml:space="preserve"> (chi phí sang Việt Nam, điện thoại), </w:t>
+      </w:r>
+      <w:r>
+        <w:rPr>
+          <w:i/>
+        </w:rPr>
+        <w:t>ghi nợ nhà cung cấp, trả theo đợt</w:t>
+      </w:r>
+      <w:r>
+        <w:t xml:space="preserve"> (chipping), </w:t>
+      </w:r>
+      <w:r>
+        <w:rPr>
+          <w:i/>
+        </w:rPr>
+        <w:t>trả theo chuyến qua thẻ</w:t>
+      </w:r>
+      <w:r>
+        <w:t xml:space="preserve"> (phí cao tốc). Khoản nào một chuyến tính hai lần thật (ví dụ qua cầu hai lượt) thì mới ghi SL 2. Tiền = SL × </w:t>
       </w:r>
       <w:r>
         <w:rPr>
@@ -15282,7 +15336,7 @@
         <w:t>hàng</w:t>
       </w:r>
       <w:r>
-        <w:t xml:space="preserve"> đi (mỏ → bãi, bãi → cảng); chiều về là đoạn xe chạy không hàng — phiếu gom chạy rỗng từ bãi lên mỏ trước, phiếu giao chạy rỗng về bãi sau. Tuyến có chiều về thì </w:t>
+        <w:t xml:space="preserve"> đi (mỏ → bãi, bãi → cảng); chiều về là đoạn xe chạy không hàng — phiếu gom chạy rỗng từ bãi lên mỏ trước, phiếu giao chạy rỗng về bãi sau. </w:t>
       </w:r>
       <w:r>
         <w:rPr>
@@ -15291,7 +15345,25 @@
         <w:t>BOT</w:t>
       </w:r>
       <w:r>
-        <w:t xml:space="preserve"> nên ghi cả hai lượt qua trạm (phí cao tốc tự thành một dòng mục IV khi lập phiếu).</w:t>
+        <w:t xml:space="preserve"> ghi số tiền </w:t>
+      </w:r>
+      <w:r>
+        <w:rPr>
+          <w:b/>
+        </w:rPr>
+        <w:t>một chuyến</w:t>
+      </w:r>
+      <w:r>
+        <w:t xml:space="preserve"> như Excel của họ (phí cao tốc 1 × 1.833.500, </w:t>
+      </w:r>
+      <w:r>
+        <w:rPr>
+          <w:i/>
+        </w:rPr>
+        <w:t>trả theo chuyến</w:t>
+      </w:r>
+      <w:r>
+        <w:t>) — có chiều về cũng không nhân đôi; lập phiếu thì BOT tự thành một dòng phí cao tốc SL 1 ở mục IV.</w:t>
       </w:r>
     </w:p>
     <w:p>
@@ -18848,7 +18920,7 @@
         <w:t>ທ່າບົກ → ທ່າເຮືອກະລໍ</w:t>
       </w:r>
       <w:r>
-        <w:t xml:space="preserve"> | Giao: bãi → ດ່ານ ນໍ້າພາວ → cảng | 360 km | 360 km | 720 km | 3.667.000 LAK (hai lượt) | 30,5 · 30 |</w:t>
+        <w:t xml:space="preserve"> | Giao: bãi → ດ່ານ ນໍ້າພາວ → cảng | 360 km | 360 km | 720 km | 1.833.500 LAK (một chuyến, như Excel) | 30,5 · 30 |</w:t>
       </w:r>
     </w:p>
     <w:p>

</xml_diff>

<commit_message>
Màn phiếu nói rõ SL đếm theo gì: mục IV, VI "SL (lần / chuyến)", dòng nhắc dưới bảng IV, V, VI (theo Excel của họ)
SL 1 = một lần trong chuyến, đơn giá = tiền trọn chuyến (tiền nước 60.000 × 1, phí cao tốc 1.833.500 × 1); mục V là số
phụ tùng hoặc số lần sửa. Dòng nhắc không in. Tài liệu A → Z bước 3: bảng "SL đếm theo gì" cho mục III–VI và bảng các
khoản mục IV đúng số trong Excel; ca test T03b.

Co-Authored-By: Claude Opus 5.5 (1M context) <noreply@anthropic.com>
</commit_message>
<xml_diff>
--- a/DOCS/word/LUONG_A_Z_HAI_TRANG.docx
+++ b/DOCS/word/LUONG_A_Z_HAI_TRANG.docx
@@ -306,7 +306,7 @@
         <w:t>10.</w:t>
       </w:r>
       <w:r>
-        <w:t xml:space="preserve"> Kịch bản test tay: chuẩn bị, rồi 59 ca theo thứ tự luồng</w:t>
+        <w:t xml:space="preserve"> Kịch bản test tay: chuẩn bị, rồi 60 ca theo thứ tự luồng</w:t>
       </w:r>
     </w:p>
     <w:p>
@@ -6894,97 +6894,7 @@
         <w:t>Khác (tự gõ)…</w:t>
       </w:r>
       <w:r>
-        <w:t xml:space="preserve">. </w:t>
-      </w:r>
-      <w:r>
-        <w:rPr>
-          <w:b/>
-        </w:rPr>
-        <w:t>SL là số lượng, không phải tiền — và theo Excel của họ, SL 1 là 1 chuyến</w:t>
-      </w:r>
-      <w:r>
-        <w:t xml:space="preserve"> (không phải ngày hay buổi): tờ </w:t>
-      </w:r>
-      <w:r>
-        <w:rPr>
-          <w:i/>
-        </w:rPr>
-        <w:t>ໃບເບີກລົດອອກໄປຂົນສົ່ງ</w:t>
-      </w:r>
-      <w:r>
-        <w:t xml:space="preserve"> mục IV ghi mọi khoản SL 1, đơn giá là </w:t>
-      </w:r>
-      <w:r>
-        <w:rPr>
-          <w:b/>
-        </w:rPr>
-        <w:t>số tiền trọn chuyến</w:t>
-      </w:r>
-      <w:r>
-        <w:t xml:space="preserve"> — tiền nước 60.000, chi phí sang Việt Nam 430.000, chipping Lào 620.000, chipping Việt 1.500.000, phí cao tốc 1.833.500, tiền chuyến 1.800.000, điện thoại 150.000 LAK — cột ghi chú nói trả thế nào: </w:t>
-      </w:r>
-      <w:r>
-        <w:rPr>
-          <w:i/>
-        </w:rPr>
-        <w:t>trả theo chuyến cùng lương</w:t>
-      </w:r>
-      <w:r>
-        <w:t xml:space="preserve"> (tiền nước, tiền chuyến), </w:t>
-      </w:r>
-      <w:r>
-        <w:rPr>
-          <w:i/>
-        </w:rPr>
-        <w:t>trả ngay khi tài xế xuất xe</w:t>
-      </w:r>
-      <w:r>
-        <w:t xml:space="preserve"> (chi phí sang Việt Nam, điện thoại), </w:t>
-      </w:r>
-      <w:r>
-        <w:rPr>
-          <w:i/>
-        </w:rPr>
-        <w:t>ghi nợ nhà cung cấp, trả theo đợt</w:t>
-      </w:r>
-      <w:r>
-        <w:t xml:space="preserve"> (chipping), </w:t>
-      </w:r>
-      <w:r>
-        <w:rPr>
-          <w:i/>
-        </w:rPr>
-        <w:t>trả theo chuyến qua thẻ</w:t>
-      </w:r>
-      <w:r>
-        <w:t xml:space="preserve"> (phí cao tốc). Khoản nào một chuyến tính hai lần thật (ví dụ qua cầu hai lượt) thì mới ghi SL 2. Tiền = SL × </w:t>
-      </w:r>
-      <w:r>
-        <w:rPr>
-          <w:b/>
-        </w:rPr>
-        <w:t>Đơn giá</w:t>
-      </w:r>
-      <w:r>
-        <w:t xml:space="preserve">; Bãi không thấy cột đơn giá, thành tiền, nên dòng </w:t>
-      </w:r>
-      <w:r>
-        <w:rPr>
-          <w:b/>
-        </w:rPr>
-        <w:t>Tổng</w:t>
-      </w:r>
-      <w:r>
-        <w:t xml:space="preserve"> bên Bãi để trống — KT Chi phí nhập đơn giá ở bước 7. Mục III cũng vậy: SL là </w:t>
-      </w:r>
-      <w:r>
-        <w:rPr>
-          <w:b/>
-        </w:rPr>
-        <w:t>lít</w:t>
-      </w:r>
-      <w:r>
-        <w:t>.</w:t>
+        <w:t>. SL đếm theo gì: xem bảng ngay dưới.</w:t>
       </w:r>
     </w:p>
     <w:p>
@@ -7063,6 +6973,844 @@
       </w:r>
       <w:r>
         <w:t>, tài xế cầm tới quỹ.</w:t>
+      </w:r>
+    </w:p>
+    <w:p>
+      <w:pPr>
+        <w:jc w:val="both"/>
+      </w:pPr>
+      <w:r>
+        <w:rPr>
+          <w:b/>
+        </w:rPr>
+        <w:t>SL đếm theo gì</w:t>
+      </w:r>
+      <w:r>
+        <w:t xml:space="preserve"> — SL là </w:t>
+      </w:r>
+      <w:r>
+        <w:rPr>
+          <w:b/>
+        </w:rPr>
+        <w:t>số lượng, không phải tiền</w:t>
+      </w:r>
+      <w:r>
+        <w:t xml:space="preserve">. Trên màn phiếu, cột mục IV, VI ghi </w:t>
+      </w:r>
+      <w:r>
+        <w:rPr>
+          <w:b/>
+        </w:rPr>
+        <w:t>SL (lần / chuyến)</w:t>
+      </w:r>
+      <w:r>
+        <w:t>, dưới bảng mục IV, V, VI có một dòng nhắc nói đúng như bảng này:</w:t>
+      </w:r>
+    </w:p>
+    <w:tbl>
+      <w:tblPr>
+        <w:tblStyle w:val="LightGrid-Accent1"/>
+        <w:tblW w:type="auto" w:w="0"/>
+        <w:tblLook w:firstColumn="1" w:firstRow="1" w:lastColumn="0" w:lastRow="0" w:noHBand="0" w:noVBand="1" w:val="04A0"/>
+      </w:tblPr>
+      <w:tblGrid>
+        <w:gridCol w:w="2160"/>
+        <w:gridCol w:w="2160"/>
+        <w:gridCol w:w="2160"/>
+        <w:gridCol w:w="2160"/>
+      </w:tblGrid>
+      <w:tr>
+        <w:tc>
+          <w:tcPr>
+            <w:tcW w:type="dxa" w:w="2160"/>
+          </w:tcPr>
+          <w:p>
+            <w:r>
+              <w:rPr>
+                <w:b/>
+              </w:rPr>
+            </w:r>
+            <w:r>
+              <w:rPr>
+                <w:b/>
+              </w:rPr>
+              <w:t>Mục</w:t>
+            </w:r>
+          </w:p>
+        </w:tc>
+        <w:tc>
+          <w:tcPr>
+            <w:tcW w:type="dxa" w:w="2160"/>
+          </w:tcPr>
+          <w:p>
+            <w:r>
+              <w:rPr>
+                <w:b/>
+              </w:rPr>
+            </w:r>
+            <w:r>
+              <w:rPr>
+                <w:b/>
+              </w:rPr>
+              <w:t>SL là</w:t>
+            </w:r>
+          </w:p>
+        </w:tc>
+        <w:tc>
+          <w:tcPr>
+            <w:tcW w:type="dxa" w:w="2160"/>
+          </w:tcPr>
+          <w:p>
+            <w:r>
+              <w:rPr>
+                <w:b/>
+              </w:rPr>
+            </w:r>
+            <w:r>
+              <w:rPr>
+                <w:b/>
+              </w:rPr>
+              <w:t>SL 1 nghĩa là</w:t>
+            </w:r>
+          </w:p>
+        </w:tc>
+        <w:tc>
+          <w:tcPr>
+            <w:tcW w:type="dxa" w:w="2160"/>
+          </w:tcPr>
+          <w:p>
+            <w:r>
+              <w:rPr>
+                <w:b/>
+              </w:rPr>
+            </w:r>
+            <w:r>
+              <w:rPr>
+                <w:b/>
+              </w:rPr>
+              <w:t>Đơn giá là</w:t>
+            </w:r>
+          </w:p>
+        </w:tc>
+      </w:tr>
+      <w:tr>
+        <w:tc>
+          <w:tcPr>
+            <w:tcW w:type="dxa" w:w="2160"/>
+          </w:tcPr>
+          <w:p>
+            <w:r/>
+            <w:r>
+              <w:t>III · Nhiên liệu</w:t>
+            </w:r>
+          </w:p>
+        </w:tc>
+        <w:tc>
+          <w:tcPr>
+            <w:tcW w:type="dxa" w:w="2160"/>
+          </w:tcPr>
+          <w:p>
+            <w:r/>
+            <w:r>
+              <w:rPr>
+                <w:b/>
+              </w:rPr>
+              <w:t>Lít</w:t>
+            </w:r>
+            <w:r>
+              <w:t xml:space="preserve"> (cột ghi </w:t>
+            </w:r>
+            <w:r>
+              <w:rPr>
+                <w:i/>
+              </w:rPr>
+              <w:t>Lít</w:t>
+            </w:r>
+            <w:r>
+              <w:t>)</w:t>
+            </w:r>
+          </w:p>
+        </w:tc>
+        <w:tc>
+          <w:tcPr>
+            <w:tcW w:type="dxa" w:w="2160"/>
+          </w:tcPr>
+          <w:p>
+            <w:r/>
+            <w:r>
+              <w:t>1 lít</w:t>
+            </w:r>
+          </w:p>
+        </w:tc>
+        <w:tc>
+          <w:tcPr>
+            <w:tcW w:type="dxa" w:w="2160"/>
+          </w:tcPr>
+          <w:p>
+            <w:r/>
+            <w:r>
+              <w:t>giá một lít — dầu kho: bình quân của kho; dầu mua: KT kho xăng dầu nhập</w:t>
+            </w:r>
+          </w:p>
+        </w:tc>
+      </w:tr>
+      <w:tr>
+        <w:tc>
+          <w:tcPr>
+            <w:tcW w:type="dxa" w:w="2160"/>
+          </w:tcPr>
+          <w:p>
+            <w:r/>
+            <w:r>
+              <w:t>IV · Đi đường</w:t>
+            </w:r>
+          </w:p>
+        </w:tc>
+        <w:tc>
+          <w:tcPr>
+            <w:tcW w:type="dxa" w:w="2160"/>
+          </w:tcPr>
+          <w:p>
+            <w:r/>
+            <w:r>
+              <w:rPr>
+                <w:b/>
+              </w:rPr>
+              <w:t>Số lần trong chuyến</w:t>
+            </w:r>
+          </w:p>
+        </w:tc>
+        <w:tc>
+          <w:tcPr>
+            <w:tcW w:type="dxa" w:w="2160"/>
+          </w:tcPr>
+          <w:p>
+            <w:r/>
+            <w:r>
+              <w:t xml:space="preserve">cả chuyến có khoản đó </w:t>
+            </w:r>
+            <w:r>
+              <w:rPr>
+                <w:b/>
+              </w:rPr>
+              <w:t>một lần</w:t>
+            </w:r>
+            <w:r>
+              <w:t xml:space="preserve"> — không phải một ngày, không phải một buổi</w:t>
+            </w:r>
+          </w:p>
+        </w:tc>
+        <w:tc>
+          <w:tcPr>
+            <w:tcW w:type="dxa" w:w="2160"/>
+          </w:tcPr>
+          <w:p>
+            <w:r/>
+            <w:r>
+              <w:rPr>
+                <w:b/>
+              </w:rPr>
+              <w:t>tiền trọn khoản cho cả chuyến</w:t>
+            </w:r>
+          </w:p>
+        </w:tc>
+      </w:tr>
+      <w:tr>
+        <w:tc>
+          <w:tcPr>
+            <w:tcW w:type="dxa" w:w="2160"/>
+          </w:tcPr>
+          <w:p>
+            <w:r/>
+            <w:r>
+              <w:t>V · Sửa chữa</w:t>
+            </w:r>
+          </w:p>
+        </w:tc>
+        <w:tc>
+          <w:tcPr>
+            <w:tcW w:type="dxa" w:w="2160"/>
+          </w:tcPr>
+          <w:p>
+            <w:r/>
+            <w:r>
+              <w:rPr>
+                <w:b/>
+              </w:rPr>
+              <w:t>Số phụ tùng</w:t>
+            </w:r>
+            <w:r>
+              <w:t xml:space="preserve">, hoặc </w:t>
+            </w:r>
+            <w:r>
+              <w:rPr>
+                <w:b/>
+              </w:rPr>
+              <w:t>số lần sửa</w:t>
+            </w:r>
+          </w:p>
+        </w:tc>
+        <w:tc>
+          <w:tcPr>
+            <w:tcW w:type="dxa" w:w="2160"/>
+          </w:tcPr>
+          <w:p>
+            <w:r/>
+            <w:r>
+              <w:t>1 cái phụ tùng · sửa 1 lần</w:t>
+            </w:r>
+          </w:p>
+        </w:tc>
+        <w:tc>
+          <w:tcPr>
+            <w:tcW w:type="dxa" w:w="2160"/>
+          </w:tcPr>
+          <w:p>
+            <w:r/>
+            <w:r>
+              <w:t>giá một cái / một lần — phụ tùng kho: bình quân của kho</w:t>
+            </w:r>
+          </w:p>
+        </w:tc>
+      </w:tr>
+      <w:tr>
+        <w:tc>
+          <w:tcPr>
+            <w:tcW w:type="dxa" w:w="2160"/>
+          </w:tcPr>
+          <w:p>
+            <w:r/>
+            <w:r>
+              <w:t>VI · Chi khác</w:t>
+            </w:r>
+          </w:p>
+        </w:tc>
+        <w:tc>
+          <w:tcPr>
+            <w:tcW w:type="dxa" w:w="2160"/>
+          </w:tcPr>
+          <w:p>
+            <w:r/>
+            <w:r>
+              <w:rPr>
+                <w:b/>
+              </w:rPr>
+              <w:t>Số lần trong chuyến</w:t>
+            </w:r>
+          </w:p>
+        </w:tc>
+        <w:tc>
+          <w:tcPr>
+            <w:tcW w:type="dxa" w:w="2160"/>
+          </w:tcPr>
+          <w:p>
+            <w:r/>
+            <w:r>
+              <w:t>như mục IV</w:t>
+            </w:r>
+          </w:p>
+        </w:tc>
+        <w:tc>
+          <w:tcPr>
+            <w:tcW w:type="dxa" w:w="2160"/>
+          </w:tcPr>
+          <w:p>
+            <w:r/>
+            <w:r>
+              <w:t>như mục IV</w:t>
+            </w:r>
+          </w:p>
+        </w:tc>
+      </w:tr>
+    </w:tbl>
+    <w:p/>
+    <w:p>
+      <w:pPr>
+        <w:jc w:val="both"/>
+      </w:pPr>
+      <w:r>
+        <w:t>Đúng như tờ Excel của họ (</w:t>
+      </w:r>
+      <w:r>
+        <w:rPr>
+          <w:i/>
+        </w:rPr>
+        <w:t>ໃບເບີກລົດອອກໄປຂົນສົ່ງ</w:t>
+      </w:r>
+      <w:r>
+        <w:t xml:space="preserve">, mục IV): mỗi khoản một dòng, </w:t>
+      </w:r>
+      <w:r>
+        <w:rPr>
+          <w:b/>
+        </w:rPr>
+        <w:t>SL 1</w:t>
+      </w:r>
+      <w:r>
+        <w:t>, đơn giá là tiền trọn chuyến, cột ghi chú nói trả thế nào:</w:t>
+      </w:r>
+    </w:p>
+    <w:tbl>
+      <w:tblPr>
+        <w:tblStyle w:val="LightGrid-Accent1"/>
+        <w:tblW w:type="auto" w:w="0"/>
+        <w:tblLook w:firstColumn="1" w:firstRow="1" w:lastColumn="0" w:lastRow="0" w:noHBand="0" w:noVBand="1" w:val="04A0"/>
+      </w:tblPr>
+      <w:tblGrid>
+        <w:gridCol w:w="2160"/>
+        <w:gridCol w:w="2160"/>
+        <w:gridCol w:w="2160"/>
+        <w:gridCol w:w="2160"/>
+      </w:tblGrid>
+      <w:tr>
+        <w:tc>
+          <w:tcPr>
+            <w:tcW w:type="dxa" w:w="2160"/>
+          </w:tcPr>
+          <w:p>
+            <w:r>
+              <w:rPr>
+                <w:b/>
+              </w:rPr>
+            </w:r>
+            <w:r>
+              <w:rPr>
+                <w:b/>
+              </w:rPr>
+              <w:t>Khoản (Excel)</w:t>
+            </w:r>
+          </w:p>
+        </w:tc>
+        <w:tc>
+          <w:tcPr>
+            <w:tcW w:type="dxa" w:w="2160"/>
+          </w:tcPr>
+          <w:p>
+            <w:r>
+              <w:rPr>
+                <w:b/>
+              </w:rPr>
+            </w:r>
+            <w:r>
+              <w:rPr>
+                <w:b/>
+              </w:rPr>
+              <w:t>SL</w:t>
+            </w:r>
+          </w:p>
+        </w:tc>
+        <w:tc>
+          <w:tcPr>
+            <w:tcW w:type="dxa" w:w="2160"/>
+          </w:tcPr>
+          <w:p>
+            <w:r>
+              <w:rPr>
+                <w:b/>
+              </w:rPr>
+            </w:r>
+            <w:r>
+              <w:rPr>
+                <w:b/>
+              </w:rPr>
+              <w:t>Đơn giá (LAK)</w:t>
+            </w:r>
+          </w:p>
+        </w:tc>
+        <w:tc>
+          <w:tcPr>
+            <w:tcW w:type="dxa" w:w="2160"/>
+          </w:tcPr>
+          <w:p>
+            <w:r>
+              <w:rPr>
+                <w:b/>
+              </w:rPr>
+            </w:r>
+            <w:r>
+              <w:rPr>
+                <w:b/>
+              </w:rPr>
+              <w:t>Ghi chú trong Excel</w:t>
+            </w:r>
+          </w:p>
+        </w:tc>
+      </w:tr>
+      <w:tr>
+        <w:tc>
+          <w:tcPr>
+            <w:tcW w:type="dxa" w:w="2160"/>
+          </w:tcPr>
+          <w:p>
+            <w:r/>
+            <w:r>
+              <w:t>Tiền nước · ເງີນເຕີມນ້ຳ</w:t>
+            </w:r>
+          </w:p>
+        </w:tc>
+        <w:tc>
+          <w:tcPr>
+            <w:tcW w:type="dxa" w:w="2160"/>
+          </w:tcPr>
+          <w:p>
+            <w:r/>
+            <w:r>
+              <w:t>1</w:t>
+            </w:r>
+          </w:p>
+        </w:tc>
+        <w:tc>
+          <w:tcPr>
+            <w:tcW w:type="dxa" w:w="2160"/>
+          </w:tcPr>
+          <w:p>
+            <w:r/>
+            <w:r>
+              <w:t>60.000</w:t>
+            </w:r>
+          </w:p>
+        </w:tc>
+        <w:tc>
+          <w:tcPr>
+            <w:tcW w:type="dxa" w:w="2160"/>
+          </w:tcPr>
+          <w:p>
+            <w:r/>
+            <w:r>
+              <w:t>trả theo chuyến cùng lương</w:t>
+            </w:r>
+          </w:p>
+        </w:tc>
+      </w:tr>
+      <w:tr>
+        <w:tc>
+          <w:tcPr>
+            <w:tcW w:type="dxa" w:w="2160"/>
+          </w:tcPr>
+          <w:p>
+            <w:r/>
+            <w:r>
+              <w:t>Chi phí sang Việt Nam · ເງິນໃຊ້ຈ່າຍໄປຫວຽດນາມ</w:t>
+            </w:r>
+          </w:p>
+        </w:tc>
+        <w:tc>
+          <w:tcPr>
+            <w:tcW w:type="dxa" w:w="2160"/>
+          </w:tcPr>
+          <w:p>
+            <w:r/>
+            <w:r>
+              <w:t>1</w:t>
+            </w:r>
+          </w:p>
+        </w:tc>
+        <w:tc>
+          <w:tcPr>
+            <w:tcW w:type="dxa" w:w="2160"/>
+          </w:tcPr>
+          <w:p>
+            <w:r/>
+            <w:r>
+              <w:t>430.000</w:t>
+            </w:r>
+          </w:p>
+        </w:tc>
+        <w:tc>
+          <w:tcPr>
+            <w:tcW w:type="dxa" w:w="2160"/>
+          </w:tcPr>
+          <w:p>
+            <w:r/>
+            <w:r>
+              <w:t>trả ngay khi tài xế xuất xe</w:t>
+            </w:r>
+          </w:p>
+        </w:tc>
+      </w:tr>
+      <w:tr>
+        <w:tc>
+          <w:tcPr>
+            <w:tcW w:type="dxa" w:w="2160"/>
+          </w:tcPr>
+          <w:p>
+            <w:r/>
+            <w:r>
+              <w:t>Chipping Lào · ຄ່າຊີບປີງລາວ</w:t>
+            </w:r>
+          </w:p>
+        </w:tc>
+        <w:tc>
+          <w:tcPr>
+            <w:tcW w:type="dxa" w:w="2160"/>
+          </w:tcPr>
+          <w:p>
+            <w:r/>
+            <w:r>
+              <w:t>1</w:t>
+            </w:r>
+          </w:p>
+        </w:tc>
+        <w:tc>
+          <w:tcPr>
+            <w:tcW w:type="dxa" w:w="2160"/>
+          </w:tcPr>
+          <w:p>
+            <w:r/>
+            <w:r>
+              <w:t>620.000</w:t>
+            </w:r>
+          </w:p>
+        </w:tc>
+        <w:tc>
+          <w:tcPr>
+            <w:tcW w:type="dxa" w:w="2160"/>
+          </w:tcPr>
+          <w:p>
+            <w:r/>
+            <w:r>
+              <w:t>ghi nợ nhà cung cấp, trả theo đợt</w:t>
+            </w:r>
+          </w:p>
+        </w:tc>
+      </w:tr>
+      <w:tr>
+        <w:tc>
+          <w:tcPr>
+            <w:tcW w:type="dxa" w:w="2160"/>
+          </w:tcPr>
+          <w:p>
+            <w:r/>
+            <w:r>
+              <w:t>Chipping Việt · ຄ່າຊີບປີງຫວຽດ</w:t>
+            </w:r>
+          </w:p>
+        </w:tc>
+        <w:tc>
+          <w:tcPr>
+            <w:tcW w:type="dxa" w:w="2160"/>
+          </w:tcPr>
+          <w:p>
+            <w:r/>
+            <w:r>
+              <w:t>1</w:t>
+            </w:r>
+          </w:p>
+        </w:tc>
+        <w:tc>
+          <w:tcPr>
+            <w:tcW w:type="dxa" w:w="2160"/>
+          </w:tcPr>
+          <w:p>
+            <w:r/>
+            <w:r>
+              <w:t>1.500.000</w:t>
+            </w:r>
+          </w:p>
+        </w:tc>
+        <w:tc>
+          <w:tcPr>
+            <w:tcW w:type="dxa" w:w="2160"/>
+          </w:tcPr>
+          <w:p>
+            <w:r/>
+            <w:r>
+              <w:t>ghi nợ nhà cung cấp, trả theo đợt</w:t>
+            </w:r>
+          </w:p>
+        </w:tc>
+      </w:tr>
+      <w:tr>
+        <w:tc>
+          <w:tcPr>
+            <w:tcW w:type="dxa" w:w="2160"/>
+          </w:tcPr>
+          <w:p>
+            <w:r/>
+            <w:r>
+              <w:t>Phí cao tốc · ເງີນຄ່າທາງດ່ວນ</w:t>
+            </w:r>
+          </w:p>
+        </w:tc>
+        <w:tc>
+          <w:tcPr>
+            <w:tcW w:type="dxa" w:w="2160"/>
+          </w:tcPr>
+          <w:p>
+            <w:r/>
+            <w:r>
+              <w:t>1</w:t>
+            </w:r>
+          </w:p>
+        </w:tc>
+        <w:tc>
+          <w:tcPr>
+            <w:tcW w:type="dxa" w:w="2160"/>
+          </w:tcPr>
+          <w:p>
+            <w:r/>
+            <w:r>
+              <w:t>1.833.500</w:t>
+            </w:r>
+          </w:p>
+        </w:tc>
+        <w:tc>
+          <w:tcPr>
+            <w:tcW w:type="dxa" w:w="2160"/>
+          </w:tcPr>
+          <w:p>
+            <w:r/>
+            <w:r>
+              <w:t>trả theo chuyến, qua thẻ (nạp 15 triệu kíp mỗi lần)</w:t>
+            </w:r>
+          </w:p>
+        </w:tc>
+      </w:tr>
+      <w:tr>
+        <w:tc>
+          <w:tcPr>
+            <w:tcW w:type="dxa" w:w="2160"/>
+          </w:tcPr>
+          <w:p>
+            <w:r/>
+            <w:r>
+              <w:t>Tiền chuyến · ເງີນຖ້ຽວແກ່ແຮ່</w:t>
+            </w:r>
+          </w:p>
+        </w:tc>
+        <w:tc>
+          <w:tcPr>
+            <w:tcW w:type="dxa" w:w="2160"/>
+          </w:tcPr>
+          <w:p>
+            <w:r/>
+            <w:r>
+              <w:t>1</w:t>
+            </w:r>
+          </w:p>
+        </w:tc>
+        <w:tc>
+          <w:tcPr>
+            <w:tcW w:type="dxa" w:w="2160"/>
+          </w:tcPr>
+          <w:p>
+            <w:r/>
+            <w:r>
+              <w:t>1.800.000</w:t>
+            </w:r>
+          </w:p>
+        </w:tc>
+        <w:tc>
+          <w:tcPr>
+            <w:tcW w:type="dxa" w:w="2160"/>
+          </w:tcPr>
+          <w:p>
+            <w:r/>
+            <w:r>
+              <w:t>trả theo chuyến cùng lương</w:t>
+            </w:r>
+          </w:p>
+        </w:tc>
+      </w:tr>
+      <w:tr>
+        <w:tc>
+          <w:tcPr>
+            <w:tcW w:type="dxa" w:w="2160"/>
+          </w:tcPr>
+          <w:p>
+            <w:r/>
+            <w:r>
+              <w:t>Điện thoại · ຄ່າເບີໂທ</w:t>
+            </w:r>
+          </w:p>
+        </w:tc>
+        <w:tc>
+          <w:tcPr>
+            <w:tcW w:type="dxa" w:w="2160"/>
+          </w:tcPr>
+          <w:p>
+            <w:r/>
+            <w:r>
+              <w:t>1</w:t>
+            </w:r>
+          </w:p>
+        </w:tc>
+        <w:tc>
+          <w:tcPr>
+            <w:tcW w:type="dxa" w:w="2160"/>
+          </w:tcPr>
+          <w:p>
+            <w:r/>
+            <w:r>
+              <w:t>150.000</w:t>
+            </w:r>
+          </w:p>
+        </w:tc>
+        <w:tc>
+          <w:tcPr>
+            <w:tcW w:type="dxa" w:w="2160"/>
+          </w:tcPr>
+          <w:p>
+            <w:r/>
+            <w:r>
+              <w:t>trả ngay khi tài xế xuất xe</w:t>
+            </w:r>
+          </w:p>
+        </w:tc>
+      </w:tr>
+    </w:tbl>
+    <w:p/>
+    <w:p>
+      <w:pPr>
+        <w:jc w:val="both"/>
+      </w:pPr>
+      <w:r>
+        <w:t xml:space="preserve">Chỉ ghi SL 2 khi khoản đó </w:t>
+      </w:r>
+      <w:r>
+        <w:rPr>
+          <w:b/>
+        </w:rPr>
+        <w:t>xảy ra hai lần thật</w:t>
+      </w:r>
+      <w:r>
+        <w:t xml:space="preserve"> trong cùng một chuyến (ví dụ qua cầu hai lượt). Chuyến dài hơn thì </w:t>
+      </w:r>
+      <w:r>
+        <w:rPr>
+          <w:b/>
+        </w:rPr>
+        <w:t>đơn giá</w:t>
+      </w:r>
+      <w:r>
+        <w:t xml:space="preserve"> lớn hơn, SL vẫn là 1. Bãi chỉ ghi khoản mục và SL; không thấy cột đơn giá, thành tiền, nên dòng </w:t>
+      </w:r>
+      <w:r>
+        <w:rPr>
+          <w:b/>
+        </w:rPr>
+        <w:t>Tổng</w:t>
+      </w:r>
+      <w:r>
+        <w:t xml:space="preserve"> bên Bãi để trống — KT Chi phí nhập đơn giá khi kiểm (bước 7). Phần cách trả máy đang theo: tiền nước, tiền chuyến gom lên màn </w:t>
+      </w:r>
+      <w:r>
+        <w:rPr>
+          <w:b/>
+        </w:rPr>
+        <w:t>Tiền chuyến &amp; tiền nước tài xế</w:t>
+      </w:r>
+      <w:r>
+        <w:t xml:space="preserve"> để trả cùng lương (bước 20); phí cao tốc chọn thẻ thì trừ thẻ, không vào tạm ứng; dầu </w:t>
+      </w:r>
+      <w:r>
+        <w:rPr>
+          <w:b/>
+        </w:rPr>
+        <w:t>ghi nợ tại trạm</w:t>
+      </w:r>
+      <w:r>
+        <w:t xml:space="preserve"> không vào tạm ứng.</w:t>
       </w:r>
     </w:p>
     <w:p>
@@ -20007,6 +20755,168 @@
             <w:r/>
             <w:r>
               <w:t>Tờ tạm ứng có mã QR; Bãi không nhập được đơn giá</w:t>
+            </w:r>
+          </w:p>
+        </w:tc>
+        <w:tc>
+          <w:tcPr>
+            <w:tcW w:type="dxa" w:w="1440"/>
+          </w:tcPr>
+          <w:p>
+            <w:r/>
+            <w:r>
+              <w:t>3</w:t>
+            </w:r>
+          </w:p>
+        </w:tc>
+        <w:tc>
+          <w:tcPr>
+            <w:tcW w:type="dxa" w:w="1440"/>
+          </w:tcPr>
+          <w:p>
+            <w:r/>
+          </w:p>
+        </w:tc>
+      </w:tr>
+      <w:tr>
+        <w:tc>
+          <w:tcPr>
+            <w:tcW w:type="dxa" w:w="1440"/>
+          </w:tcPr>
+          <w:p>
+            <w:r/>
+            <w:r>
+              <w:t>T03b</w:t>
+            </w:r>
+          </w:p>
+        </w:tc>
+        <w:tc>
+          <w:tcPr>
+            <w:tcW w:type="dxa" w:w="1440"/>
+          </w:tcPr>
+          <w:p>
+            <w:r/>
+            <w:r>
+              <w:rPr>
+                <w:rFonts w:ascii="Consolas" w:hAnsi="Consolas"/>
+                <w:sz w:val="19"/>
+              </w:rPr>
+              <w:t>thabok</w:t>
+            </w:r>
+            <w:r>
+              <w:t xml:space="preserve"> rồi </w:t>
+            </w:r>
+            <w:r>
+              <w:rPr>
+                <w:rFonts w:ascii="Consolas" w:hAnsi="Consolas"/>
+                <w:sz w:val="19"/>
+              </w:rPr>
+              <w:t>ketoancp</w:t>
+            </w:r>
+            <w:r>
+              <w:t xml:space="preserve"> · điều xe</w:t>
+            </w:r>
+          </w:p>
+        </w:tc>
+        <w:tc>
+          <w:tcPr>
+            <w:tcW w:type="dxa" w:w="1440"/>
+          </w:tcPr>
+          <w:p>
+            <w:r/>
+            <w:r>
+              <w:t xml:space="preserve">Bãi nhìn bảng mục IV: tiêu đề cột và dòng nhắc dưới bảng. Rồi </w:t>
+            </w:r>
+            <w:r>
+              <w:rPr>
+                <w:rFonts w:ascii="Consolas" w:hAnsi="Consolas"/>
+                <w:sz w:val="19"/>
+              </w:rPr>
+              <w:t>ketoancp</w:t>
+            </w:r>
+            <w:r>
+              <w:t xml:space="preserve"> mở cùng phiếu</w:t>
+            </w:r>
+          </w:p>
+        </w:tc>
+        <w:tc>
+          <w:tcPr>
+            <w:tcW w:type="dxa" w:w="1440"/>
+          </w:tcPr>
+          <w:p>
+            <w:r/>
+            <w:r>
+              <w:t xml:space="preserve">Bãi: cột </w:t>
+            </w:r>
+            <w:r>
+              <w:rPr>
+                <w:b/>
+              </w:rPr>
+              <w:t>SL (lần / chuyến)</w:t>
+            </w:r>
+            <w:r>
+              <w:t xml:space="preserve">, dưới bảng ghi </w:t>
+            </w:r>
+            <w:r>
+              <w:rPr>
+                <w:i/>
+              </w:rPr>
+              <w:t>SL 1 = một lần trong chuyến này, theo Excel…</w:t>
+            </w:r>
+            <w:r>
+              <w:t xml:space="preserve">; không có cột đơn giá, dòng </w:t>
+            </w:r>
+            <w:r>
+              <w:rPr>
+                <w:b/>
+              </w:rPr>
+              <w:t>Tổng</w:t>
+            </w:r>
+            <w:r>
+              <w:t xml:space="preserve"> trống. </w:t>
+            </w:r>
+            <w:r>
+              <w:rPr>
+                <w:rFonts w:ascii="Consolas" w:hAnsi="Consolas"/>
+                <w:sz w:val="19"/>
+              </w:rPr>
+              <w:t>ketoancp</w:t>
+            </w:r>
+            <w:r>
+              <w:t xml:space="preserve">: thấy thêm </w:t>
+            </w:r>
+            <w:r>
+              <w:rPr>
+                <w:b/>
+              </w:rPr>
+              <w:t>Đơn giá</w:t>
+            </w:r>
+            <w:r>
+              <w:t xml:space="preserve">, </w:t>
+            </w:r>
+            <w:r>
+              <w:rPr>
+                <w:b/>
+              </w:rPr>
+              <w:t>Thành tiền (LAK)</w:t>
+            </w:r>
+            <w:r>
+              <w:t xml:space="preserve">, dòng </w:t>
+            </w:r>
+            <w:r>
+              <w:rPr>
+                <w:b/>
+              </w:rPr>
+              <w:t>Tổng</w:t>
+            </w:r>
+            <w:r>
+              <w:t xml:space="preserve"> có số. Mục V dưới bảng ghi </w:t>
+            </w:r>
+            <w:r>
+              <w:rPr>
+                <w:i/>
+              </w:rPr>
+              <w:t>SL: số phụ tùng, hoặc số lần sửa…</w:t>
             </w:r>
           </w:p>
         </w:tc>

</xml_diff>

<commit_message>
Tờ tạm ứng có mã QR cho phiếu mới; quỹ chi ở đâu Tất toán cũng biết đã ứng; tài liệu 10.0b đi A → Z từng cú bấm
- Nút "Phiếu chi tạm ứng" lập (hoặc cập nhật) tờ PTU có mã QR rồi mới mở màn in — trước đây không màn nào lập tờ này
  cho phiếu mới, quỹ không có gì để quét ở Cấp phát. Lập được cả khi kế toán chưa nhập giá; tờ còn "chờ" thì số hiện và
  số chi theo dòng tiền mặt lúc đó (dam_bao_tam_ung, phieu_linh.py).
- Quỹ chi thẳng ở mục IV (trang điều xe) thì tờ PTU thành "đã cấp": Tất toán đếm "đã ứng" theo tờ này, quét QR sau đó
  bị chặn — trước đây tờ nằm "chờ" mãi, Tất toán báo công ty chi bù thêm một lần.
- kiem/thu_cach_tra.py thêm đường chi thẳng mục IV. Tài liệu A → Z: mục 10.0b (33 bước, số phải thấy từng bước), xe mẫu
  343/344 (341/342 còn phiếu cũ chưa về), bước 3 và 9 theo tờ QR.

Co-Authored-By: Claude Opus 5.5 (1M context) <noreply@anthropic.com>
</commit_message>
<xml_diff>
--- a/DOCS/word/LUONG_A_Z_HAI_TRANG.docx
+++ b/DOCS/word/LUONG_A_Z_HAI_TRANG.docx
@@ -306,7 +306,16 @@
         <w:t>10.</w:t>
       </w:r>
       <w:r>
-        <w:t xml:space="preserve"> Kịch bản test tay: chuẩn bị, rồi 61 ca theo thứ tự luồng</w:t>
+        <w:t xml:space="preserve"> Kịch bản test tay: chuẩn bị, </w:t>
+      </w:r>
+      <w:r>
+        <w:rPr>
+          <w:b/>
+        </w:rPr>
+        <w:t>10.0b đi thử một chuyến mới A → Z từng cú bấm</w:t>
+      </w:r>
+      <w:r>
+        <w:t>, rồi 61 ca theo thứ tự luồng</w:t>
       </w:r>
     </w:p>
     <w:p>
@@ -4972,7 +4981,7 @@
         <w:rPr>
           <w:b/>
         </w:rPr>
-        <w:t>341</w:t>
+        <w:t>343</w:t>
       </w:r>
       <w:r>
         <w:t xml:space="preserve"> (xe nhà), tài xế </w:t>
@@ -5033,7 +5042,7 @@
         <w:rPr>
           <w:b/>
         </w:rPr>
-        <w:t>342</w:t>
+        <w:t>344</w:t>
       </w:r>
       <w:r>
         <w:t xml:space="preserve">, tài xế </w:t>
@@ -5885,7 +5894,7 @@
         <w:t>Số xe</w:t>
       </w:r>
       <w:r>
-        <w:t xml:space="preserve"> 341; biển đầu kéo, biển rơ-moóc, hãng xe tự điền. Chọn </w:t>
+        <w:t xml:space="preserve"> 343; biển đầu kéo, biển rơ-moóc, hãng xe tự điền. Chọn </w:t>
       </w:r>
       <w:r>
         <w:rPr>
@@ -6999,7 +7008,26 @@
         <w:t>Phiếu chi tạm ứng</w:t>
       </w:r>
       <w:r>
-        <w:t xml:space="preserve">: mở màn </w:t>
+        <w:t xml:space="preserve"> (thanh nút trên cùng): máy </w:t>
+      </w:r>
+      <w:r>
+        <w:rPr>
+          <w:b/>
+        </w:rPr>
+        <w:t>lập tờ tạm ứng có mã QR</w:t>
+      </w:r>
+      <w:r>
+        <w:t xml:space="preserve"> (</w:t>
+      </w:r>
+      <w:r>
+        <w:rPr>
+          <w:rFonts w:ascii="Consolas" w:hAnsi="Consolas"/>
+          <w:sz w:val="19"/>
+        </w:rPr>
+        <w:t>PTU-&lt;số phiếu&gt;</w:t>
+      </w:r>
+      <w:r>
+        <w:t xml:space="preserve">, đã có thì cập nhật) rồi mở màn </w:t>
       </w:r>
       <w:r>
         <w:rPr>
@@ -7008,7 +7036,7 @@
         <w:t>Phiếu chi · Phiếu thu</w:t>
       </w:r>
       <w:r>
-        <w:t xml:space="preserve"> ở tờ tạm ứng của phiếu này, có mã QR. Bấm </w:t>
+        <w:t xml:space="preserve"> ở tờ đó. Bấm </w:t>
       </w:r>
       <w:r>
         <w:rPr>
@@ -7017,7 +7045,25 @@
         <w:t>In</w:t>
       </w:r>
       <w:r>
-        <w:t>, tài xế cầm tới quỹ.</w:t>
+        <w:t xml:space="preserve">, tài xế cầm tới quỹ. Bãi in lúc kế toán </w:t>
+      </w:r>
+      <w:r>
+        <w:rPr>
+          <w:b/>
+        </w:rPr>
+        <w:t>chưa nhập giá</w:t>
+      </w:r>
+      <w:r>
+        <w:t xml:space="preserve"> cũng được: tờ chỉ có khoản mục và SL, số tiền quỹ thấy khi quét mã là số theo giá kế toán đã nhập </w:t>
+      </w:r>
+      <w:r>
+        <w:rPr>
+          <w:b/>
+        </w:rPr>
+        <w:t>lúc chi</w:t>
+      </w:r>
+      <w:r>
+        <w:t>.</w:t>
       </w:r>
     </w:p>
     <w:p>
@@ -9531,7 +9577,16 @@
         <w:t>Đã chi</w:t>
       </w:r>
       <w:r>
-        <w:t xml:space="preserve">; sinh tờ </w:t>
+        <w:t xml:space="preserve">; tờ tạm ứng có mã QR thành </w:t>
+      </w:r>
+      <w:r>
+        <w:rPr>
+          <w:i/>
+        </w:rPr>
+        <w:t>Đã cấp</w:t>
+      </w:r>
+      <w:r>
+        <w:t xml:space="preserve"> (chi ở cách nào cũng vậy — Tất toán đếm "đã ứng" theo tờ này; chi rồi quét QR lần nữa thì bị chặn); sinh tờ </w:t>
       </w:r>
       <w:r>
         <w:rPr>
@@ -11198,7 +11253,7 @@
         <w:rPr>
           <w:b/>
         </w:rPr>
-        <w:t>342</w:t>
+        <w:t>344</w:t>
       </w:r>
       <w:r>
         <w:t xml:space="preserve">, tài xế </w:t>
@@ -11211,7 +11266,16 @@
         <w:t>tx02</w:t>
       </w:r>
       <w:r>
-        <w:t>, tuyến bãi → cảng, khách, ngày.</w:t>
+        <w:t xml:space="preserve">, tuyến </w:t>
+      </w:r>
+      <w:r>
+        <w:rPr>
+          <w:b/>
+        </w:rPr>
+        <w:t>ທ່າບົກ → ທ່າເຮືອກະລໍ</w:t>
+      </w:r>
+      <w:r>
+        <w:t>, khách, ngày.</w:t>
       </w:r>
     </w:p>
     <w:p>
@@ -19857,7 +19921,25 @@
         <w:t>342</w:t>
       </w:r>
       <w:r>
-        <w:t xml:space="preserve"> và 12 đầu kéo thêm ngày 29/09 </w:t>
+        <w:t xml:space="preserve"> (đang có phiếu mẫu cũ chưa về — test dùng xe </w:t>
+      </w:r>
+      <w:r>
+        <w:rPr>
+          <w:b/>
+        </w:rPr>
+        <w:t>343</w:t>
+      </w:r>
+      <w:r>
+        <w:t xml:space="preserve">, </w:t>
+      </w:r>
+      <w:r>
+        <w:rPr>
+          <w:b/>
+        </w:rPr>
+        <w:t>344</w:t>
+      </w:r>
+      <w:r>
+        <w:t xml:space="preserve">) và 12 đầu kéo thêm ngày 29/09 </w:t>
       </w:r>
       <w:r>
         <w:rPr>
@@ -20315,6 +20397,2975 @@
       </w:r>
       <w:r>
         <w:t>.</w:t>
+      </w:r>
+    </w:p>
+    <w:p>
+      <w:pPr>
+        <w:pStyle w:val="Heading2"/>
+      </w:pPr>
+      <w:r>
+        <w:t>10.0b. Đi thử một chuyến mới từ A đến Z — bấm theo thứ tự này</w:t>
+      </w:r>
+    </w:p>
+    <w:p>
+      <w:pPr>
+        <w:jc w:val="both"/>
+      </w:pPr>
+      <w:r>
+        <w:t xml:space="preserve">Một chuyến trọn vẹn làm từ đầu: phiếu </w:t>
+      </w:r>
+      <w:r>
+        <w:rPr>
+          <w:b/>
+        </w:rPr>
+        <w:t>GOM</w:t>
+      </w:r>
+      <w:r>
+        <w:t xml:space="preserve"> mỏ → bãi, rồi phiếu </w:t>
+      </w:r>
+      <w:r>
+        <w:rPr>
+          <w:b/>
+        </w:rPr>
+        <w:t>GIAO</w:t>
+      </w:r>
+      <w:r>
+        <w:t xml:space="preserve"> lấy hàng từ lô đó ra cảng, tới hoá đơn và sổ. Mỗi bước ghi </w:t>
+      </w:r>
+      <w:r>
+        <w:rPr>
+          <w:b/>
+        </w:rPr>
+        <w:t>ai</w:t>
+      </w:r>
+      <w:r>
+        <w:t xml:space="preserve"> (đăng nhập tài khoản nào), </w:t>
+      </w:r>
+      <w:r>
+        <w:rPr>
+          <w:b/>
+        </w:rPr>
+        <w:t>trang</w:t>
+      </w:r>
+      <w:r>
+        <w:t xml:space="preserve"> nào, </w:t>
+      </w:r>
+      <w:r>
+        <w:rPr>
+          <w:b/>
+        </w:rPr>
+        <w:t>bấm gì</w:t>
+      </w:r>
+      <w:r>
+        <w:t xml:space="preserve"> (đúng chữ trên nút), và </w:t>
+      </w:r>
+      <w:r>
+        <w:rPr>
+          <w:b/>
+        </w:rPr>
+        <w:t>thấy gì là đúng</w:t>
+      </w:r>
+      <w:r>
+        <w:t xml:space="preserve"> — số đã tính sẵn theo đúng số em cho ở đây. Mã ca ở cuối mỗi bước (T…) là dòng tương ứng trong bảng 10.1–10.6 để đánh dấu </w:t>
+      </w:r>
+      <w:r>
+        <w:rPr>
+          <w:b/>
+        </w:rPr>
+        <w:t>Đạt</w:t>
+      </w:r>
+      <w:r>
+        <w:t>.</w:t>
+      </w:r>
+    </w:p>
+    <w:p>
+      <w:pPr>
+        <w:jc w:val="both"/>
+      </w:pPr>
+      <w:r>
+        <w:rPr>
+          <w:b/>
+        </w:rPr>
+        <w:t>Chuẩn bị (một lần):</w:t>
+      </w:r>
+      <w:r>
+        <w:t xml:space="preserve"> Ctrl+F5 cả hai trang. Tab 1: trang điều xe </w:t>
+      </w:r>
+      <w:r>
+        <w:rPr>
+          <w:rFonts w:ascii="Consolas" w:hAnsi="Consolas"/>
+          <w:sz w:val="19"/>
+        </w:rPr>
+        <w:t>http://&lt;máy chủ&gt;:8020</w:t>
+      </w:r>
+      <w:r>
+        <w:t xml:space="preserve">. Tab 2: trang kế toán </w:t>
+      </w:r>
+      <w:r>
+        <w:rPr>
+          <w:rFonts w:ascii="Consolas" w:hAnsi="Consolas"/>
+          <w:sz w:val="19"/>
+        </w:rPr>
+        <w:t>http://&lt;máy chủ&gt;:8030</w:t>
+      </w:r>
+      <w:r>
+        <w:t xml:space="preserve">. Tài xế dùng </w:t>
+      </w:r>
+      <w:r>
+        <w:rPr>
+          <w:b/>
+        </w:rPr>
+        <w:t>điện thoại</w:t>
+      </w:r>
+      <w:r>
+        <w:t xml:space="preserve"> hoặc một </w:t>
+      </w:r>
+      <w:r>
+        <w:rPr>
+          <w:b/>
+        </w:rPr>
+        <w:t>cửa sổ ẩn danh</w:t>
+      </w:r>
+      <w:r>
+        <w:t xml:space="preserve"> (Ctrl+Shift+N) đăng nhập </w:t>
+      </w:r>
+      <w:r>
+        <w:rPr>
+          <w:rFonts w:ascii="Consolas" w:hAnsi="Consolas"/>
+          <w:sz w:val="19"/>
+        </w:rPr>
+        <w:t>tx01</w:t>
+      </w:r>
+      <w:r>
+        <w:t xml:space="preserve">, sau này </w:t>
+      </w:r>
+      <w:r>
+        <w:rPr>
+          <w:rFonts w:ascii="Consolas" w:hAnsi="Consolas"/>
+          <w:sz w:val="19"/>
+        </w:rPr>
+        <w:t>tx02</w:t>
+      </w:r>
+      <w:r>
+        <w:t xml:space="preserve">. Mật khẩu mọi tài khoản </w:t>
+      </w:r>
+      <w:r>
+        <w:rPr>
+          <w:rFonts w:ascii="Consolas" w:hAnsi="Consolas"/>
+          <w:sz w:val="19"/>
+        </w:rPr>
+        <w:t>1234</w:t>
+      </w:r>
+      <w:r>
+        <w:t xml:space="preserve">. Đổi người: bấm tên người ở góc trên phải → </w:t>
+      </w:r>
+      <w:r>
+        <w:rPr>
+          <w:b/>
+        </w:rPr>
+        <w:t>Đổi tài khoản</w:t>
+      </w:r>
+      <w:r>
+        <w:t xml:space="preserve"> → đăng nhập tài khoản mới.</w:t>
+      </w:r>
+    </w:p>
+    <w:p>
+      <w:pPr>
+        <w:jc w:val="both"/>
+      </w:pPr>
+      <w:r>
+        <w:t xml:space="preserve">#### A. Phiếu GOM — Bãi lập (trang điều xe, </w:t>
+      </w:r>
+      <w:r>
+        <w:rPr>
+          <w:rFonts w:ascii="Consolas" w:hAnsi="Consolas"/>
+          <w:sz w:val="19"/>
+        </w:rPr>
+        <w:t>thabok</w:t>
+      </w:r>
+      <w:r>
+        <w:t>)</w:t>
+      </w:r>
+    </w:p>
+    <w:p>
+      <w:pPr>
+        <w:pStyle w:val="ListNumber"/>
+      </w:pPr>
+      <w:r>
+        <w:rPr>
+          <w:b/>
+        </w:rPr>
+        <w:t>Vận tải → Phiếu xuất xe</w:t>
+      </w:r>
+      <w:r>
+        <w:t xml:space="preserve"> → bấm </w:t>
+      </w:r>
+      <w:r>
+        <w:rPr>
+          <w:b/>
+        </w:rPr>
+        <w:t>Phiếu mới</w:t>
+      </w:r>
+      <w:r>
+        <w:t>.</w:t>
+      </w:r>
+    </w:p>
+    <w:p>
+      <w:pPr>
+        <w:pStyle w:val="ListNumber"/>
+      </w:pPr>
+      <w:r>
+        <w:t xml:space="preserve">Thẻ </w:t>
+      </w:r>
+      <w:r>
+        <w:rPr>
+          <w:b/>
+        </w:rPr>
+        <w:t>I</w:t>
+      </w:r>
+      <w:r>
+        <w:t xml:space="preserve">: </w:t>
+      </w:r>
+      <w:r>
+        <w:rPr>
+          <w:b/>
+        </w:rPr>
+        <w:t>Loại phiếu</w:t>
+      </w:r>
+      <w:r>
+        <w:t xml:space="preserve"> = </w:t>
+      </w:r>
+      <w:r>
+        <w:rPr>
+          <w:b/>
+        </w:rPr>
+        <w:t>Gom (mỏ → bãi)</w:t>
+      </w:r>
+      <w:r>
+        <w:t xml:space="preserve"> (số phiếu đổi thành </w:t>
+      </w:r>
+      <w:r>
+        <w:rPr>
+          <w:rFonts w:ascii="Consolas" w:hAnsi="Consolas"/>
+          <w:sz w:val="19"/>
+        </w:rPr>
+        <w:t>G4-…</w:t>
+      </w:r>
+      <w:r>
+        <w:t xml:space="preserve">). </w:t>
+      </w:r>
+      <w:r>
+        <w:rPr>
+          <w:b/>
+        </w:rPr>
+        <w:t>Số xe</w:t>
+      </w:r>
+      <w:r>
+        <w:t xml:space="preserve"> = </w:t>
+      </w:r>
+      <w:r>
+        <w:rPr>
+          <w:b/>
+        </w:rPr>
+        <w:t>343</w:t>
+      </w:r>
+      <w:r>
+        <w:t xml:space="preserve"> → biển đầu kéo, rơ-moóc, hãng tự điền; ô </w:t>
+      </w:r>
+      <w:r>
+        <w:rPr>
+          <w:b/>
+        </w:rPr>
+        <w:t>Lúc đi</w:t>
+      </w:r>
+      <w:r>
+        <w:t xml:space="preserve"> tự điền </w:t>
+      </w:r>
+      <w:r>
+        <w:rPr>
+          <w:b/>
+        </w:rPr>
+        <w:t>61200</w:t>
+      </w:r>
+      <w:r>
+        <w:t xml:space="preserve">, dưới ô ghi </w:t>
+      </w:r>
+      <w:r>
+        <w:rPr>
+          <w:i/>
+        </w:rPr>
+        <w:t>Điền sẵn theo công-tơ-mét của xe — sửa được</w:t>
+      </w:r>
+      <w:r>
+        <w:t xml:space="preserve">. </w:t>
+      </w:r>
+      <w:r>
+        <w:rPr>
+          <w:b/>
+        </w:rPr>
+        <w:t>Tài xế</w:t>
+      </w:r>
+      <w:r>
+        <w:t xml:space="preserve"> = </w:t>
+      </w:r>
+      <w:r>
+        <w:rPr>
+          <w:b/>
+        </w:rPr>
+        <w:t>ທ້າວ ທັດສະດາພອນ</w:t>
+      </w:r>
+      <w:r>
+        <w:t xml:space="preserve"> (</w:t>
+      </w:r>
+      <w:r>
+        <w:rPr>
+          <w:rFonts w:ascii="Consolas" w:hAnsi="Consolas"/>
+          <w:sz w:val="19"/>
+        </w:rPr>
+        <w:t>tx01</w:t>
+      </w:r>
+      <w:r>
+        <w:t xml:space="preserve">). </w:t>
+      </w:r>
+      <w:r>
+        <w:rPr>
+          <w:b/>
+        </w:rPr>
+        <w:t>Ngày lập phiếu</w:t>
+      </w:r>
+      <w:r>
+        <w:t xml:space="preserve">, </w:t>
+      </w:r>
+      <w:r>
+        <w:rPr>
+          <w:b/>
+        </w:rPr>
+        <w:t>Ngày xe đi</w:t>
+      </w:r>
+      <w:r>
+        <w:t xml:space="preserve"> = hôm nay. </w:t>
+      </w:r>
+      <w:r>
+        <w:rPr>
+          <w:i/>
+        </w:rPr>
+        <w:t>(T01, T01b)</w:t>
+      </w:r>
+    </w:p>
+    <w:p>
+      <w:pPr>
+        <w:pStyle w:val="ListNumber"/>
+      </w:pPr>
+      <w:r>
+        <w:t xml:space="preserve">Thẻ </w:t>
+      </w:r>
+      <w:r>
+        <w:rPr>
+          <w:b/>
+        </w:rPr>
+        <w:t>II</w:t>
+      </w:r>
+      <w:r>
+        <w:t xml:space="preserve">: </w:t>
+      </w:r>
+      <w:r>
+        <w:rPr>
+          <w:b/>
+        </w:rPr>
+        <w:t>Chọn tuyến</w:t>
+      </w:r>
+      <w:r>
+        <w:t xml:space="preserve"> = </w:t>
+      </w:r>
+      <w:r>
+        <w:rPr>
+          <w:i/>
+        </w:rPr>
+        <w:t>ກາສີ → ທ່າບົກ · 145.0 km · ↩ 145.0 km</w:t>
+      </w:r>
+      <w:r>
+        <w:t xml:space="preserve"> → điểm đi, điểm đến tự điền; </w:t>
+      </w:r>
+      <w:r>
+        <w:rPr>
+          <w:b/>
+        </w:rPr>
+        <w:t>Km về ước tính</w:t>
+      </w:r>
+      <w:r>
+        <w:t xml:space="preserve"> (thẻ I) thành </w:t>
+      </w:r>
+      <w:r>
+        <w:rPr>
+          <w:b/>
+        </w:rPr>
+        <w:t>61.490</w:t>
+      </w:r>
+      <w:r>
+        <w:t xml:space="preserve"> (61.200 + 145 + 145). </w:t>
+      </w:r>
+      <w:r>
+        <w:rPr>
+          <w:b/>
+        </w:rPr>
+        <w:t>Khách hàng</w:t>
+      </w:r>
+      <w:r>
+        <w:t xml:space="preserve"> = </w:t>
+      </w:r>
+      <w:r>
+        <w:rPr>
+          <w:b/>
+        </w:rPr>
+        <w:t>ຄຳຕຸ້ຍ</w:t>
+      </w:r>
+      <w:r>
+        <w:t xml:space="preserve">. </w:t>
+      </w:r>
+      <w:r>
+        <w:rPr>
+          <w:b/>
+        </w:rPr>
+        <w:t>Loại hàng</w:t>
+      </w:r>
+      <w:r>
+        <w:t xml:space="preserve"> = </w:t>
+      </w:r>
+      <w:r>
+        <w:rPr>
+          <w:b/>
+        </w:rPr>
+        <w:t>Quặng sắt</w:t>
+      </w:r>
+      <w:r>
+        <w:t xml:space="preserve">. Ô </w:t>
+      </w:r>
+      <w:r>
+        <w:rPr>
+          <w:b/>
+        </w:rPr>
+        <w:t>Cân tại mỏ (t)</w:t>
+      </w:r>
+      <w:r>
+        <w:t xml:space="preserve"> để </w:t>
+      </w:r>
+      <w:r>
+        <w:rPr>
+          <w:b/>
+        </w:rPr>
+        <w:t>trống</w:t>
+      </w:r>
+      <w:r>
+        <w:t xml:space="preserve">. Không có khung </w:t>
+      </w:r>
+      <w:r>
+        <w:rPr>
+          <w:i/>
+        </w:rPr>
+        <w:t>Hàng trên phiếu</w:t>
+      </w:r>
+      <w:r>
+        <w:t xml:space="preserve"> (phiếu gom). </w:t>
+      </w:r>
+      <w:r>
+        <w:rPr>
+          <w:i/>
+        </w:rPr>
+        <w:t>(T01)</w:t>
+      </w:r>
+    </w:p>
+    <w:p>
+      <w:pPr>
+        <w:pStyle w:val="ListNumber"/>
+      </w:pPr>
+      <w:r>
+        <w:t xml:space="preserve">Thẻ </w:t>
+      </w:r>
+      <w:r>
+        <w:rPr>
+          <w:b/>
+        </w:rPr>
+        <w:t>III</w:t>
+      </w:r>
+      <w:r>
+        <w:t xml:space="preserve"> → </w:t>
+      </w:r>
+      <w:r>
+        <w:rPr>
+          <w:b/>
+        </w:rPr>
+        <w:t>+ Thêm dòng</w:t>
+      </w:r>
+      <w:r>
+        <w:t xml:space="preserve">: </w:t>
+      </w:r>
+      <w:r>
+        <w:rPr>
+          <w:b/>
+        </w:rPr>
+        <w:t>Lít</w:t>
+      </w:r>
+      <w:r>
+        <w:t xml:space="preserve"> 200, </w:t>
+      </w:r>
+      <w:r>
+        <w:rPr>
+          <w:b/>
+        </w:rPr>
+        <w:t>Nơi đổ</w:t>
+      </w:r>
+      <w:r>
+        <w:t xml:space="preserve"> = kho Thà Bốc (nhóm </w:t>
+      </w:r>
+      <w:r>
+        <w:rPr>
+          <w:i/>
+        </w:rPr>
+        <w:t>Kho của EPL (lĩnh)</w:t>
+      </w:r>
+      <w:r>
+        <w:t xml:space="preserve">). </w:t>
+      </w:r>
+      <w:r>
+        <w:rPr>
+          <w:i/>
+        </w:rPr>
+        <w:t>(T02)</w:t>
+      </w:r>
+    </w:p>
+    <w:p>
+      <w:pPr>
+        <w:pStyle w:val="ListNumber"/>
+      </w:pPr>
+      <w:r>
+        <w:t xml:space="preserve">Thẻ </w:t>
+      </w:r>
+      <w:r>
+        <w:rPr>
+          <w:b/>
+        </w:rPr>
+        <w:t>IV</w:t>
+      </w:r>
+      <w:r>
+        <w:t xml:space="preserve"> → bấm </w:t>
+      </w:r>
+      <w:r>
+        <w:rPr>
+          <w:b/>
+        </w:rPr>
+        <w:t>+ Thêm dòng</w:t>
+      </w:r>
+      <w:r>
+        <w:t xml:space="preserve"> 5 lần, mỗi dòng chọn </w:t>
+      </w:r>
+      <w:r>
+        <w:rPr>
+          <w:b/>
+        </w:rPr>
+        <w:t>Khoản mục</w:t>
+      </w:r>
+      <w:r>
+        <w:t xml:space="preserve">, </w:t>
+      </w:r>
+      <w:r>
+        <w:rPr>
+          <w:b/>
+        </w:rPr>
+        <w:t>SL (lần / chuyến)</w:t>
+      </w:r>
+      <w:r>
+        <w:t xml:space="preserve"> = 1. Ô </w:t>
+      </w:r>
+      <w:r>
+        <w:rPr>
+          <w:b/>
+        </w:rPr>
+        <w:t>cách trả</w:t>
+      </w:r>
+      <w:r>
+        <w:t xml:space="preserve"> dưới khoản mục </w:t>
+      </w:r>
+      <w:r>
+        <w:rPr>
+          <w:b/>
+        </w:rPr>
+        <w:t>tự chọn</w:t>
+      </w:r>
+      <w:r>
+        <w:t xml:space="preserve"> — nhìn cho đúng:</w:t>
+      </w:r>
+    </w:p>
+    <w:p>
+      <w:pPr>
+        <w:jc w:val="both"/>
+      </w:pPr>
+      <w:r>
+        <w:t>| Khoản mục | Cách trả máy chọn |</w:t>
+      </w:r>
+    </w:p>
+    <w:p>
+      <w:pPr>
+        <w:jc w:val="both"/>
+      </w:pPr>
+      <w:r>
+        <w:t>|---|---|</w:t>
+      </w:r>
+    </w:p>
+    <w:p>
+      <w:pPr>
+        <w:jc w:val="both"/>
+      </w:pPr>
+      <w:r>
+        <w:t>| Tiền nước | Trả theo chuyến cùng lương |</w:t>
+      </w:r>
+    </w:p>
+    <w:p>
+      <w:pPr>
+        <w:jc w:val="both"/>
+      </w:pPr>
+      <w:r>
+        <w:t>| Tiền chi phí sang Việt Nam cho tài xế | Chi ngay khi xe đi |</w:t>
+      </w:r>
+    </w:p>
+    <w:p>
+      <w:pPr>
+        <w:jc w:val="both"/>
+      </w:pPr>
+      <w:r>
+        <w:t>| Phí chipping Lào (kho hải quan) | Nợ NCC / trả theo đợt |</w:t>
+      </w:r>
+    </w:p>
+    <w:p>
+      <w:pPr>
+        <w:jc w:val="both"/>
+      </w:pPr>
+      <w:r>
+        <w:t>| Tiền chuyến chở quặng | Trả theo chuyến cùng lương |</w:t>
+      </w:r>
+    </w:p>
+    <w:p>
+      <w:pPr>
+        <w:jc w:val="both"/>
+      </w:pPr>
+      <w:r>
+        <w:t>| Tiền điện thoại | Chi ngay khi xe đi |</w:t>
+      </w:r>
+    </w:p>
+    <w:p>
+      <w:pPr>
+        <w:jc w:val="both"/>
+      </w:pPr>
+      <w:r>
+        <w:t xml:space="preserve">Bãi không thấy cột đơn giá, dòng </w:t>
+      </w:r>
+      <w:r>
+        <w:rPr>
+          <w:b/>
+        </w:rPr>
+        <w:t>Tổng</w:t>
+      </w:r>
+      <w:r>
+        <w:t xml:space="preserve"> trống — đúng. </w:t>
+      </w:r>
+      <w:r>
+        <w:rPr>
+          <w:i/>
+        </w:rPr>
+        <w:t>(T03, T03b)</w:t>
+      </w:r>
+    </w:p>
+    <w:p>
+      <w:pPr>
+        <w:pStyle w:val="ListNumber"/>
+      </w:pPr>
+      <w:r>
+        <w:t xml:space="preserve">Bấm </w:t>
+      </w:r>
+      <w:r>
+        <w:rPr>
+          <w:b/>
+        </w:rPr>
+        <w:t>Lưu</w:t>
+      </w:r>
+      <w:r>
+        <w:t xml:space="preserve"> (nút xanh góc trên phải) → </w:t>
+      </w:r>
+      <w:r>
+        <w:rPr>
+          <w:i/>
+        </w:rPr>
+        <w:t>Đã lưu</w:t>
+      </w:r>
+      <w:r>
+        <w:t xml:space="preserve">, phiếu có số </w:t>
+      </w:r>
+      <w:r>
+        <w:rPr>
+          <w:b/>
+        </w:rPr>
+        <w:t>G4-…-09/EPL</w:t>
+      </w:r>
+      <w:r>
+        <w:t xml:space="preserve"> (ghi số này lại). Ô </w:t>
+      </w:r>
+      <w:r>
+        <w:rPr>
+          <w:b/>
+        </w:rPr>
+        <w:t>Hợp đồng vận chuyển</w:t>
+      </w:r>
+      <w:r>
+        <w:t xml:space="preserve"> tự điền hợp đồng còn hạn của ຄຳຕຸ້ຍ. </w:t>
+      </w:r>
+      <w:r>
+        <w:rPr>
+          <w:i/>
+        </w:rPr>
+        <w:t>(T01)</w:t>
+      </w:r>
+    </w:p>
+    <w:p>
+      <w:pPr>
+        <w:pStyle w:val="ListNumber"/>
+      </w:pPr>
+      <w:r>
+        <w:t xml:space="preserve">Đầu các mục </w:t>
+      </w:r>
+      <w:r>
+        <w:rPr>
+          <w:b/>
+        </w:rPr>
+        <w:t>I</w:t>
+      </w:r>
+      <w:r>
+        <w:t xml:space="preserve">, </w:t>
+      </w:r>
+      <w:r>
+        <w:rPr>
+          <w:b/>
+        </w:rPr>
+        <w:t>III</w:t>
+      </w:r>
+      <w:r>
+        <w:t xml:space="preserve">, </w:t>
+      </w:r>
+      <w:r>
+        <w:rPr>
+          <w:b/>
+        </w:rPr>
+        <w:t>IV</w:t>
+      </w:r>
+      <w:r>
+        <w:t xml:space="preserve"> bấm </w:t>
+      </w:r>
+      <w:r>
+        <w:rPr>
+          <w:b/>
+        </w:rPr>
+        <w:t>Gửi kiểm tra</w:t>
+      </w:r>
+      <w:r>
+        <w:t xml:space="preserve"> (mục </w:t>
+      </w:r>
+      <w:r>
+        <w:rPr>
+          <w:b/>
+        </w:rPr>
+        <w:t>II</w:t>
+      </w:r>
+      <w:r>
+        <w:t xml:space="preserve"> chưa gửi — chờ cân ở mỏ). </w:t>
+      </w:r>
+      <w:r>
+        <w:rPr>
+          <w:i/>
+        </w:rPr>
+        <w:t>(T04)</w:t>
+      </w:r>
+    </w:p>
+    <w:p>
+      <w:pPr>
+        <w:pStyle w:val="ListNumber"/>
+      </w:pPr>
+      <w:r>
+        <w:t xml:space="preserve">Bấm </w:t>
+      </w:r>
+      <w:r>
+        <w:rPr>
+          <w:b/>
+        </w:rPr>
+        <w:t>Phiếu lĩnh nhiên liệu</w:t>
+      </w:r>
+      <w:r>
+        <w:t xml:space="preserve"> → màn </w:t>
+      </w:r>
+      <w:r>
+        <w:rPr>
+          <w:b/>
+        </w:rPr>
+        <w:t>Phiếu chi · Phiếu thu</w:t>
+      </w:r>
+      <w:r>
+        <w:t xml:space="preserve"> mở tờ </w:t>
+      </w:r>
+      <w:r>
+        <w:rPr>
+          <w:rFonts w:ascii="Consolas" w:hAnsi="Consolas"/>
+          <w:sz w:val="19"/>
+        </w:rPr>
+        <w:t>PLNL-…</w:t>
+      </w:r>
+      <w:r>
+        <w:t xml:space="preserve"> có mã QR, 200 lít, không có tiền → </w:t>
+      </w:r>
+      <w:r>
+        <w:rPr>
+          <w:b/>
+        </w:rPr>
+        <w:t>In</w:t>
+      </w:r>
+      <w:r>
+        <w:t xml:space="preserve">. </w:t>
+      </w:r>
+      <w:r>
+        <w:rPr>
+          <w:i/>
+        </w:rPr>
+        <w:t>(T02)</w:t>
+      </w:r>
+    </w:p>
+    <w:p>
+      <w:pPr>
+        <w:pStyle w:val="ListNumber"/>
+      </w:pPr>
+      <w:r>
+        <w:t xml:space="preserve">Quay lại phiếu → bấm </w:t>
+      </w:r>
+      <w:r>
+        <w:rPr>
+          <w:b/>
+        </w:rPr>
+        <w:t>Phiếu chi tạm ứng</w:t>
+      </w:r>
+      <w:r>
+        <w:t xml:space="preserve"> → tờ </w:t>
+      </w:r>
+      <w:r>
+        <w:rPr>
+          <w:rFonts w:ascii="Consolas" w:hAnsi="Consolas"/>
+          <w:sz w:val="19"/>
+        </w:rPr>
+        <w:t>PTU-G4-…</w:t>
+      </w:r>
+      <w:r>
+        <w:t xml:space="preserve"> có mã QR; Bãi chỉ thấy khoản mục </w:t>
+      </w:r>
+      <w:r>
+        <w:rPr>
+          <w:b/>
+        </w:rPr>
+        <w:t>sang Việt Nam</w:t>
+      </w:r>
+      <w:r>
+        <w:t xml:space="preserve"> và </w:t>
+      </w:r>
+      <w:r>
+        <w:rPr>
+          <w:b/>
+        </w:rPr>
+        <w:t>điện thoại</w:t>
+      </w:r>
+      <w:r>
+        <w:t xml:space="preserve"> (hai dòng </w:t>
+      </w:r>
+      <w:r>
+        <w:rPr>
+          <w:i/>
+        </w:rPr>
+        <w:t>Chi ngay khi xe đi</w:t>
+      </w:r>
+      <w:r>
+        <w:t xml:space="preserve">), không thấy tiền → </w:t>
+      </w:r>
+      <w:r>
+        <w:rPr>
+          <w:b/>
+        </w:rPr>
+        <w:t>In</w:t>
+      </w:r>
+      <w:r>
+        <w:t xml:space="preserve">. </w:t>
+      </w:r>
+      <w:r>
+        <w:rPr>
+          <w:i/>
+        </w:rPr>
+        <w:t>(T03)</w:t>
+      </w:r>
+    </w:p>
+    <w:p>
+      <w:pPr>
+        <w:jc w:val="both"/>
+      </w:pPr>
+      <w:r>
+        <w:t>#### B. Kế toán kiểm và nhập giá (trang điều xe)</w:t>
+      </w:r>
+    </w:p>
+    <w:p>
+      <w:pPr>
+        <w:pStyle w:val="ListNumber"/>
+      </w:pPr>
+      <w:r>
+        <w:rPr>
+          <w:rFonts w:ascii="Consolas" w:hAnsi="Consolas"/>
+          <w:sz w:val="19"/>
+        </w:rPr>
+        <w:t>ketoan</w:t>
+      </w:r>
+      <w:r>
+        <w:t xml:space="preserve">: mở phiếu G4-… (ô </w:t>
+      </w:r>
+      <w:r>
+        <w:rPr>
+          <w:b/>
+        </w:rPr>
+        <w:t>Số phiếu</w:t>
+      </w:r>
+      <w:r>
+        <w:t xml:space="preserve"> trên cùng, hoặc </w:t>
+      </w:r>
+      <w:r>
+        <w:rPr>
+          <w:b/>
+        </w:rPr>
+        <w:t>Tổng quan → Việc của tôi</w:t>
+      </w:r>
+      <w:r>
+        <w:t xml:space="preserve">) → đầu mục </w:t>
+      </w:r>
+      <w:r>
+        <w:rPr>
+          <w:b/>
+        </w:rPr>
+        <w:t>I</w:t>
+      </w:r>
+      <w:r>
+        <w:t xml:space="preserve"> bấm </w:t>
+      </w:r>
+      <w:r>
+        <w:rPr>
+          <w:b/>
+        </w:rPr>
+        <w:t>Xác nhận kiểm tra</w:t>
+      </w:r>
+      <w:r>
+        <w:t xml:space="preserve">. </w:t>
+      </w:r>
+      <w:r>
+        <w:rPr>
+          <w:i/>
+        </w:rPr>
+        <w:t>(T05)</w:t>
+      </w:r>
+    </w:p>
+    <w:p>
+      <w:pPr>
+        <w:pStyle w:val="ListNumber"/>
+      </w:pPr>
+      <w:r>
+        <w:rPr>
+          <w:rFonts w:ascii="Consolas" w:hAnsi="Consolas"/>
+          <w:sz w:val="19"/>
+        </w:rPr>
+        <w:t>ketoancp</w:t>
+      </w:r>
+      <w:r>
+        <w:t xml:space="preserve">: thẻ </w:t>
+      </w:r>
+      <w:r>
+        <w:rPr>
+          <w:b/>
+        </w:rPr>
+        <w:t>IV</w:t>
+      </w:r>
+      <w:r>
+        <w:t xml:space="preserve"> → cột </w:t>
+      </w:r>
+      <w:r>
+        <w:rPr>
+          <w:b/>
+        </w:rPr>
+        <w:t>Đơn giá</w:t>
+      </w:r>
+      <w:r>
+        <w:t xml:space="preserve"> gõ </w:t>
+      </w:r>
+      <w:r>
+        <w:rPr>
+          <w:b/>
+        </w:rPr>
+        <w:t>60.000 · 430.000 · 620.000 · 1.800.000 · 150.000</w:t>
+      </w:r>
+      <w:r>
+        <w:t xml:space="preserve"> (theo thứ tự 5 dòng trên) → </w:t>
+      </w:r>
+      <w:r>
+        <w:rPr>
+          <w:b/>
+        </w:rPr>
+        <w:t>Lưu</w:t>
+      </w:r>
+      <w:r>
+        <w:t xml:space="preserve"> → dòng </w:t>
+      </w:r>
+      <w:r>
+        <w:rPr>
+          <w:b/>
+        </w:rPr>
+        <w:t>Tổng</w:t>
+      </w:r>
+      <w:r>
+        <w:t xml:space="preserve"> = </w:t>
+      </w:r>
+      <w:r>
+        <w:rPr>
+          <w:b/>
+        </w:rPr>
+        <w:t>3.060.000</w:t>
+      </w:r>
+      <w:r>
+        <w:t xml:space="preserve"> → </w:t>
+      </w:r>
+      <w:r>
+        <w:rPr>
+          <w:b/>
+        </w:rPr>
+        <w:t>Xác nhận kiểm tra</w:t>
+      </w:r>
+      <w:r>
+        <w:t xml:space="preserve"> → </w:t>
+      </w:r>
+      <w:r>
+        <w:rPr>
+          <w:b/>
+        </w:rPr>
+        <w:t>Ghi sổ kế toán</w:t>
+      </w:r>
+      <w:r>
+        <w:t xml:space="preserve">. Mở lại </w:t>
+      </w:r>
+      <w:r>
+        <w:rPr>
+          <w:b/>
+        </w:rPr>
+        <w:t>Phiếu chi tạm ứng</w:t>
+      </w:r>
+      <w:r>
+        <w:t xml:space="preserve">: tổng </w:t>
+      </w:r>
+      <w:r>
+        <w:rPr>
+          <w:b/>
+        </w:rPr>
+        <w:t>580.000 LAK</w:t>
+      </w:r>
+      <w:r>
+        <w:t xml:space="preserve"> (430.000 + 150.000). </w:t>
+      </w:r>
+      <w:r>
+        <w:rPr>
+          <w:i/>
+        </w:rPr>
+        <w:t>(T03c, T08)</w:t>
+      </w:r>
+    </w:p>
+    <w:p>
+      <w:pPr>
+        <w:jc w:val="both"/>
+      </w:pPr>
+      <w:r>
+        <w:t>#### C. Cấp dầu, chi tạm ứng (trang kế toán)</w:t>
+      </w:r>
+    </w:p>
+    <w:p>
+      <w:pPr>
+        <w:pStyle w:val="ListNumber"/>
+      </w:pPr>
+      <w:r>
+        <w:rPr>
+          <w:rFonts w:ascii="Consolas" w:hAnsi="Consolas"/>
+          <w:sz w:val="19"/>
+        </w:rPr>
+        <w:t>khotb</w:t>
+      </w:r>
+      <w:r>
+        <w:t xml:space="preserve">: </w:t>
+      </w:r>
+      <w:r>
+        <w:rPr>
+          <w:b/>
+        </w:rPr>
+        <w:t>Kho → Cấp phát</w:t>
+      </w:r>
+      <w:r>
+        <w:t xml:space="preserve"> → bảng </w:t>
+      </w:r>
+      <w:r>
+        <w:rPr>
+          <w:b/>
+        </w:rPr>
+        <w:t>Chờ cấp</w:t>
+      </w:r>
+      <w:r>
+        <w:t xml:space="preserve"> có </w:t>
+      </w:r>
+      <w:r>
+        <w:rPr>
+          <w:rFonts w:ascii="Consolas" w:hAnsi="Consolas"/>
+          <w:sz w:val="19"/>
+        </w:rPr>
+        <w:t>PLNL-G4-…</w:t>
+      </w:r>
+      <w:r>
+        <w:t xml:space="preserve"> → bấm dòng (hoặc gõ mã trên tờ vào ô </w:t>
+      </w:r>
+      <w:r>
+        <w:rPr>
+          <w:b/>
+        </w:rPr>
+        <w:t>Nhập mã QR</w:t>
+      </w:r>
+      <w:r>
+        <w:t xml:space="preserve">) → khung </w:t>
+      </w:r>
+      <w:r>
+        <w:rPr>
+          <w:b/>
+        </w:rPr>
+        <w:t>Đối chiếu trước khi cấp</w:t>
+      </w:r>
+      <w:r>
+        <w:t xml:space="preserve"> đúng xe 343, đúng tài xế → </w:t>
+      </w:r>
+      <w:r>
+        <w:rPr>
+          <w:b/>
+        </w:rPr>
+        <w:t>Cấp dầu</w:t>
+      </w:r>
+      <w:r>
+        <w:t xml:space="preserve"> → hộp </w:t>
+      </w:r>
+      <w:r>
+        <w:rPr>
+          <w:b/>
+        </w:rPr>
+        <w:t>Số lít cấp thật</w:t>
+      </w:r>
+      <w:r>
+        <w:t xml:space="preserve"> 200 → </w:t>
+      </w:r>
+      <w:r>
+        <w:rPr>
+          <w:b/>
+        </w:rPr>
+        <w:t>Cấp dầu</w:t>
+      </w:r>
+      <w:r>
+        <w:t xml:space="preserve">. Tồn kho Thà Bốc giảm 200 L. </w:t>
+      </w:r>
+      <w:r>
+        <w:rPr>
+          <w:i/>
+        </w:rPr>
+        <w:t>(T06)</w:t>
+      </w:r>
+    </w:p>
+    <w:p>
+      <w:pPr>
+        <w:pStyle w:val="ListNumber"/>
+      </w:pPr>
+      <w:r>
+        <w:rPr>
+          <w:rFonts w:ascii="Consolas" w:hAnsi="Consolas"/>
+          <w:sz w:val="19"/>
+        </w:rPr>
+        <w:t>khonl</w:t>
+      </w:r>
+      <w:r>
+        <w:t xml:space="preserve"> (trang điều xe): mở phiếu G4-… → mục </w:t>
+      </w:r>
+      <w:r>
+        <w:rPr>
+          <w:b/>
+        </w:rPr>
+        <w:t>III</w:t>
+      </w:r>
+      <w:r>
+        <w:t xml:space="preserve"> → </w:t>
+      </w:r>
+      <w:r>
+        <w:rPr>
+          <w:b/>
+        </w:rPr>
+        <w:t>Xác nhận kiểm tra</w:t>
+      </w:r>
+      <w:r>
+        <w:t xml:space="preserve"> → </w:t>
+      </w:r>
+      <w:r>
+        <w:rPr>
+          <w:b/>
+        </w:rPr>
+        <w:t>Ghi sổ kế toán</w:t>
+      </w:r>
+      <w:r>
+        <w:t xml:space="preserve">. </w:t>
+      </w:r>
+      <w:r>
+        <w:rPr>
+          <w:i/>
+        </w:rPr>
+        <w:t>(T07)</w:t>
+      </w:r>
+    </w:p>
+    <w:p>
+      <w:pPr>
+        <w:pStyle w:val="ListNumber"/>
+      </w:pPr>
+      <w:r>
+        <w:rPr>
+          <w:rFonts w:ascii="Consolas" w:hAnsi="Consolas"/>
+          <w:sz w:val="19"/>
+        </w:rPr>
+        <w:t>quytb</w:t>
+      </w:r>
+      <w:r>
+        <w:t xml:space="preserve"> (trang kế toán): </w:t>
+      </w:r>
+      <w:r>
+        <w:rPr>
+          <w:b/>
+        </w:rPr>
+        <w:t>Kho → Cấp phát</w:t>
+      </w:r>
+      <w:r>
+        <w:t xml:space="preserve"> → tab </w:t>
+      </w:r>
+      <w:r>
+        <w:rPr>
+          <w:b/>
+        </w:rPr>
+        <w:t>Phiếu tạm ứng đi đường</w:t>
+      </w:r>
+      <w:r>
+        <w:t xml:space="preserve"> → dòng </w:t>
+      </w:r>
+      <w:r>
+        <w:rPr>
+          <w:rFonts w:ascii="Consolas" w:hAnsi="Consolas"/>
+          <w:sz w:val="19"/>
+        </w:rPr>
+        <w:t>PTU-G4-…</w:t>
+      </w:r>
+      <w:r>
+        <w:t xml:space="preserve"> </w:t>
+      </w:r>
+      <w:r>
+        <w:rPr>
+          <w:b/>
+        </w:rPr>
+        <w:t>Số tiền 580.000</w:t>
+      </w:r>
+      <w:r>
+        <w:t xml:space="preserve"> → </w:t>
+      </w:r>
+      <w:r>
+        <w:rPr>
+          <w:b/>
+        </w:rPr>
+        <w:t>Chi tiền</w:t>
+      </w:r>
+      <w:r>
+        <w:t xml:space="preserve"> → xác nhận. Bên trang điều xe mục </w:t>
+      </w:r>
+      <w:r>
+        <w:rPr>
+          <w:b/>
+        </w:rPr>
+        <w:t>IV</w:t>
+      </w:r>
+      <w:r>
+        <w:t xml:space="preserve"> thành </w:t>
+      </w:r>
+      <w:r>
+        <w:rPr>
+          <w:i/>
+        </w:rPr>
+        <w:t>Đã chi</w:t>
+      </w:r>
+      <w:r>
+        <w:t xml:space="preserve">. </w:t>
+      </w:r>
+      <w:r>
+        <w:rPr>
+          <w:i/>
+        </w:rPr>
+        <w:t>(T09)</w:t>
+      </w:r>
+      <w:r>
+        <w:t xml:space="preserve"> — Hoặc chi ở trang điều xe: mở phiếu → mục IV → </w:t>
+      </w:r>
+      <w:r>
+        <w:rPr>
+          <w:b/>
+        </w:rPr>
+        <w:t>Xác nhận đã chi</w:t>
+      </w:r>
+      <w:r>
+        <w:t xml:space="preserve"> (tờ QR tự thành </w:t>
+      </w:r>
+      <w:r>
+        <w:rPr>
+          <w:i/>
+        </w:rPr>
+        <w:t>Đã cấp</w:t>
+      </w:r>
+      <w:r>
+        <w:t>, quét lại thì bị chặn).</w:t>
+      </w:r>
+    </w:p>
+    <w:p>
+      <w:pPr>
+        <w:jc w:val="both"/>
+      </w:pPr>
+      <w:r>
+        <w:t xml:space="preserve">#### D. Tài xế trên đường (điện thoại / ẩn danh, </w:t>
+      </w:r>
+      <w:r>
+        <w:rPr>
+          <w:rFonts w:ascii="Consolas" w:hAnsi="Consolas"/>
+          <w:sz w:val="19"/>
+        </w:rPr>
+        <w:t>tx01</w:t>
+      </w:r>
+      <w:r>
+        <w:t>)</w:t>
+      </w:r>
+    </w:p>
+    <w:p>
+      <w:pPr>
+        <w:pStyle w:val="ListNumber"/>
+      </w:pPr>
+      <w:r>
+        <w:rPr>
+          <w:b/>
+        </w:rPr>
+        <w:t>Phiếu của tôi</w:t>
+      </w:r>
+      <w:r>
+        <w:t xml:space="preserve"> → thẻ phiếu G4-… (có thể có vài phiếu cũ — chọn đúng số): ô </w:t>
+      </w:r>
+      <w:r>
+        <w:rPr>
+          <w:b/>
+        </w:rPr>
+        <w:t>Tiền tạm ứng</w:t>
+      </w:r>
+      <w:r>
+        <w:t xml:space="preserve"> ghi </w:t>
+      </w:r>
+      <w:r>
+        <w:rPr>
+          <w:b/>
+        </w:rPr>
+        <w:t>580.000 LAK · Đã nhận tiền</w:t>
+      </w:r>
+      <w:r>
+        <w:t xml:space="preserve"> → bấm </w:t>
+      </w:r>
+      <w:r>
+        <w:rPr>
+          <w:b/>
+        </w:rPr>
+        <w:t>Xuất phát</w:t>
+      </w:r>
+      <w:r>
+        <w:t xml:space="preserve"> → cho phép vị trí. Phiếu </w:t>
+      </w:r>
+      <w:r>
+        <w:rPr>
+          <w:i/>
+        </w:rPr>
+        <w:t>Đang vận chuyển</w:t>
+      </w:r>
+      <w:r>
+        <w:t xml:space="preserve">. </w:t>
+      </w:r>
+      <w:r>
+        <w:rPr>
+          <w:i/>
+        </w:rPr>
+        <w:t>(T10)</w:t>
+      </w:r>
+    </w:p>
+    <w:p>
+      <w:pPr>
+        <w:pStyle w:val="ListNumber"/>
+      </w:pPr>
+      <w:r>
+        <w:t xml:space="preserve">(tới mỏ, bốc xong) bấm </w:t>
+      </w:r>
+      <w:r>
+        <w:rPr>
+          <w:b/>
+        </w:rPr>
+        <w:t>Báo cân ở mỏ</w:t>
+      </w:r>
+      <w:r>
+        <w:t xml:space="preserve"> → </w:t>
+      </w:r>
+      <w:r>
+        <w:rPr>
+          <w:b/>
+        </w:rPr>
+        <w:t>Cân tại mỏ (t)</w:t>
+      </w:r>
+      <w:r>
+        <w:t xml:space="preserve"> </w:t>
+      </w:r>
+      <w:r>
+        <w:rPr>
+          <w:b/>
+        </w:rPr>
+        <w:t>40</w:t>
+      </w:r>
+      <w:r>
+        <w:t xml:space="preserve"> → </w:t>
+      </w:r>
+      <w:r>
+        <w:rPr>
+          <w:b/>
+        </w:rPr>
+        <w:t>Thêm ảnh phiếu cân · phiếu quặng</w:t>
+      </w:r>
+      <w:r>
+        <w:t xml:space="preserve"> (chụp một tờ, không bắt buộc) → </w:t>
+      </w:r>
+      <w:r>
+        <w:rPr>
+          <w:b/>
+        </w:rPr>
+        <w:t>Gửi</w:t>
+      </w:r>
+      <w:r>
+        <w:t xml:space="preserve"> → </w:t>
+      </w:r>
+      <w:r>
+        <w:rPr>
+          <w:i/>
+        </w:rPr>
+        <w:t>Đã báo cân tại mỏ. Bãi sẽ xác nhận.</w:t>
+      </w:r>
+      <w:r>
+        <w:t xml:space="preserve"> Muốn thử mất mạng: bật chế độ máy bay trước khi bấm </w:t>
+      </w:r>
+      <w:r>
+        <w:rPr>
+          <w:b/>
+        </w:rPr>
+        <w:t>Gửi</w:t>
+      </w:r>
+      <w:r>
+        <w:t xml:space="preserve"> (ca T10c). </w:t>
+      </w:r>
+      <w:r>
+        <w:rPr>
+          <w:i/>
+        </w:rPr>
+        <w:t>(T10b)</w:t>
+      </w:r>
+    </w:p>
+    <w:p>
+      <w:pPr>
+        <w:jc w:val="both"/>
+      </w:pPr>
+      <w:r>
+        <w:t>#### E. Bãi và kế toán chốt mục II (trang điều xe)</w:t>
+      </w:r>
+    </w:p>
+    <w:p>
+      <w:pPr>
+        <w:pStyle w:val="ListNumber"/>
+      </w:pPr>
+      <w:r>
+        <w:rPr>
+          <w:rFonts w:ascii="Consolas" w:hAnsi="Consolas"/>
+          <w:sz w:val="19"/>
+        </w:rPr>
+        <w:t>thabok</w:t>
+      </w:r>
+      <w:r>
+        <w:t xml:space="preserve">: mở phiếu G4-… → thẻ </w:t>
+      </w:r>
+      <w:r>
+        <w:rPr>
+          <w:b/>
+        </w:rPr>
+        <w:t>II</w:t>
+      </w:r>
+      <w:r>
+        <w:t xml:space="preserve">: ô </w:t>
+      </w:r>
+      <w:r>
+        <w:rPr>
+          <w:b/>
+        </w:rPr>
+        <w:t>Cân tại mỏ (t)</w:t>
+      </w:r>
+      <w:r>
+        <w:t xml:space="preserve"> đã có </w:t>
+      </w:r>
+      <w:r>
+        <w:rPr>
+          <w:b/>
+        </w:rPr>
+        <w:t>40</w:t>
+      </w:r>
+      <w:r>
+        <w:t xml:space="preserve">, ảnh ở </w:t>
+      </w:r>
+      <w:r>
+        <w:rPr>
+          <w:b/>
+        </w:rPr>
+        <w:t>Phiếu quặng đính kèm</w:t>
+      </w:r>
+      <w:r>
+        <w:t xml:space="preserve"> → đầu mục </w:t>
+      </w:r>
+      <w:r>
+        <w:rPr>
+          <w:b/>
+        </w:rPr>
+        <w:t>II</w:t>
+      </w:r>
+      <w:r>
+        <w:t xml:space="preserve"> bấm </w:t>
+      </w:r>
+      <w:r>
+        <w:rPr>
+          <w:b/>
+        </w:rPr>
+        <w:t>Gửi kiểm tra</w:t>
+      </w:r>
+      <w:r>
+        <w:t xml:space="preserve">. </w:t>
+      </w:r>
+      <w:r>
+        <w:rPr>
+          <w:i/>
+        </w:rPr>
+        <w:t>(T10d)</w:t>
+      </w:r>
+    </w:p>
+    <w:p>
+      <w:pPr>
+        <w:pStyle w:val="ListNumber"/>
+      </w:pPr>
+      <w:r>
+        <w:rPr>
+          <w:rFonts w:ascii="Consolas" w:hAnsi="Consolas"/>
+          <w:sz w:val="19"/>
+        </w:rPr>
+        <w:t>ketoan</w:t>
+      </w:r>
+      <w:r>
+        <w:t xml:space="preserve">: thẻ </w:t>
+      </w:r>
+      <w:r>
+        <w:rPr>
+          <w:b/>
+        </w:rPr>
+        <w:t>II</w:t>
+      </w:r>
+      <w:r>
+        <w:t xml:space="preserve"> → gõ </w:t>
+      </w:r>
+      <w:r>
+        <w:rPr>
+          <w:b/>
+        </w:rPr>
+        <w:t>Số phiếu quặng</w:t>
+      </w:r>
+      <w:r>
+        <w:t xml:space="preserve"> (ví dụ </w:t>
+      </w:r>
+      <w:r>
+        <w:rPr>
+          <w:rFonts w:ascii="Consolas" w:hAnsi="Consolas"/>
+          <w:sz w:val="19"/>
+        </w:rPr>
+        <w:t>BQ-2909-01</w:t>
+      </w:r>
+      <w:r>
+        <w:t xml:space="preserve">) và </w:t>
+      </w:r>
+      <w:r>
+        <w:rPr>
+          <w:b/>
+        </w:rPr>
+        <w:t>Ngày phiếu quặng</w:t>
+      </w:r>
+      <w:r>
+        <w:t xml:space="preserve"> → </w:t>
+      </w:r>
+      <w:r>
+        <w:rPr>
+          <w:b/>
+        </w:rPr>
+        <w:t>Lưu</w:t>
+      </w:r>
+      <w:r>
+        <w:t xml:space="preserve"> → mục </w:t>
+      </w:r>
+      <w:r>
+        <w:rPr>
+          <w:b/>
+        </w:rPr>
+        <w:t>II</w:t>
+      </w:r>
+      <w:r>
+        <w:t xml:space="preserve"> </w:t>
+      </w:r>
+      <w:r>
+        <w:rPr>
+          <w:b/>
+        </w:rPr>
+        <w:t>Xác nhận kiểm tra</w:t>
+      </w:r>
+      <w:r>
+        <w:t xml:space="preserve">. Ketoan thấy </w:t>
+      </w:r>
+      <w:r>
+        <w:rPr>
+          <w:b/>
+        </w:rPr>
+        <w:t>Giá cước</w:t>
+      </w:r>
+      <w:r>
+        <w:t xml:space="preserve"> </w:t>
+      </w:r>
+      <w:r>
+        <w:rPr>
+          <w:b/>
+        </w:rPr>
+        <w:t>12,5 USD/t</w:t>
+      </w:r>
+      <w:r>
+        <w:t xml:space="preserve"> (bảng giá ຄຳຕຸ້ຍ × tuyến). Điện thoại tài xế tải lại: không còn nút </w:t>
+      </w:r>
+      <w:r>
+        <w:rPr>
+          <w:b/>
+        </w:rPr>
+        <w:t>Báo cân ở mỏ</w:t>
+      </w:r>
+      <w:r>
+        <w:t xml:space="preserve">. </w:t>
+      </w:r>
+      <w:r>
+        <w:rPr>
+          <w:i/>
+        </w:rPr>
+        <w:t>(T10d)</w:t>
+      </w:r>
+    </w:p>
+    <w:p>
+      <w:pPr>
+        <w:jc w:val="both"/>
+      </w:pPr>
+      <w:r>
+        <w:t>#### F. Xe về bãi — hàng vào kho</w:t>
+      </w:r>
+    </w:p>
+    <w:p>
+      <w:pPr>
+        <w:pStyle w:val="ListNumber"/>
+      </w:pPr>
+      <w:r>
+        <w:rPr>
+          <w:rFonts w:ascii="Consolas" w:hAnsi="Consolas"/>
+          <w:sz w:val="19"/>
+        </w:rPr>
+        <w:t>tx01</w:t>
+      </w:r>
+      <w:r>
+        <w:t xml:space="preserve">: </w:t>
+      </w:r>
+      <w:r>
+        <w:rPr>
+          <w:b/>
+        </w:rPr>
+        <w:t>Báo đã về</w:t>
+      </w:r>
+      <w:r>
+        <w:t xml:space="preserve"> → </w:t>
+      </w:r>
+      <w:r>
+        <w:rPr>
+          <w:b/>
+        </w:rPr>
+        <w:t>Ngày xe về</w:t>
+      </w:r>
+      <w:r>
+        <w:t xml:space="preserve"> hôm nay, </w:t>
+      </w:r>
+      <w:r>
+        <w:rPr>
+          <w:b/>
+        </w:rPr>
+        <w:t>Km về</w:t>
+      </w:r>
+      <w:r>
+        <w:t xml:space="preserve"> </w:t>
+      </w:r>
+      <w:r>
+        <w:rPr>
+          <w:b/>
+        </w:rPr>
+        <w:t>61490</w:t>
+      </w:r>
+      <w:r>
+        <w:t xml:space="preserve"> → </w:t>
+      </w:r>
+      <w:r>
+        <w:rPr>
+          <w:b/>
+        </w:rPr>
+        <w:t>Lưu</w:t>
+      </w:r>
+      <w:r>
+        <w:t xml:space="preserve">. </w:t>
+      </w:r>
+      <w:r>
+        <w:rPr>
+          <w:i/>
+        </w:rPr>
+        <w:t>(T12)</w:t>
+      </w:r>
+    </w:p>
+    <w:p>
+      <w:pPr>
+        <w:pStyle w:val="ListNumber"/>
+      </w:pPr>
+      <w:r>
+        <w:rPr>
+          <w:rFonts w:ascii="Consolas" w:hAnsi="Consolas"/>
+          <w:sz w:val="19"/>
+        </w:rPr>
+        <w:t>thabok</w:t>
+      </w:r>
+      <w:r>
+        <w:t xml:space="preserve">: phiếu G4-… → </w:t>
+      </w:r>
+      <w:r>
+        <w:rPr>
+          <w:b/>
+        </w:rPr>
+        <w:t>Xe đã tới · nhập cân cuối</w:t>
+      </w:r>
+      <w:r>
+        <w:t xml:space="preserve"> → ô </w:t>
+      </w:r>
+      <w:r>
+        <w:rPr>
+          <w:b/>
+        </w:rPr>
+        <w:t>Cân tại mỏ (t)</w:t>
+      </w:r>
+      <w:r>
+        <w:t xml:space="preserve"> đã điền sẵn </w:t>
+      </w:r>
+      <w:r>
+        <w:rPr>
+          <w:b/>
+        </w:rPr>
+        <w:t>40</w:t>
+      </w:r>
+      <w:r>
+        <w:t xml:space="preserve"> (không sửa) → </w:t>
+      </w:r>
+      <w:r>
+        <w:rPr>
+          <w:b/>
+        </w:rPr>
+        <w:t>Cân tại bãi khi về (t)</w:t>
+      </w:r>
+      <w:r>
+        <w:t xml:space="preserve"> </w:t>
+      </w:r>
+      <w:r>
+        <w:rPr>
+          <w:b/>
+        </w:rPr>
+        <w:t>39,6</w:t>
+      </w:r>
+      <w:r>
+        <w:t xml:space="preserve"> → ngày về, km về đã điền sẵn → </w:t>
+      </w:r>
+      <w:r>
+        <w:rPr>
+          <w:b/>
+        </w:rPr>
+        <w:t>Đồng ý</w:t>
+      </w:r>
+      <w:r>
+        <w:t xml:space="preserve">. Trên phiếu có dòng hao hụt </w:t>
+      </w:r>
+      <w:r>
+        <w:rPr>
+          <w:b/>
+        </w:rPr>
+        <w:t>0,4 t</w:t>
+      </w:r>
+      <w:r>
+        <w:t xml:space="preserve">; ô </w:t>
+      </w:r>
+      <w:r>
+        <w:rPr>
+          <w:b/>
+        </w:rPr>
+        <w:t>Km chạy</w:t>
+      </w:r>
+      <w:r>
+        <w:t xml:space="preserve"> = </w:t>
+      </w:r>
+      <w:r>
+        <w:rPr>
+          <w:b/>
+        </w:rPr>
+        <w:t>290</w:t>
+      </w:r>
+      <w:r>
+        <w:t xml:space="preserve">. </w:t>
+      </w:r>
+      <w:r>
+        <w:rPr>
+          <w:i/>
+        </w:rPr>
+        <w:t>(T12)</w:t>
+      </w:r>
+    </w:p>
+    <w:p>
+      <w:pPr>
+        <w:pStyle w:val="ListNumber"/>
+      </w:pPr>
+      <w:r>
+        <w:t xml:space="preserve">Trang kế toán, </w:t>
+      </w:r>
+      <w:r>
+        <w:rPr>
+          <w:rFonts w:ascii="Consolas" w:hAnsi="Consolas"/>
+          <w:sz w:val="19"/>
+        </w:rPr>
+        <w:t>ketoan</w:t>
+      </w:r>
+      <w:r>
+        <w:t xml:space="preserve">: </w:t>
+      </w:r>
+      <w:r>
+        <w:rPr>
+          <w:b/>
+        </w:rPr>
+        <w:t>Kho → Kho hàng</w:t>
+      </w:r>
+      <w:r>
+        <w:t xml:space="preserve"> → bảng </w:t>
+      </w:r>
+      <w:r>
+        <w:rPr>
+          <w:b/>
+        </w:rPr>
+        <w:t>Lô hàng trong kho</w:t>
+      </w:r>
+      <w:r>
+        <w:t xml:space="preserve"> có lô </w:t>
+      </w:r>
+      <w:r>
+        <w:rPr>
+          <w:b/>
+        </w:rPr>
+        <w:t>G4-…</w:t>
+      </w:r>
+      <w:r>
+        <w:t xml:space="preserve"> còn </w:t>
+      </w:r>
+      <w:r>
+        <w:rPr>
+          <w:b/>
+        </w:rPr>
+        <w:t>39,6 t</w:t>
+      </w:r>
+      <w:r>
+        <w:t xml:space="preserve">, tờ </w:t>
+      </w:r>
+      <w:r>
+        <w:rPr>
+          <w:b/>
+        </w:rPr>
+        <w:t>PNK_HH</w:t>
+      </w:r>
+      <w:r>
+        <w:t xml:space="preserve">. </w:t>
+      </w:r>
+      <w:r>
+        <w:rPr>
+          <w:i/>
+        </w:rPr>
+        <w:t>(T12)</w:t>
+      </w:r>
+    </w:p>
+    <w:p>
+      <w:pPr>
+        <w:jc w:val="both"/>
+      </w:pPr>
+      <w:r>
+        <w:t xml:space="preserve">#### G. Phiếu GIAO lấy hàng từ lô (trang điều xe, </w:t>
+      </w:r>
+      <w:r>
+        <w:rPr>
+          <w:rFonts w:ascii="Consolas" w:hAnsi="Consolas"/>
+          <w:sz w:val="19"/>
+        </w:rPr>
+        <w:t>thabok</w:t>
+      </w:r>
+      <w:r>
+        <w:t>)</w:t>
+      </w:r>
+    </w:p>
+    <w:p>
+      <w:pPr>
+        <w:pStyle w:val="ListNumber"/>
+      </w:pPr>
+      <w:r>
+        <w:rPr>
+          <w:b/>
+        </w:rPr>
+        <w:t>Phiếu mới</w:t>
+      </w:r>
+      <w:r>
+        <w:t xml:space="preserve"> → </w:t>
+      </w:r>
+      <w:r>
+        <w:rPr>
+          <w:b/>
+        </w:rPr>
+        <w:t>Loại phiếu</w:t>
+      </w:r>
+      <w:r>
+        <w:t xml:space="preserve"> = </w:t>
+      </w:r>
+      <w:r>
+        <w:rPr>
+          <w:b/>
+        </w:rPr>
+        <w:t>Giao (bãi → khách)</w:t>
+      </w:r>
+      <w:r>
+        <w:t xml:space="preserve"> (số </w:t>
+      </w:r>
+      <w:r>
+        <w:rPr>
+          <w:rFonts w:ascii="Consolas" w:hAnsi="Consolas"/>
+          <w:sz w:val="19"/>
+        </w:rPr>
+        <w:t>T4-…</w:t>
+      </w:r>
+      <w:r>
+        <w:t xml:space="preserve">) → </w:t>
+      </w:r>
+      <w:r>
+        <w:rPr>
+          <w:b/>
+        </w:rPr>
+        <w:t>Số xe</w:t>
+      </w:r>
+      <w:r>
+        <w:t xml:space="preserve"> </w:t>
+      </w:r>
+      <w:r>
+        <w:rPr>
+          <w:b/>
+        </w:rPr>
+        <w:t>344</w:t>
+      </w:r>
+      <w:r>
+        <w:t xml:space="preserve"> (ô </w:t>
+      </w:r>
+      <w:r>
+        <w:rPr>
+          <w:b/>
+        </w:rPr>
+        <w:t>Lúc đi</w:t>
+      </w:r>
+      <w:r>
+        <w:t xml:space="preserve"> tự điền </w:t>
+      </w:r>
+      <w:r>
+        <w:rPr>
+          <w:b/>
+        </w:rPr>
+        <w:t>58800</w:t>
+      </w:r>
+      <w:r>
+        <w:t xml:space="preserve">) → </w:t>
+      </w:r>
+      <w:r>
+        <w:rPr>
+          <w:b/>
+        </w:rPr>
+        <w:t>Tài xế</w:t>
+      </w:r>
+      <w:r>
+        <w:t xml:space="preserve"> </w:t>
+      </w:r>
+      <w:r>
+        <w:rPr>
+          <w:b/>
+        </w:rPr>
+        <w:t>ທ້າວ ບຸນມີ</w:t>
+      </w:r>
+      <w:r>
+        <w:t xml:space="preserve"> (</w:t>
+      </w:r>
+      <w:r>
+        <w:rPr>
+          <w:rFonts w:ascii="Consolas" w:hAnsi="Consolas"/>
+          <w:sz w:val="19"/>
+        </w:rPr>
+        <w:t>tx02</w:t>
+      </w:r>
+      <w:r>
+        <w:t xml:space="preserve">) → thẻ </w:t>
+      </w:r>
+      <w:r>
+        <w:rPr>
+          <w:b/>
+        </w:rPr>
+        <w:t>II</w:t>
+      </w:r>
+      <w:r>
+        <w:t xml:space="preserve">: tuyến </w:t>
+      </w:r>
+      <w:r>
+        <w:rPr>
+          <w:i/>
+        </w:rPr>
+        <w:t>ທ່າບົກ → ທ່າເຮືອກະລໍ · 360.0 km · ↩ 360.0 km</w:t>
+      </w:r>
+      <w:r>
+        <w:t xml:space="preserve">, khách </w:t>
+      </w:r>
+      <w:r>
+        <w:rPr>
+          <w:b/>
+        </w:rPr>
+        <w:t>ຄຳຕຸ້ຍ</w:t>
+      </w:r>
+      <w:r>
+        <w:t xml:space="preserve"> → khung </w:t>
+      </w:r>
+      <w:r>
+        <w:rPr>
+          <w:b/>
+        </w:rPr>
+        <w:t>Hàng trên phiếu</w:t>
+      </w:r>
+      <w:r>
+        <w:t xml:space="preserve"> → </w:t>
+      </w:r>
+      <w:r>
+        <w:rPr>
+          <w:b/>
+        </w:rPr>
+        <w:t>Thêm dòng</w:t>
+      </w:r>
+      <w:r>
+        <w:t xml:space="preserve"> → </w:t>
+      </w:r>
+      <w:r>
+        <w:rPr>
+          <w:b/>
+        </w:rPr>
+        <w:t>Lấy từ lô (phiếu gom)</w:t>
+      </w:r>
+      <w:r>
+        <w:t xml:space="preserve"> chọn lô </w:t>
+      </w:r>
+      <w:r>
+        <w:rPr>
+          <w:b/>
+        </w:rPr>
+        <w:t>G4-… · 39,60 t</w:t>
+      </w:r>
+      <w:r>
+        <w:t xml:space="preserve"> → </w:t>
+      </w:r>
+      <w:r>
+        <w:rPr>
+          <w:b/>
+        </w:rPr>
+        <w:t>Số tấn</w:t>
+      </w:r>
+      <w:r>
+        <w:t xml:space="preserve"> </w:t>
+      </w:r>
+      <w:r>
+        <w:rPr>
+          <w:b/>
+        </w:rPr>
+        <w:t>25</w:t>
+      </w:r>
+      <w:r>
+        <w:t xml:space="preserve">. </w:t>
+      </w:r>
+      <w:r>
+        <w:rPr>
+          <w:i/>
+        </w:rPr>
+        <w:t>(T14)</w:t>
+      </w:r>
+    </w:p>
+    <w:p>
+      <w:pPr>
+        <w:pStyle w:val="ListNumber"/>
+      </w:pPr>
+      <w:r>
+        <w:t xml:space="preserve">Thẻ </w:t>
+      </w:r>
+      <w:r>
+        <w:rPr>
+          <w:b/>
+        </w:rPr>
+        <w:t>IV</w:t>
+      </w:r>
+      <w:r>
+        <w:t xml:space="preserve">: dòng </w:t>
+      </w:r>
+      <w:r>
+        <w:rPr>
+          <w:b/>
+        </w:rPr>
+        <w:t>Phí cao tốc</w:t>
+      </w:r>
+      <w:r>
+        <w:t xml:space="preserve"> máy </w:t>
+      </w:r>
+      <w:r>
+        <w:rPr>
+          <w:b/>
+        </w:rPr>
+        <w:t>tự thêm</w:t>
+      </w:r>
+      <w:r>
+        <w:t xml:space="preserve"> (tuyến có BOT) → ô thẻ: chọn một thẻ cao tốc (trừ thẻ, không vào tạm ứng) hoặc để </w:t>
+      </w:r>
+      <w:r>
+        <w:rPr>
+          <w:b/>
+        </w:rPr>
+        <w:t>Trả tiền mặt (không dùng thẻ)</w:t>
+      </w:r>
+      <w:r>
+        <w:t xml:space="preserve">. </w:t>
+      </w:r>
+      <w:r>
+        <w:rPr>
+          <w:b/>
+        </w:rPr>
+        <w:t>+ Thêm dòng</w:t>
+      </w:r>
+      <w:r>
+        <w:t xml:space="preserve">: tiền nước, sang Việt Nam, tiền chuyến, điện thoại (SL 1). → </w:t>
+      </w:r>
+      <w:r>
+        <w:rPr>
+          <w:b/>
+        </w:rPr>
+        <w:t>Lưu</w:t>
+      </w:r>
+      <w:r>
+        <w:t xml:space="preserve"> → </w:t>
+      </w:r>
+      <w:r>
+        <w:rPr>
+          <w:b/>
+        </w:rPr>
+        <w:t>Cân đầu</w:t>
+      </w:r>
+      <w:r>
+        <w:t xml:space="preserve"> = </w:t>
+      </w:r>
+      <w:r>
+        <w:rPr>
+          <w:b/>
+        </w:rPr>
+        <w:t>25</w:t>
+      </w:r>
+      <w:r>
+        <w:t xml:space="preserve">; lô G4-… còn </w:t>
+      </w:r>
+      <w:r>
+        <w:rPr>
+          <w:b/>
+        </w:rPr>
+        <w:t>14,6 t</w:t>
+      </w:r>
+      <w:r>
+        <w:t xml:space="preserve">. Thử gõ 50 t → máy chặn (quá tồn). </w:t>
+      </w:r>
+      <w:r>
+        <w:rPr>
+          <w:i/>
+        </w:rPr>
+        <w:t>(T14)</w:t>
+      </w:r>
+    </w:p>
+    <w:p>
+      <w:pPr>
+        <w:pStyle w:val="ListNumber"/>
+      </w:pPr>
+      <w:r>
+        <w:t xml:space="preserve">Làm lại như bước 7–15 cho phiếu T4-…: </w:t>
+      </w:r>
+      <w:r>
+        <w:rPr>
+          <w:b/>
+        </w:rPr>
+        <w:t>Gửi kiểm tra</w:t>
+      </w:r>
+      <w:r>
+        <w:t xml:space="preserve"> mục I, </w:t>
+      </w:r>
+      <w:r>
+        <w:rPr>
+          <w:b/>
+        </w:rPr>
+        <w:t>II</w:t>
+      </w:r>
+      <w:r>
+        <w:t xml:space="preserve"> (phiếu giao gửi luôn), IV → </w:t>
+      </w:r>
+      <w:r>
+        <w:rPr>
+          <w:rFonts w:ascii="Consolas" w:hAnsi="Consolas"/>
+          <w:sz w:val="19"/>
+        </w:rPr>
+        <w:t>ketoan</w:t>
+      </w:r>
+      <w:r>
+        <w:t xml:space="preserve"> kiểm I, II (thấy giá </w:t>
+      </w:r>
+      <w:r>
+        <w:rPr>
+          <w:b/>
+        </w:rPr>
+        <w:t>30,5 USD/t</w:t>
+      </w:r>
+      <w:r>
+        <w:t xml:space="preserve">) → </w:t>
+      </w:r>
+      <w:r>
+        <w:rPr>
+          <w:rFonts w:ascii="Consolas" w:hAnsi="Consolas"/>
+          <w:sz w:val="19"/>
+        </w:rPr>
+        <w:t>ketoancp</w:t>
+      </w:r>
+      <w:r>
+        <w:t xml:space="preserve"> nhập giá IV như bước 11 (tiền nước 60.000, sang VN 430.000, tiền chuyến 1.800.000, điện thoại 150.000; phí cao tốc máy đã điền 1.833.500), kiểm, ghi sổ → </w:t>
+      </w:r>
+      <w:r>
+        <w:rPr>
+          <w:b/>
+        </w:rPr>
+        <w:t>Phiếu chi tạm ứng</w:t>
+      </w:r>
+      <w:r>
+        <w:t xml:space="preserve">: </w:t>
+      </w:r>
+      <w:r>
+        <w:rPr>
+          <w:b/>
+        </w:rPr>
+        <w:t>580.000</w:t>
+      </w:r>
+      <w:r>
+        <w:t xml:space="preserve"> nếu phí cao tốc trừ thẻ, </w:t>
+      </w:r>
+      <w:r>
+        <w:rPr>
+          <w:b/>
+        </w:rPr>
+        <w:t>2.413.500</w:t>
+      </w:r>
+      <w:r>
+        <w:t xml:space="preserve"> nếu để trả tiền mặt → </w:t>
+      </w:r>
+      <w:r>
+        <w:rPr>
+          <w:rFonts w:ascii="Consolas" w:hAnsi="Consolas"/>
+          <w:sz w:val="19"/>
+        </w:rPr>
+        <w:t>quytb</w:t>
+      </w:r>
+      <w:r>
+        <w:t xml:space="preserve"> chi → </w:t>
+      </w:r>
+      <w:r>
+        <w:rPr>
+          <w:rFonts w:ascii="Consolas" w:hAnsi="Consolas"/>
+          <w:sz w:val="19"/>
+        </w:rPr>
+        <w:t>tx02</w:t>
+      </w:r>
+      <w:r>
+        <w:t xml:space="preserve"> </w:t>
+      </w:r>
+      <w:r>
+        <w:rPr>
+          <w:b/>
+        </w:rPr>
+        <w:t>Xuất phát</w:t>
+      </w:r>
+      <w:r>
+        <w:t xml:space="preserve">. </w:t>
+      </w:r>
+      <w:r>
+        <w:rPr>
+          <w:i/>
+        </w:rPr>
+        <w:t>(T15)</w:t>
+      </w:r>
+    </w:p>
+    <w:p>
+      <w:pPr>
+        <w:pStyle w:val="ListNumber"/>
+      </w:pPr>
+      <w:r>
+        <w:rPr>
+          <w:rFonts w:ascii="Consolas" w:hAnsi="Consolas"/>
+          <w:sz w:val="19"/>
+        </w:rPr>
+        <w:t>tx02</w:t>
+      </w:r>
+      <w:r>
+        <w:t xml:space="preserve">: </w:t>
+      </w:r>
+      <w:r>
+        <w:rPr>
+          <w:b/>
+        </w:rPr>
+        <w:t>Giao hàng hoàn tất · ký nhận</w:t>
+      </w:r>
+      <w:r>
+        <w:t xml:space="preserve"> → người nhận ký lên màn → </w:t>
+      </w:r>
+      <w:r>
+        <w:rPr>
+          <w:b/>
+        </w:rPr>
+        <w:t>Thêm ảnh biên bản · phiếu cân</w:t>
+      </w:r>
+      <w:r>
+        <w:t xml:space="preserve"> → </w:t>
+      </w:r>
+      <w:r>
+        <w:rPr>
+          <w:b/>
+        </w:rPr>
+        <w:t>Gửi</w:t>
+      </w:r>
+      <w:r>
+        <w:t xml:space="preserve"> → khi về </w:t>
+      </w:r>
+      <w:r>
+        <w:rPr>
+          <w:b/>
+        </w:rPr>
+        <w:t>Báo đã về</w:t>
+      </w:r>
+      <w:r>
+        <w:t xml:space="preserve"> (km về </w:t>
+      </w:r>
+      <w:r>
+        <w:rPr>
+          <w:b/>
+        </w:rPr>
+        <w:t>59520</w:t>
+      </w:r>
+      <w:r>
+        <w:t xml:space="preserve"> = 58.800 + 720). </w:t>
+      </w:r>
+      <w:r>
+        <w:rPr>
+          <w:i/>
+        </w:rPr>
+        <w:t>(T16)</w:t>
+      </w:r>
+    </w:p>
+    <w:p>
+      <w:pPr>
+        <w:pStyle w:val="ListNumber"/>
+      </w:pPr>
+      <w:r>
+        <w:rPr>
+          <w:rFonts w:ascii="Consolas" w:hAnsi="Consolas"/>
+          <w:sz w:val="19"/>
+        </w:rPr>
+        <w:t>thabok</w:t>
+      </w:r>
+      <w:r>
+        <w:t xml:space="preserve">: </w:t>
+      </w:r>
+      <w:r>
+        <w:rPr>
+          <w:b/>
+        </w:rPr>
+        <w:t>Xe đã tới · nhập cân cuối</w:t>
+      </w:r>
+      <w:r>
+        <w:t xml:space="preserve"> → </w:t>
+      </w:r>
+      <w:r>
+        <w:rPr>
+          <w:b/>
+        </w:rPr>
+        <w:t>Cân cuối (tấn)</w:t>
+      </w:r>
+      <w:r>
+        <w:t xml:space="preserve"> </w:t>
+      </w:r>
+      <w:r>
+        <w:rPr>
+          <w:b/>
+        </w:rPr>
+        <w:t>24,7</w:t>
+      </w:r>
+      <w:r>
+        <w:t xml:space="preserve">, </w:t>
+      </w:r>
+      <w:r>
+        <w:rPr>
+          <w:b/>
+        </w:rPr>
+        <w:t>Số POD</w:t>
+      </w:r>
+      <w:r>
+        <w:t xml:space="preserve"> (ví dụ </w:t>
+      </w:r>
+      <w:r>
+        <w:rPr>
+          <w:rFonts w:ascii="Consolas" w:hAnsi="Consolas"/>
+          <w:sz w:val="19"/>
+        </w:rPr>
+        <w:t>POD-2909-01</w:t>
+      </w:r>
+      <w:r>
+        <w:t xml:space="preserve">), </w:t>
+      </w:r>
+      <w:r>
+        <w:rPr>
+          <w:b/>
+        </w:rPr>
+        <w:t>Người ký nhận</w:t>
+      </w:r>
+      <w:r>
+        <w:t xml:space="preserve"> → </w:t>
+      </w:r>
+      <w:r>
+        <w:rPr>
+          <w:b/>
+        </w:rPr>
+        <w:t>Đồng ý</w:t>
+      </w:r>
+      <w:r>
+        <w:t xml:space="preserve"> → dòng hao hụt </w:t>
+      </w:r>
+      <w:r>
+        <w:rPr>
+          <w:b/>
+        </w:rPr>
+        <w:t>0,3 t</w:t>
+      </w:r>
+      <w:r>
+        <w:t xml:space="preserve">; </w:t>
+      </w:r>
+      <w:r>
+        <w:rPr>
+          <w:b/>
+        </w:rPr>
+        <w:t>In biên bản giao nhận</w:t>
+      </w:r>
+      <w:r>
+        <w:t xml:space="preserve"> in được. </w:t>
+      </w:r>
+      <w:r>
+        <w:rPr>
+          <w:i/>
+        </w:rPr>
+        <w:t>(T17)</w:t>
+      </w:r>
+    </w:p>
+    <w:p>
+      <w:pPr>
+        <w:jc w:val="both"/>
+      </w:pPr>
+      <w:r>
+        <w:t>#### H. Khoá, hoá đơn, thu tiền</w:t>
+      </w:r>
+    </w:p>
+    <w:p>
+      <w:pPr>
+        <w:pStyle w:val="ListNumber"/>
+      </w:pPr>
+      <w:r>
+        <w:rPr>
+          <w:rFonts w:ascii="Consolas" w:hAnsi="Consolas"/>
+          <w:sz w:val="19"/>
+        </w:rPr>
+        <w:t>ketoan</w:t>
+      </w:r>
+      <w:r>
+        <w:t xml:space="preserve"> (trang điều xe): phiếu T4-… → </w:t>
+      </w:r>
+      <w:r>
+        <w:rPr>
+          <w:b/>
+        </w:rPr>
+        <w:t>🔒 Khoá phiếu</w:t>
+      </w:r>
+      <w:r>
+        <w:t xml:space="preserve"> → đọc cảnh báo (không có </w:t>
+      </w:r>
+      <w:r>
+        <w:rPr>
+          <w:i/>
+        </w:rPr>
+        <w:t>Km về lệch</w:t>
+      </w:r>
+      <w:r>
+        <w:t xml:space="preserve"> nếu km về đúng 59.520) → </w:t>
+      </w:r>
+      <w:r>
+        <w:rPr>
+          <w:b/>
+        </w:rPr>
+        <w:t>Đồng ý</w:t>
+      </w:r>
+      <w:r>
+        <w:t xml:space="preserve"> → </w:t>
+      </w:r>
+      <w:r>
+        <w:rPr>
+          <w:i/>
+        </w:rPr>
+        <w:t>Đã khoá 🔒</w:t>
+      </w:r>
+      <w:r>
+        <w:t xml:space="preserve">. </w:t>
+      </w:r>
+      <w:r>
+        <w:rPr>
+          <w:i/>
+        </w:rPr>
+        <w:t>(T19)</w:t>
+      </w:r>
+    </w:p>
+    <w:p>
+      <w:pPr>
+        <w:pStyle w:val="ListNumber"/>
+      </w:pPr>
+      <w:r>
+        <w:rPr>
+          <w:rFonts w:ascii="Consolas" w:hAnsi="Consolas"/>
+          <w:sz w:val="19"/>
+        </w:rPr>
+        <w:t>doanhthu</w:t>
+      </w:r>
+      <w:r>
+        <w:t xml:space="preserve"> (trang điều xe): phiếu T4-… → </w:t>
+      </w:r>
+      <w:r>
+        <w:rPr>
+          <w:b/>
+        </w:rPr>
+        <w:t>Lập hóa đơn thu ↗</w:t>
+      </w:r>
+      <w:r>
+        <w:t xml:space="preserve"> → trang kế toán mở đúng phiếu → </w:t>
+      </w:r>
+      <w:r>
+        <w:rPr>
+          <w:b/>
+        </w:rPr>
+        <w:t>Lập hóa đơn thu</w:t>
+      </w:r>
+      <w:r>
+        <w:t xml:space="preserve"> → xác nhận. Tiền hoá đơn = </w:t>
+      </w:r>
+      <w:r>
+        <w:rPr>
+          <w:b/>
+        </w:rPr>
+        <w:t>24,7 t × 30,5 USD = 753,35 USD</w:t>
+      </w:r>
+      <w:r>
+        <w:t xml:space="preserve"> (cân nơi giao × đơn giá, tiền của hợp đồng: USD). </w:t>
+      </w:r>
+      <w:r>
+        <w:rPr>
+          <w:i/>
+        </w:rPr>
+        <w:t>(T20)</w:t>
+      </w:r>
+    </w:p>
+    <w:p>
+      <w:pPr>
+        <w:pStyle w:val="ListNumber"/>
+      </w:pPr>
+      <w:r>
+        <w:rPr>
+          <w:rFonts w:ascii="Consolas" w:hAnsi="Consolas"/>
+          <w:sz w:val="19"/>
+        </w:rPr>
+        <w:t>doanhthu</w:t>
+      </w:r>
+      <w:r>
+        <w:t xml:space="preserve"> (trang kế toán): khung </w:t>
+      </w:r>
+      <w:r>
+        <w:rPr>
+          <w:b/>
+        </w:rPr>
+        <w:t>Sổ thu tiền</w:t>
+      </w:r>
+      <w:r>
+        <w:t xml:space="preserve"> → </w:t>
+      </w:r>
+      <w:r>
+        <w:rPr>
+          <w:b/>
+        </w:rPr>
+        <w:t>Ghi một lần thu</w:t>
+      </w:r>
+      <w:r>
+        <w:t xml:space="preserve"> → </w:t>
+      </w:r>
+      <w:r>
+        <w:rPr>
+          <w:b/>
+        </w:rPr>
+        <w:t>Số tiền khách trả</w:t>
+      </w:r>
+      <w:r>
+        <w:t xml:space="preserve"> </w:t>
+      </w:r>
+      <w:r>
+        <w:rPr>
+          <w:b/>
+        </w:rPr>
+        <w:t>400</w:t>
+      </w:r>
+      <w:r>
+        <w:t xml:space="preserve"> USD → </w:t>
+      </w:r>
+      <w:r>
+        <w:rPr>
+          <w:b/>
+        </w:rPr>
+        <w:t>Lưu</w:t>
+      </w:r>
+      <w:r>
+        <w:t xml:space="preserve"> → </w:t>
+      </w:r>
+      <w:r>
+        <w:rPr>
+          <w:i/>
+        </w:rPr>
+        <w:t>Thu một phần</w:t>
+      </w:r>
+      <w:r>
+        <w:t xml:space="preserve">; ghi tiếp </w:t>
+      </w:r>
+      <w:r>
+        <w:rPr>
+          <w:b/>
+        </w:rPr>
+        <w:t>353,35</w:t>
+      </w:r>
+      <w:r>
+        <w:t xml:space="preserve"> → </w:t>
+      </w:r>
+      <w:r>
+        <w:rPr>
+          <w:i/>
+        </w:rPr>
+        <w:t>Đã thu đủ</w:t>
+      </w:r>
+      <w:r>
+        <w:t xml:space="preserve"> — ở cả hai trang. </w:t>
+      </w:r>
+      <w:r>
+        <w:rPr>
+          <w:i/>
+        </w:rPr>
+        <w:t>(T21)</w:t>
+      </w:r>
+    </w:p>
+    <w:p>
+      <w:pPr>
+        <w:jc w:val="both"/>
+      </w:pPr>
+      <w:r>
+        <w:t>#### I. Cuối tháng và sổ (trang kế toán)</w:t>
+      </w:r>
+    </w:p>
+    <w:p>
+      <w:pPr>
+        <w:pStyle w:val="ListNumber"/>
+      </w:pPr>
+      <w:r>
+        <w:rPr>
+          <w:rFonts w:ascii="Consolas" w:hAnsi="Consolas"/>
+          <w:sz w:val="19"/>
+        </w:rPr>
+        <w:t>ketoan</w:t>
+      </w:r>
+      <w:r>
+        <w:t xml:space="preserve">: </w:t>
+      </w:r>
+      <w:r>
+        <w:rPr>
+          <w:b/>
+        </w:rPr>
+        <w:t>Tiền vận chuyển → Tiền chuyến &amp; tiền nước tài xế</w:t>
+      </w:r>
+      <w:r>
+        <w:t xml:space="preserve"> → tháng này → dòng ທ້າວ ທັດສະດາພອນ và ທ້າວ ບຸນມີ có </w:t>
+      </w:r>
+      <w:r>
+        <w:rPr>
+          <w:b/>
+        </w:rPr>
+        <w:t>Tiền chuyến</w:t>
+      </w:r>
+      <w:r>
+        <w:t xml:space="preserve"> 1.800.000, </w:t>
+      </w:r>
+      <w:r>
+        <w:rPr>
+          <w:b/>
+        </w:rPr>
+        <w:t>Tiền nước</w:t>
+      </w:r>
+      <w:r>
+        <w:t xml:space="preserve"> 60.000 của phiếu mới (cộng thêm phiếu mẫu cũ của họ); cột </w:t>
+      </w:r>
+      <w:r>
+        <w:rPr>
+          <w:b/>
+        </w:rPr>
+        <w:t>Điện thoại</w:t>
+      </w:r>
+      <w:r>
+        <w:t xml:space="preserve">, </w:t>
+      </w:r>
+      <w:r>
+        <w:rPr>
+          <w:b/>
+        </w:rPr>
+        <w:t>Chi phí VN</w:t>
+      </w:r>
+      <w:r>
+        <w:t xml:space="preserve"> không cộng khoản đã đưa tiền mặt. </w:t>
+      </w:r>
+      <w:r>
+        <w:rPr>
+          <w:i/>
+        </w:rPr>
+        <w:t>(T33)</w:t>
+      </w:r>
+    </w:p>
+    <w:p>
+      <w:pPr>
+        <w:pStyle w:val="ListNumber"/>
+      </w:pPr>
+      <w:r>
+        <w:rPr>
+          <w:rFonts w:ascii="Consolas" w:hAnsi="Consolas"/>
+          <w:sz w:val="19"/>
+        </w:rPr>
+        <w:t>ketoancp</w:t>
+      </w:r>
+      <w:r>
+        <w:t xml:space="preserve">: </w:t>
+      </w:r>
+      <w:r>
+        <w:rPr>
+          <w:b/>
+        </w:rPr>
+        <w:t>Tiền vận chuyển → Tất toán tài xế</w:t>
+      </w:r>
+      <w:r>
+        <w:t xml:space="preserve"> → bấm dòng ທ້າວ ທັດສະດາພອນ → khung dưới có phiếu </w:t>
+      </w:r>
+      <w:r>
+        <w:rPr>
+          <w:b/>
+        </w:rPr>
+        <w:t>G4-…</w:t>
+      </w:r>
+      <w:r>
+        <w:t xml:space="preserve"> </w:t>
+      </w:r>
+      <w:r>
+        <w:rPr>
+          <w:b/>
+        </w:rPr>
+        <w:t>Đã chi thật 580.000</w:t>
+      </w:r>
+      <w:r>
+        <w:t xml:space="preserve"> (bằng tạm ứng). Dòng tổng của tài xế vẫn gộp phiếu mẫu cũ (chi tạm ứng theo luật cũ) nên còn </w:t>
+      </w:r>
+      <w:r>
+        <w:rPr>
+          <w:i/>
+        </w:rPr>
+        <w:t>Tài xế nộp lại</w:t>
+      </w:r>
+      <w:r>
+        <w:t xml:space="preserve"> — xem lưu ý ở T34. </w:t>
+      </w:r>
+      <w:r>
+        <w:rPr>
+          <w:i/>
+        </w:rPr>
+        <w:t>(T34)</w:t>
+      </w:r>
+    </w:p>
+    <w:p>
+      <w:pPr>
+        <w:pStyle w:val="ListNumber"/>
+      </w:pPr>
+      <w:r>
+        <w:rPr>
+          <w:rFonts w:ascii="Consolas" w:hAnsi="Consolas"/>
+          <w:sz w:val="19"/>
+        </w:rPr>
+        <w:t>ketoan</w:t>
+      </w:r>
+      <w:r>
+        <w:t xml:space="preserve"> (trang điều xe): </w:t>
+      </w:r>
+      <w:r>
+        <w:rPr>
+          <w:b/>
+        </w:rPr>
+        <w:t>Vận tải → Phiếu chi · Phiếu thu</w:t>
+      </w:r>
+      <w:r>
+        <w:t xml:space="preserve"> → tab </w:t>
+      </w:r>
+      <w:r>
+        <w:rPr>
+          <w:b/>
+        </w:rPr>
+        <w:t>Sổ chứng từ</w:t>
+      </w:r>
+      <w:r>
+        <w:t xml:space="preserve"> → </w:t>
+      </w:r>
+      <w:r>
+        <w:rPr>
+          <w:b/>
+        </w:rPr>
+        <w:t>Đẩy hết tờ chưa đẩy</w:t>
+      </w:r>
+      <w:r>
+        <w:t xml:space="preserve"> → máy báo số tờ đẩy được. </w:t>
+      </w:r>
+      <w:r>
+        <w:rPr>
+          <w:i/>
+        </w:rPr>
+        <w:t>(T41)</w:t>
+      </w:r>
+    </w:p>
+    <w:p>
+      <w:pPr>
+        <w:pStyle w:val="ListNumber"/>
+      </w:pPr>
+      <w:r>
+        <w:rPr>
+          <w:rFonts w:ascii="Consolas" w:hAnsi="Consolas"/>
+          <w:sz w:val="19"/>
+        </w:rPr>
+        <w:t>ketoan</w:t>
+      </w:r>
+      <w:r>
+        <w:t xml:space="preserve"> (trang kế toán): </w:t>
+      </w:r>
+      <w:r>
+        <w:rPr>
+          <w:b/>
+        </w:rPr>
+        <w:t>Sổ sách → Kế toán → Nhật ký chung</w:t>
+      </w:r>
+      <w:r>
+        <w:t xml:space="preserve"> → thấy HD, PT vừa làm; </w:t>
+      </w:r>
+      <w:r>
+        <w:rPr>
+          <w:b/>
+        </w:rPr>
+        <w:t>Cân đối phát sinh</w:t>
+      </w:r>
+      <w:r>
+        <w:t xml:space="preserve"> </w:t>
+      </w:r>
+      <w:r>
+        <w:rPr>
+          <w:i/>
+        </w:rPr>
+        <w:t>Nợ = Có</w:t>
+      </w:r>
+      <w:r>
+        <w:t xml:space="preserve">. </w:t>
+      </w:r>
+      <w:r>
+        <w:rPr>
+          <w:b/>
+        </w:rPr>
+        <w:t>Chuyến &amp; kho → Chuyến xe</w:t>
+      </w:r>
+      <w:r>
+        <w:t xml:space="preserve"> → phiếu T4-…: doanh thu 753,35 USD, còn phải thu 0. </w:t>
+      </w:r>
+      <w:r>
+        <w:rPr>
+          <w:i/>
+        </w:rPr>
+        <w:t>(T42, T43)</w:t>
+      </w:r>
+    </w:p>
+    <w:p>
+      <w:pPr>
+        <w:jc w:val="both"/>
+      </w:pPr>
+      <w:r>
+        <w:t>Xong bước 33 là đi trọn một chuyến. Các ca còn lại (xe liên kết T27–T32, nhà cung cấp T37–T40, vai và chặn T44–T49, việc ngoài chuyến T50–T53) làm thêm theo bảng dưới.</w:t>
       </w:r>
     </w:p>
     <w:p>
@@ -20672,7 +23723,7 @@
               <w:t>Gom (mỏ → bãi)</w:t>
             </w:r>
             <w:r>
-              <w:t xml:space="preserve">, xe 341 (ô </w:t>
+              <w:t xml:space="preserve">, xe 343 (ô </w:t>
             </w:r>
             <w:r>
               <w:rPr>
@@ -20914,7 +23965,7 @@
               <w:t>Số xe</w:t>
             </w:r>
             <w:r>
-              <w:t xml:space="preserve"> sang xe khác và chọn lại 341</w:t>
+              <w:t xml:space="preserve"> sang xe khác và chọn lại 343</w:t>
             </w:r>
           </w:p>
         </w:tc>
@@ -20943,7 +23994,7 @@
               <w:t>Công-tơ-mét (km)</w:t>
             </w:r>
             <w:r>
-              <w:t xml:space="preserve"> của xe 341 (như ở màn </w:t>
+              <w:t xml:space="preserve"> của xe 343 (61.200) (như ở màn </w:t>
             </w:r>
             <w:r>
               <w:rPr>
@@ -23346,7 +26397,7 @@
               <w:t>Giao (bãi → khách)</w:t>
             </w:r>
             <w:r>
-              <w:t xml:space="preserve">, xe 342, tài xế </w:t>
+              <w:t xml:space="preserve">, xe 344, tài xế </w:t>
             </w:r>
             <w:r>
               <w:rPr>
@@ -28152,7 +31203,7 @@
               <w:t>+ Lệnh sửa chữa</w:t>
             </w:r>
             <w:r>
-              <w:t xml:space="preserve"> xe 341 → </w:t>
+              <w:t xml:space="preserve"> xe 345 → </w:t>
             </w:r>
             <w:r>
               <w:rPr>

</xml_diff>

<commit_message>
Cặp phiếu mẫu đi trọn A → Z để xem bằng nhiều vai; tờ PTU theo đúng số quỹ chi; tài liệu 10.0c
- tools/phieu_mau_a_z.py: lập một phiếu gom + một phiếu giao qua API, mỗi bước bằng đúng vai (Bãi, kế toán,
  KT chi phí, thủ kho, KT kho xăng dầu, quỹ, tài xế, KT doanh thu) tới khoá, hoá đơn, thu đủ; chỉ đẩy chứng
  từ của hai phiếu mẫu. Chạy thử mặc định, 'that' mới ghi; cùng ngày đã có thì dừng. Dùng xe 345/346, tx03
  để không đụng số km của bài bấm tay 10.0b.
- Tờ chứng từ PTU ghi số lúc Bãi in tờ tạm ứng (kế toán chưa nhập giá → 0 LAK) rồi kẹt ở đó, lệch PC_TU.
  Nay chưa đẩy sang kế toán thì theo số tạm ứng hiện tại (lúc lập / xem tờ / quỹ chi).
- Tài liệu A → Z 10.0c: hai phiếu mẫu G4-0104-09 / T4-0447-09, mở 10 tab (bỏ tick Ghi nhớ đăng nhập để
  mỗi tab một tài khoản), mỗi vai thấy gì, tab khác F5 mới thấy, bảng chứng từ và bút toán Nợ / Có.

Co-Authored-By: Claude Opus 5.5 (1M context) <noreply@anthropic.com>
</commit_message>
<xml_diff>
--- a/DOCS/word/LUONG_A_Z_HAI_TRANG.docx
+++ b/DOCS/word/LUONG_A_Z_HAI_TRANG.docx
@@ -313,6 +313,15 @@
           <w:b/>
         </w:rPr>
         <w:t>10.0b đi thử một chuyến mới A → Z từng cú bấm</w:t>
+      </w:r>
+      <w:r>
+        <w:t xml:space="preserve">, </w:t>
+      </w:r>
+      <w:r>
+        <w:rPr>
+          <w:b/>
+        </w:rPr>
+        <w:t>10.0c hai phiếu mẫu đã đi trọn để xem bằng nhiều vai và xem sổ</w:t>
       </w:r>
       <w:r>
         <w:t>, rồi 61 ca theo thứ tự luồng</w:t>
@@ -23366,6 +23375,2796 @@
       </w:pPr>
       <w:r>
         <w:t>Xong bước 33 là đi trọn một chuyến. Các ca còn lại (xe liên kết T27–T32, nhà cung cấp T37–T40, vai và chặn T44–T49, việc ngoài chuyến T50–T53) làm thêm theo bảng dưới.</w:t>
+      </w:r>
+    </w:p>
+    <w:p>
+      <w:pPr>
+        <w:pStyle w:val="Heading2"/>
+      </w:pPr>
+      <w:r>
+        <w:t>10.0c. Phiếu mẫu đã đi trọn — mở cho sếp xem bằng nhiều vai và xem ghi sổ</w:t>
+      </w:r>
+    </w:p>
+    <w:p>
+      <w:pPr>
+        <w:jc w:val="both"/>
+      </w:pPr>
+      <w:r>
+        <w:t xml:space="preserve">Trên máy thật (8020 · 8030) đã có </w:t>
+      </w:r>
+      <w:r>
+        <w:rPr>
+          <w:b/>
+        </w:rPr>
+        <w:t>một cặp phiếu đi trọn A → Z</w:t>
+      </w:r>
+      <w:r>
+        <w:t xml:space="preserve">, lập ngày 29/09/2026 bằng công cụ </w:t>
+      </w:r>
+      <w:r>
+        <w:rPr>
+          <w:rFonts w:ascii="Consolas" w:hAnsi="Consolas"/>
+          <w:sz w:val="19"/>
+        </w:rPr>
+        <w:t>tools/phieu_mau_a_z.py</w:t>
+      </w:r>
+      <w:r>
+        <w:t xml:space="preserve">. Công cụ bấm qua đúng các nút như người dùng, </w:t>
+      </w:r>
+      <w:r>
+        <w:rPr>
+          <w:b/>
+        </w:rPr>
+        <w:t>mỗi bước bằng đúng tài khoản của vai đó</w:t>
+      </w:r>
+      <w:r>
+        <w:t xml:space="preserve">, máy chủ kiểm và chặn như khi bấm tay. Phiếu mẫu dùng </w:t>
+      </w:r>
+      <w:r>
+        <w:rPr>
+          <w:b/>
+        </w:rPr>
+        <w:t>xe 345, 346</w:t>
+      </w:r>
+      <w:r>
+        <w:t xml:space="preserve"> và tài xế </w:t>
+      </w:r>
+      <w:r>
+        <w:rPr>
+          <w:b/>
+        </w:rPr>
+        <w:t>`tx03`</w:t>
+      </w:r>
+      <w:r>
+        <w:t xml:space="preserve"> — không đụng xe 343/344, </w:t>
+      </w:r>
+      <w:r>
+        <w:rPr>
+          <w:rFonts w:ascii="Consolas" w:hAnsi="Consolas"/>
+          <w:sz w:val="19"/>
+        </w:rPr>
+        <w:t>tx01</w:t>
+      </w:r>
+      <w:r>
+        <w:t>/</w:t>
+      </w:r>
+      <w:r>
+        <w:rPr>
+          <w:rFonts w:ascii="Consolas" w:hAnsi="Consolas"/>
+          <w:sz w:val="19"/>
+        </w:rPr>
+        <w:t>tx02</w:t>
+      </w:r>
+      <w:r>
+        <w:t xml:space="preserve"> của bài bấm tay 10.0b, nên số km trong 10.0b vẫn đúng. Hai phiếu có ghi chú </w:t>
+      </w:r>
+      <w:r>
+        <w:rPr>
+          <w:i/>
+        </w:rPr>
+        <w:t>Phiếu mẫu A→Z</w:t>
+      </w:r>
+      <w:r>
+        <w:t xml:space="preserve">, số phiếu quặng </w:t>
+      </w:r>
+      <w:r>
+        <w:rPr>
+          <w:rFonts w:ascii="Consolas" w:hAnsi="Consolas"/>
+          <w:sz w:val="19"/>
+        </w:rPr>
+        <w:t>MAU-2909-01</w:t>
+      </w:r>
+      <w:r>
+        <w:t xml:space="preserve">, </w:t>
+      </w:r>
+      <w:r>
+        <w:rPr>
+          <w:rFonts w:ascii="Consolas" w:hAnsi="Consolas"/>
+          <w:sz w:val="19"/>
+        </w:rPr>
+        <w:t>MAU-2909-02</w:t>
+      </w:r>
+      <w:r>
+        <w:t>. Giá cước là giá mẫu tự đặt trong bảng giá (ຄຳຕຸ້ຍ: tuyến gom 12,5 USD/t, tuyến ra cảng 30,5 USD/t), tỷ giá trên phiếu 22.000 LAK/USD.</w:t>
+      </w:r>
+    </w:p>
+    <w:tbl>
+      <w:tblPr>
+        <w:tblStyle w:val="LightGrid-Accent1"/>
+        <w:tblW w:type="auto" w:w="0"/>
+        <w:tblLook w:firstColumn="1" w:firstRow="1" w:lastColumn="0" w:lastRow="0" w:noHBand="0" w:noVBand="1" w:val="04A0"/>
+      </w:tblPr>
+      <w:tblGrid>
+        <w:gridCol w:w="2880"/>
+        <w:gridCol w:w="2880"/>
+        <w:gridCol w:w="2880"/>
+      </w:tblGrid>
+      <w:tr>
+        <w:tc>
+          <w:tcPr>
+            <w:tcW w:type="dxa" w:w="2880"/>
+          </w:tcPr>
+          <w:p>
+            <w:r>
+              <w:rPr>
+                <w:b/>
+              </w:rPr>
+            </w:r>
+          </w:p>
+        </w:tc>
+        <w:tc>
+          <w:tcPr>
+            <w:tcW w:type="dxa" w:w="2880"/>
+          </w:tcPr>
+          <w:p>
+            <w:r>
+              <w:rPr>
+                <w:b/>
+              </w:rPr>
+            </w:r>
+            <w:r>
+              <w:rPr>
+                <w:b/>
+              </w:rPr>
+              <w:t>G4-0104-09/EPL</w:t>
+            </w:r>
+            <w:r>
+              <w:rPr>
+                <w:b/>
+              </w:rPr>
+              <w:t xml:space="preserve"> — phiếu GOM</w:t>
+            </w:r>
+          </w:p>
+        </w:tc>
+        <w:tc>
+          <w:tcPr>
+            <w:tcW w:type="dxa" w:w="2880"/>
+          </w:tcPr>
+          <w:p>
+            <w:r>
+              <w:rPr>
+                <w:b/>
+              </w:rPr>
+            </w:r>
+            <w:r>
+              <w:rPr>
+                <w:b/>
+              </w:rPr>
+              <w:t>T4-0447-09/EPL</w:t>
+            </w:r>
+            <w:r>
+              <w:rPr>
+                <w:b/>
+              </w:rPr>
+              <w:t xml:space="preserve"> — phiếu GIAO</w:t>
+            </w:r>
+          </w:p>
+        </w:tc>
+      </w:tr>
+      <w:tr>
+        <w:tc>
+          <w:tcPr>
+            <w:tcW w:type="dxa" w:w="2880"/>
+          </w:tcPr>
+          <w:p>
+            <w:r/>
+            <w:r>
+              <w:t>Xe · tài xế</w:t>
+            </w:r>
+          </w:p>
+        </w:tc>
+        <w:tc>
+          <w:tcPr>
+            <w:tcW w:type="dxa" w:w="2880"/>
+          </w:tcPr>
+          <w:p>
+            <w:r/>
+            <w:r>
+              <w:t>345 · ທ້າວ ສົມພອນ (</w:t>
+            </w:r>
+            <w:r>
+              <w:rPr>
+                <w:rFonts w:ascii="Consolas" w:hAnsi="Consolas"/>
+                <w:sz w:val="19"/>
+              </w:rPr>
+              <w:t>tx03</w:t>
+            </w:r>
+            <w:r>
+              <w:t>)</w:t>
+            </w:r>
+          </w:p>
+        </w:tc>
+        <w:tc>
+          <w:tcPr>
+            <w:tcW w:type="dxa" w:w="2880"/>
+          </w:tcPr>
+          <w:p>
+            <w:r/>
+            <w:r>
+              <w:t>346 · ທ້າວ ສົມພອນ (</w:t>
+            </w:r>
+            <w:r>
+              <w:rPr>
+                <w:rFonts w:ascii="Consolas" w:hAnsi="Consolas"/>
+                <w:sz w:val="19"/>
+              </w:rPr>
+              <w:t>tx03</w:t>
+            </w:r>
+            <w:r>
+              <w:t>)</w:t>
+            </w:r>
+          </w:p>
+        </w:tc>
+      </w:tr>
+      <w:tr>
+        <w:tc>
+          <w:tcPr>
+            <w:tcW w:type="dxa" w:w="2880"/>
+          </w:tcPr>
+          <w:p>
+            <w:r/>
+            <w:r>
+              <w:t>Tuyến</w:t>
+            </w:r>
+          </w:p>
+        </w:tc>
+        <w:tc>
+          <w:tcPr>
+            <w:tcW w:type="dxa" w:w="2880"/>
+          </w:tcPr>
+          <w:p>
+            <w:r/>
+            <w:r>
+              <w:t>ກາສີ → ທ່າບົກ (145 km + 145 km về)</w:t>
+            </w:r>
+          </w:p>
+        </w:tc>
+        <w:tc>
+          <w:tcPr>
+            <w:tcW w:type="dxa" w:w="2880"/>
+          </w:tcPr>
+          <w:p>
+            <w:r/>
+            <w:r>
+              <w:t>ທ່າບົກ → ທ່າເຮືອກະລໍ (360 km + 360 km về, BOT 1.833.500)</w:t>
+            </w:r>
+          </w:p>
+        </w:tc>
+      </w:tr>
+      <w:tr>
+        <w:tc>
+          <w:tcPr>
+            <w:tcW w:type="dxa" w:w="2880"/>
+          </w:tcPr>
+          <w:p>
+            <w:r/>
+            <w:r>
+              <w:t>Km lúc đi → km về</w:t>
+            </w:r>
+          </w:p>
+        </w:tc>
+        <w:tc>
+          <w:tcPr>
+            <w:tcW w:type="dxa" w:w="2880"/>
+          </w:tcPr>
+          <w:p>
+            <w:r/>
+            <w:r>
+              <w:t>132.500 → 132.790 (đúng ước tính, không cảnh báo)</w:t>
+            </w:r>
+          </w:p>
+        </w:tc>
+        <w:tc>
+          <w:tcPr>
+            <w:tcW w:type="dxa" w:w="2880"/>
+          </w:tcPr>
+          <w:p>
+            <w:r/>
+            <w:r>
+              <w:t>128.900 → 129.620 (đúng ước tính)</w:t>
+            </w:r>
+          </w:p>
+        </w:tc>
+      </w:tr>
+      <w:tr>
+        <w:tc>
+          <w:tcPr>
+            <w:tcW w:type="dxa" w:w="2880"/>
+          </w:tcPr>
+          <w:p>
+            <w:r/>
+            <w:r>
+              <w:t>Hàng</w:t>
+            </w:r>
+          </w:p>
+        </w:tc>
+        <w:tc>
+          <w:tcPr>
+            <w:tcW w:type="dxa" w:w="2880"/>
+          </w:tcPr>
+          <w:p>
+            <w:r/>
+            <w:r>
+              <w:t xml:space="preserve">cân mỏ </w:t>
+            </w:r>
+            <w:r>
+              <w:rPr>
+                <w:b/>
+              </w:rPr>
+              <w:t>42 t</w:t>
+            </w:r>
+            <w:r>
+              <w:t xml:space="preserve"> (tài xế báo từ mỏ, 1 ảnh phiếu cân) → cân bãi </w:t>
+            </w:r>
+            <w:r>
+              <w:rPr>
+                <w:b/>
+              </w:rPr>
+              <w:t>41,5 t</w:t>
+            </w:r>
+            <w:r>
+              <w:t>, hao hụt 0,5 t; lô vào kho bãi</w:t>
+            </w:r>
+          </w:p>
+        </w:tc>
+        <w:tc>
+          <w:tcPr>
+            <w:tcW w:type="dxa" w:w="2880"/>
+          </w:tcPr>
+          <w:p>
+            <w:r/>
+            <w:r>
+              <w:t xml:space="preserve">lấy </w:t>
+            </w:r>
+            <w:r>
+              <w:rPr>
+                <w:b/>
+              </w:rPr>
+              <w:t>30 t</w:t>
+            </w:r>
+            <w:r>
+              <w:t xml:space="preserve"> từ lô G4-0104-09 (lô còn </w:t>
+            </w:r>
+            <w:r>
+              <w:rPr>
+                <w:b/>
+              </w:rPr>
+              <w:t>11,5 t</w:t>
+            </w:r>
+            <w:r>
+              <w:t xml:space="preserve">) → cân cảng </w:t>
+            </w:r>
+            <w:r>
+              <w:rPr>
+                <w:b/>
+              </w:rPr>
+              <w:t>29,7 t</w:t>
+            </w:r>
+            <w:r>
+              <w:t>, hao hụt 0,3 t; người nhận ນາງ ມະນີ ký trên màn</w:t>
+            </w:r>
+          </w:p>
+        </w:tc>
+      </w:tr>
+      <w:tr>
+        <w:tc>
+          <w:tcPr>
+            <w:tcW w:type="dxa" w:w="2880"/>
+          </w:tcPr>
+          <w:p>
+            <w:r/>
+            <w:r>
+              <w:t>Dầu (mục III)</w:t>
+            </w:r>
+          </w:p>
+        </w:tc>
+        <w:tc>
+          <w:tcPr>
+            <w:tcW w:type="dxa" w:w="2880"/>
+          </w:tcPr>
+          <w:p>
+            <w:r/>
+            <w:r>
+              <w:t>lĩnh 200 L kho Thà Bốc × 28.500 = 5.700.000 LAK</w:t>
+            </w:r>
+          </w:p>
+        </w:tc>
+        <w:tc>
+          <w:tcPr>
+            <w:tcW w:type="dxa" w:w="2880"/>
+          </w:tcPr>
+          <w:p>
+            <w:r/>
+            <w:r>
+              <w:t>lĩnh 300 L kho Thà Bốc = 8.550.000 LAK</w:t>
+            </w:r>
+          </w:p>
+        </w:tc>
+      </w:tr>
+      <w:tr>
+        <w:tc>
+          <w:tcPr>
+            <w:tcW w:type="dxa" w:w="2880"/>
+          </w:tcPr>
+          <w:p>
+            <w:r/>
+            <w:r>
+              <w:t>Mục IV (tổng)</w:t>
+            </w:r>
+          </w:p>
+        </w:tc>
+        <w:tc>
+          <w:tcPr>
+            <w:tcW w:type="dxa" w:w="2880"/>
+          </w:tcPr>
+          <w:p>
+            <w:r/>
+            <w:r>
+              <w:t>3.060.000 LAK: nước 60.000 · sang VN 430.000 · chipping Lào 620.000 · tiền chuyến 1.800.000 · điện thoại 150.000</w:t>
+            </w:r>
+          </w:p>
+        </w:tc>
+        <w:tc>
+          <w:tcPr>
+            <w:tcW w:type="dxa" w:w="2880"/>
+          </w:tcPr>
+          <w:p>
+            <w:r/>
+            <w:r>
+              <w:t>4.273.500 LAK: nước 60.000 · sang VN 430.000 · tiền chuyến 1.800.000 · điện thoại 150.000 · phí cao tốc 1.833.500 (trả tiền mặt)</w:t>
+            </w:r>
+          </w:p>
+        </w:tc>
+      </w:tr>
+      <w:tr>
+        <w:tc>
+          <w:tcPr>
+            <w:tcW w:type="dxa" w:w="2880"/>
+          </w:tcPr>
+          <w:p>
+            <w:r/>
+            <w:r>
+              <w:t>Tạm ứng (quỹ chi)</w:t>
+            </w:r>
+          </w:p>
+        </w:tc>
+        <w:tc>
+          <w:tcPr>
+            <w:tcW w:type="dxa" w:w="2880"/>
+          </w:tcPr>
+          <w:p>
+            <w:r/>
+            <w:r>
+              <w:rPr>
+                <w:b/>
+              </w:rPr>
+              <w:t>580.000</w:t>
+            </w:r>
+            <w:r>
+              <w:t xml:space="preserve"> (sang VN + điện thoại)</w:t>
+            </w:r>
+          </w:p>
+        </w:tc>
+        <w:tc>
+          <w:tcPr>
+            <w:tcW w:type="dxa" w:w="2880"/>
+          </w:tcPr>
+          <w:p>
+            <w:r/>
+            <w:r>
+              <w:rPr>
+                <w:b/>
+              </w:rPr>
+              <w:t>2.413.500</w:t>
+            </w:r>
+            <w:r>
+              <w:t xml:space="preserve"> (sang VN + điện thoại + phí cao tốc)</w:t>
+            </w:r>
+          </w:p>
+        </w:tc>
+      </w:tr>
+      <w:tr>
+        <w:tc>
+          <w:tcPr>
+            <w:tcW w:type="dxa" w:w="2880"/>
+          </w:tcPr>
+          <w:p>
+            <w:r/>
+            <w:r>
+              <w:t>Hoá đơn</w:t>
+            </w:r>
+          </w:p>
+        </w:tc>
+        <w:tc>
+          <w:tcPr>
+            <w:tcW w:type="dxa" w:w="2880"/>
+          </w:tcPr>
+          <w:p>
+            <w:r/>
+            <w:r>
+              <w:t xml:space="preserve">41,5 t × 12,5 USD = </w:t>
+            </w:r>
+            <w:r>
+              <w:rPr>
+                <w:b/>
+              </w:rPr>
+              <w:t>518,75 USD</w:t>
+            </w:r>
+            <w:r>
+              <w:t xml:space="preserve"> (11.412.500 LAK)</w:t>
+            </w:r>
+          </w:p>
+        </w:tc>
+        <w:tc>
+          <w:tcPr>
+            <w:tcW w:type="dxa" w:w="2880"/>
+          </w:tcPr>
+          <w:p>
+            <w:r/>
+            <w:r>
+              <w:t xml:space="preserve">29,7 t × 30,5 USD = </w:t>
+            </w:r>
+            <w:r>
+              <w:rPr>
+                <w:b/>
+              </w:rPr>
+              <w:t>905,85 USD</w:t>
+            </w:r>
+            <w:r>
+              <w:t xml:space="preserve"> (19.928.700 LAK)</w:t>
+            </w:r>
+          </w:p>
+        </w:tc>
+      </w:tr>
+      <w:tr>
+        <w:tc>
+          <w:tcPr>
+            <w:tcW w:type="dxa" w:w="2880"/>
+          </w:tcPr>
+          <w:p>
+            <w:r/>
+            <w:r>
+              <w:t>Thu tiền</w:t>
+            </w:r>
+          </w:p>
+        </w:tc>
+        <w:tc>
+          <w:tcPr>
+            <w:tcW w:type="dxa" w:w="2880"/>
+          </w:tcPr>
+          <w:p>
+            <w:r/>
+            <w:r>
+              <w:t xml:space="preserve">một lần 518,75 USD → </w:t>
+            </w:r>
+            <w:r>
+              <w:rPr>
+                <w:i/>
+              </w:rPr>
+              <w:t>Đã thu đủ</w:t>
+            </w:r>
+          </w:p>
+        </w:tc>
+        <w:tc>
+          <w:tcPr>
+            <w:tcW w:type="dxa" w:w="2880"/>
+          </w:tcPr>
+          <w:p>
+            <w:r/>
+            <w:r>
+              <w:t xml:space="preserve">hai lần 400 + 505,85 USD → </w:t>
+            </w:r>
+            <w:r>
+              <w:rPr>
+                <w:i/>
+              </w:rPr>
+              <w:t>Đã thu đủ</w:t>
+            </w:r>
+          </w:p>
+        </w:tc>
+      </w:tr>
+      <w:tr>
+        <w:tc>
+          <w:tcPr>
+            <w:tcW w:type="dxa" w:w="2880"/>
+          </w:tcPr>
+          <w:p>
+            <w:r/>
+            <w:r>
+              <w:t>Trạng thái</w:t>
+            </w:r>
+          </w:p>
+        </w:tc>
+        <w:tc>
+          <w:tcPr>
+            <w:tcW w:type="dxa" w:w="2880"/>
+          </w:tcPr>
+          <w:p>
+            <w:r/>
+            <w:r>
+              <w:t>🔒 đã khoá · mọi mục đã xong · đã thu đủ</w:t>
+            </w:r>
+          </w:p>
+        </w:tc>
+        <w:tc>
+          <w:tcPr>
+            <w:tcW w:type="dxa" w:w="2880"/>
+          </w:tcPr>
+          <w:p>
+            <w:r/>
+            <w:r>
+              <w:t>🔒 đã khoá · mọi mục đã xong · đã thu đủ</w:t>
+            </w:r>
+          </w:p>
+        </w:tc>
+      </w:tr>
+    </w:tbl>
+    <w:p/>
+    <w:p>
+      <w:pPr>
+        <w:jc w:val="both"/>
+      </w:pPr>
+      <w:r>
+        <w:rPr>
+          <w:b/>
+        </w:rPr>
+        <w:t>Kho sau cặp phiếu:</w:t>
+      </w:r>
+      <w:r>
+        <w:t xml:space="preserve"> kho dầu Thà Bốc 3.220 → </w:t>
+      </w:r>
+      <w:r>
+        <w:rPr>
+          <w:b/>
+        </w:rPr>
+        <w:t>2.720 L</w:t>
+      </w:r>
+      <w:r>
+        <w:t xml:space="preserve">; kho hàng bãi có lô </w:t>
+      </w:r>
+      <w:r>
+        <w:rPr>
+          <w:b/>
+        </w:rPr>
+        <w:t>G4-0104-09/EPL còn 11,5 t</w:t>
+      </w:r>
+      <w:r>
+        <w:t>.</w:t>
+      </w:r>
+    </w:p>
+    <w:p>
+      <w:pPr>
+        <w:jc w:val="both"/>
+      </w:pPr>
+      <w:r>
+        <w:t>#### Mở bao nhiêu tab, mỗi tab một tài khoản</w:t>
+      </w:r>
+    </w:p>
+    <w:p>
+      <w:pPr>
+        <w:jc w:val="both"/>
+      </w:pPr>
+      <w:r>
+        <w:t>*</w:t>
+      </w:r>
+      <w:r>
+        <w:rPr>
+          <w:i/>
+        </w:rPr>
+        <w:t xml:space="preserve">Điều bắt buộc: mỗi lần đăng nhập, BỎ TICK ô </w:t>
+      </w:r>
+      <w:r>
+        <w:t>Ghi nhớ đăng nhập*</w:t>
+      </w:r>
+      <w:r>
+        <w:rPr>
+          <w:b/>
+        </w:rPr>
+        <w:t xml:space="preserve"> (ô này mặc định có tick, ở cả hai trang). Có tick thì phiên lưu chung cho cả trình duyệt: một tab đăng nhập tài khoản khác là </w:t>
+      </w:r>
+      <w:r>
+        <w:t>mọi tab của trang đó</w:t>
+      </w:r>
+      <w:r>
+        <w:rPr>
+          <w:b/>
+        </w:rPr>
+        <w:t xml:space="preserve"> chạy theo tài khoản mới — tab ghi tên "Bãi" bấm nút lại chạy bằng quyền kế toán. Bỏ tick thì mỗi tab giữ tài khoản của riêng nó. Mở tab mới bằng </w:t>
+      </w:r>
+      <w:r>
+        <w:t>Ctrl+T</w:t>
+      </w:r>
+      <w:r>
+        <w:rPr>
+          <w:b/>
+        </w:rPr>
+        <w:t xml:space="preserve"> rồi gõ địa chỉ, </w:t>
+      </w:r>
+      <w:r>
+        <w:t xml:space="preserve">đừng dùng </w:t>
+      </w:r>
+      <w:r>
+        <w:rPr>
+          <w:i/>
+        </w:rPr>
+        <w:t>Nhân đôi thẻ</w:t>
+      </w:r>
+      <w:r>
+        <w:rPr>
+          <w:b/>
+        </w:rPr>
+        <w:t xml:space="preserve"> (nhân đôi chép luôn phiên của tab cũ). Bấm </w:t>
+      </w:r>
+      <w:r>
+        <w:t xml:space="preserve">Đổi tài khoản** trong một tab thì cũng bỏ tick lại. Trang điều xe (8020) và trang kế toán (8030) là hai trang riêng: </w:t>
+      </w:r>
+      <w:r>
+        <w:rPr>
+          <w:rFonts w:ascii="Consolas" w:hAnsi="Consolas"/>
+          <w:sz w:val="19"/>
+        </w:rPr>
+        <w:t>ketoan</w:t>
+      </w:r>
+      <w:r>
+        <w:t xml:space="preserve"> ở 8020 và </w:t>
+      </w:r>
+      <w:r>
+        <w:rPr>
+          <w:rFonts w:ascii="Consolas" w:hAnsi="Consolas"/>
+          <w:sz w:val="19"/>
+        </w:rPr>
+        <w:t>ketoan</w:t>
+      </w:r>
+      <w:r>
+        <w:t xml:space="preserve"> ở 8030 là hai tab, không đụng nhau.</w:t>
+      </w:r>
+    </w:p>
+    <w:p>
+      <w:pPr>
+        <w:jc w:val="both"/>
+      </w:pPr>
+      <w:r>
+        <w:t xml:space="preserve">Đủ bộ để xem cặp phiếu mẫu (và để đi lại 10.0b) — </w:t>
+      </w:r>
+      <w:r>
+        <w:rPr>
+          <w:b/>
+        </w:rPr>
+        <w:t>10 tab</w:t>
+      </w:r>
+      <w:r>
+        <w:t>:</w:t>
+      </w:r>
+    </w:p>
+    <w:tbl>
+      <w:tblPr>
+        <w:tblStyle w:val="LightGrid-Accent1"/>
+        <w:tblW w:type="auto" w:w="0"/>
+        <w:tblLook w:firstColumn="1" w:firstRow="1" w:lastColumn="0" w:lastRow="0" w:noHBand="0" w:noVBand="1" w:val="04A0"/>
+      </w:tblPr>
+      <w:tblGrid>
+        <w:gridCol w:w="2160"/>
+        <w:gridCol w:w="2160"/>
+        <w:gridCol w:w="2160"/>
+        <w:gridCol w:w="2160"/>
+      </w:tblGrid>
+      <w:tr>
+        <w:tc>
+          <w:tcPr>
+            <w:tcW w:type="dxa" w:w="2160"/>
+          </w:tcPr>
+          <w:p>
+            <w:r>
+              <w:rPr>
+                <w:b/>
+              </w:rPr>
+            </w:r>
+            <w:r>
+              <w:rPr>
+                <w:b/>
+              </w:rPr>
+              <w:t>Tab</w:t>
+            </w:r>
+          </w:p>
+        </w:tc>
+        <w:tc>
+          <w:tcPr>
+            <w:tcW w:type="dxa" w:w="2160"/>
+          </w:tcPr>
+          <w:p>
+            <w:r>
+              <w:rPr>
+                <w:b/>
+              </w:rPr>
+            </w:r>
+            <w:r>
+              <w:rPr>
+                <w:b/>
+              </w:rPr>
+              <w:t>Trang</w:t>
+            </w:r>
+          </w:p>
+        </w:tc>
+        <w:tc>
+          <w:tcPr>
+            <w:tcW w:type="dxa" w:w="2160"/>
+          </w:tcPr>
+          <w:p>
+            <w:r>
+              <w:rPr>
+                <w:b/>
+              </w:rPr>
+            </w:r>
+            <w:r>
+              <w:rPr>
+                <w:b/>
+              </w:rPr>
+              <w:t>Tài khoản</w:t>
+            </w:r>
+          </w:p>
+        </w:tc>
+        <w:tc>
+          <w:tcPr>
+            <w:tcW w:type="dxa" w:w="2160"/>
+          </w:tcPr>
+          <w:p>
+            <w:r>
+              <w:rPr>
+                <w:b/>
+              </w:rPr>
+            </w:r>
+            <w:r>
+              <w:rPr>
+                <w:b/>
+              </w:rPr>
+              <w:t>Mở màn nào, thấy gì ở phiếu mẫu</w:t>
+            </w:r>
+          </w:p>
+        </w:tc>
+      </w:tr>
+      <w:tr>
+        <w:tc>
+          <w:tcPr>
+            <w:tcW w:type="dxa" w:w="2160"/>
+          </w:tcPr>
+          <w:p>
+            <w:r/>
+            <w:r>
+              <w:t>1</w:t>
+            </w:r>
+          </w:p>
+        </w:tc>
+        <w:tc>
+          <w:tcPr>
+            <w:tcW w:type="dxa" w:w="2160"/>
+          </w:tcPr>
+          <w:p>
+            <w:r/>
+            <w:r>
+              <w:t>điều xe 8020</w:t>
+            </w:r>
+          </w:p>
+        </w:tc>
+        <w:tc>
+          <w:tcPr>
+            <w:tcW w:type="dxa" w:w="2160"/>
+          </w:tcPr>
+          <w:p>
+            <w:r/>
+            <w:r>
+              <w:rPr>
+                <w:rFonts w:ascii="Consolas" w:hAnsi="Consolas"/>
+                <w:sz w:val="19"/>
+              </w:rPr>
+              <w:t>thabok</w:t>
+            </w:r>
+            <w:r>
+              <w:t xml:space="preserve"> — Admin Thà Bốc</w:t>
+            </w:r>
+          </w:p>
+        </w:tc>
+        <w:tc>
+          <w:tcPr>
+            <w:tcW w:type="dxa" w:w="2160"/>
+          </w:tcPr>
+          <w:p>
+            <w:r/>
+            <w:r>
+              <w:rPr>
+                <w:b/>
+              </w:rPr>
+              <w:t>Vận tải → Phiếu xuất xe</w:t>
+            </w:r>
+            <w:r>
+              <w:t xml:space="preserve"> → ô </w:t>
+            </w:r>
+            <w:r>
+              <w:rPr>
+                <w:b/>
+              </w:rPr>
+              <w:t>Số phiếu</w:t>
+            </w:r>
+            <w:r>
+              <w:t xml:space="preserve"> gõ </w:t>
+            </w:r>
+            <w:r>
+              <w:rPr>
+                <w:rFonts w:ascii="Consolas" w:hAnsi="Consolas"/>
+                <w:sz w:val="19"/>
+              </w:rPr>
+              <w:t>T4-0447</w:t>
+            </w:r>
+            <w:r>
+              <w:t xml:space="preserve"> → mở phiếu: có xe, tài xế, hàng, số lít, khoản mục IV; </w:t>
+            </w:r>
+            <w:r>
+              <w:rPr>
+                <w:b/>
+              </w:rPr>
+              <w:t>không có</w:t>
+            </w:r>
+            <w:r>
+              <w:t xml:space="preserve"> giá cước, doanh thu, cột đơn giá mục IV (dòng </w:t>
+            </w:r>
+            <w:r>
+              <w:rPr>
+                <w:b/>
+              </w:rPr>
+              <w:t>Tổng</w:t>
+            </w:r>
+            <w:r>
+              <w:t xml:space="preserve"> trống) — Bãi không thấy tiền</w:t>
+            </w:r>
+          </w:p>
+        </w:tc>
+      </w:tr>
+      <w:tr>
+        <w:tc>
+          <w:tcPr>
+            <w:tcW w:type="dxa" w:w="2160"/>
+          </w:tcPr>
+          <w:p>
+            <w:r/>
+            <w:r>
+              <w:t>2</w:t>
+            </w:r>
+          </w:p>
+        </w:tc>
+        <w:tc>
+          <w:tcPr>
+            <w:tcW w:type="dxa" w:w="2160"/>
+          </w:tcPr>
+          <w:p>
+            <w:r/>
+            <w:r>
+              <w:t>điều xe 8020</w:t>
+            </w:r>
+          </w:p>
+        </w:tc>
+        <w:tc>
+          <w:tcPr>
+            <w:tcW w:type="dxa" w:w="2160"/>
+          </w:tcPr>
+          <w:p>
+            <w:r/>
+            <w:r>
+              <w:rPr>
+                <w:rFonts w:ascii="Consolas" w:hAnsi="Consolas"/>
+                <w:sz w:val="19"/>
+              </w:rPr>
+              <w:t>ketoan</w:t>
+            </w:r>
+            <w:r>
+              <w:t xml:space="preserve"> — KT Thu/Chi VC</w:t>
+            </w:r>
+          </w:p>
+        </w:tc>
+        <w:tc>
+          <w:tcPr>
+            <w:tcW w:type="dxa" w:w="2160"/>
+          </w:tcPr>
+          <w:p>
+            <w:r/>
+            <w:r>
+              <w:t xml:space="preserve">cùng phiếu: </w:t>
+            </w:r>
+            <w:r>
+              <w:rPr>
+                <w:b/>
+              </w:rPr>
+              <w:t>Giá cước 30,5 USD/t</w:t>
+            </w:r>
+            <w:r>
+              <w:t xml:space="preserve">, doanh thu 905,85 USD, số phiếu quặng </w:t>
+            </w:r>
+            <w:r>
+              <w:rPr>
+                <w:rFonts w:ascii="Consolas" w:hAnsi="Consolas"/>
+                <w:sz w:val="19"/>
+              </w:rPr>
+              <w:t>MAU-2909-02</w:t>
+            </w:r>
+            <w:r>
+              <w:t xml:space="preserve">, mục I–II </w:t>
+            </w:r>
+            <w:r>
+              <w:rPr>
+                <w:i/>
+              </w:rPr>
+              <w:t>Đã kiểm</w:t>
+            </w:r>
+            <w:r>
+              <w:t xml:space="preserve">, 🔒 đã khoá, </w:t>
+            </w:r>
+            <w:r>
+              <w:rPr>
+                <w:i/>
+              </w:rPr>
+              <w:t>Đã thu đủ</w:t>
+            </w:r>
+            <w:r>
+              <w:t xml:space="preserve">. </w:t>
+            </w:r>
+            <w:r>
+              <w:rPr>
+                <w:b/>
+              </w:rPr>
+              <w:t>Vận tải → Phiếu chi · Phiếu thu</w:t>
+            </w:r>
+            <w:r>
+              <w:t xml:space="preserve"> → tab </w:t>
+            </w:r>
+            <w:r>
+              <w:rPr>
+                <w:b/>
+              </w:rPr>
+              <w:t>Sổ chứng từ</w:t>
+            </w:r>
+            <w:r>
+              <w:t xml:space="preserve">: các tờ của hai phiếu đều </w:t>
+            </w:r>
+            <w:r>
+              <w:rPr>
+                <w:i/>
+              </w:rPr>
+              <w:t>đã đẩy</w:t>
+            </w:r>
+          </w:p>
+        </w:tc>
+      </w:tr>
+      <w:tr>
+        <w:tc>
+          <w:tcPr>
+            <w:tcW w:type="dxa" w:w="2160"/>
+          </w:tcPr>
+          <w:p>
+            <w:r/>
+            <w:r>
+              <w:t>3</w:t>
+            </w:r>
+          </w:p>
+        </w:tc>
+        <w:tc>
+          <w:tcPr>
+            <w:tcW w:type="dxa" w:w="2160"/>
+          </w:tcPr>
+          <w:p>
+            <w:r/>
+            <w:r>
+              <w:t>điều xe 8020</w:t>
+            </w:r>
+          </w:p>
+        </w:tc>
+        <w:tc>
+          <w:tcPr>
+            <w:tcW w:type="dxa" w:w="2160"/>
+          </w:tcPr>
+          <w:p>
+            <w:r/>
+            <w:r>
+              <w:rPr>
+                <w:rFonts w:ascii="Consolas" w:hAnsi="Consolas"/>
+                <w:sz w:val="19"/>
+              </w:rPr>
+              <w:t>ketoancp</w:t>
+            </w:r>
+            <w:r>
+              <w:t xml:space="preserve"> — KT Chi phí</w:t>
+            </w:r>
+          </w:p>
+        </w:tc>
+        <w:tc>
+          <w:tcPr>
+            <w:tcW w:type="dxa" w:w="2160"/>
+          </w:tcPr>
+          <w:p>
+            <w:r/>
+            <w:r>
+              <w:t xml:space="preserve">thẻ </w:t>
+            </w:r>
+            <w:r>
+              <w:rPr>
+                <w:b/>
+              </w:rPr>
+              <w:t>IV</w:t>
+            </w:r>
+            <w:r>
+              <w:t xml:space="preserve">: đơn giá từng dòng, ô cách trả từng dòng, tổng 4.273.500; mục IV </w:t>
+            </w:r>
+            <w:r>
+              <w:rPr>
+                <w:i/>
+              </w:rPr>
+              <w:t>Đã chi</w:t>
+            </w:r>
+          </w:p>
+        </w:tc>
+      </w:tr>
+      <w:tr>
+        <w:tc>
+          <w:tcPr>
+            <w:tcW w:type="dxa" w:w="2160"/>
+          </w:tcPr>
+          <w:p>
+            <w:r/>
+            <w:r>
+              <w:t>4</w:t>
+            </w:r>
+          </w:p>
+        </w:tc>
+        <w:tc>
+          <w:tcPr>
+            <w:tcW w:type="dxa" w:w="2160"/>
+          </w:tcPr>
+          <w:p>
+            <w:r/>
+            <w:r>
+              <w:t>điều xe 8020</w:t>
+            </w:r>
+          </w:p>
+        </w:tc>
+        <w:tc>
+          <w:tcPr>
+            <w:tcW w:type="dxa" w:w="2160"/>
+          </w:tcPr>
+          <w:p>
+            <w:r/>
+            <w:r>
+              <w:rPr>
+                <w:rFonts w:ascii="Consolas" w:hAnsi="Consolas"/>
+                <w:sz w:val="19"/>
+              </w:rPr>
+              <w:t>khonl</w:t>
+            </w:r>
+            <w:r>
+              <w:t xml:space="preserve"> — KT kho xăng dầu</w:t>
+            </w:r>
+          </w:p>
+        </w:tc>
+        <w:tc>
+          <w:tcPr>
+            <w:tcW w:type="dxa" w:w="2160"/>
+          </w:tcPr>
+          <w:p>
+            <w:r/>
+            <w:r>
+              <w:t xml:space="preserve">thẻ </w:t>
+            </w:r>
+            <w:r>
+              <w:rPr>
+                <w:b/>
+              </w:rPr>
+              <w:t>III</w:t>
+            </w:r>
+            <w:r>
+              <w:t xml:space="preserve">: 300 L × 28.500 = 8.550.000, mục III </w:t>
+            </w:r>
+            <w:r>
+              <w:rPr>
+                <w:i/>
+              </w:rPr>
+              <w:t>Đã ghi sổ</w:t>
+            </w:r>
+          </w:p>
+        </w:tc>
+      </w:tr>
+      <w:tr>
+        <w:tc>
+          <w:tcPr>
+            <w:tcW w:type="dxa" w:w="2160"/>
+          </w:tcPr>
+          <w:p>
+            <w:r/>
+            <w:r>
+              <w:t>5</w:t>
+            </w:r>
+          </w:p>
+        </w:tc>
+        <w:tc>
+          <w:tcPr>
+            <w:tcW w:type="dxa" w:w="2160"/>
+          </w:tcPr>
+          <w:p>
+            <w:r/>
+            <w:r>
+              <w:t>điều xe 8020 (điện thoại được)</w:t>
+            </w:r>
+          </w:p>
+        </w:tc>
+        <w:tc>
+          <w:tcPr>
+            <w:tcW w:type="dxa" w:w="2160"/>
+          </w:tcPr>
+          <w:p>
+            <w:r/>
+            <w:r>
+              <w:rPr>
+                <w:rFonts w:ascii="Consolas" w:hAnsi="Consolas"/>
+                <w:sz w:val="19"/>
+              </w:rPr>
+              <w:t>tx03</w:t>
+            </w:r>
+            <w:r>
+              <w:t xml:space="preserve"> — tài xế</w:t>
+            </w:r>
+          </w:p>
+        </w:tc>
+        <w:tc>
+          <w:tcPr>
+            <w:tcW w:type="dxa" w:w="2160"/>
+          </w:tcPr>
+          <w:p>
+            <w:r/>
+            <w:r>
+              <w:rPr>
+                <w:b/>
+              </w:rPr>
+              <w:t>Phiếu của tôi</w:t>
+            </w:r>
+            <w:r>
+              <w:t xml:space="preserve">: hai thẻ G4-0104-09 và T4-0447-09, ô </w:t>
+            </w:r>
+            <w:r>
+              <w:rPr>
+                <w:b/>
+              </w:rPr>
+              <w:t>Tiền tạm ứng</w:t>
+            </w:r>
+            <w:r>
+              <w:t xml:space="preserve"> 580.000 / 2.413.500 LAK · </w:t>
+            </w:r>
+            <w:r>
+              <w:rPr>
+                <w:i/>
+              </w:rPr>
+              <w:t>Đã nhận tiền</w:t>
+            </w:r>
+            <w:r>
+              <w:t>; không thấy giá cước. Có thêm vài phiếu mẫu cũ của tài xế này — chọn đúng số</w:t>
+            </w:r>
+          </w:p>
+        </w:tc>
+      </w:tr>
+      <w:tr>
+        <w:tc>
+          <w:tcPr>
+            <w:tcW w:type="dxa" w:w="2160"/>
+          </w:tcPr>
+          <w:p>
+            <w:r/>
+            <w:r>
+              <w:t>6</w:t>
+            </w:r>
+          </w:p>
+        </w:tc>
+        <w:tc>
+          <w:tcPr>
+            <w:tcW w:type="dxa" w:w="2160"/>
+          </w:tcPr>
+          <w:p>
+            <w:r/>
+            <w:r>
+              <w:t>điều xe 8020</w:t>
+            </w:r>
+          </w:p>
+        </w:tc>
+        <w:tc>
+          <w:tcPr>
+            <w:tcW w:type="dxa" w:w="2160"/>
+          </w:tcPr>
+          <w:p>
+            <w:r/>
+            <w:r>
+              <w:rPr>
+                <w:rFonts w:ascii="Consolas" w:hAnsi="Consolas"/>
+                <w:sz w:val="19"/>
+              </w:rPr>
+              <w:t>admin</w:t>
+            </w:r>
+            <w:r>
+              <w:t xml:space="preserve"> — Sếp</w:t>
+            </w:r>
+          </w:p>
+        </w:tc>
+        <w:tc>
+          <w:tcPr>
+            <w:tcW w:type="dxa" w:w="2160"/>
+          </w:tcPr>
+          <w:p>
+            <w:r/>
+            <w:r>
+              <w:t xml:space="preserve">thấy hết; </w:t>
+            </w:r>
+            <w:r>
+              <w:rPr>
+                <w:b/>
+              </w:rPr>
+              <w:t>Tổng quan</w:t>
+            </w:r>
+            <w:r>
+              <w:t xml:space="preserve"> tick </w:t>
+            </w:r>
+            <w:r>
+              <w:rPr>
+                <w:b/>
+              </w:rPr>
+              <w:t>Tự cập nhật 60 s</w:t>
+            </w:r>
+            <w:r>
+              <w:t xml:space="preserve"> để màn tự tải lại</w:t>
+            </w:r>
+          </w:p>
+        </w:tc>
+      </w:tr>
+      <w:tr>
+        <w:tc>
+          <w:tcPr>
+            <w:tcW w:type="dxa" w:w="2160"/>
+          </w:tcPr>
+          <w:p>
+            <w:r/>
+            <w:r>
+              <w:t>7</w:t>
+            </w:r>
+          </w:p>
+        </w:tc>
+        <w:tc>
+          <w:tcPr>
+            <w:tcW w:type="dxa" w:w="2160"/>
+          </w:tcPr>
+          <w:p>
+            <w:r/>
+            <w:r>
+              <w:t>kế toán 8030</w:t>
+            </w:r>
+          </w:p>
+        </w:tc>
+        <w:tc>
+          <w:tcPr>
+            <w:tcW w:type="dxa" w:w="2160"/>
+          </w:tcPr>
+          <w:p>
+            <w:r/>
+            <w:r>
+              <w:rPr>
+                <w:rFonts w:ascii="Consolas" w:hAnsi="Consolas"/>
+                <w:sz w:val="19"/>
+              </w:rPr>
+              <w:t>khotb</w:t>
+            </w:r>
+            <w:r>
+              <w:t xml:space="preserve"> — thủ kho Thà Bốc</w:t>
+            </w:r>
+          </w:p>
+        </w:tc>
+        <w:tc>
+          <w:tcPr>
+            <w:tcW w:type="dxa" w:w="2160"/>
+          </w:tcPr>
+          <w:p>
+            <w:r/>
+            <w:r>
+              <w:rPr>
+                <w:b/>
+              </w:rPr>
+              <w:t>Kho → Cấp phát</w:t>
+            </w:r>
+            <w:r>
+              <w:t xml:space="preserve">: hai tờ </w:t>
+            </w:r>
+            <w:r>
+              <w:rPr>
+                <w:rFonts w:ascii="Consolas" w:hAnsi="Consolas"/>
+                <w:sz w:val="19"/>
+              </w:rPr>
+              <w:t>PLNL-G4-0104-09/EPL-1</w:t>
+            </w:r>
+            <w:r>
+              <w:t xml:space="preserve"> (200 L), </w:t>
+            </w:r>
+            <w:r>
+              <w:rPr>
+                <w:rFonts w:ascii="Consolas" w:hAnsi="Consolas"/>
+                <w:sz w:val="19"/>
+              </w:rPr>
+              <w:t>PLNL-T4-0447-09/EPL-1</w:t>
+            </w:r>
+            <w:r>
+              <w:t xml:space="preserve"> (300 L) đã cấp. </w:t>
+            </w:r>
+            <w:r>
+              <w:rPr>
+                <w:b/>
+              </w:rPr>
+              <w:t>Kho → Kho nhiên liệu</w:t>
+            </w:r>
+            <w:r>
+              <w:t>: kho Thà Bốc còn 2.720 L</w:t>
+            </w:r>
+          </w:p>
+        </w:tc>
+      </w:tr>
+      <w:tr>
+        <w:tc>
+          <w:tcPr>
+            <w:tcW w:type="dxa" w:w="2160"/>
+          </w:tcPr>
+          <w:p>
+            <w:r/>
+            <w:r>
+              <w:t>8</w:t>
+            </w:r>
+          </w:p>
+        </w:tc>
+        <w:tc>
+          <w:tcPr>
+            <w:tcW w:type="dxa" w:w="2160"/>
+          </w:tcPr>
+          <w:p>
+            <w:r/>
+            <w:r>
+              <w:t>kế toán 8030</w:t>
+            </w:r>
+          </w:p>
+        </w:tc>
+        <w:tc>
+          <w:tcPr>
+            <w:tcW w:type="dxa" w:w="2160"/>
+          </w:tcPr>
+          <w:p>
+            <w:r/>
+            <w:r>
+              <w:rPr>
+                <w:rFonts w:ascii="Consolas" w:hAnsi="Consolas"/>
+                <w:sz w:val="19"/>
+              </w:rPr>
+              <w:t>quytb</w:t>
+            </w:r>
+            <w:r>
+              <w:t xml:space="preserve"> — quỹ Thà Bốc</w:t>
+            </w:r>
+          </w:p>
+        </w:tc>
+        <w:tc>
+          <w:tcPr>
+            <w:tcW w:type="dxa" w:w="2160"/>
+          </w:tcPr>
+          <w:p>
+            <w:r/>
+            <w:r>
+              <w:rPr>
+                <w:b/>
+              </w:rPr>
+              <w:t>Kho → Cấp phát</w:t>
+            </w:r>
+            <w:r>
+              <w:t xml:space="preserve"> → tab </w:t>
+            </w:r>
+            <w:r>
+              <w:rPr>
+                <w:b/>
+              </w:rPr>
+              <w:t>Phiếu tạm ứng đi đường</w:t>
+            </w:r>
+            <w:r>
+              <w:t xml:space="preserve">: </w:t>
+            </w:r>
+            <w:r>
+              <w:rPr>
+                <w:rFonts w:ascii="Consolas" w:hAnsi="Consolas"/>
+                <w:sz w:val="19"/>
+              </w:rPr>
+              <w:t>PTU-G4-0104-09/EPL</w:t>
+            </w:r>
+            <w:r>
+              <w:t xml:space="preserve"> 580.000, </w:t>
+            </w:r>
+            <w:r>
+              <w:rPr>
+                <w:rFonts w:ascii="Consolas" w:hAnsi="Consolas"/>
+                <w:sz w:val="19"/>
+              </w:rPr>
+              <w:t>PTU-T4-0447-09/EPL</w:t>
+            </w:r>
+            <w:r>
+              <w:t xml:space="preserve"> 2.413.500 đã chi</w:t>
+            </w:r>
+          </w:p>
+        </w:tc>
+      </w:tr>
+      <w:tr>
+        <w:tc>
+          <w:tcPr>
+            <w:tcW w:type="dxa" w:w="2160"/>
+          </w:tcPr>
+          <w:p>
+            <w:r/>
+            <w:r>
+              <w:t>9</w:t>
+            </w:r>
+          </w:p>
+        </w:tc>
+        <w:tc>
+          <w:tcPr>
+            <w:tcW w:type="dxa" w:w="2160"/>
+          </w:tcPr>
+          <w:p>
+            <w:r/>
+            <w:r>
+              <w:t>kế toán 8030</w:t>
+            </w:r>
+          </w:p>
+        </w:tc>
+        <w:tc>
+          <w:tcPr>
+            <w:tcW w:type="dxa" w:w="2160"/>
+          </w:tcPr>
+          <w:p>
+            <w:r/>
+            <w:r>
+              <w:rPr>
+                <w:rFonts w:ascii="Consolas" w:hAnsi="Consolas"/>
+                <w:sz w:val="19"/>
+              </w:rPr>
+              <w:t>doanhthu</w:t>
+            </w:r>
+            <w:r>
+              <w:t xml:space="preserve"> — KT Doanh thu</w:t>
+            </w:r>
+          </w:p>
+        </w:tc>
+        <w:tc>
+          <w:tcPr>
+            <w:tcW w:type="dxa" w:w="2160"/>
+          </w:tcPr>
+          <w:p>
+            <w:r/>
+            <w:r>
+              <w:rPr>
+                <w:b/>
+              </w:rPr>
+              <w:t>Tiền vận chuyển → Hóa đơn vận chuyển</w:t>
+            </w:r>
+            <w:r>
+              <w:t xml:space="preserve">: hai phiếu đã lập hoá đơn, khung </w:t>
+            </w:r>
+            <w:r>
+              <w:rPr>
+                <w:b/>
+              </w:rPr>
+              <w:t>Sổ thu tiền</w:t>
+            </w:r>
+            <w:r>
+              <w:t xml:space="preserve"> của T4-0447-09 có hai lần thu 400 + 505,85 USD</w:t>
+            </w:r>
+          </w:p>
+        </w:tc>
+      </w:tr>
+      <w:tr>
+        <w:tc>
+          <w:tcPr>
+            <w:tcW w:type="dxa" w:w="2160"/>
+          </w:tcPr>
+          <w:p>
+            <w:r/>
+            <w:r>
+              <w:t>10</w:t>
+            </w:r>
+          </w:p>
+        </w:tc>
+        <w:tc>
+          <w:tcPr>
+            <w:tcW w:type="dxa" w:w="2160"/>
+          </w:tcPr>
+          <w:p>
+            <w:r/>
+            <w:r>
+              <w:t>kế toán 8030</w:t>
+            </w:r>
+          </w:p>
+        </w:tc>
+        <w:tc>
+          <w:tcPr>
+            <w:tcW w:type="dxa" w:w="2160"/>
+          </w:tcPr>
+          <w:p>
+            <w:r/>
+            <w:r>
+              <w:rPr>
+                <w:rFonts w:ascii="Consolas" w:hAnsi="Consolas"/>
+                <w:sz w:val="19"/>
+              </w:rPr>
+              <w:t>ketoan</w:t>
+            </w:r>
+            <w:r>
+              <w:t xml:space="preserve"> — sổ</w:t>
+            </w:r>
+          </w:p>
+        </w:tc>
+        <w:tc>
+          <w:tcPr>
+            <w:tcW w:type="dxa" w:w="2160"/>
+          </w:tcPr>
+          <w:p>
+            <w:r/>
+            <w:r>
+              <w:rPr>
+                <w:b/>
+              </w:rPr>
+              <w:t>Sổ sách → Kế toán → Nhật ký chung</w:t>
+            </w:r>
+            <w:r>
+              <w:t xml:space="preserve"> → ô tìm gõ </w:t>
+            </w:r>
+            <w:r>
+              <w:rPr>
+                <w:rFonts w:ascii="Consolas" w:hAnsi="Consolas"/>
+                <w:sz w:val="19"/>
+              </w:rPr>
+              <w:t>G4-0104</w:t>
+            </w:r>
+            <w:r>
+              <w:t xml:space="preserve"> rồi </w:t>
+            </w:r>
+            <w:r>
+              <w:rPr>
+                <w:rFonts w:ascii="Consolas" w:hAnsi="Consolas"/>
+                <w:sz w:val="19"/>
+              </w:rPr>
+              <w:t>T4-0447</w:t>
+            </w:r>
+            <w:r>
+              <w:t xml:space="preserve">: các bút toán ở bảng dưới; </w:t>
+            </w:r>
+            <w:r>
+              <w:rPr>
+                <w:b/>
+              </w:rPr>
+              <w:t>Cân đối phát sinh</w:t>
+            </w:r>
+            <w:r>
+              <w:t xml:space="preserve"> </w:t>
+            </w:r>
+            <w:r>
+              <w:rPr>
+                <w:i/>
+              </w:rPr>
+              <w:t>Nợ = Có</w:t>
+            </w:r>
+            <w:r>
+              <w:t xml:space="preserve">. </w:t>
+            </w:r>
+            <w:r>
+              <w:rPr>
+                <w:b/>
+              </w:rPr>
+              <w:t>Chuyến &amp; kho → Chuyến xe</w:t>
+            </w:r>
+            <w:r>
+              <w:t xml:space="preserve"> → phiếu T4-0447-09: doanh thu 905,85 USD, còn phải thu 0. </w:t>
+            </w:r>
+            <w:r>
+              <w:rPr>
+                <w:b/>
+              </w:rPr>
+              <w:t>Kho → Kho hàng</w:t>
+            </w:r>
+            <w:r>
+              <w:t>: lô G4-0104-09 còn 11,5 t</w:t>
+            </w:r>
+          </w:p>
+        </w:tc>
+      </w:tr>
+    </w:tbl>
+    <w:p/>
+    <w:p>
+      <w:pPr>
+        <w:jc w:val="both"/>
+      </w:pPr>
+      <w:r>
+        <w:t xml:space="preserve">Muốn ngắn cho sếp thì </w:t>
+      </w:r>
+      <w:r>
+        <w:rPr>
+          <w:b/>
+        </w:rPr>
+        <w:t>5 tab</w:t>
+      </w:r>
+      <w:r>
+        <w:t xml:space="preserve"> là đủ thấy mỗi vai một khác: 1 (</w:t>
+      </w:r>
+      <w:r>
+        <w:rPr>
+          <w:rFonts w:ascii="Consolas" w:hAnsi="Consolas"/>
+          <w:sz w:val="19"/>
+        </w:rPr>
+        <w:t>thabok</w:t>
+      </w:r>
+      <w:r>
+        <w:t>), 2 (</w:t>
+      </w:r>
+      <w:r>
+        <w:rPr>
+          <w:rFonts w:ascii="Consolas" w:hAnsi="Consolas"/>
+          <w:sz w:val="19"/>
+        </w:rPr>
+        <w:t>ketoan</w:t>
+      </w:r>
+      <w:r>
+        <w:t xml:space="preserve"> 8020), 5 (</w:t>
+      </w:r>
+      <w:r>
+        <w:rPr>
+          <w:rFonts w:ascii="Consolas" w:hAnsi="Consolas"/>
+          <w:sz w:val="19"/>
+        </w:rPr>
+        <w:t>tx03</w:t>
+      </w:r>
+      <w:r>
+        <w:t>), 9 (</w:t>
+      </w:r>
+      <w:r>
+        <w:rPr>
+          <w:rFonts w:ascii="Consolas" w:hAnsi="Consolas"/>
+          <w:sz w:val="19"/>
+        </w:rPr>
+        <w:t>doanhthu</w:t>
+      </w:r>
+      <w:r>
+        <w:t>), 10 (</w:t>
+      </w:r>
+      <w:r>
+        <w:rPr>
+          <w:rFonts w:ascii="Consolas" w:hAnsi="Consolas"/>
+          <w:sz w:val="19"/>
+        </w:rPr>
+        <w:t>ketoan</w:t>
+      </w:r>
+      <w:r>
+        <w:t xml:space="preserve"> 8030).</w:t>
+      </w:r>
+    </w:p>
+    <w:p>
+      <w:pPr>
+        <w:jc w:val="both"/>
+      </w:pPr>
+      <w:r>
+        <w:rPr>
+          <w:b/>
+        </w:rPr>
+        <w:t>Có cập nhật ngay sang tab khác không?</w:t>
+      </w:r>
+      <w:r>
+        <w:t xml:space="preserve"> Dữ liệu dùng chung </w:t>
+      </w:r>
+      <w:r>
+        <w:rPr>
+          <w:b/>
+        </w:rPr>
+        <w:t>ngay trên máy chủ</w:t>
+      </w:r>
+      <w:r>
+        <w:t xml:space="preserve"> — bấm xong ở tab này là hai trang đã ghi (ví dụ thủ kho bấm </w:t>
+      </w:r>
+      <w:r>
+        <w:rPr>
+          <w:b/>
+        </w:rPr>
+        <w:t>Cấp dầu</w:t>
+      </w:r>
+      <w:r>
+        <w:t xml:space="preserve"> ở 8030 thì phiếu ở 8020 đã có dầu đã cấp). Nhưng tab đang mở </w:t>
+      </w:r>
+      <w:r>
+        <w:rPr>
+          <w:b/>
+        </w:rPr>
+        <w:t>không tự vẽ lại</w:t>
+      </w:r>
+      <w:r>
+        <w:t xml:space="preserve">: sang tab kia bấm </w:t>
+      </w:r>
+      <w:r>
+        <w:rPr>
+          <w:b/>
+        </w:rPr>
+        <w:t>F5</w:t>
+      </w:r>
+      <w:r>
+        <w:t xml:space="preserve"> (hoặc bấm lại màn đó trên menu) là thấy. Hai màn tự tải lại: </w:t>
+      </w:r>
+      <w:r>
+        <w:rPr>
+          <w:b/>
+        </w:rPr>
+        <w:t>Tổng quan</w:t>
+      </w:r>
+      <w:r>
+        <w:t xml:space="preserve"> (tick </w:t>
+      </w:r>
+      <w:r>
+        <w:rPr>
+          <w:b/>
+        </w:rPr>
+        <w:t>Tự cập nhật 60 s</w:t>
+      </w:r>
+      <w:r>
+        <w:t xml:space="preserve">) và </w:t>
+      </w:r>
+      <w:r>
+        <w:rPr>
+          <w:b/>
+        </w:rPr>
+        <w:t>Theo dõi tuyến</w:t>
+      </w:r>
+      <w:r>
+        <w:t xml:space="preserve"> (tick </w:t>
+      </w:r>
+      <w:r>
+        <w:rPr>
+          <w:b/>
+        </w:rPr>
+        <w:t>Tự cập nhật 30 giây</w:t>
+      </w:r>
+      <w:r>
+        <w:t xml:space="preserve">). Riêng </w:t>
+      </w:r>
+      <w:r>
+        <w:rPr>
+          <w:b/>
+        </w:rPr>
+        <w:t>sổ kế toán</w:t>
+      </w:r>
+      <w:r>
+        <w:t xml:space="preserve">: tờ sinh ở trang kế toán (cấp dầu, hoá đơn, thu tiền, nhập / xuất kho hàng) vào sổ ngay lúc bấm; tờ sinh ở trang điều xe (phiếu chi tạm ứng, phiếu xuất xe, phiếu lĩnh) vào sổ khi </w:t>
+      </w:r>
+      <w:r>
+        <w:rPr>
+          <w:rFonts w:ascii="Consolas" w:hAnsi="Consolas"/>
+          <w:sz w:val="19"/>
+        </w:rPr>
+        <w:t>ketoan</w:t>
+      </w:r>
+      <w:r>
+        <w:t xml:space="preserve"> bấm </w:t>
+      </w:r>
+      <w:r>
+        <w:rPr>
+          <w:b/>
+        </w:rPr>
+        <w:t>Đẩy</w:t>
+      </w:r>
+      <w:r>
+        <w:t xml:space="preserve"> (</w:t>
+      </w:r>
+      <w:r>
+        <w:rPr>
+          <w:b/>
+        </w:rPr>
+        <w:t>Vận tải → Phiếu chi · Phiếu thu</w:t>
+      </w:r>
+      <w:r>
+        <w:t xml:space="preserve"> → tab </w:t>
+      </w:r>
+      <w:r>
+        <w:rPr>
+          <w:b/>
+        </w:rPr>
+        <w:t>Sổ chứng từ</w:t>
+      </w:r>
+      <w:r>
+        <w:t xml:space="preserve"> → </w:t>
+      </w:r>
+      <w:r>
+        <w:rPr>
+          <w:b/>
+        </w:rPr>
+        <w:t>Đẩy hết tờ chưa đẩy</w:t>
+      </w:r>
+      <w:r>
+        <w:t>). Tờ của cặp phiếu mẫu đã đẩy rồi.</w:t>
+      </w:r>
+    </w:p>
+    <w:p>
+      <w:pPr>
+        <w:jc w:val="both"/>
+      </w:pPr>
+      <w:r>
+        <w:t>#### Ghi sổ như thế nào — chứng từ và bút toán của cặp phiếu mẫu</w:t>
+      </w:r>
+    </w:p>
+    <w:p>
+      <w:pPr>
+        <w:jc w:val="both"/>
+      </w:pPr>
+      <w:r>
+        <w:t xml:space="preserve">Mỗi việc trên phiếu sinh một </w:t>
+      </w:r>
+      <w:r>
+        <w:rPr>
+          <w:b/>
+        </w:rPr>
+        <w:t>tờ chứng từ</w:t>
+      </w:r>
+      <w:r>
+        <w:t xml:space="preserve">; tờ nào có tiền thì thành </w:t>
+      </w:r>
+      <w:r>
+        <w:rPr>
+          <w:b/>
+        </w:rPr>
+        <w:t>một bút toán Nợ / Có</w:t>
+      </w:r>
+      <w:r>
+        <w:t xml:space="preserve"> trong Nhật ký chung. Tài khoản theo hệ thống tài khoản đang có ở trang kế toán: </w:t>
+      </w:r>
+      <w:r>
+        <w:rPr>
+          <w:b/>
+        </w:rPr>
+        <w:t>625</w:t>
+      </w:r>
+      <w:r>
+        <w:t xml:space="preserve"> Chi phí vận chuyển · </w:t>
+      </w:r>
+      <w:r>
+        <w:rPr>
+          <w:b/>
+        </w:rPr>
+        <w:t>1371</w:t>
+      </w:r>
+      <w:r>
+        <w:t xml:space="preserve"> Kho hàng, vật tư · </w:t>
+      </w:r>
+      <w:r>
+        <w:rPr>
+          <w:b/>
+        </w:rPr>
+        <w:t>1011</w:t>
+      </w:r>
+      <w:r>
+        <w:t xml:space="preserve"> Tiền mặt bằng Kíp · </w:t>
+      </w:r>
+      <w:r>
+        <w:rPr>
+          <w:b/>
+        </w:rPr>
+        <w:t>1211</w:t>
+      </w:r>
+      <w:r>
+        <w:t xml:space="preserve"> Phải thu khách hàng · </w:t>
+      </w:r>
+      <w:r>
+        <w:rPr>
+          <w:b/>
+        </w:rPr>
+        <w:t>70</w:t>
+      </w:r>
+      <w:r>
+        <w:t xml:space="preserve"> Doanh thu bán hàng và dịch vụ · </w:t>
+      </w:r>
+      <w:r>
+        <w:rPr>
+          <w:b/>
+        </w:rPr>
+        <w:t>1022</w:t>
+      </w:r>
+      <w:r>
+        <w:t xml:space="preserve"> Ngân hàng ngoại tệ.</w:t>
+      </w:r>
+    </w:p>
+    <w:tbl>
+      <w:tblPr>
+        <w:tblStyle w:val="LightGrid-Accent1"/>
+        <w:tblW w:type="auto" w:w="0"/>
+        <w:tblLook w:firstColumn="1" w:firstRow="1" w:lastColumn="0" w:lastRow="0" w:noHBand="0" w:noVBand="1" w:val="04A0"/>
+      </w:tblPr>
+      <w:tblGrid>
+        <w:gridCol w:w="2160"/>
+        <w:gridCol w:w="2160"/>
+        <w:gridCol w:w="2160"/>
+        <w:gridCol w:w="2160"/>
+      </w:tblGrid>
+      <w:tr>
+        <w:tc>
+          <w:tcPr>
+            <w:tcW w:type="dxa" w:w="2160"/>
+          </w:tcPr>
+          <w:p>
+            <w:r>
+              <w:rPr>
+                <w:b/>
+              </w:rPr>
+            </w:r>
+            <w:r>
+              <w:rPr>
+                <w:b/>
+              </w:rPr>
+              <w:t>Việc (ai bấm)</w:t>
+            </w:r>
+          </w:p>
+        </w:tc>
+        <w:tc>
+          <w:tcPr>
+            <w:tcW w:type="dxa" w:w="2160"/>
+          </w:tcPr>
+          <w:p>
+            <w:r>
+              <w:rPr>
+                <w:b/>
+              </w:rPr>
+            </w:r>
+            <w:r>
+              <w:rPr>
+                <w:b/>
+              </w:rPr>
+              <w:t>Tờ chứng từ — G4-0104-09 (gom)</w:t>
+            </w:r>
+          </w:p>
+        </w:tc>
+        <w:tc>
+          <w:tcPr>
+            <w:tcW w:type="dxa" w:w="2160"/>
+          </w:tcPr>
+          <w:p>
+            <w:r>
+              <w:rPr>
+                <w:b/>
+              </w:rPr>
+            </w:r>
+            <w:r>
+              <w:rPr>
+                <w:b/>
+              </w:rPr>
+              <w:t>Tờ chứng từ — T4-0447-09 (giao)</w:t>
+            </w:r>
+          </w:p>
+        </w:tc>
+        <w:tc>
+          <w:tcPr>
+            <w:tcW w:type="dxa" w:w="2160"/>
+          </w:tcPr>
+          <w:p>
+            <w:r>
+              <w:rPr>
+                <w:b/>
+              </w:rPr>
+            </w:r>
+            <w:r>
+              <w:rPr>
+                <w:b/>
+              </w:rPr>
+              <w:t>Bút toán</w:t>
+            </w:r>
+          </w:p>
+        </w:tc>
+      </w:tr>
+      <w:tr>
+        <w:tc>
+          <w:tcPr>
+            <w:tcW w:type="dxa" w:w="2160"/>
+          </w:tcPr>
+          <w:p>
+            <w:r/>
+            <w:r>
+              <w:t>Bãi lập phiếu (</w:t>
+            </w:r>
+            <w:r>
+              <w:rPr>
+                <w:rFonts w:ascii="Consolas" w:hAnsi="Consolas"/>
+                <w:sz w:val="19"/>
+              </w:rPr>
+              <w:t>thabok</w:t>
+            </w:r>
+            <w:r>
+              <w:t>)</w:t>
+            </w:r>
+          </w:p>
+        </w:tc>
+        <w:tc>
+          <w:tcPr>
+            <w:tcW w:type="dxa" w:w="2160"/>
+          </w:tcPr>
+          <w:p>
+            <w:r/>
+            <w:r>
+              <w:t>DO/2609/0012 phiếu xuất xe</w:t>
+            </w:r>
+          </w:p>
+        </w:tc>
+        <w:tc>
+          <w:tcPr>
+            <w:tcW w:type="dxa" w:w="2160"/>
+          </w:tcPr>
+          <w:p>
+            <w:r/>
+            <w:r>
+              <w:t>DO/2609/0013</w:t>
+            </w:r>
+          </w:p>
+        </w:tc>
+        <w:tc>
+          <w:tcPr>
+            <w:tcW w:type="dxa" w:w="2160"/>
+          </w:tcPr>
+          <w:p>
+            <w:r/>
+            <w:r>
+              <w:t>— (tờ gốc, không có tiền)</w:t>
+            </w:r>
+          </w:p>
+        </w:tc>
+      </w:tr>
+      <w:tr>
+        <w:tc>
+          <w:tcPr>
+            <w:tcW w:type="dxa" w:w="2160"/>
+          </w:tcPr>
+          <w:p>
+            <w:r/>
+            <w:r>
+              <w:t>Bãi in phiếu lĩnh (</w:t>
+            </w:r>
+            <w:r>
+              <w:rPr>
+                <w:rFonts w:ascii="Consolas" w:hAnsi="Consolas"/>
+                <w:sz w:val="19"/>
+              </w:rPr>
+              <w:t>thabok</w:t>
+            </w:r>
+            <w:r>
+              <w:t>)</w:t>
+            </w:r>
+          </w:p>
+        </w:tc>
+        <w:tc>
+          <w:tcPr>
+            <w:tcW w:type="dxa" w:w="2160"/>
+          </w:tcPr>
+          <w:p>
+            <w:r/>
+            <w:r>
+              <w:t>PLNL/2609/0001 — 200 L</w:t>
+            </w:r>
+          </w:p>
+        </w:tc>
+        <w:tc>
+          <w:tcPr>
+            <w:tcW w:type="dxa" w:w="2160"/>
+          </w:tcPr>
+          <w:p>
+            <w:r/>
+            <w:r>
+              <w:t>PLNL/2609/0002 — 300 L</w:t>
+            </w:r>
+          </w:p>
+        </w:tc>
+        <w:tc>
+          <w:tcPr>
+            <w:tcW w:type="dxa" w:w="2160"/>
+          </w:tcPr>
+          <w:p>
+            <w:r/>
+            <w:r>
+              <w:t>— (chỉ số lít)</w:t>
+            </w:r>
+          </w:p>
+        </w:tc>
+      </w:tr>
+      <w:tr>
+        <w:tc>
+          <w:tcPr>
+            <w:tcW w:type="dxa" w:w="2160"/>
+          </w:tcPr>
+          <w:p>
+            <w:r/>
+            <w:r>
+              <w:t>Thủ kho cấp dầu (</w:t>
+            </w:r>
+            <w:r>
+              <w:rPr>
+                <w:rFonts w:ascii="Consolas" w:hAnsi="Consolas"/>
+                <w:sz w:val="19"/>
+              </w:rPr>
+              <w:t>khotb</w:t>
+            </w:r>
+            <w:r>
+              <w:t>)</w:t>
+            </w:r>
+          </w:p>
+        </w:tc>
+        <w:tc>
+          <w:tcPr>
+            <w:tcW w:type="dxa" w:w="2160"/>
+          </w:tcPr>
+          <w:p>
+            <w:r/>
+            <w:r>
+              <w:t>PXK_NL/2609/0006 — 5.700.000</w:t>
+            </w:r>
+          </w:p>
+        </w:tc>
+        <w:tc>
+          <w:tcPr>
+            <w:tcW w:type="dxa" w:w="2160"/>
+          </w:tcPr>
+          <w:p>
+            <w:r/>
+            <w:r>
+              <w:t>PXK_NL/2609/0007 — 8.550.000</w:t>
+            </w:r>
+          </w:p>
+        </w:tc>
+        <w:tc>
+          <w:tcPr>
+            <w:tcW w:type="dxa" w:w="2160"/>
+          </w:tcPr>
+          <w:p>
+            <w:r/>
+            <w:r>
+              <w:rPr>
+                <w:b/>
+              </w:rPr>
+              <w:t>Nợ 625 / Có 1371</w:t>
+            </w:r>
+            <w:r>
+              <w:t xml:space="preserve"> (dầu kho thành chi phí chuyến, theo giá vốn bình quân kho)</w:t>
+            </w:r>
+          </w:p>
+        </w:tc>
+      </w:tr>
+      <w:tr>
+        <w:tc>
+          <w:tcPr>
+            <w:tcW w:type="dxa" w:w="2160"/>
+          </w:tcPr>
+          <w:p>
+            <w:r/>
+            <w:r>
+              <w:t>Bãi in tờ tạm ứng (</w:t>
+            </w:r>
+            <w:r>
+              <w:rPr>
+                <w:rFonts w:ascii="Consolas" w:hAnsi="Consolas"/>
+                <w:sz w:val="19"/>
+              </w:rPr>
+              <w:t>thabok</w:t>
+            </w:r>
+            <w:r>
+              <w:t>)</w:t>
+            </w:r>
+          </w:p>
+        </w:tc>
+        <w:tc>
+          <w:tcPr>
+            <w:tcW w:type="dxa" w:w="2160"/>
+          </w:tcPr>
+          <w:p>
+            <w:r/>
+            <w:r>
+              <w:t>PTU/2609/0006 — 580.000</w:t>
+            </w:r>
+          </w:p>
+        </w:tc>
+        <w:tc>
+          <w:tcPr>
+            <w:tcW w:type="dxa" w:w="2160"/>
+          </w:tcPr>
+          <w:p>
+            <w:r/>
+            <w:r>
+              <w:t>PTU/2609/0007 — 2.413.500</w:t>
+            </w:r>
+          </w:p>
+        </w:tc>
+        <w:tc>
+          <w:tcPr>
+            <w:tcW w:type="dxa" w:w="2160"/>
+          </w:tcPr>
+          <w:p>
+            <w:r/>
+            <w:r>
+              <w:t>— (tờ đưa tiền, có mã QR)</w:t>
+            </w:r>
+          </w:p>
+        </w:tc>
+      </w:tr>
+      <w:tr>
+        <w:tc>
+          <w:tcPr>
+            <w:tcW w:type="dxa" w:w="2160"/>
+          </w:tcPr>
+          <w:p>
+            <w:r/>
+            <w:r>
+              <w:t>Quỹ chi tạm ứng (</w:t>
+            </w:r>
+            <w:r>
+              <w:rPr>
+                <w:rFonts w:ascii="Consolas" w:hAnsi="Consolas"/>
+                <w:sz w:val="19"/>
+              </w:rPr>
+              <w:t>quytb</w:t>
+            </w:r>
+            <w:r>
+              <w:t>)</w:t>
+            </w:r>
+          </w:p>
+        </w:tc>
+        <w:tc>
+          <w:tcPr>
+            <w:tcW w:type="dxa" w:w="2160"/>
+          </w:tcPr>
+          <w:p>
+            <w:r/>
+            <w:r>
+              <w:t>PC_TU/2609/0010 — 580.000</w:t>
+            </w:r>
+          </w:p>
+        </w:tc>
+        <w:tc>
+          <w:tcPr>
+            <w:tcW w:type="dxa" w:w="2160"/>
+          </w:tcPr>
+          <w:p>
+            <w:r/>
+            <w:r>
+              <w:t>PC_TU/2609/0011 — 2.413.500</w:t>
+            </w:r>
+          </w:p>
+        </w:tc>
+        <w:tc>
+          <w:tcPr>
+            <w:tcW w:type="dxa" w:w="2160"/>
+          </w:tcPr>
+          <w:p>
+            <w:r/>
+            <w:r>
+              <w:rPr>
+                <w:b/>
+              </w:rPr>
+              <w:t>Nợ 625 / Có 1011</w:t>
+            </w:r>
+            <w:r>
+              <w:t xml:space="preserve"> (tiền mặt ra khỏi quỹ)</w:t>
+            </w:r>
+          </w:p>
+        </w:tc>
+      </w:tr>
+      <w:tr>
+        <w:tc>
+          <w:tcPr>
+            <w:tcW w:type="dxa" w:w="2160"/>
+          </w:tcPr>
+          <w:p>
+            <w:r/>
+            <w:r>
+              <w:t>Xe gom về bãi · xe giao lấy hàng (</w:t>
+            </w:r>
+            <w:r>
+              <w:rPr>
+                <w:rFonts w:ascii="Consolas" w:hAnsi="Consolas"/>
+                <w:sz w:val="19"/>
+              </w:rPr>
+              <w:t>thabok</w:t>
+            </w:r>
+            <w:r>
+              <w:t>)</w:t>
+            </w:r>
+          </w:p>
+        </w:tc>
+        <w:tc>
+          <w:tcPr>
+            <w:tcW w:type="dxa" w:w="2160"/>
+          </w:tcPr>
+          <w:p>
+            <w:r/>
+            <w:r>
+              <w:t>PNK_HH/2609/0003 — nhập 41,5 t</w:t>
+            </w:r>
+          </w:p>
+        </w:tc>
+        <w:tc>
+          <w:tcPr>
+            <w:tcW w:type="dxa" w:w="2160"/>
+          </w:tcPr>
+          <w:p>
+            <w:r/>
+            <w:r>
+              <w:t>PXK_HH/2609/0003 — xuất 30 t</w:t>
+            </w:r>
+          </w:p>
+        </w:tc>
+        <w:tc>
+          <w:tcPr>
+            <w:tcW w:type="dxa" w:w="2160"/>
+          </w:tcPr>
+          <w:p>
+            <w:r/>
+            <w:r>
+              <w:t>— (hàng của khách gửi bãi: sổ kho hàng theo tấn, không có tiền)</w:t>
+            </w:r>
+          </w:p>
+        </w:tc>
+      </w:tr>
+      <w:tr>
+        <w:tc>
+          <w:tcPr>
+            <w:tcW w:type="dxa" w:w="2160"/>
+          </w:tcPr>
+          <w:p>
+            <w:r/>
+            <w:r>
+              <w:t>Lập hoá đơn (</w:t>
+            </w:r>
+            <w:r>
+              <w:rPr>
+                <w:rFonts w:ascii="Consolas" w:hAnsi="Consolas"/>
+                <w:sz w:val="19"/>
+              </w:rPr>
+              <w:t>doanhthu</w:t>
+            </w:r>
+            <w:r>
+              <w:t>)</w:t>
+            </w:r>
+          </w:p>
+        </w:tc>
+        <w:tc>
+          <w:tcPr>
+            <w:tcW w:type="dxa" w:w="2160"/>
+          </w:tcPr>
+          <w:p>
+            <w:r/>
+            <w:r>
+              <w:t>HD/2609/0005 — 518,75 USD = 11.412.500 LAK</w:t>
+            </w:r>
+          </w:p>
+        </w:tc>
+        <w:tc>
+          <w:tcPr>
+            <w:tcW w:type="dxa" w:w="2160"/>
+          </w:tcPr>
+          <w:p>
+            <w:r/>
+            <w:r>
+              <w:t>HD/2609/0006 — 905,85 USD = 19.928.700 LAK</w:t>
+            </w:r>
+          </w:p>
+        </w:tc>
+        <w:tc>
+          <w:tcPr>
+            <w:tcW w:type="dxa" w:w="2160"/>
+          </w:tcPr>
+          <w:p>
+            <w:r/>
+            <w:r>
+              <w:rPr>
+                <w:b/>
+              </w:rPr>
+              <w:t>Nợ 1211 / Có 70</w:t>
+            </w:r>
+            <w:r>
+              <w:t xml:space="preserve"> (khách nợ tiền cước)</w:t>
+            </w:r>
+          </w:p>
+        </w:tc>
+      </w:tr>
+      <w:tr>
+        <w:tc>
+          <w:tcPr>
+            <w:tcW w:type="dxa" w:w="2160"/>
+          </w:tcPr>
+          <w:p>
+            <w:r/>
+            <w:r>
+              <w:t>Ghi thu tiền (</w:t>
+            </w:r>
+            <w:r>
+              <w:rPr>
+                <w:rFonts w:ascii="Consolas" w:hAnsi="Consolas"/>
+                <w:sz w:val="19"/>
+              </w:rPr>
+              <w:t>doanhthu</w:t>
+            </w:r>
+            <w:r>
+              <w:t>)</w:t>
+            </w:r>
+          </w:p>
+        </w:tc>
+        <w:tc>
+          <w:tcPr>
+            <w:tcW w:type="dxa" w:w="2160"/>
+          </w:tcPr>
+          <w:p>
+            <w:r/>
+            <w:r>
+              <w:t>PT/2609/0004 — 518,75 USD</w:t>
+            </w:r>
+          </w:p>
+        </w:tc>
+        <w:tc>
+          <w:tcPr>
+            <w:tcW w:type="dxa" w:w="2160"/>
+          </w:tcPr>
+          <w:p>
+            <w:r/>
+            <w:r>
+              <w:t>PT/2609/0005 — 400 USD · PT/2609/0006 — 505,85 USD</w:t>
+            </w:r>
+          </w:p>
+        </w:tc>
+        <w:tc>
+          <w:tcPr>
+            <w:tcW w:type="dxa" w:w="2160"/>
+          </w:tcPr>
+          <w:p>
+            <w:r/>
+            <w:r>
+              <w:rPr>
+                <w:b/>
+              </w:rPr>
+              <w:t>Nợ 1022 / Có 1211</w:t>
+            </w:r>
+            <w:r>
+              <w:t xml:space="preserve"> (tiền về ngân hàng, xoá nợ khách)</w:t>
+            </w:r>
+          </w:p>
+        </w:tc>
+      </w:tr>
+    </w:tbl>
+    <w:p/>
+    <w:p>
+      <w:pPr>
+        <w:jc w:val="both"/>
+      </w:pPr>
+      <w:r>
+        <w:t xml:space="preserve">Trong </w:t>
+      </w:r>
+      <w:r>
+        <w:rPr>
+          <w:b/>
+        </w:rPr>
+        <w:t>Sổ sách → Kế toán → Nhật ký chung</w:t>
+      </w:r>
+      <w:r>
+        <w:t xml:space="preserve"> là 9 bút toán </w:t>
+      </w:r>
+      <w:r>
+        <w:rPr>
+          <w:b/>
+        </w:rPr>
+        <w:t>BT-000053 … BT-000061</w:t>
+      </w:r>
+      <w:r>
+        <w:t xml:space="preserve"> (4 của phiếu gom, 5 của phiếu giao); </w:t>
+      </w:r>
+      <w:r>
+        <w:rPr>
+          <w:b/>
+        </w:rPr>
+        <w:t>Cân đối phát sinh</w:t>
+      </w:r>
+      <w:r>
+        <w:t xml:space="preserve"> vẫn </w:t>
+      </w:r>
+      <w:r>
+        <w:rPr>
+          <w:i/>
+        </w:rPr>
+        <w:t>Nợ = Có</w:t>
+      </w:r>
+      <w:r>
+        <w:t>.</w:t>
+      </w:r>
+    </w:p>
+    <w:p>
+      <w:pPr>
+        <w:jc w:val="both"/>
+      </w:pPr>
+      <w:r>
+        <w:rPr>
+          <w:b/>
+        </w:rPr>
+        <w:t>Chưa vào sổ, đúng luật cách trả</w:t>
+      </w:r>
+      <w:r>
+        <w:t xml:space="preserve"> (bước 3): trong mục IV, chỉ dòng </w:t>
+      </w:r>
+      <w:r>
+        <w:rPr>
+          <w:i/>
+        </w:rPr>
+        <w:t>Chi ngay khi xe đi</w:t>
+      </w:r>
+      <w:r>
+        <w:t xml:space="preserve"> đi qua quỹ lúc xe đi. </w:t>
+      </w:r>
+      <w:r>
+        <w:rPr>
+          <w:b/>
+        </w:rPr>
+        <w:t>Tiền nước + tiền chuyến</w:t>
+      </w:r>
+      <w:r>
+        <w:t xml:space="preserve"> (1.860.000 mỗi phiếu) là </w:t>
+      </w:r>
+      <w:r>
+        <w:rPr>
+          <w:i/>
+        </w:rPr>
+        <w:t>Trả theo chuyến cùng lương</w:t>
+      </w:r>
+      <w:r>
+        <w:t xml:space="preserve">: hiện ở </w:t>
+      </w:r>
+      <w:r>
+        <w:rPr>
+          <w:b/>
+        </w:rPr>
+        <w:t>Tiền vận chuyển → Tiền chuyến &amp; tiền nước tài xế</w:t>
+      </w:r>
+      <w:r>
+        <w:t xml:space="preserve"> tháng 09 của ທ້າວ ສົມພອນ, ghi sổ khi trả lương. </w:t>
+      </w:r>
+      <w:r>
+        <w:rPr>
+          <w:b/>
+        </w:rPr>
+        <w:t>Chipping Lào</w:t>
+      </w:r>
+      <w:r>
+        <w:t xml:space="preserve"> 620.000 (phiếu gom) là </w:t>
+      </w:r>
+      <w:r>
+        <w:rPr>
+          <w:i/>
+        </w:rPr>
+        <w:t>Nợ NCC / trả theo đợt</w:t>
+      </w:r>
+      <w:r>
+        <w:t xml:space="preserve">: vào công nợ nhà cung cấp, ghi sổ khi kế toán trả đợt (6.6). Cộng lại đúng tổng mục IV: phiếu gom 580.000 + 1.860.000 + 620.000 = </w:t>
+      </w:r>
+      <w:r>
+        <w:rPr>
+          <w:b/>
+        </w:rPr>
+        <w:t>3.060.000</w:t>
+      </w:r>
+      <w:r>
+        <w:t xml:space="preserve">; phiếu giao 2.413.500 + 1.860.000 = </w:t>
+      </w:r>
+      <w:r>
+        <w:rPr>
+          <w:b/>
+        </w:rPr>
+        <w:t>4.273.500</w:t>
+      </w:r>
+      <w:r>
+        <w:t>.</w:t>
+      </w:r>
+    </w:p>
+    <w:p>
+      <w:pPr>
+        <w:jc w:val="both"/>
+      </w:pPr>
+      <w:r>
+        <w:rPr>
+          <w:b/>
+        </w:rPr>
+        <w:t>Lưu ý khi mở Tất toán tài xế</w:t>
+      </w:r>
+      <w:r>
+        <w:t xml:space="preserve"> cho ທ້າວ ສົມພອນ: dòng của hai phiếu mẫu </w:t>
+      </w:r>
+      <w:r>
+        <w:rPr>
+          <w:i/>
+        </w:rPr>
+        <w:t>đã chi thật = tạm ứng</w:t>
+      </w:r>
+      <w:r>
+        <w:t xml:space="preserve">, </w:t>
+      </w:r>
+      <w:r>
+        <w:rPr>
+          <w:b/>
+        </w:rPr>
+        <w:t>chênh 0</w:t>
+      </w:r>
+      <w:r>
+        <w:t xml:space="preserve">; nhưng dòng tổng của tài xế còn gộp phiếu mẫu cũ tháng 8–9 (chi tạm ứng theo luật cũ) nên có thể hiện </w:t>
+      </w:r>
+      <w:r>
+        <w:rPr>
+          <w:i/>
+        </w:rPr>
+        <w:t>Tài xế nộp lại</w:t>
+      </w:r>
+      <w:r>
+        <w:t xml:space="preserve"> — xem lưu ý ở ca T34.</w:t>
+      </w:r>
+    </w:p>
+    <w:p>
+      <w:pPr>
+        <w:jc w:val="both"/>
+      </w:pPr>
+      <w:r>
+        <w:rPr>
+          <w:b/>
+        </w:rPr>
+        <w:t>Lập lại cặp phiếu mẫu khác</w:t>
+      </w:r>
+      <w:r>
+        <w:t xml:space="preserve"> (ví dụ hôm sau): </w:t>
+      </w:r>
+      <w:r>
+        <w:rPr>
+          <w:rFonts w:ascii="Consolas" w:hAnsi="Consolas"/>
+          <w:sz w:val="19"/>
+        </w:rPr>
+        <w:t>python tools/phieu_mau_a_z.py</w:t>
+      </w:r>
+      <w:r>
+        <w:t xml:space="preserve"> chạy thử (không ghi, chỉ kể sẽ làm gì), thêm </w:t>
+      </w:r>
+      <w:r>
+        <w:rPr>
+          <w:rFonts w:ascii="Consolas" w:hAnsi="Consolas"/>
+          <w:sz w:val="19"/>
+        </w:rPr>
+        <w:t>http://127.0.0.1:8020 http://127.0.0.1:8030 that</w:t>
+      </w:r>
+      <w:r>
+        <w:t xml:space="preserve"> là làm thật. Cùng ngày đã có phiếu mẫu thì công cụ dừng, không lập trùng. Công cụ chỉ đẩy tờ của hai phiếu mẫu, không bấm </w:t>
+      </w:r>
+      <w:r>
+        <w:rPr>
+          <w:i/>
+        </w:rPr>
+        <w:t>Đẩy hết</w:t>
+      </w:r>
+      <w:r>
+        <w:t xml:space="preserve"> (không cuốn tờ của phiếu anh đang test tay).</w:t>
       </w:r>
     </w:p>
     <w:p>

</xml_diff>

<commit_message>
Tài liệu A → Z 10.0c: từng tài khoản mở phiếu mẫu nào, bấm gì, thấy số nào
Mười tab, mỗi tab các bước bấm và con số phải thấy trên G4-0104-09 / T4-0447-09; mã QR bốn tờ để tra ở
Cấp phát (màn này chỉ liệt kê tờ chờ cấp); vì sao lãi trên phiếu khác lãi ở màn Chuyến xe của sổ; ảnh
của phiếu mẫu là ảnh trống.

Co-Authored-By: Claude Opus 5.5 (1M context) <noreply@anthropic.com>
</commit_message>
<xml_diff>
--- a/DOCS/word/LUONG_A_Z_HAI_TRANG.docx
+++ b/DOCS/word/LUONG_A_Z_HAI_TRANG.docx
@@ -24144,16 +24144,33 @@
         <w:jc w:val="both"/>
       </w:pPr>
       <w:r>
-        <w:t xml:space="preserve">Đủ bộ để xem cặp phiếu mẫu (và để đi lại 10.0b) — </w:t>
-      </w:r>
-      <w:r>
-        <w:rPr>
-          <w:b/>
-        </w:rPr>
-        <w:t>10 tab</w:t>
-      </w:r>
-      <w:r>
-        <w:t>:</w:t>
+        <w:rPr>
+          <w:b/>
+        </w:rPr>
+        <w:t>Đủ bộ là 10 tab</w:t>
+      </w:r>
+      <w:r>
+        <w:t xml:space="preserve">, mở theo thứ tự này (tab 1–6 ở </w:t>
+      </w:r>
+      <w:r>
+        <w:rPr>
+          <w:rFonts w:ascii="Consolas" w:hAnsi="Consolas"/>
+          <w:sz w:val="19"/>
+        </w:rPr>
+        <w:t>http://&lt;máy chủ&gt;:8020</w:t>
+      </w:r>
+      <w:r>
+        <w:t xml:space="preserve">, tab 7–10 ở </w:t>
+      </w:r>
+      <w:r>
+        <w:rPr>
+          <w:rFonts w:ascii="Consolas" w:hAnsi="Consolas"/>
+          <w:sz w:val="19"/>
+        </w:rPr>
+        <w:t>http://&lt;máy chủ&gt;:8030</w:t>
+      </w:r>
+      <w:r>
+        <w:t>):</w:t>
       </w:r>
     </w:p>
     <w:tbl>
@@ -24237,7 +24254,7 @@
               <w:rPr>
                 <w:b/>
               </w:rPr>
-              <w:t>Mở màn nào, thấy gì ở phiếu mẫu</w:t>
+              <w:t>Xem để thấy</w:t>
             </w:r>
           </w:p>
         </w:tc>
@@ -24261,7 +24278,7 @@
           <w:p>
             <w:r/>
             <w:r>
-              <w:t>điều xe 8020</w:t>
+              <w:t>điều xe</w:t>
             </w:r>
           </w:p>
         </w:tc>
@@ -24290,50 +24307,66 @@
           <w:p>
             <w:r/>
             <w:r>
-              <w:rPr>
-                <w:b/>
-              </w:rPr>
-              <w:t>Vận tải → Phiếu xuất xe</w:t>
-            </w:r>
-            <w:r>
-              <w:t xml:space="preserve"> → ô </w:t>
-            </w:r>
-            <w:r>
-              <w:rPr>
-                <w:b/>
-              </w:rPr>
-              <w:t>Số phiếu</w:t>
-            </w:r>
-            <w:r>
-              <w:t xml:space="preserve"> gõ </w:t>
-            </w:r>
+              <w:t xml:space="preserve">Bãi làm phiếu nhưng </w:t>
+            </w:r>
+            <w:r>
+              <w:rPr>
+                <w:b/>
+              </w:rPr>
+              <w:t>không thấy tiền bán</w:t>
+            </w:r>
+          </w:p>
+        </w:tc>
+      </w:tr>
+      <w:tr>
+        <w:tc>
+          <w:tcPr>
+            <w:tcW w:type="dxa" w:w="2160"/>
+          </w:tcPr>
+          <w:p>
+            <w:r/>
+            <w:r>
+              <w:t>2</w:t>
+            </w:r>
+          </w:p>
+        </w:tc>
+        <w:tc>
+          <w:tcPr>
+            <w:tcW w:type="dxa" w:w="2160"/>
+          </w:tcPr>
+          <w:p>
+            <w:r/>
+            <w:r>
+              <w:t>điều xe</w:t>
+            </w:r>
+          </w:p>
+        </w:tc>
+        <w:tc>
+          <w:tcPr>
+            <w:tcW w:type="dxa" w:w="2160"/>
+          </w:tcPr>
+          <w:p>
+            <w:r/>
             <w:r>
               <w:rPr>
                 <w:rFonts w:ascii="Consolas" w:hAnsi="Consolas"/>
                 <w:sz w:val="19"/>
               </w:rPr>
-              <w:t>T4-0447</w:t>
-            </w:r>
-            <w:r>
-              <w:t xml:space="preserve"> → mở phiếu: có xe, tài xế, hàng, số lít, khoản mục IV; </w:t>
-            </w:r>
-            <w:r>
-              <w:rPr>
-                <w:b/>
-              </w:rPr>
-              <w:t>không có</w:t>
-            </w:r>
-            <w:r>
-              <w:t xml:space="preserve"> giá cước, doanh thu, cột đơn giá mục IV (dòng </w:t>
-            </w:r>
-            <w:r>
-              <w:rPr>
-                <w:b/>
-              </w:rPr>
-              <w:t>Tổng</w:t>
-            </w:r>
-            <w:r>
-              <w:t xml:space="preserve"> trống) — Bãi không thấy tiền</w:t>
+              <w:t>ketoan</w:t>
+            </w:r>
+            <w:r>
+              <w:t xml:space="preserve"> — KT Thu/Chi VC</w:t>
+            </w:r>
+          </w:p>
+        </w:tc>
+        <w:tc>
+          <w:tcPr>
+            <w:tcW w:type="dxa" w:w="2160"/>
+          </w:tcPr>
+          <w:p>
+            <w:r/>
+            <w:r>
+              <w:t>giá cước, doanh thu, lãi chuyến, ai duyệt bước nào</w:t>
             </w:r>
           </w:p>
         </w:tc>
@@ -24346,7 +24379,7 @@
           <w:p>
             <w:r/>
             <w:r>
-              <w:t>2</w:t>
+              <w:t>3</w:t>
             </w:r>
           </w:p>
         </w:tc>
@@ -24357,7 +24390,7 @@
           <w:p>
             <w:r/>
             <w:r>
-              <w:t>điều xe 8020</w:t>
+              <w:t>điều xe</w:t>
             </w:r>
           </w:p>
         </w:tc>
@@ -24372,10 +24405,10 @@
                 <w:rFonts w:ascii="Consolas" w:hAnsi="Consolas"/>
                 <w:sz w:val="19"/>
               </w:rPr>
-              <w:t>ketoan</w:t>
-            </w:r>
-            <w:r>
-              <w:t xml:space="preserve"> — KT Thu/Chi VC</w:t>
+              <w:t>ketoancp</w:t>
+            </w:r>
+            <w:r>
+              <w:t xml:space="preserve"> — KT Chi phí</w:t>
             </w:r>
           </w:p>
         </w:tc>
@@ -24386,68 +24419,60 @@
           <w:p>
             <w:r/>
             <w:r>
-              <w:t xml:space="preserve">cùng phiếu: </w:t>
-            </w:r>
-            <w:r>
-              <w:rPr>
-                <w:b/>
-              </w:rPr>
-              <w:t>Giá cước 30,5 USD/t</w:t>
-            </w:r>
-            <w:r>
-              <w:t xml:space="preserve">, doanh thu 905,85 USD, số phiếu quặng </w:t>
-            </w:r>
+              <w:t>đơn giá mục IV, cách trả từng dòng, tờ tạm ứng</w:t>
+            </w:r>
+          </w:p>
+        </w:tc>
+      </w:tr>
+      <w:tr>
+        <w:tc>
+          <w:tcPr>
+            <w:tcW w:type="dxa" w:w="2160"/>
+          </w:tcPr>
+          <w:p>
+            <w:r/>
+            <w:r>
+              <w:t>4</w:t>
+            </w:r>
+          </w:p>
+        </w:tc>
+        <w:tc>
+          <w:tcPr>
+            <w:tcW w:type="dxa" w:w="2160"/>
+          </w:tcPr>
+          <w:p>
+            <w:r/>
+            <w:r>
+              <w:t>điều xe</w:t>
+            </w:r>
+          </w:p>
+        </w:tc>
+        <w:tc>
+          <w:tcPr>
+            <w:tcW w:type="dxa" w:w="2160"/>
+          </w:tcPr>
+          <w:p>
+            <w:r/>
             <w:r>
               <w:rPr>
                 <w:rFonts w:ascii="Consolas" w:hAnsi="Consolas"/>
                 <w:sz w:val="19"/>
               </w:rPr>
-              <w:t>MAU-2909-02</w:t>
-            </w:r>
-            <w:r>
-              <w:t xml:space="preserve">, mục I–II </w:t>
-            </w:r>
-            <w:r>
-              <w:rPr>
-                <w:i/>
-              </w:rPr>
-              <w:t>Đã kiểm</w:t>
-            </w:r>
-            <w:r>
-              <w:t xml:space="preserve">, 🔒 đã khoá, </w:t>
-            </w:r>
-            <w:r>
-              <w:rPr>
-                <w:i/>
-              </w:rPr>
-              <w:t>Đã thu đủ</w:t>
-            </w:r>
-            <w:r>
-              <w:t xml:space="preserve">. </w:t>
-            </w:r>
-            <w:r>
-              <w:rPr>
-                <w:b/>
-              </w:rPr>
-              <w:t>Vận tải → Phiếu chi · Phiếu thu</w:t>
-            </w:r>
-            <w:r>
-              <w:t xml:space="preserve"> → tab </w:t>
-            </w:r>
-            <w:r>
-              <w:rPr>
-                <w:b/>
-              </w:rPr>
-              <w:t>Sổ chứng từ</w:t>
-            </w:r>
-            <w:r>
-              <w:t xml:space="preserve">: các tờ của hai phiếu đều </w:t>
-            </w:r>
-            <w:r>
-              <w:rPr>
-                <w:i/>
-              </w:rPr>
-              <w:t>đã đẩy</w:t>
+              <w:t>khonl</w:t>
+            </w:r>
+            <w:r>
+              <w:t xml:space="preserve"> — KT kho xăng dầu</w:t>
+            </w:r>
+          </w:p>
+        </w:tc>
+        <w:tc>
+          <w:tcPr>
+            <w:tcW w:type="dxa" w:w="2160"/>
+          </w:tcPr>
+          <w:p>
+            <w:r/>
+            <w:r>
+              <w:t>dầu mục III theo giá bình quân kho</w:t>
             </w:r>
           </w:p>
         </w:tc>
@@ -24460,7 +24485,7 @@
           <w:p>
             <w:r/>
             <w:r>
-              <w:t>3</w:t>
+              <w:t>5</w:t>
             </w:r>
           </w:p>
         </w:tc>
@@ -24471,7 +24496,7 @@
           <w:p>
             <w:r/>
             <w:r>
-              <w:t>điều xe 8020</w:t>
+              <w:t>điều xe (hoặc điện thoại)</w:t>
             </w:r>
           </w:p>
         </w:tc>
@@ -24486,10 +24511,10 @@
                 <w:rFonts w:ascii="Consolas" w:hAnsi="Consolas"/>
                 <w:sz w:val="19"/>
               </w:rPr>
-              <w:t>ketoancp</w:t>
-            </w:r>
-            <w:r>
-              <w:t xml:space="preserve"> — KT Chi phí</w:t>
+              <w:t>tx03</w:t>
+            </w:r>
+            <w:r>
+              <w:t xml:space="preserve"> — tài xế ທ້າວ ສົມພອນ</w:t>
             </w:r>
           </w:p>
         </w:tc>
@@ -24500,22 +24525,7 @@
           <w:p>
             <w:r/>
             <w:r>
-              <w:t xml:space="preserve">thẻ </w:t>
-            </w:r>
-            <w:r>
-              <w:rPr>
-                <w:b/>
-              </w:rPr>
-              <w:t>IV</w:t>
-            </w:r>
-            <w:r>
-              <w:t xml:space="preserve">: đơn giá từng dòng, ô cách trả từng dòng, tổng 4.273.500; mục IV </w:t>
-            </w:r>
-            <w:r>
-              <w:rPr>
-                <w:i/>
-              </w:rPr>
-              <w:t>Đã chi</w:t>
+              <w:t>tài xế chỉ thấy phiếu của mình, tiền tạm ứng đã nhận</w:t>
             </w:r>
           </w:p>
         </w:tc>
@@ -24528,7 +24538,7 @@
           <w:p>
             <w:r/>
             <w:r>
-              <w:t>4</w:t>
+              <w:t>6</w:t>
             </w:r>
           </w:p>
         </w:tc>
@@ -24539,7 +24549,7 @@
           <w:p>
             <w:r/>
             <w:r>
-              <w:t>điều xe 8020</w:t>
+              <w:t>điều xe</w:t>
             </w:r>
           </w:p>
         </w:tc>
@@ -24554,10 +24564,10 @@
                 <w:rFonts w:ascii="Consolas" w:hAnsi="Consolas"/>
                 <w:sz w:val="19"/>
               </w:rPr>
-              <w:t>khonl</w:t>
-            </w:r>
-            <w:r>
-              <w:t xml:space="preserve"> — KT kho xăng dầu</w:t>
+              <w:t>admin</w:t>
+            </w:r>
+            <w:r>
+              <w:t xml:space="preserve"> — Sếp</w:t>
             </w:r>
           </w:p>
         </w:tc>
@@ -24568,22 +24578,7 @@
           <w:p>
             <w:r/>
             <w:r>
-              <w:t xml:space="preserve">thẻ </w:t>
-            </w:r>
-            <w:r>
-              <w:rPr>
-                <w:b/>
-              </w:rPr>
-              <w:t>III</w:t>
-            </w:r>
-            <w:r>
-              <w:t xml:space="preserve">: 300 L × 28.500 = 8.550.000, mục III </w:t>
-            </w:r>
-            <w:r>
-              <w:rPr>
-                <w:i/>
-              </w:rPr>
-              <w:t>Đã ghi sổ</w:t>
+              <w:t>thấy hết; Tổng quan</w:t>
             </w:r>
           </w:p>
         </w:tc>
@@ -24596,7 +24591,7 @@
           <w:p>
             <w:r/>
             <w:r>
-              <w:t>5</w:t>
+              <w:t>7</w:t>
             </w:r>
           </w:p>
         </w:tc>
@@ -24607,7 +24602,7 @@
           <w:p>
             <w:r/>
             <w:r>
-              <w:t>điều xe 8020 (điện thoại được)</w:t>
+              <w:t>kế toán</w:t>
             </w:r>
           </w:p>
         </w:tc>
@@ -24622,10 +24617,10 @@
                 <w:rFonts w:ascii="Consolas" w:hAnsi="Consolas"/>
                 <w:sz w:val="19"/>
               </w:rPr>
-              <w:t>tx03</w:t>
-            </w:r>
-            <w:r>
-              <w:t xml:space="preserve"> — tài xế</w:t>
+              <w:t>khotb</w:t>
+            </w:r>
+            <w:r>
+              <w:t xml:space="preserve"> — thủ kho Thà Bốc</w:t>
             </w:r>
           </w:p>
         </w:tc>
@@ -24636,31 +24631,7 @@
           <w:p>
             <w:r/>
             <w:r>
-              <w:rPr>
-                <w:b/>
-              </w:rPr>
-              <w:t>Phiếu của tôi</w:t>
-            </w:r>
-            <w:r>
-              <w:t xml:space="preserve">: hai thẻ G4-0104-09 và T4-0447-09, ô </w:t>
-            </w:r>
-            <w:r>
-              <w:rPr>
-                <w:b/>
-              </w:rPr>
-              <w:t>Tiền tạm ứng</w:t>
-            </w:r>
-            <w:r>
-              <w:t xml:space="preserve"> 580.000 / 2.413.500 LAK · </w:t>
-            </w:r>
-            <w:r>
-              <w:rPr>
-                <w:i/>
-              </w:rPr>
-              <w:t>Đã nhận tiền</w:t>
-            </w:r>
-            <w:r>
-              <w:t>; không thấy giá cước. Có thêm vài phiếu mẫu cũ của tài xế này — chọn đúng số</w:t>
+              <w:t>dầu đã cấp, tồn kho dầu</w:t>
             </w:r>
           </w:p>
         </w:tc>
@@ -24673,7 +24644,7 @@
           <w:p>
             <w:r/>
             <w:r>
-              <w:t>6</w:t>
+              <w:t>8</w:t>
             </w:r>
           </w:p>
         </w:tc>
@@ -24684,7 +24655,7 @@
           <w:p>
             <w:r/>
             <w:r>
-              <w:t>điều xe 8020</w:t>
+              <w:t>kế toán</w:t>
             </w:r>
           </w:p>
         </w:tc>
@@ -24699,10 +24670,10 @@
                 <w:rFonts w:ascii="Consolas" w:hAnsi="Consolas"/>
                 <w:sz w:val="19"/>
               </w:rPr>
-              <w:t>admin</w:t>
-            </w:r>
-            <w:r>
-              <w:t xml:space="preserve"> — Sếp</w:t>
+              <w:t>quytb</w:t>
+            </w:r>
+            <w:r>
+              <w:t xml:space="preserve"> — quỹ Thà Bốc</w:t>
             </w:r>
           </w:p>
         </w:tc>
@@ -24713,25 +24684,7 @@
           <w:p>
             <w:r/>
             <w:r>
-              <w:t xml:space="preserve">thấy hết; </w:t>
-            </w:r>
-            <w:r>
-              <w:rPr>
-                <w:b/>
-              </w:rPr>
-              <w:t>Tổng quan</w:t>
-            </w:r>
-            <w:r>
-              <w:t xml:space="preserve"> tick </w:t>
-            </w:r>
-            <w:r>
-              <w:rPr>
-                <w:b/>
-              </w:rPr>
-              <w:t>Tự cập nhật 60 s</w:t>
-            </w:r>
-            <w:r>
-              <w:t xml:space="preserve"> để màn tự tải lại</w:t>
+              <w:t>tiền tạm ứng đã chi</w:t>
             </w:r>
           </w:p>
         </w:tc>
@@ -24744,7 +24697,7 @@
           <w:p>
             <w:r/>
             <w:r>
-              <w:t>7</w:t>
+              <w:t>9</w:t>
             </w:r>
           </w:p>
         </w:tc>
@@ -24755,7 +24708,7 @@
           <w:p>
             <w:r/>
             <w:r>
-              <w:t>kế toán 8030</w:t>
+              <w:t>kế toán</w:t>
             </w:r>
           </w:p>
         </w:tc>
@@ -24770,10 +24723,10 @@
                 <w:rFonts w:ascii="Consolas" w:hAnsi="Consolas"/>
                 <w:sz w:val="19"/>
               </w:rPr>
-              <w:t>khotb</w:t>
-            </w:r>
-            <w:r>
-              <w:t xml:space="preserve"> — thủ kho Thà Bốc</w:t>
+              <w:t>doanhthu</w:t>
+            </w:r>
+            <w:r>
+              <w:t xml:space="preserve"> — KT Doanh thu</w:t>
             </w:r>
           </w:p>
         </w:tc>
@@ -24784,47 +24737,52 @@
           <w:p>
             <w:r/>
             <w:r>
-              <w:rPr>
-                <w:b/>
-              </w:rPr>
-              <w:t>Kho → Cấp phát</w:t>
-            </w:r>
-            <w:r>
-              <w:t xml:space="preserve">: hai tờ </w:t>
-            </w:r>
+              <w:t>hoá đơn, hai lần thu tiền</w:t>
+            </w:r>
+          </w:p>
+        </w:tc>
+      </w:tr>
+      <w:tr>
+        <w:tc>
+          <w:tcPr>
+            <w:tcW w:type="dxa" w:w="2160"/>
+          </w:tcPr>
+          <w:p>
+            <w:r/>
+            <w:r>
+              <w:t>10</w:t>
+            </w:r>
+          </w:p>
+        </w:tc>
+        <w:tc>
+          <w:tcPr>
+            <w:tcW w:type="dxa" w:w="2160"/>
+          </w:tcPr>
+          <w:p>
+            <w:r/>
+            <w:r>
+              <w:t>kế toán</w:t>
+            </w:r>
+          </w:p>
+        </w:tc>
+        <w:tc>
+          <w:tcPr>
+            <w:tcW w:type="dxa" w:w="2160"/>
+          </w:tcPr>
+          <w:p>
+            <w:r/>
             <w:r>
               <w:rPr>
                 <w:rFonts w:ascii="Consolas" w:hAnsi="Consolas"/>
                 <w:sz w:val="19"/>
               </w:rPr>
-              <w:t>PLNL-G4-0104-09/EPL-1</w:t>
-            </w:r>
-            <w:r>
-              <w:t xml:space="preserve"> (200 L), </w:t>
-            </w:r>
-            <w:r>
-              <w:rPr>
-                <w:rFonts w:ascii="Consolas" w:hAnsi="Consolas"/>
-                <w:sz w:val="19"/>
-              </w:rPr>
-              <w:t>PLNL-T4-0447-09/EPL-1</w:t>
-            </w:r>
-            <w:r>
-              <w:t xml:space="preserve"> (300 L) đã cấp. </w:t>
-            </w:r>
-            <w:r>
-              <w:rPr>
-                <w:b/>
-              </w:rPr>
-              <w:t>Kho → Kho nhiên liệu</w:t>
-            </w:r>
-            <w:r>
-              <w:t>: kho Thà Bốc còn 2.720 L</w:t>
-            </w:r>
-          </w:p>
-        </w:tc>
-      </w:tr>
-      <w:tr>
+              <w:t>ketoan</w:t>
+            </w:r>
+            <w:r>
+              <w:t xml:space="preserve"> — sổ</w:t>
+            </w:r>
+          </w:p>
+        </w:tc>
         <w:tc>
           <w:tcPr>
             <w:tcW w:type="dxa" w:w="2160"/>
@@ -24832,265 +24790,7 @@
           <w:p>
             <w:r/>
             <w:r>
-              <w:t>8</w:t>
-            </w:r>
-          </w:p>
-        </w:tc>
-        <w:tc>
-          <w:tcPr>
-            <w:tcW w:type="dxa" w:w="2160"/>
-          </w:tcPr>
-          <w:p>
-            <w:r/>
-            <w:r>
-              <w:t>kế toán 8030</w:t>
-            </w:r>
-          </w:p>
-        </w:tc>
-        <w:tc>
-          <w:tcPr>
-            <w:tcW w:type="dxa" w:w="2160"/>
-          </w:tcPr>
-          <w:p>
-            <w:r/>
-            <w:r>
-              <w:rPr>
-                <w:rFonts w:ascii="Consolas" w:hAnsi="Consolas"/>
-                <w:sz w:val="19"/>
-              </w:rPr>
-              <w:t>quytb</w:t>
-            </w:r>
-            <w:r>
-              <w:t xml:space="preserve"> — quỹ Thà Bốc</w:t>
-            </w:r>
-          </w:p>
-        </w:tc>
-        <w:tc>
-          <w:tcPr>
-            <w:tcW w:type="dxa" w:w="2160"/>
-          </w:tcPr>
-          <w:p>
-            <w:r/>
-            <w:r>
-              <w:rPr>
-                <w:b/>
-              </w:rPr>
-              <w:t>Kho → Cấp phát</w:t>
-            </w:r>
-            <w:r>
-              <w:t xml:space="preserve"> → tab </w:t>
-            </w:r>
-            <w:r>
-              <w:rPr>
-                <w:b/>
-              </w:rPr>
-              <w:t>Phiếu tạm ứng đi đường</w:t>
-            </w:r>
-            <w:r>
-              <w:t xml:space="preserve">: </w:t>
-            </w:r>
-            <w:r>
-              <w:rPr>
-                <w:rFonts w:ascii="Consolas" w:hAnsi="Consolas"/>
-                <w:sz w:val="19"/>
-              </w:rPr>
-              <w:t>PTU-G4-0104-09/EPL</w:t>
-            </w:r>
-            <w:r>
-              <w:t xml:space="preserve"> 580.000, </w:t>
-            </w:r>
-            <w:r>
-              <w:rPr>
-                <w:rFonts w:ascii="Consolas" w:hAnsi="Consolas"/>
-                <w:sz w:val="19"/>
-              </w:rPr>
-              <w:t>PTU-T4-0447-09/EPL</w:t>
-            </w:r>
-            <w:r>
-              <w:t xml:space="preserve"> 2.413.500 đã chi</w:t>
-            </w:r>
-          </w:p>
-        </w:tc>
-      </w:tr>
-      <w:tr>
-        <w:tc>
-          <w:tcPr>
-            <w:tcW w:type="dxa" w:w="2160"/>
-          </w:tcPr>
-          <w:p>
-            <w:r/>
-            <w:r>
-              <w:t>9</w:t>
-            </w:r>
-          </w:p>
-        </w:tc>
-        <w:tc>
-          <w:tcPr>
-            <w:tcW w:type="dxa" w:w="2160"/>
-          </w:tcPr>
-          <w:p>
-            <w:r/>
-            <w:r>
-              <w:t>kế toán 8030</w:t>
-            </w:r>
-          </w:p>
-        </w:tc>
-        <w:tc>
-          <w:tcPr>
-            <w:tcW w:type="dxa" w:w="2160"/>
-          </w:tcPr>
-          <w:p>
-            <w:r/>
-            <w:r>
-              <w:rPr>
-                <w:rFonts w:ascii="Consolas" w:hAnsi="Consolas"/>
-                <w:sz w:val="19"/>
-              </w:rPr>
-              <w:t>doanhthu</w:t>
-            </w:r>
-            <w:r>
-              <w:t xml:space="preserve"> — KT Doanh thu</w:t>
-            </w:r>
-          </w:p>
-        </w:tc>
-        <w:tc>
-          <w:tcPr>
-            <w:tcW w:type="dxa" w:w="2160"/>
-          </w:tcPr>
-          <w:p>
-            <w:r/>
-            <w:r>
-              <w:rPr>
-                <w:b/>
-              </w:rPr>
-              <w:t>Tiền vận chuyển → Hóa đơn vận chuyển</w:t>
-            </w:r>
-            <w:r>
-              <w:t xml:space="preserve">: hai phiếu đã lập hoá đơn, khung </w:t>
-            </w:r>
-            <w:r>
-              <w:rPr>
-                <w:b/>
-              </w:rPr>
-              <w:t>Sổ thu tiền</w:t>
-            </w:r>
-            <w:r>
-              <w:t xml:space="preserve"> của T4-0447-09 có hai lần thu 400 + 505,85 USD</w:t>
-            </w:r>
-          </w:p>
-        </w:tc>
-      </w:tr>
-      <w:tr>
-        <w:tc>
-          <w:tcPr>
-            <w:tcW w:type="dxa" w:w="2160"/>
-          </w:tcPr>
-          <w:p>
-            <w:r/>
-            <w:r>
-              <w:t>10</w:t>
-            </w:r>
-          </w:p>
-        </w:tc>
-        <w:tc>
-          <w:tcPr>
-            <w:tcW w:type="dxa" w:w="2160"/>
-          </w:tcPr>
-          <w:p>
-            <w:r/>
-            <w:r>
-              <w:t>kế toán 8030</w:t>
-            </w:r>
-          </w:p>
-        </w:tc>
-        <w:tc>
-          <w:tcPr>
-            <w:tcW w:type="dxa" w:w="2160"/>
-          </w:tcPr>
-          <w:p>
-            <w:r/>
-            <w:r>
-              <w:rPr>
-                <w:rFonts w:ascii="Consolas" w:hAnsi="Consolas"/>
-                <w:sz w:val="19"/>
-              </w:rPr>
-              <w:t>ketoan</w:t>
-            </w:r>
-            <w:r>
-              <w:t xml:space="preserve"> — sổ</w:t>
-            </w:r>
-          </w:p>
-        </w:tc>
-        <w:tc>
-          <w:tcPr>
-            <w:tcW w:type="dxa" w:w="2160"/>
-          </w:tcPr>
-          <w:p>
-            <w:r/>
-            <w:r>
-              <w:rPr>
-                <w:b/>
-              </w:rPr>
-              <w:t>Sổ sách → Kế toán → Nhật ký chung</w:t>
-            </w:r>
-            <w:r>
-              <w:t xml:space="preserve"> → ô tìm gõ </w:t>
-            </w:r>
-            <w:r>
-              <w:rPr>
-                <w:rFonts w:ascii="Consolas" w:hAnsi="Consolas"/>
-                <w:sz w:val="19"/>
-              </w:rPr>
-              <w:t>G4-0104</w:t>
-            </w:r>
-            <w:r>
-              <w:t xml:space="preserve"> rồi </w:t>
-            </w:r>
-            <w:r>
-              <w:rPr>
-                <w:rFonts w:ascii="Consolas" w:hAnsi="Consolas"/>
-                <w:sz w:val="19"/>
-              </w:rPr>
-              <w:t>T4-0447</w:t>
-            </w:r>
-            <w:r>
-              <w:t xml:space="preserve">: các bút toán ở bảng dưới; </w:t>
-            </w:r>
-            <w:r>
-              <w:rPr>
-                <w:b/>
-              </w:rPr>
-              <w:t>Cân đối phát sinh</w:t>
-            </w:r>
-            <w:r>
-              <w:t xml:space="preserve"> </w:t>
-            </w:r>
-            <w:r>
-              <w:rPr>
-                <w:i/>
-              </w:rPr>
-              <w:t>Nợ = Có</w:t>
-            </w:r>
-            <w:r>
-              <w:t xml:space="preserve">. </w:t>
-            </w:r>
-            <w:r>
-              <w:rPr>
-                <w:b/>
-              </w:rPr>
-              <w:t>Chuyến &amp; kho → Chuyến xe</w:t>
-            </w:r>
-            <w:r>
-              <w:t xml:space="preserve"> → phiếu T4-0447-09: doanh thu 905,85 USD, còn phải thu 0. </w:t>
-            </w:r>
-            <w:r>
-              <w:rPr>
-                <w:b/>
-              </w:rPr>
-              <w:t>Kho → Kho hàng</w:t>
-            </w:r>
-            <w:r>
-              <w:t>: lô G4-0104-09 còn 11,5 t</w:t>
+              <w:t>bút toán Nợ / Có, cân đối, chuyến xe, kho hàng</w:t>
             </w:r>
           </w:p>
         </w:tc>
@@ -25102,16 +24802,13 @@
         <w:jc w:val="both"/>
       </w:pPr>
       <w:r>
-        <w:t xml:space="preserve">Muốn ngắn cho sếp thì </w:t>
-      </w:r>
-      <w:r>
-        <w:rPr>
-          <w:b/>
-        </w:rPr>
-        <w:t>5 tab</w:t>
-      </w:r>
-      <w:r>
-        <w:t xml:space="preserve"> là đủ thấy mỗi vai một khác: 1 (</w:t>
+        <w:rPr>
+          <w:b/>
+        </w:rPr>
+        <w:t>Bản ngắn cho sếp — 5 tab:</w:t>
+      </w:r>
+      <w:r>
+        <w:t xml:space="preserve"> 1 (</w:t>
       </w:r>
       <w:r>
         <w:rPr>
@@ -25131,7 +24828,7 @@
         <w:t>ketoan</w:t>
       </w:r>
       <w:r>
-        <w:t xml:space="preserve"> 8020), 5 (</w:t>
+        <w:t xml:space="preserve"> điều xe), 5 (</w:t>
       </w:r>
       <w:r>
         <w:rPr>
@@ -25161,7 +24858,2019 @@
         <w:t>ketoan</w:t>
       </w:r>
       <w:r>
-        <w:t xml:space="preserve"> 8030).</w:t>
+        <w:t xml:space="preserve"> kế toán). Đi theo thứ tự đó là kể được trọn chuyện: Bãi lập mà không thấy tiền → kế toán thấy tiền, thấy ai duyệt → tài xế nhận tiền, giao hàng → hoá đơn, thu tiền → sổ.</w:t>
+      </w:r>
+    </w:p>
+    <w:p>
+      <w:pPr>
+        <w:jc w:val="both"/>
+      </w:pPr>
+      <w:r>
+        <w:rPr>
+          <w:b/>
+        </w:rPr>
+        <w:t>Mở một phiếu ở trang điều xe</w:t>
+      </w:r>
+      <w:r>
+        <w:t xml:space="preserve"> (tab 1–4, 6): </w:t>
+      </w:r>
+      <w:r>
+        <w:rPr>
+          <w:b/>
+        </w:rPr>
+        <w:t>Vận tải → Phiếu xuất xe</w:t>
+      </w:r>
+      <w:r>
+        <w:t xml:space="preserve"> → ô </w:t>
+      </w:r>
+      <w:r>
+        <w:rPr>
+          <w:b/>
+        </w:rPr>
+        <w:t>Số phiếu</w:t>
+      </w:r>
+      <w:r>
+        <w:t xml:space="preserve"> trên cùng gõ </w:t>
+      </w:r>
+      <w:r>
+        <w:rPr>
+          <w:rFonts w:ascii="Consolas" w:hAnsi="Consolas"/>
+          <w:sz w:val="19"/>
+        </w:rPr>
+        <w:t>T4-0447</w:t>
+      </w:r>
+      <w:r>
+        <w:t xml:space="preserve"> (hoặc </w:t>
+      </w:r>
+      <w:r>
+        <w:rPr>
+          <w:rFonts w:ascii="Consolas" w:hAnsi="Consolas"/>
+          <w:sz w:val="19"/>
+        </w:rPr>
+        <w:t>G4-0104</w:t>
+      </w:r>
+      <w:r>
+        <w:t xml:space="preserve">) → chọn phiếu ở ô bên cạnh. Thanh thẻ mục </w:t>
+      </w:r>
+      <w:r>
+        <w:rPr>
+          <w:b/>
+        </w:rPr>
+        <w:t>I … VI</w:t>
+      </w:r>
+      <w:r>
+        <w:t xml:space="preserve"> dưới đầu phiếu; thẻ </w:t>
+      </w:r>
+      <w:r>
+        <w:rPr>
+          <w:b/>
+        </w:rPr>
+        <w:t>Toàn phiếu</w:t>
+      </w:r>
+      <w:r>
+        <w:t xml:space="preserve"> ở cuối thanh hiện cả sáu mục một trang. Cuối trang phiếu có khung tổng (doanh thu, chi phí, lãi — vai không thấy tiền thì không có) và khung </w:t>
+      </w:r>
+      <w:r>
+        <w:rPr>
+          <w:b/>
+        </w:rPr>
+        <w:t>Lịch sử duyệt</w:t>
+      </w:r>
+      <w:r>
+        <w:t>.</w:t>
+      </w:r>
+    </w:p>
+    <w:p>
+      <w:pPr>
+        <w:jc w:val="both"/>
+      </w:pPr>
+      <w:r>
+        <w:t>#### Từng tài khoản: mở phiếu nào, bấm gì, thấy gì</w:t>
+      </w:r>
+    </w:p>
+    <w:p>
+      <w:pPr>
+        <w:jc w:val="both"/>
+      </w:pPr>
+      <w:r>
+        <w:rPr>
+          <w:b/>
+        </w:rPr>
+        <w:t>Tab 1 · `thabok` — Admin Thà Bốc (trang điều xe)</w:t>
+      </w:r>
+    </w:p>
+    <w:p>
+      <w:pPr>
+        <w:pStyle w:val="ListNumber"/>
+      </w:pPr>
+      <w:r>
+        <w:t xml:space="preserve">Mở phiếu </w:t>
+      </w:r>
+      <w:r>
+        <w:rPr>
+          <w:b/>
+        </w:rPr>
+        <w:t>T4-0447-09/EPL</w:t>
+      </w:r>
+      <w:r>
+        <w:t xml:space="preserve"> (như trên) → thẻ </w:t>
+      </w:r>
+      <w:r>
+        <w:rPr>
+          <w:b/>
+        </w:rPr>
+        <w:t>I</w:t>
+      </w:r>
+      <w:r>
+        <w:t xml:space="preserve">: xe </w:t>
+      </w:r>
+      <w:r>
+        <w:rPr>
+          <w:b/>
+        </w:rPr>
+        <w:t>346</w:t>
+      </w:r>
+      <w:r>
+        <w:t xml:space="preserve">, biển đầu kéo, rơ-moóc, tài xế ທ້າວ ສົມພອນ, </w:t>
+      </w:r>
+      <w:r>
+        <w:rPr>
+          <w:b/>
+        </w:rPr>
+        <w:t>Lúc đi</w:t>
+      </w:r>
+      <w:r>
+        <w:t xml:space="preserve"> 128.900, </w:t>
+      </w:r>
+      <w:r>
+        <w:rPr>
+          <w:b/>
+        </w:rPr>
+        <w:t>Lúc về</w:t>
+      </w:r>
+      <w:r>
+        <w:t xml:space="preserve"> 129.620, </w:t>
+      </w:r>
+      <w:r>
+        <w:rPr>
+          <w:i/>
+        </w:rPr>
+        <w:t>Đã kiểm</w:t>
+      </w:r>
+      <w:r>
+        <w:t>.</w:t>
+      </w:r>
+    </w:p>
+    <w:p>
+      <w:pPr>
+        <w:pStyle w:val="ListNumber"/>
+      </w:pPr>
+      <w:r>
+        <w:t xml:space="preserve">Thẻ </w:t>
+      </w:r>
+      <w:r>
+        <w:rPr>
+          <w:b/>
+        </w:rPr>
+        <w:t>II</w:t>
+      </w:r>
+      <w:r>
+        <w:t xml:space="preserve">: tuyến ທ່າບົກ → ທ່າເຮືອກະລໍ, khách ຄຳຕຸ້ຍ, khung </w:t>
+      </w:r>
+      <w:r>
+        <w:rPr>
+          <w:b/>
+        </w:rPr>
+        <w:t>Hàng trên phiếu</w:t>
+      </w:r>
+      <w:r>
+        <w:t xml:space="preserve"> một dòng 30 t lấy từ lô </w:t>
+      </w:r>
+      <w:r>
+        <w:rPr>
+          <w:b/>
+        </w:rPr>
+        <w:t>G4-0104-09/EPL</w:t>
+      </w:r>
+      <w:r>
+        <w:t xml:space="preserve">, </w:t>
+      </w:r>
+      <w:r>
+        <w:rPr>
+          <w:b/>
+        </w:rPr>
+        <w:t>Cân đầu (tấn)</w:t>
+      </w:r>
+      <w:r>
+        <w:t xml:space="preserve"> 30, </w:t>
+      </w:r>
+      <w:r>
+        <w:rPr>
+          <w:b/>
+        </w:rPr>
+        <w:t>Cân cuối (tấn)</w:t>
+      </w:r>
+      <w:r>
+        <w:t xml:space="preserve"> 29,7, dòng </w:t>
+      </w:r>
+      <w:r>
+        <w:rPr>
+          <w:b/>
+        </w:rPr>
+        <w:t>Hao hụt</w:t>
+      </w:r>
+      <w:r>
+        <w:t xml:space="preserve"> 0,3 t, </w:t>
+      </w:r>
+      <w:r>
+        <w:rPr>
+          <w:b/>
+        </w:rPr>
+        <w:t>Số POD</w:t>
+      </w:r>
+      <w:r>
+        <w:t xml:space="preserve"> </w:t>
+      </w:r>
+      <w:r>
+        <w:rPr>
+          <w:rFonts w:ascii="Consolas" w:hAnsi="Consolas"/>
+          <w:sz w:val="19"/>
+        </w:rPr>
+        <w:t>POD-T4-0447-09</w:t>
+      </w:r>
+      <w:r>
+        <w:t xml:space="preserve"> (máy tự đặt lúc ký nhận), </w:t>
+      </w:r>
+      <w:r>
+        <w:rPr>
+          <w:b/>
+        </w:rPr>
+        <w:t>Người ký nhận</w:t>
+      </w:r>
+      <w:r>
+        <w:t xml:space="preserve"> ນາງ ມະນີ. </w:t>
+      </w:r>
+      <w:r>
+        <w:rPr>
+          <w:b/>
+        </w:rPr>
+        <w:t>Không có</w:t>
+      </w:r>
+      <w:r>
+        <w:t xml:space="preserve"> ô giá cước, </w:t>
+      </w:r>
+      <w:r>
+        <w:rPr>
+          <w:b/>
+        </w:rPr>
+        <w:t>Thành tiền</w:t>
+      </w:r>
+      <w:r>
+        <w:t>, doanh thu.</w:t>
+      </w:r>
+    </w:p>
+    <w:p>
+      <w:pPr>
+        <w:pStyle w:val="ListNumber"/>
+      </w:pPr>
+      <w:r>
+        <w:t xml:space="preserve">Thẻ </w:t>
+      </w:r>
+      <w:r>
+        <w:rPr>
+          <w:b/>
+        </w:rPr>
+        <w:t>III</w:t>
+      </w:r>
+      <w:r>
+        <w:t xml:space="preserve">: 300 lít, nơi đổ kho Thà Bốc — </w:t>
+      </w:r>
+      <w:r>
+        <w:rPr>
+          <w:b/>
+        </w:rPr>
+        <w:t>không có</w:t>
+      </w:r>
+      <w:r>
+        <w:t xml:space="preserve"> cột đơn giá, thành tiền. Thẻ </w:t>
+      </w:r>
+      <w:r>
+        <w:rPr>
+          <w:b/>
+        </w:rPr>
+        <w:t>IV</w:t>
+      </w:r>
+      <w:r>
+        <w:t xml:space="preserve">: năm khoản mục, SL 1, ô cách trả — </w:t>
+      </w:r>
+      <w:r>
+        <w:rPr>
+          <w:b/>
+        </w:rPr>
+        <w:t>không có</w:t>
+      </w:r>
+      <w:r>
+        <w:t xml:space="preserve"> cột </w:t>
+      </w:r>
+      <w:r>
+        <w:rPr>
+          <w:b/>
+        </w:rPr>
+        <w:t>Đơn giá</w:t>
+      </w:r>
+      <w:r>
+        <w:t xml:space="preserve">, dòng </w:t>
+      </w:r>
+      <w:r>
+        <w:rPr>
+          <w:b/>
+        </w:rPr>
+        <w:t>Tổng</w:t>
+      </w:r>
+      <w:r>
+        <w:t xml:space="preserve"> trống.</w:t>
+      </w:r>
+    </w:p>
+    <w:p>
+      <w:pPr>
+        <w:pStyle w:val="ListNumber"/>
+      </w:pPr>
+      <w:r>
+        <w:t xml:space="preserve">Cuối trang: </w:t>
+      </w:r>
+      <w:r>
+        <w:rPr>
+          <w:b/>
+        </w:rPr>
+        <w:t>không có</w:t>
+      </w:r>
+      <w:r>
+        <w:t xml:space="preserve"> khung doanh thu, chi phí, lãi. Phiếu </w:t>
+      </w:r>
+      <w:r>
+        <w:rPr>
+          <w:i/>
+        </w:rPr>
+        <w:t>Đã khoá 🔒</w:t>
+      </w:r>
+      <w:r>
+        <w:t xml:space="preserve"> — Bãi không sửa được gì nữa.</w:t>
+      </w:r>
+    </w:p>
+    <w:p>
+      <w:pPr>
+        <w:pStyle w:val="ListNumber"/>
+      </w:pPr>
+      <w:r>
+        <w:t xml:space="preserve">Mở phiếu </w:t>
+      </w:r>
+      <w:r>
+        <w:rPr>
+          <w:b/>
+        </w:rPr>
+        <w:t>G4-0104-09/EPL</w:t>
+      </w:r>
+      <w:r>
+        <w:t xml:space="preserve"> → thẻ </w:t>
+      </w:r>
+      <w:r>
+        <w:rPr>
+          <w:b/>
+        </w:rPr>
+        <w:t>II</w:t>
+      </w:r>
+      <w:r>
+        <w:t xml:space="preserve">: </w:t>
+      </w:r>
+      <w:r>
+        <w:rPr>
+          <w:b/>
+        </w:rPr>
+        <w:t>Cân tại mỏ (t)</w:t>
+      </w:r>
+      <w:r>
+        <w:t xml:space="preserve"> 42 (tài xế báo từ mỏ), </w:t>
+      </w:r>
+      <w:r>
+        <w:rPr>
+          <w:b/>
+        </w:rPr>
+        <w:t>Cân tại bãi khi về</w:t>
+      </w:r>
+      <w:r>
+        <w:t xml:space="preserve"> 41,5, dòng </w:t>
+      </w:r>
+      <w:r>
+        <w:rPr>
+          <w:b/>
+        </w:rPr>
+        <w:t>Hao hụt</w:t>
+      </w:r>
+      <w:r>
+        <w:t xml:space="preserve"> 0,5 t; khung </w:t>
+      </w:r>
+      <w:r>
+        <w:rPr>
+          <w:b/>
+        </w:rPr>
+        <w:t>Phiếu quặng đính kèm</w:t>
+      </w:r>
+      <w:r>
+        <w:t xml:space="preserve"> có 1 ảnh phiếu cân tài xế gửi.</w:t>
+      </w:r>
+    </w:p>
+    <w:p>
+      <w:pPr>
+        <w:jc w:val="both"/>
+      </w:pPr>
+      <w:r>
+        <w:rPr>
+          <w:i/>
+        </w:rPr>
+        <w:t>Nói với sếp:</w:t>
+      </w:r>
+      <w:r>
+        <w:t xml:space="preserve"> Bãi lập phiếu, ghi dầu, khoản đi đường, nhận xe về — nhưng giá khách trả và lãi của công ty Bãi không bao giờ thấy (anh Khampla A2).</w:t>
+      </w:r>
+    </w:p>
+    <w:p>
+      <w:pPr>
+        <w:jc w:val="both"/>
+      </w:pPr>
+      <w:r>
+        <w:rPr>
+          <w:b/>
+        </w:rPr>
+        <w:t>Tab 2 · `ketoan` — KT Thu/Chi VC (trang điều xe)</w:t>
+      </w:r>
+    </w:p>
+    <w:p>
+      <w:pPr>
+        <w:pStyle w:val="ListNumber"/>
+      </w:pPr>
+      <w:r>
+        <w:t xml:space="preserve">Mở phiếu </w:t>
+      </w:r>
+      <w:r>
+        <w:rPr>
+          <w:b/>
+        </w:rPr>
+        <w:t>T4-0447-09/EPL</w:t>
+      </w:r>
+      <w:r>
+        <w:t xml:space="preserve"> → thẻ </w:t>
+      </w:r>
+      <w:r>
+        <w:rPr>
+          <w:b/>
+        </w:rPr>
+        <w:t>II</w:t>
+      </w:r>
+      <w:r>
+        <w:t xml:space="preserve">: </w:t>
+      </w:r>
+      <w:r>
+        <w:rPr>
+          <w:b/>
+        </w:rPr>
+        <w:t>Số phiếu quặng</w:t>
+      </w:r>
+      <w:r>
+        <w:t xml:space="preserve"> </w:t>
+      </w:r>
+      <w:r>
+        <w:rPr>
+          <w:rFonts w:ascii="Consolas" w:hAnsi="Consolas"/>
+          <w:sz w:val="19"/>
+        </w:rPr>
+        <w:t>MAU-2909-02</w:t>
+      </w:r>
+      <w:r>
+        <w:t xml:space="preserve">, </w:t>
+      </w:r>
+      <w:r>
+        <w:rPr>
+          <w:b/>
+        </w:rPr>
+        <w:t>Đơn giá mỗi tấn</w:t>
+      </w:r>
+      <w:r>
+        <w:t xml:space="preserve"> </w:t>
+      </w:r>
+      <w:r>
+        <w:rPr>
+          <w:b/>
+        </w:rPr>
+        <w:t>30,5</w:t>
+      </w:r>
+      <w:r>
+        <w:t xml:space="preserve"> USD, </w:t>
+      </w:r>
+      <w:r>
+        <w:rPr>
+          <w:b/>
+        </w:rPr>
+        <w:t>Thành tiền</w:t>
+      </w:r>
+      <w:r>
+        <w:t xml:space="preserve"> </w:t>
+      </w:r>
+      <w:r>
+        <w:rPr>
+          <w:b/>
+        </w:rPr>
+        <w:t>905,85</w:t>
+      </w:r>
+      <w:r>
+        <w:t xml:space="preserve"> USD (29,7 t × 30,5 — tính theo cân cuối), </w:t>
+      </w:r>
+      <w:r>
+        <w:rPr>
+          <w:b/>
+        </w:rPr>
+        <w:t>Quy đổi (LAK)</w:t>
+      </w:r>
+      <w:r>
+        <w:t xml:space="preserve"> 19.928.700, </w:t>
+      </w:r>
+      <w:r>
+        <w:rPr>
+          <w:b/>
+        </w:rPr>
+        <w:t>Hợp đồng vận chuyển</w:t>
+      </w:r>
+      <w:r>
+        <w:t xml:space="preserve"> của ຄຳຕຸ້ຍ. Mục I, II </w:t>
+      </w:r>
+      <w:r>
+        <w:rPr>
+          <w:i/>
+        </w:rPr>
+        <w:t>Đã kiểm</w:t>
+      </w:r>
+      <w:r>
+        <w:t>.</w:t>
+      </w:r>
+    </w:p>
+    <w:p>
+      <w:pPr>
+        <w:pStyle w:val="ListNumber"/>
+      </w:pPr>
+      <w:r>
+        <w:t xml:space="preserve">Cuối trang, khung tổng: </w:t>
+      </w:r>
+      <w:r>
+        <w:rPr>
+          <w:b/>
+        </w:rPr>
+        <w:t>Doanh thu chuyến</w:t>
+      </w:r>
+      <w:r>
+        <w:t xml:space="preserve"> 19.928.700 LAK · </w:t>
+      </w:r>
+      <w:r>
+        <w:rPr>
+          <w:b/>
+        </w:rPr>
+        <w:t>Tổng chi phí chuyến</w:t>
+      </w:r>
+      <w:r>
+        <w:t xml:space="preserve"> 12.823.500 (dầu 8.550.000 + mục IV 4.273.500) · </w:t>
+      </w:r>
+      <w:r>
+        <w:rPr>
+          <w:b/>
+        </w:rPr>
+        <w:t>Lãi trong chuyến này</w:t>
+      </w:r>
+      <w:r>
+        <w:t xml:space="preserve"> ≈ </w:t>
+      </w:r>
+      <w:r>
+        <w:rPr>
+          <w:b/>
+        </w:rPr>
+        <w:t>7.105.200 LAK</w:t>
+      </w:r>
+      <w:r>
+        <w:t xml:space="preserve">. Khung </w:t>
+      </w:r>
+      <w:r>
+        <w:rPr>
+          <w:b/>
+        </w:rPr>
+        <w:t>Sổ thu tiền</w:t>
+      </w:r>
+      <w:r>
+        <w:t xml:space="preserve">: </w:t>
+      </w:r>
+      <w:r>
+        <w:rPr>
+          <w:i/>
+        </w:rPr>
+        <w:t>Đã lập hóa đơn</w:t>
+      </w:r>
+      <w:r>
+        <w:t xml:space="preserve">, </w:t>
+      </w:r>
+      <w:r>
+        <w:rPr>
+          <w:i/>
+        </w:rPr>
+        <w:t>Đã thu đủ</w:t>
+      </w:r>
+      <w:r>
+        <w:t>, hai lần thu 400 + 505,85 USD (ghi ở trang kế toán, bên này chỉ đọc).</w:t>
+      </w:r>
+    </w:p>
+    <w:p>
+      <w:pPr>
+        <w:pStyle w:val="ListNumber"/>
+      </w:pPr>
+      <w:r>
+        <w:t xml:space="preserve">Khung </w:t>
+      </w:r>
+      <w:r>
+        <w:rPr>
+          <w:b/>
+        </w:rPr>
+        <w:t>Lịch sử duyệt</w:t>
+      </w:r>
+      <w:r>
+        <w:t xml:space="preserve"> (cuối trang): từng bước ai bấm, vai gì, lúc nào — Bãi lập và gửi kiểm, KT Thu/Chi kiểm I–II, KT Chi phí nhập giá và ghi sổ IV, KT kho xăng dầu kiểm và ghi sổ III, tài xế xuất phát, ký nhận, báo về, Bãi báo tới, KT Thu/Chi khoá, KT Doanh thu lập hoá đơn, thu một phần, thu đủ. </w:t>
+      </w:r>
+      <w:r>
+        <w:rPr>
+          <w:i/>
+        </w:rPr>
+        <w:t>Đây là chỗ cho sếp thấy chuỗi phê duyệt theo vai.</w:t>
+      </w:r>
+    </w:p>
+    <w:p>
+      <w:pPr>
+        <w:pStyle w:val="ListNumber"/>
+      </w:pPr>
+      <w:r>
+        <w:t xml:space="preserve">Mở phiếu </w:t>
+      </w:r>
+      <w:r>
+        <w:rPr>
+          <w:b/>
+        </w:rPr>
+        <w:t>G4-0104-09/EPL</w:t>
+      </w:r>
+      <w:r>
+        <w:t xml:space="preserve"> → cuối trang: doanh thu 11.412.500 · chi phí 8.760.000 (dầu 5.700.000 + mục IV 3.060.000) · lãi ≈ </w:t>
+      </w:r>
+      <w:r>
+        <w:rPr>
+          <w:b/>
+        </w:rPr>
+        <w:t>2.652.500 LAK</w:t>
+      </w:r>
+      <w:r>
+        <w:t>.</w:t>
+      </w:r>
+    </w:p>
+    <w:p>
+      <w:pPr>
+        <w:pStyle w:val="ListNumber"/>
+      </w:pPr>
+      <w:r>
+        <w:rPr>
+          <w:b/>
+        </w:rPr>
+        <w:t>Vận tải → Phiếu chi · Phiếu thu</w:t>
+      </w:r>
+      <w:r>
+        <w:t xml:space="preserve"> → tab </w:t>
+      </w:r>
+      <w:r>
+        <w:rPr>
+          <w:b/>
+        </w:rPr>
+        <w:t>Sổ chứng từ</w:t>
+      </w:r>
+      <w:r>
+        <w:t xml:space="preserve"> → lọc theo phiếu: các tờ DO, PLNL, PTU, PC_TU của hai phiếu đều </w:t>
+      </w:r>
+      <w:r>
+        <w:rPr>
+          <w:i/>
+        </w:rPr>
+        <w:t>đã đẩy</w:t>
+      </w:r>
+      <w:r>
+        <w:t>.</w:t>
+      </w:r>
+    </w:p>
+    <w:p>
+      <w:pPr>
+        <w:jc w:val="both"/>
+      </w:pPr>
+      <w:r>
+        <w:rPr>
+          <w:b/>
+        </w:rPr>
+        <w:t>Tab 3 · `ketoancp` — KT Chi phí (trang điều xe)</w:t>
+      </w:r>
+    </w:p>
+    <w:p>
+      <w:pPr>
+        <w:pStyle w:val="ListNumber"/>
+      </w:pPr>
+      <w:r>
+        <w:t xml:space="preserve">Mở phiếu </w:t>
+      </w:r>
+      <w:r>
+        <w:rPr>
+          <w:b/>
+        </w:rPr>
+        <w:t>G4-0104-09/EPL</w:t>
+      </w:r>
+      <w:r>
+        <w:t xml:space="preserve"> → thẻ </w:t>
+      </w:r>
+      <w:r>
+        <w:rPr>
+          <w:b/>
+        </w:rPr>
+        <w:t>IV</w:t>
+      </w:r>
+      <w:r>
+        <w:t xml:space="preserve">: cột </w:t>
+      </w:r>
+      <w:r>
+        <w:rPr>
+          <w:b/>
+        </w:rPr>
+        <w:t>Đơn giá</w:t>
+      </w:r>
+      <w:r>
+        <w:t xml:space="preserve"> 60.000 · 430.000 · 620.000 · 1.800.000 · 150.000, </w:t>
+      </w:r>
+      <w:r>
+        <w:rPr>
+          <w:b/>
+        </w:rPr>
+        <w:t>Thành tiền (LAK)</w:t>
+      </w:r>
+      <w:r>
+        <w:t xml:space="preserve">, dòng </w:t>
+      </w:r>
+      <w:r>
+        <w:rPr>
+          <w:b/>
+        </w:rPr>
+        <w:t>Tổng</w:t>
+      </w:r>
+      <w:r>
+        <w:t xml:space="preserve"> </w:t>
+      </w:r>
+      <w:r>
+        <w:rPr>
+          <w:b/>
+        </w:rPr>
+        <w:t>3.060.000</w:t>
+      </w:r>
+      <w:r>
+        <w:t xml:space="preserve">. Ô cách trả từng dòng: tiền nước, tiền chuyến </w:t>
+      </w:r>
+      <w:r>
+        <w:rPr>
+          <w:i/>
+        </w:rPr>
+        <w:t>Trả theo chuyến cùng lương</w:t>
+      </w:r>
+      <w:r>
+        <w:t xml:space="preserve">; sang Việt Nam, điện thoại </w:t>
+      </w:r>
+      <w:r>
+        <w:rPr>
+          <w:i/>
+        </w:rPr>
+        <w:t>Chi ngay khi xe đi</w:t>
+      </w:r>
+      <w:r>
+        <w:t xml:space="preserve">; chipping Lào </w:t>
+      </w:r>
+      <w:r>
+        <w:rPr>
+          <w:i/>
+        </w:rPr>
+        <w:t>Nợ NCC / trả theo đợt</w:t>
+      </w:r>
+      <w:r>
+        <w:t xml:space="preserve">. Mục IV </w:t>
+      </w:r>
+      <w:r>
+        <w:rPr>
+          <w:i/>
+        </w:rPr>
+        <w:t>Đã chi</w:t>
+      </w:r>
+      <w:r>
+        <w:t>.</w:t>
+      </w:r>
+    </w:p>
+    <w:p>
+      <w:pPr>
+        <w:pStyle w:val="ListNumber"/>
+      </w:pPr>
+      <w:r>
+        <w:t xml:space="preserve">Bấm </w:t>
+      </w:r>
+      <w:r>
+        <w:rPr>
+          <w:b/>
+        </w:rPr>
+        <w:t>Phiếu chi tạm ứng</w:t>
+      </w:r>
+      <w:r>
+        <w:t xml:space="preserve"> (thanh nút trên cùng) → tờ </w:t>
+      </w:r>
+      <w:r>
+        <w:rPr>
+          <w:rFonts w:ascii="Consolas" w:hAnsi="Consolas"/>
+          <w:sz w:val="19"/>
+        </w:rPr>
+        <w:t>PTU-G4-0104-09/EPL</w:t>
+      </w:r>
+      <w:r>
+        <w:t xml:space="preserve"> có mã QR: chỉ hai dòng sang Việt Nam + điện thoại = </w:t>
+      </w:r>
+      <w:r>
+        <w:rPr>
+          <w:b/>
+        </w:rPr>
+        <w:t>580.000 LAK</w:t>
+      </w:r>
+      <w:r>
+        <w:t xml:space="preserve">, </w:t>
+      </w:r>
+      <w:r>
+        <w:rPr>
+          <w:i/>
+        </w:rPr>
+        <w:t>Đã cấp</w:t>
+      </w:r>
+      <w:r>
+        <w:t>.</w:t>
+      </w:r>
+    </w:p>
+    <w:p>
+      <w:pPr>
+        <w:pStyle w:val="ListNumber"/>
+      </w:pPr>
+      <w:r>
+        <w:t xml:space="preserve">Mở phiếu </w:t>
+      </w:r>
+      <w:r>
+        <w:rPr>
+          <w:b/>
+        </w:rPr>
+        <w:t>T4-0447-09/EPL</w:t>
+      </w:r>
+      <w:r>
+        <w:t xml:space="preserve"> → thẻ </w:t>
+      </w:r>
+      <w:r>
+        <w:rPr>
+          <w:b/>
+        </w:rPr>
+        <w:t>IV</w:t>
+      </w:r>
+      <w:r>
+        <w:t xml:space="preserve">: thêm dòng </w:t>
+      </w:r>
+      <w:r>
+        <w:rPr>
+          <w:b/>
+        </w:rPr>
+        <w:t>Phí cao tốc</w:t>
+      </w:r>
+      <w:r>
+        <w:t xml:space="preserve"> 1.833.500 (máy tự thêm theo tuyến, </w:t>
+      </w:r>
+      <w:r>
+        <w:rPr>
+          <w:i/>
+        </w:rPr>
+        <w:t>Trả tiền mặt</w:t>
+      </w:r>
+      <w:r>
+        <w:t xml:space="preserve">), tổng </w:t>
+      </w:r>
+      <w:r>
+        <w:rPr>
+          <w:b/>
+        </w:rPr>
+        <w:t>4.273.500</w:t>
+      </w:r>
+      <w:r>
+        <w:t xml:space="preserve">; tờ tạm ứng </w:t>
+      </w:r>
+      <w:r>
+        <w:rPr>
+          <w:b/>
+        </w:rPr>
+        <w:t>2.413.500</w:t>
+      </w:r>
+      <w:r>
+        <w:t xml:space="preserve"> (sang VN + điện thoại + phí cao tốc).</w:t>
+      </w:r>
+    </w:p>
+    <w:p>
+      <w:pPr>
+        <w:jc w:val="both"/>
+      </w:pPr>
+      <w:r>
+        <w:rPr>
+          <w:i/>
+        </w:rPr>
+        <w:t>Nói với sếp:</w:t>
+      </w:r>
+      <w:r>
+        <w:t xml:space="preserve"> tổng mục IV không phải số tài xế cầm đi — chỉ dòng </w:t>
+      </w:r>
+      <w:r>
+        <w:rPr>
+          <w:i/>
+        </w:rPr>
+        <w:t>Chi ngay khi xe đi</w:t>
+      </w:r>
+      <w:r>
+        <w:t xml:space="preserve"> thành tiền mặt; tiền chuyến, tiền nước trả cùng lương; chipping nợ nhà cung cấp — đúng cột ghi chú trong Excel của anh Khampla.</w:t>
+      </w:r>
+    </w:p>
+    <w:p>
+      <w:pPr>
+        <w:jc w:val="both"/>
+      </w:pPr>
+      <w:r>
+        <w:rPr>
+          <w:b/>
+        </w:rPr>
+        <w:t>Tab 4 · `khonl` — KT kho xăng dầu (trang điều xe)</w:t>
+      </w:r>
+    </w:p>
+    <w:p>
+      <w:pPr>
+        <w:pStyle w:val="ListNumber"/>
+      </w:pPr>
+      <w:r>
+        <w:t xml:space="preserve">Mở phiếu </w:t>
+      </w:r>
+      <w:r>
+        <w:rPr>
+          <w:b/>
+        </w:rPr>
+        <w:t>T4-0447-09/EPL</w:t>
+      </w:r>
+      <w:r>
+        <w:t xml:space="preserve"> → thẻ </w:t>
+      </w:r>
+      <w:r>
+        <w:rPr>
+          <w:b/>
+        </w:rPr>
+        <w:t>III</w:t>
+      </w:r>
+      <w:r>
+        <w:t xml:space="preserve">: 300 lít × </w:t>
+      </w:r>
+      <w:r>
+        <w:rPr>
+          <w:b/>
+        </w:rPr>
+        <w:t>28.500</w:t>
+      </w:r>
+      <w:r>
+        <w:t xml:space="preserve"> (giá bình quân kho Thà Bốc, máy điền, không gõ tay) = </w:t>
+      </w:r>
+      <w:r>
+        <w:rPr>
+          <w:b/>
+        </w:rPr>
+        <w:t>8.550.000 LAK</w:t>
+      </w:r>
+      <w:r>
+        <w:t xml:space="preserve">; mục III </w:t>
+      </w:r>
+      <w:r>
+        <w:rPr>
+          <w:i/>
+        </w:rPr>
+        <w:t>Đã ghi sổ</w:t>
+      </w:r>
+      <w:r>
+        <w:t>.</w:t>
+      </w:r>
+    </w:p>
+    <w:p>
+      <w:pPr>
+        <w:pStyle w:val="ListNumber"/>
+      </w:pPr>
+      <w:r>
+        <w:t xml:space="preserve">Bấm </w:t>
+      </w:r>
+      <w:r>
+        <w:rPr>
+          <w:b/>
+        </w:rPr>
+        <w:t>Phiếu lĩnh nhiên liệu</w:t>
+      </w:r>
+      <w:r>
+        <w:t xml:space="preserve"> → tờ </w:t>
+      </w:r>
+      <w:r>
+        <w:rPr>
+          <w:rFonts w:ascii="Consolas" w:hAnsi="Consolas"/>
+          <w:sz w:val="19"/>
+        </w:rPr>
+        <w:t>PLNL-T4-0447-09/EPL-1</w:t>
+      </w:r>
+      <w:r>
+        <w:t xml:space="preserve"> có mã QR, 300 lít, </w:t>
+      </w:r>
+      <w:r>
+        <w:rPr>
+          <w:i/>
+        </w:rPr>
+        <w:t>Đã cấp</w:t>
+      </w:r>
+      <w:r>
+        <w:t xml:space="preserve"> — người cấp ທ້າວ ບຸນມາ.</w:t>
+      </w:r>
+    </w:p>
+    <w:p>
+      <w:pPr>
+        <w:pStyle w:val="ListNumber"/>
+      </w:pPr>
+      <w:r>
+        <w:t xml:space="preserve">Phiếu </w:t>
+      </w:r>
+      <w:r>
+        <w:rPr>
+          <w:b/>
+        </w:rPr>
+        <w:t>G4-0104-09/EPL</w:t>
+      </w:r>
+      <w:r>
+        <w:t>: 200 lít × 28.500 = 5.700.000.</w:t>
+      </w:r>
+    </w:p>
+    <w:p>
+      <w:pPr>
+        <w:jc w:val="both"/>
+      </w:pPr>
+      <w:r>
+        <w:rPr>
+          <w:b/>
+        </w:rPr>
+        <w:t>Tab 5 · `tx03` — tài xế ທ້າວ ສົມພອນ (trang điều xe, nên mở trên điện thoại)</w:t>
+      </w:r>
+    </w:p>
+    <w:p>
+      <w:pPr>
+        <w:pStyle w:val="ListNumber"/>
+      </w:pPr>
+      <w:r>
+        <w:t xml:space="preserve">Đăng nhập là vào thẳng </w:t>
+      </w:r>
+      <w:r>
+        <w:rPr>
+          <w:b/>
+        </w:rPr>
+        <w:t>Phiếu của tôi</w:t>
+      </w:r>
+      <w:r>
+        <w:t xml:space="preserve"> — chỉ thấy phiếu </w:t>
+      </w:r>
+      <w:r>
+        <w:rPr>
+          <w:b/>
+        </w:rPr>
+        <w:t>của mình</w:t>
+      </w:r>
+      <w:r>
+        <w:t xml:space="preserve"> (có thêm vài phiếu mẫu cũ của tài xế này; hai phiếu mẫu ở trên cùng vì là hôm nay).</w:t>
+      </w:r>
+    </w:p>
+    <w:p>
+      <w:pPr>
+        <w:pStyle w:val="ListNumber"/>
+      </w:pPr>
+      <w:r>
+        <w:t xml:space="preserve">Thẻ </w:t>
+      </w:r>
+      <w:r>
+        <w:rPr>
+          <w:b/>
+        </w:rPr>
+        <w:t>G4-0104-09/EPL</w:t>
+      </w:r>
+      <w:r>
+        <w:t xml:space="preserve">: tuyến, xe 345, khách, </w:t>
+      </w:r>
+      <w:r>
+        <w:rPr>
+          <w:b/>
+        </w:rPr>
+        <w:t>Cân tại mỏ (t)</w:t>
+      </w:r>
+      <w:r>
+        <w:t xml:space="preserve"> 42,00 t, ô </w:t>
+      </w:r>
+      <w:r>
+        <w:rPr>
+          <w:b/>
+        </w:rPr>
+        <w:t>Tiền tạm ứng</w:t>
+      </w:r>
+      <w:r>
+        <w:t xml:space="preserve"> </w:t>
+      </w:r>
+      <w:r>
+        <w:rPr>
+          <w:b/>
+        </w:rPr>
+        <w:t>580.000 LAK · Đã nhận tiền</w:t>
+      </w:r>
+      <w:r>
+        <w:t xml:space="preserve">. Không còn nút </w:t>
+      </w:r>
+      <w:r>
+        <w:rPr>
+          <w:b/>
+        </w:rPr>
+        <w:t>Báo cân ở mỏ</w:t>
+      </w:r>
+      <w:r>
+        <w:t xml:space="preserve"> (xe đã về, phiếu đã khoá).</w:t>
+      </w:r>
+    </w:p>
+    <w:p>
+      <w:pPr>
+        <w:pStyle w:val="ListNumber"/>
+      </w:pPr>
+      <w:r>
+        <w:t xml:space="preserve">Thẻ </w:t>
+      </w:r>
+      <w:r>
+        <w:rPr>
+          <w:b/>
+        </w:rPr>
+        <w:t>T4-0447-09/EPL</w:t>
+      </w:r>
+      <w:r>
+        <w:t xml:space="preserve">: </w:t>
+      </w:r>
+      <w:r>
+        <w:rPr>
+          <w:b/>
+        </w:rPr>
+        <w:t>Cân đầu (tấn)</w:t>
+      </w:r>
+      <w:r>
+        <w:t xml:space="preserve"> 30,00 t, </w:t>
+      </w:r>
+      <w:r>
+        <w:rPr>
+          <w:b/>
+        </w:rPr>
+        <w:t>Tiền tạm ứng</w:t>
+      </w:r>
+      <w:r>
+        <w:t xml:space="preserve"> </w:t>
+      </w:r>
+      <w:r>
+        <w:rPr>
+          <w:b/>
+        </w:rPr>
+        <w:t>2.413.500 LAK · Đã nhận tiền</w:t>
+      </w:r>
+      <w:r>
+        <w:t xml:space="preserve">, dòng </w:t>
+      </w:r>
+      <w:r>
+        <w:rPr>
+          <w:b/>
+        </w:rPr>
+        <w:t>✓ Đã ký nhận: ນາງ ມະນີ</w:t>
+      </w:r>
+      <w:r>
+        <w:t xml:space="preserve"> kèm giờ ký.</w:t>
+      </w:r>
+    </w:p>
+    <w:p>
+      <w:pPr>
+        <w:pStyle w:val="ListNumber"/>
+      </w:pPr>
+      <w:r>
+        <w:t xml:space="preserve">Tài xế </w:t>
+      </w:r>
+      <w:r>
+        <w:rPr>
+          <w:b/>
+        </w:rPr>
+        <w:t>không thấy</w:t>
+      </w:r>
+      <w:r>
+        <w:t xml:space="preserve"> giá cước, doanh thu, không mở được phiếu của tài xế khác.</w:t>
+      </w:r>
+    </w:p>
+    <w:p>
+      <w:pPr>
+        <w:jc w:val="both"/>
+      </w:pPr>
+      <w:r>
+        <w:rPr>
+          <w:b/>
+        </w:rPr>
+        <w:t>Tab 6 · `admin` — Sếp (trang điều xe)</w:t>
+      </w:r>
+    </w:p>
+    <w:p>
+      <w:pPr>
+        <w:jc w:val="both"/>
+      </w:pPr>
+      <w:r>
+        <w:t xml:space="preserve">Mở được mọi phiếu, thấy như tab 2 cộng các nút của mọi vai. </w:t>
+      </w:r>
+      <w:r>
+        <w:rPr>
+          <w:b/>
+        </w:rPr>
+        <w:t>Tổng quan</w:t>
+      </w:r>
+      <w:r>
+        <w:t xml:space="preserve">: tick </w:t>
+      </w:r>
+      <w:r>
+        <w:rPr>
+          <w:b/>
+        </w:rPr>
+        <w:t>Tự cập nhật 60 s</w:t>
+      </w:r>
+      <w:r>
+        <w:t xml:space="preserve"> để màn tự tải lại trong lúc demo.</w:t>
+      </w:r>
+    </w:p>
+    <w:p>
+      <w:pPr>
+        <w:jc w:val="both"/>
+      </w:pPr>
+      <w:r>
+        <w:rPr>
+          <w:b/>
+        </w:rPr>
+        <w:t>Tab 7 · `khotb` — thủ kho Thà Bốc (trang kế toán)</w:t>
+      </w:r>
+    </w:p>
+    <w:p>
+      <w:pPr>
+        <w:pStyle w:val="ListNumber"/>
+      </w:pPr>
+      <w:r>
+        <w:t xml:space="preserve">Đăng nhập là vào </w:t>
+      </w:r>
+      <w:r>
+        <w:rPr>
+          <w:b/>
+        </w:rPr>
+        <w:t>Kho → Cấp phát</w:t>
+      </w:r>
+      <w:r>
+        <w:t xml:space="preserve">: bảng </w:t>
+      </w:r>
+      <w:r>
+        <w:rPr>
+          <w:b/>
+        </w:rPr>
+        <w:t>Chờ cấp</w:t>
+      </w:r>
+      <w:r>
+        <w:t xml:space="preserve"> không còn tờ nào của hai phiếu mẫu (đã cấp hết). Muốn xem lại một tờ đã cấp: ô </w:t>
+      </w:r>
+      <w:r>
+        <w:rPr>
+          <w:b/>
+        </w:rPr>
+        <w:t>Nhập mã QR</w:t>
+      </w:r>
+      <w:r>
+        <w:t xml:space="preserve"> gõ mã in trên tờ rồi Enter — </w:t>
+      </w:r>
+      <w:r>
+        <w:rPr>
+          <w:rFonts w:ascii="Consolas" w:hAnsi="Consolas"/>
+          <w:sz w:val="19"/>
+        </w:rPr>
+        <w:t>W13LRwYrS0ft</w:t>
+      </w:r>
+      <w:r>
+        <w:t xml:space="preserve"> (PLNL-G4-0104-09/EPL-1, 200 L) hoặc </w:t>
+      </w:r>
+      <w:r>
+        <w:rPr>
+          <w:rFonts w:ascii="Consolas" w:hAnsi="Consolas"/>
+          <w:sz w:val="19"/>
+        </w:rPr>
+        <w:t>F5b6KJrQkqsg</w:t>
+      </w:r>
+      <w:r>
+        <w:t xml:space="preserve"> (PLNL-T4-0447-09/EPL-1, 300 L) → khung </w:t>
+      </w:r>
+      <w:r>
+        <w:rPr>
+          <w:b/>
+        </w:rPr>
+        <w:t>Đối chiếu trước khi cấp</w:t>
+      </w:r>
+      <w:r>
+        <w:t xml:space="preserve"> hiện đúng xe, biển đầu kéo, rơ-moóc, tài xế, trạng thái </w:t>
+      </w:r>
+      <w:r>
+        <w:rPr>
+          <w:i/>
+        </w:rPr>
+        <w:t>Đã cấp</w:t>
+      </w:r>
+      <w:r>
+        <w:t xml:space="preserve">, </w:t>
+      </w:r>
+      <w:r>
+        <w:rPr>
+          <w:b/>
+        </w:rPr>
+        <w:t>Người cấp</w:t>
+      </w:r>
+      <w:r>
+        <w:t xml:space="preserve"> ທ້າວ ບຸນມາ; không có nút cấp lần hai.</w:t>
+      </w:r>
+    </w:p>
+    <w:p>
+      <w:pPr>
+        <w:pStyle w:val="ListNumber"/>
+      </w:pPr>
+      <w:r>
+        <w:rPr>
+          <w:b/>
+        </w:rPr>
+        <w:t>Kho → Kho nhiên liệu</w:t>
+      </w:r>
+      <w:r>
+        <w:t xml:space="preserve"> → ô </w:t>
+      </w:r>
+      <w:r>
+        <w:rPr>
+          <w:b/>
+        </w:rPr>
+        <w:t>Kho</w:t>
+      </w:r>
+      <w:r>
+        <w:t xml:space="preserve"> chọn kho Thà Bốc: </w:t>
+      </w:r>
+      <w:r>
+        <w:rPr>
+          <w:b/>
+        </w:rPr>
+        <w:t>Tồn kho hiện tại</w:t>
+      </w:r>
+      <w:r>
+        <w:t xml:space="preserve"> </w:t>
+      </w:r>
+      <w:r>
+        <w:rPr>
+          <w:b/>
+        </w:rPr>
+        <w:t>2.720 L</w:t>
+      </w:r>
+      <w:r>
+        <w:t xml:space="preserve">; sổ dầu hai dòng mới nhất </w:t>
+      </w:r>
+      <w:r>
+        <w:rPr>
+          <w:i/>
+        </w:rPr>
+        <w:t>Xuất theo phiếu</w:t>
+      </w:r>
+      <w:r>
+        <w:t xml:space="preserve"> </w:t>
+      </w:r>
+      <w:r>
+        <w:rPr>
+          <w:rFonts w:ascii="Consolas" w:hAnsi="Consolas"/>
+          <w:sz w:val="19"/>
+        </w:rPr>
+        <w:t>PLNL-T4-0447-09/EPL-1</w:t>
+      </w:r>
+      <w:r>
+        <w:t xml:space="preserve"> xe 346 (tồn còn 2.720) và </w:t>
+      </w:r>
+      <w:r>
+        <w:rPr>
+          <w:rFonts w:ascii="Consolas" w:hAnsi="Consolas"/>
+          <w:sz w:val="19"/>
+        </w:rPr>
+        <w:t>PLNL-G4-0104-09/EPL-1</w:t>
+      </w:r>
+      <w:r>
+        <w:t xml:space="preserve"> xe 345 (tồn còn 3.020), trước đó 3.220.</w:t>
+      </w:r>
+    </w:p>
+    <w:p>
+      <w:pPr>
+        <w:jc w:val="both"/>
+      </w:pPr>
+      <w:r>
+        <w:rPr>
+          <w:b/>
+        </w:rPr>
+        <w:t>Tab 8 · `quytb` — quỹ Thà Bốc (trang kế toán)</w:t>
+      </w:r>
+    </w:p>
+    <w:p>
+      <w:pPr>
+        <w:pStyle w:val="ListNumber"/>
+      </w:pPr>
+      <w:r>
+        <w:rPr>
+          <w:b/>
+        </w:rPr>
+        <w:t>Kho → Cấp phát</w:t>
+      </w:r>
+      <w:r>
+        <w:t xml:space="preserve"> → tab </w:t>
+      </w:r>
+      <w:r>
+        <w:rPr>
+          <w:b/>
+        </w:rPr>
+        <w:t>Phiếu tạm ứng đi đường</w:t>
+      </w:r>
+      <w:r>
+        <w:t>: không còn tờ chờ của hai phiếu mẫu.</w:t>
+      </w:r>
+    </w:p>
+    <w:p>
+      <w:pPr>
+        <w:pStyle w:val="ListNumber"/>
+      </w:pPr>
+      <w:r>
+        <w:t xml:space="preserve">Ô </w:t>
+      </w:r>
+      <w:r>
+        <w:rPr>
+          <w:b/>
+        </w:rPr>
+        <w:t>Nhập mã QR</w:t>
+      </w:r>
+      <w:r>
+        <w:t xml:space="preserve"> gõ </w:t>
+      </w:r>
+      <w:r>
+        <w:rPr>
+          <w:rFonts w:ascii="Consolas" w:hAnsi="Consolas"/>
+          <w:sz w:val="19"/>
+        </w:rPr>
+        <w:t>mX0zV9urgYXJ</w:t>
+      </w:r>
+      <w:r>
+        <w:t xml:space="preserve"> (PTU-G4-0104-09/EPL) hoặc </w:t>
+      </w:r>
+      <w:r>
+        <w:rPr>
+          <w:rFonts w:ascii="Consolas" w:hAnsi="Consolas"/>
+          <w:sz w:val="19"/>
+        </w:rPr>
+        <w:t>y_gjm-_Yy2TM</w:t>
+      </w:r>
+      <w:r>
+        <w:t xml:space="preserve"> (PTU-T4-0447-09/EPL) → </w:t>
+      </w:r>
+      <w:r>
+        <w:rPr>
+          <w:b/>
+        </w:rPr>
+        <w:t>Số tiền</w:t>
+      </w:r>
+      <w:r>
+        <w:t xml:space="preserve"> </w:t>
+      </w:r>
+      <w:r>
+        <w:rPr>
+          <w:b/>
+        </w:rPr>
+        <w:t>580.000</w:t>
+      </w:r>
+      <w:r>
+        <w:t xml:space="preserve"> / </w:t>
+      </w:r>
+      <w:r>
+        <w:rPr>
+          <w:b/>
+        </w:rPr>
+        <w:t>2.413.500</w:t>
+      </w:r>
+      <w:r>
+        <w:t xml:space="preserve">, </w:t>
+      </w:r>
+      <w:r>
+        <w:rPr>
+          <w:i/>
+        </w:rPr>
+        <w:t>Đã cấp</w:t>
+      </w:r>
+      <w:r>
+        <w:t xml:space="preserve">, </w:t>
+      </w:r>
+      <w:r>
+        <w:rPr>
+          <w:b/>
+        </w:rPr>
+        <w:t>Người cấp</w:t>
+      </w:r>
+      <w:r>
+        <w:t xml:space="preserve"> ນາງ ດາວ; không chi lần hai được.</w:t>
+      </w:r>
+    </w:p>
+    <w:p>
+      <w:pPr>
+        <w:jc w:val="both"/>
+      </w:pPr>
+      <w:r>
+        <w:rPr>
+          <w:b/>
+        </w:rPr>
+        <w:t>Tab 9 · `doanhthu` — KT Doanh thu (trang kế toán)</w:t>
+      </w:r>
+    </w:p>
+    <w:p>
+      <w:pPr>
+        <w:pStyle w:val="ListNumber"/>
+      </w:pPr>
+      <w:r>
+        <w:rPr>
+          <w:b/>
+        </w:rPr>
+        <w:t>Tiền vận chuyển → Hóa đơn vận chuyển</w:t>
+      </w:r>
+      <w:r>
+        <w:t xml:space="preserve"> — màn mở ra chưa có phiếu (dòng </w:t>
+      </w:r>
+      <w:r>
+        <w:rPr>
+          <w:i/>
+        </w:rPr>
+        <w:t>Chọn một phiếu ở ô trên…</w:t>
+      </w:r>
+      <w:r>
+        <w:t xml:space="preserve">) → ô </w:t>
+      </w:r>
+      <w:r>
+        <w:rPr>
+          <w:b/>
+        </w:rPr>
+        <w:t>Chọn phiếu</w:t>
+      </w:r>
+      <w:r>
+        <w:t xml:space="preserve"> gõ </w:t>
+      </w:r>
+      <w:r>
+        <w:rPr>
+          <w:rFonts w:ascii="Consolas" w:hAnsi="Consolas"/>
+          <w:sz w:val="19"/>
+        </w:rPr>
+        <w:t>T4-0447</w:t>
+      </w:r>
+      <w:r>
+        <w:t xml:space="preserve"> → chọn phiếu.</w:t>
+      </w:r>
+    </w:p>
+    <w:p>
+      <w:pPr>
+        <w:pStyle w:val="ListNumber"/>
+      </w:pPr>
+      <w:r>
+        <w:t xml:space="preserve">Bản in hoá đơn: 29,7 t × 30,5 USD = </w:t>
+      </w:r>
+      <w:r>
+        <w:rPr>
+          <w:b/>
+        </w:rPr>
+        <w:t>905,85 USD</w:t>
+      </w:r>
+      <w:r>
+        <w:t xml:space="preserve">, </w:t>
+      </w:r>
+      <w:r>
+        <w:rPr>
+          <w:i/>
+        </w:rPr>
+        <w:t>Đã lập hóa đơn</w:t>
+      </w:r>
+      <w:r>
+        <w:t xml:space="preserve">. Khung </w:t>
+      </w:r>
+      <w:r>
+        <w:rPr>
+          <w:b/>
+        </w:rPr>
+        <w:t>Sổ thu tiền</w:t>
+      </w:r>
+      <w:r>
+        <w:t xml:space="preserve">: hai dòng thu </w:t>
+      </w:r>
+      <w:r>
+        <w:rPr>
+          <w:b/>
+        </w:rPr>
+        <w:t>400 USD</w:t>
+      </w:r>
+      <w:r>
+        <w:t xml:space="preserve"> (8.800.000 LAK) và </w:t>
+      </w:r>
+      <w:r>
+        <w:rPr>
+          <w:b/>
+        </w:rPr>
+        <w:t>505,85 USD</w:t>
+      </w:r>
+      <w:r>
+        <w:t xml:space="preserve"> (11.128.700 LAK), cách thu chuyển khoản, số UNC; trạng thái </w:t>
+      </w:r>
+      <w:r>
+        <w:rPr>
+          <w:b/>
+        </w:rPr>
+        <w:t>Đã thu đủ</w:t>
+      </w:r>
+      <w:r>
+        <w:t>, còn lại 0.</w:t>
+      </w:r>
+    </w:p>
+    <w:p>
+      <w:pPr>
+        <w:pStyle w:val="ListNumber"/>
+      </w:pPr>
+      <w:r>
+        <w:t xml:space="preserve">Bấm </w:t>
+      </w:r>
+      <w:r>
+        <w:rPr>
+          <w:b/>
+        </w:rPr>
+        <w:t>Phiếu thu</w:t>
+      </w:r>
+      <w:r>
+        <w:t xml:space="preserve"> → tờ phiếu thu tiền khách (định khoản 1211 / 70) mở trong hộp → </w:t>
+      </w:r>
+      <w:r>
+        <w:rPr>
+          <w:b/>
+        </w:rPr>
+        <w:t>In</w:t>
+      </w:r>
+      <w:r>
+        <w:t xml:space="preserve"> được.</w:t>
+      </w:r>
+    </w:p>
+    <w:p>
+      <w:pPr>
+        <w:pStyle w:val="ListNumber"/>
+      </w:pPr>
+      <w:r>
+        <w:t xml:space="preserve">Chọn phiếu </w:t>
+      </w:r>
+      <w:r>
+        <w:rPr>
+          <w:rFonts w:ascii="Consolas" w:hAnsi="Consolas"/>
+          <w:sz w:val="19"/>
+        </w:rPr>
+        <w:t>G4-0104</w:t>
+      </w:r>
+      <w:r>
+        <w:t xml:space="preserve"> → hoá đơn </w:t>
+      </w:r>
+      <w:r>
+        <w:rPr>
+          <w:b/>
+        </w:rPr>
+        <w:t>518,75 USD</w:t>
+      </w:r>
+      <w:r>
+        <w:t xml:space="preserve"> (41,5 t × 12,5), thu một lần, </w:t>
+      </w:r>
+      <w:r>
+        <w:rPr>
+          <w:i/>
+        </w:rPr>
+        <w:t>Đã thu đủ</w:t>
+      </w:r>
+      <w:r>
+        <w:t xml:space="preserve"> — phiếu gom cũng có cước riêng theo bảng giá khách × tuyến.</w:t>
+      </w:r>
+    </w:p>
+    <w:p>
+      <w:pPr>
+        <w:jc w:val="both"/>
+      </w:pPr>
+      <w:r>
+        <w:rPr>
+          <w:b/>
+        </w:rPr>
+        <w:t>Tab 10 · `ketoan` — sổ (trang kế toán)</w:t>
+      </w:r>
+    </w:p>
+    <w:p>
+      <w:pPr>
+        <w:pStyle w:val="ListNumber"/>
+      </w:pPr>
+      <w:r>
+        <w:rPr>
+          <w:b/>
+        </w:rPr>
+        <w:t>Sổ sách → Kế toán</w:t>
+      </w:r>
+      <w:r>
+        <w:t xml:space="preserve"> → </w:t>
+      </w:r>
+      <w:r>
+        <w:rPr>
+          <w:b/>
+        </w:rPr>
+        <w:t>Nhật ký chung</w:t>
+      </w:r>
+      <w:r>
+        <w:t xml:space="preserve"> → ô </w:t>
+      </w:r>
+      <w:r>
+        <w:rPr>
+          <w:b/>
+        </w:rPr>
+        <w:t>Tìm kiếm…</w:t>
+      </w:r>
+      <w:r>
+        <w:t xml:space="preserve"> gõ </w:t>
+      </w:r>
+      <w:r>
+        <w:rPr>
+          <w:rFonts w:ascii="Consolas" w:hAnsi="Consolas"/>
+          <w:sz w:val="19"/>
+        </w:rPr>
+        <w:t>T4-0447</w:t>
+      </w:r>
+      <w:r>
+        <w:t xml:space="preserve"> → 5 bút toán: xuất dầu kho (Nợ 625 / Có 1371), hoá đơn (Nợ 1211 / Có 70), hai lần thu (Nợ 1022 / Có 1211), chi tạm ứng (Nợ 625 / Có 1011). Gõ </w:t>
+      </w:r>
+      <w:r>
+        <w:rPr>
+          <w:rFonts w:ascii="Consolas" w:hAnsi="Consolas"/>
+          <w:sz w:val="19"/>
+        </w:rPr>
+        <w:t>G4-0104</w:t>
+      </w:r>
+      <w:r>
+        <w:t xml:space="preserve"> → 4 bút toán. Bảng đủ số ở mục </w:t>
+      </w:r>
+      <w:r>
+        <w:rPr>
+          <w:i/>
+        </w:rPr>
+        <w:t>Ghi sổ như thế nào</w:t>
+      </w:r>
+      <w:r>
+        <w:t xml:space="preserve"> ngay dưới.</w:t>
+      </w:r>
+    </w:p>
+    <w:p>
+      <w:pPr>
+        <w:pStyle w:val="ListNumber"/>
+      </w:pPr>
+      <w:r>
+        <w:t xml:space="preserve">Cùng màn → </w:t>
+      </w:r>
+      <w:r>
+        <w:rPr>
+          <w:b/>
+        </w:rPr>
+        <w:t>Cân đối phát sinh</w:t>
+      </w:r>
+      <w:r>
+        <w:t xml:space="preserve"> → dòng cuối </w:t>
+      </w:r>
+      <w:r>
+        <w:rPr>
+          <w:b/>
+        </w:rPr>
+        <w:t>Nợ = Có, cân đối</w:t>
+      </w:r>
+      <w:r>
+        <w:t>.</w:t>
+      </w:r>
+    </w:p>
+    <w:p>
+      <w:pPr>
+        <w:pStyle w:val="ListNumber"/>
+      </w:pPr>
+      <w:r>
+        <w:rPr>
+          <w:b/>
+        </w:rPr>
+        <w:t>Chuyến &amp; kho → Chuyến xe</w:t>
+      </w:r>
+      <w:r>
+        <w:t xml:space="preserve"> → ô </w:t>
+      </w:r>
+      <w:r>
+        <w:rPr>
+          <w:b/>
+        </w:rPr>
+        <w:t>Tìm kiếm…</w:t>
+      </w:r>
+      <w:r>
+        <w:t xml:space="preserve"> gõ </w:t>
+      </w:r>
+      <w:r>
+        <w:rPr>
+          <w:rFonts w:ascii="Consolas" w:hAnsi="Consolas"/>
+          <w:sz w:val="19"/>
+        </w:rPr>
+        <w:t>T4-0447</w:t>
+      </w:r>
+      <w:r>
+        <w:t xml:space="preserve"> → phiếu: doanh thu 19.928.700, đã thu hết, còn phải thu 0, chi phí </w:t>
+      </w:r>
+      <w:r>
+        <w:rPr>
+          <w:b/>
+        </w:rPr>
+        <w:t>đã vào sổ</w:t>
+      </w:r>
+      <w:r>
+        <w:t xml:space="preserve"> 10.963.500 (dầu 8.550.000 + tạm ứng 2.413.500), 30 t hàng xuất kho bãi, 9 tờ chứng từ. Phiếu </w:t>
+      </w:r>
+      <w:r>
+        <w:rPr>
+          <w:rFonts w:ascii="Consolas" w:hAnsi="Consolas"/>
+          <w:sz w:val="19"/>
+        </w:rPr>
+        <w:t>G4-0104</w:t>
+      </w:r>
+      <w:r>
+        <w:t>: doanh thu 11.412.500, chi phí đã vào sổ 6.280.000, 41,5 t hàng nhập kho bãi, 8 tờ.</w:t>
+      </w:r>
+    </w:p>
+    <w:p>
+      <w:pPr>
+        <w:pStyle w:val="ListNumber"/>
+      </w:pPr>
+      <w:r>
+        <w:rPr>
+          <w:b/>
+        </w:rPr>
+        <w:t>Kho → Kho hàng</w:t>
+      </w:r>
+      <w:r>
+        <w:t xml:space="preserve"> → bảng </w:t>
+      </w:r>
+      <w:r>
+        <w:rPr>
+          <w:b/>
+        </w:rPr>
+        <w:t>Lô hàng trong kho</w:t>
+      </w:r>
+      <w:r>
+        <w:t xml:space="preserve">: lô </w:t>
+      </w:r>
+      <w:r>
+        <w:rPr>
+          <w:b/>
+        </w:rPr>
+        <w:t>G4-0104-09/EPL</w:t>
+      </w:r>
+      <w:r>
+        <w:t xml:space="preserve"> nhập 41,5 t, còn </w:t>
+      </w:r>
+      <w:r>
+        <w:rPr>
+          <w:b/>
+        </w:rPr>
+        <w:t>11,5 t</w:t>
+      </w:r>
+      <w:r>
+        <w:t xml:space="preserve"> (30 t đã đi theo T4-0447-09).</w:t>
+      </w:r>
+    </w:p>
+    <w:p>
+      <w:pPr>
+        <w:jc w:val="both"/>
+      </w:pPr>
+      <w:r>
+        <w:rPr>
+          <w:b/>
+        </w:rPr>
+        <w:t>Lãi một chuyến có hai con số — nói trước với sếp.</w:t>
+      </w:r>
+      <w:r>
+        <w:t xml:space="preserve"> Trên phiếu (tab 2) lãi phiếu giao là </w:t>
+      </w:r>
+      <w:r>
+        <w:rPr>
+          <w:b/>
+        </w:rPr>
+        <w:t>7.105.200</w:t>
+      </w:r>
+      <w:r>
+        <w:t xml:space="preserve">, ở màn </w:t>
+      </w:r>
+      <w:r>
+        <w:rPr>
+          <w:b/>
+        </w:rPr>
+        <w:t>Chuyến xe</w:t>
+      </w:r>
+      <w:r>
+        <w:t xml:space="preserve"> (tab 10) là </w:t>
+      </w:r>
+      <w:r>
+        <w:rPr>
+          <w:b/>
+        </w:rPr>
+        <w:t>8.965.200</w:t>
+      </w:r>
+      <w:r>
+        <w:t xml:space="preserve">. Chênh đúng </w:t>
+      </w:r>
+      <w:r>
+        <w:rPr>
+          <w:b/>
+        </w:rPr>
+        <w:t>1.860.000</w:t>
+      </w:r>
+      <w:r>
+        <w:t xml:space="preserve"> = tiền nước + tiền chuyến </w:t>
+      </w:r>
+      <w:r>
+        <w:rPr>
+          <w:i/>
+        </w:rPr>
+        <w:t>trả cùng lương</w:t>
+      </w:r>
+      <w:r>
+        <w:t xml:space="preserve"> (phiếu gom chênh 2.480.000 = 1.860.000 + chipping 620.000 </w:t>
+      </w:r>
+      <w:r>
+        <w:rPr>
+          <w:i/>
+        </w:rPr>
+        <w:t>nợ nhà cung cấp</w:t>
+      </w:r>
+      <w:r>
+        <w:t xml:space="preserve">). Phiếu tính </w:t>
+      </w:r>
+      <w:r>
+        <w:rPr>
+          <w:b/>
+        </w:rPr>
+        <w:t>mọi khoản chi của chuyến</w:t>
+      </w:r>
+      <w:r>
+        <w:t xml:space="preserve">; màn Chuyến xe của sổ chỉ tính khoản </w:t>
+      </w:r>
+      <w:r>
+        <w:rPr>
+          <w:b/>
+        </w:rPr>
+        <w:t>đã vào sổ và gắn với phiếu</w:t>
+      </w:r>
+      <w:r>
+        <w:t xml:space="preserve"> (dầu, tạm ứng). Tiền trả cùng lương và tiền trả nhà cung cấp theo đợt được trả </w:t>
+      </w:r>
+      <w:r>
+        <w:rPr>
+          <w:b/>
+        </w:rPr>
+        <w:t>gộp theo tài xế, theo nhà cung cấp</w:t>
+      </w:r>
+      <w:r>
+        <w:t>, không gắn từng phiếu. Lãi thật của một chuyến: xem ở phiếu (trang điều xe).</w:t>
+      </w:r>
+    </w:p>
+    <w:p>
+      <w:pPr>
+        <w:jc w:val="both"/>
+      </w:pPr>
+      <w:r>
+        <w:rPr>
+          <w:b/>
+        </w:rPr>
+        <w:t>Ảnh trong phiếu mẫu là ảnh trống.</w:t>
+      </w:r>
+      <w:r>
+        <w:t xml:space="preserve"> Ảnh phiếu cân (phiếu gom), chữ ký và ảnh biên bản (phiếu giao) do công cụ gửi là ảnh trống một điểm ảnh — công cụ không chụp, không ký được. Muốn cho sếp xem chữ ký thật, ảnh thật thì dùng phiếu anh bấm tay theo 10.0b (ký bằng tay trên điện thoại).</w:t>
       </w:r>
     </w:p>
     <w:p>

</xml_diff>

<commit_message>
Tài liệu A → Z 10.0c: bốn điều cần biết trước khi demo, gom một chỗ ở đầu mục
Cấp phát chỉ hiện tờ chờ (kèm mã QR bốn tờ), lãi trên phiếu khác lãi ở màn Chuyến xe (bảng so sánh),
ảnh của phiếu mẫu là ảnh trống, vai nào thấy / không thấy giá cước. Bỏ hai đoạn trùng ở cuối phần các tab.

Co-Authored-By: Claude Opus 5.5 (1M context) <noreply@anthropic.com>
</commit_message>
<xml_diff>
--- a/DOCS/word/LUONG_A_Z_HAI_TRANG.docx
+++ b/DOCS/word/LUONG_A_Z_HAI_TRANG.docx
@@ -24057,6 +24057,842 @@
         <w:jc w:val="both"/>
       </w:pPr>
       <w:r>
+        <w:t>#### Bốn điều cần biết trước khi demo</w:t>
+      </w:r>
+    </w:p>
+    <w:p>
+      <w:pPr>
+        <w:jc w:val="both"/>
+      </w:pPr>
+      <w:r>
+        <w:rPr>
+          <w:b/>
+        </w:rPr>
+        <w:t>1. Màn Cấp phát chỉ hiện tờ đang chờ.</w:t>
+      </w:r>
+      <w:r>
+        <w:t xml:space="preserve"> Hai phiếu mẫu đã cấp dầu, đã chi tạm ứng xong, nên bảng </w:t>
+      </w:r>
+      <w:r>
+        <w:rPr>
+          <w:b/>
+        </w:rPr>
+        <w:t>Chờ cấp</w:t>
+      </w:r>
+      <w:r>
+        <w:t xml:space="preserve"> trống — không phải lỗi. Muốn xem lại một tờ: gõ mã vào ô </w:t>
+      </w:r>
+      <w:r>
+        <w:rPr>
+          <w:b/>
+        </w:rPr>
+        <w:t>Nhập mã QR</w:t>
+      </w:r>
+      <w:r>
+        <w:t xml:space="preserve"> rồi Enter, máy hiện </w:t>
+      </w:r>
+      <w:r>
+        <w:rPr>
+          <w:i/>
+        </w:rPr>
+        <w:t>Đã cấp</w:t>
+      </w:r>
+      <w:r>
+        <w:t xml:space="preserve"> và tên người cấp. Mã của bốn tờ:</w:t>
+      </w:r>
+    </w:p>
+    <w:tbl>
+      <w:tblPr>
+        <w:tblStyle w:val="LightGrid-Accent1"/>
+        <w:tblW w:type="auto" w:w="0"/>
+        <w:tblLook w:firstColumn="1" w:firstRow="1" w:lastColumn="0" w:lastRow="0" w:noHBand="0" w:noVBand="1" w:val="04A0"/>
+      </w:tblPr>
+      <w:tblGrid>
+        <w:gridCol w:w="2880"/>
+        <w:gridCol w:w="2880"/>
+        <w:gridCol w:w="2880"/>
+      </w:tblGrid>
+      <w:tr>
+        <w:tc>
+          <w:tcPr>
+            <w:tcW w:type="dxa" w:w="2880"/>
+          </w:tcPr>
+          <w:p>
+            <w:r>
+              <w:rPr>
+                <w:b/>
+              </w:rPr>
+            </w:r>
+            <w:r>
+              <w:rPr>
+                <w:b/>
+              </w:rPr>
+              <w:t>Tờ</w:t>
+            </w:r>
+          </w:p>
+        </w:tc>
+        <w:tc>
+          <w:tcPr>
+            <w:tcW w:type="dxa" w:w="2880"/>
+          </w:tcPr>
+          <w:p>
+            <w:r>
+              <w:rPr>
+                <w:b/>
+              </w:rPr>
+            </w:r>
+            <w:r>
+              <w:rPr>
+                <w:b/>
+              </w:rPr>
+              <w:t>Mã gõ vào ô Nhập mã QR</w:t>
+            </w:r>
+          </w:p>
+        </w:tc>
+        <w:tc>
+          <w:tcPr>
+            <w:tcW w:type="dxa" w:w="2880"/>
+          </w:tcPr>
+          <w:p>
+            <w:r>
+              <w:rPr>
+                <w:b/>
+              </w:rPr>
+            </w:r>
+            <w:r>
+              <w:rPr>
+                <w:b/>
+              </w:rPr>
+              <w:t>Ai mở</w:t>
+            </w:r>
+          </w:p>
+        </w:tc>
+      </w:tr>
+      <w:tr>
+        <w:tc>
+          <w:tcPr>
+            <w:tcW w:type="dxa" w:w="2880"/>
+          </w:tcPr>
+          <w:p>
+            <w:r/>
+            <w:r>
+              <w:t>Phiếu lĩnh dầu phiếu gom (200 L)</w:t>
+            </w:r>
+          </w:p>
+        </w:tc>
+        <w:tc>
+          <w:tcPr>
+            <w:tcW w:type="dxa" w:w="2880"/>
+          </w:tcPr>
+          <w:p>
+            <w:r/>
+            <w:r>
+              <w:rPr>
+                <w:rFonts w:ascii="Consolas" w:hAnsi="Consolas"/>
+                <w:sz w:val="19"/>
+              </w:rPr>
+              <w:t>W13LRwYrS0ft</w:t>
+            </w:r>
+          </w:p>
+        </w:tc>
+        <w:tc>
+          <w:tcPr>
+            <w:tcW w:type="dxa" w:w="2880"/>
+          </w:tcPr>
+          <w:p>
+            <w:r/>
+            <w:r>
+              <w:rPr>
+                <w:rFonts w:ascii="Consolas" w:hAnsi="Consolas"/>
+                <w:sz w:val="19"/>
+              </w:rPr>
+              <w:t>khotb</w:t>
+            </w:r>
+          </w:p>
+        </w:tc>
+      </w:tr>
+      <w:tr>
+        <w:tc>
+          <w:tcPr>
+            <w:tcW w:type="dxa" w:w="2880"/>
+          </w:tcPr>
+          <w:p>
+            <w:r/>
+            <w:r>
+              <w:t>Phiếu lĩnh dầu phiếu giao (300 L)</w:t>
+            </w:r>
+          </w:p>
+        </w:tc>
+        <w:tc>
+          <w:tcPr>
+            <w:tcW w:type="dxa" w:w="2880"/>
+          </w:tcPr>
+          <w:p>
+            <w:r/>
+            <w:r>
+              <w:rPr>
+                <w:rFonts w:ascii="Consolas" w:hAnsi="Consolas"/>
+                <w:sz w:val="19"/>
+              </w:rPr>
+              <w:t>F5b6KJrQkqsg</w:t>
+            </w:r>
+          </w:p>
+        </w:tc>
+        <w:tc>
+          <w:tcPr>
+            <w:tcW w:type="dxa" w:w="2880"/>
+          </w:tcPr>
+          <w:p>
+            <w:r/>
+            <w:r>
+              <w:rPr>
+                <w:rFonts w:ascii="Consolas" w:hAnsi="Consolas"/>
+                <w:sz w:val="19"/>
+              </w:rPr>
+              <w:t>khotb</w:t>
+            </w:r>
+          </w:p>
+        </w:tc>
+      </w:tr>
+      <w:tr>
+        <w:tc>
+          <w:tcPr>
+            <w:tcW w:type="dxa" w:w="2880"/>
+          </w:tcPr>
+          <w:p>
+            <w:r/>
+            <w:r>
+              <w:t>Tạm ứng phiếu gom (580.000)</w:t>
+            </w:r>
+          </w:p>
+        </w:tc>
+        <w:tc>
+          <w:tcPr>
+            <w:tcW w:type="dxa" w:w="2880"/>
+          </w:tcPr>
+          <w:p>
+            <w:r/>
+            <w:r>
+              <w:rPr>
+                <w:rFonts w:ascii="Consolas" w:hAnsi="Consolas"/>
+                <w:sz w:val="19"/>
+              </w:rPr>
+              <w:t>mX0zV9urgYXJ</w:t>
+            </w:r>
+          </w:p>
+        </w:tc>
+        <w:tc>
+          <w:tcPr>
+            <w:tcW w:type="dxa" w:w="2880"/>
+          </w:tcPr>
+          <w:p>
+            <w:r/>
+            <w:r>
+              <w:rPr>
+                <w:rFonts w:ascii="Consolas" w:hAnsi="Consolas"/>
+                <w:sz w:val="19"/>
+              </w:rPr>
+              <w:t>quytb</w:t>
+            </w:r>
+            <w:r>
+              <w:t xml:space="preserve"> (tab </w:t>
+            </w:r>
+            <w:r>
+              <w:rPr>
+                <w:b/>
+              </w:rPr>
+              <w:t>Phiếu tạm ứng đi đường</w:t>
+            </w:r>
+            <w:r>
+              <w:t>)</w:t>
+            </w:r>
+          </w:p>
+        </w:tc>
+      </w:tr>
+      <w:tr>
+        <w:tc>
+          <w:tcPr>
+            <w:tcW w:type="dxa" w:w="2880"/>
+          </w:tcPr>
+          <w:p>
+            <w:r/>
+            <w:r>
+              <w:t>Tạm ứng phiếu giao (2.413.500)</w:t>
+            </w:r>
+          </w:p>
+        </w:tc>
+        <w:tc>
+          <w:tcPr>
+            <w:tcW w:type="dxa" w:w="2880"/>
+          </w:tcPr>
+          <w:p>
+            <w:r/>
+            <w:r>
+              <w:rPr>
+                <w:rFonts w:ascii="Consolas" w:hAnsi="Consolas"/>
+                <w:sz w:val="19"/>
+              </w:rPr>
+              <w:t>y_gjm-_Yy2TM</w:t>
+            </w:r>
+          </w:p>
+        </w:tc>
+        <w:tc>
+          <w:tcPr>
+            <w:tcW w:type="dxa" w:w="2880"/>
+          </w:tcPr>
+          <w:p>
+            <w:r/>
+            <w:r>
+              <w:rPr>
+                <w:rFonts w:ascii="Consolas" w:hAnsi="Consolas"/>
+                <w:sz w:val="19"/>
+              </w:rPr>
+              <w:t>quytb</w:t>
+            </w:r>
+            <w:r>
+              <w:t xml:space="preserve"> (tab </w:t>
+            </w:r>
+            <w:r>
+              <w:rPr>
+                <w:b/>
+              </w:rPr>
+              <w:t>Phiếu tạm ứng đi đường</w:t>
+            </w:r>
+            <w:r>
+              <w:t>)</w:t>
+            </w:r>
+          </w:p>
+        </w:tc>
+      </w:tr>
+    </w:tbl>
+    <w:p/>
+    <w:p>
+      <w:pPr>
+        <w:jc w:val="both"/>
+      </w:pPr>
+      <w:r>
+        <w:t xml:space="preserve">Thủ kho xem dầu đã ra khỏi kho ở </w:t>
+      </w:r>
+      <w:r>
+        <w:rPr>
+          <w:b/>
+        </w:rPr>
+        <w:t>Kho → Kho nhiên liệu</w:t>
+      </w:r>
+      <w:r>
+        <w:t xml:space="preserve">: kho Thà Bốc còn </w:t>
+      </w:r>
+      <w:r>
+        <w:rPr>
+          <w:b/>
+        </w:rPr>
+        <w:t>2.720 L</w:t>
+      </w:r>
+      <w:r>
+        <w:t>.</w:t>
+      </w:r>
+    </w:p>
+    <w:p>
+      <w:pPr>
+        <w:jc w:val="both"/>
+      </w:pPr>
+      <w:r>
+        <w:rPr>
+          <w:b/>
+        </w:rPr>
+        <w:t>2. Lãi một chuyến có hai con số — sếp dễ hỏi.</w:t>
+      </w:r>
+      <w:r>
+        <w:t xml:space="preserve"> Lấy phiếu giao T4-0447-09:</w:t>
+      </w:r>
+    </w:p>
+    <w:tbl>
+      <w:tblPr>
+        <w:tblStyle w:val="LightGrid-Accent1"/>
+        <w:tblW w:type="auto" w:w="0"/>
+        <w:tblLook w:firstColumn="1" w:firstRow="1" w:lastColumn="0" w:lastRow="0" w:noHBand="0" w:noVBand="1" w:val="04A0"/>
+      </w:tblPr>
+      <w:tblGrid>
+        <w:gridCol w:w="2880"/>
+        <w:gridCol w:w="2880"/>
+        <w:gridCol w:w="2880"/>
+      </w:tblGrid>
+      <w:tr>
+        <w:tc>
+          <w:tcPr>
+            <w:tcW w:type="dxa" w:w="2880"/>
+          </w:tcPr>
+          <w:p>
+            <w:r>
+              <w:rPr>
+                <w:b/>
+              </w:rPr>
+            </w:r>
+            <w:r>
+              <w:rPr>
+                <w:b/>
+              </w:rPr>
+              <w:t>Xem ở đâu</w:t>
+            </w:r>
+          </w:p>
+        </w:tc>
+        <w:tc>
+          <w:tcPr>
+            <w:tcW w:type="dxa" w:w="2880"/>
+          </w:tcPr>
+          <w:p>
+            <w:r>
+              <w:rPr>
+                <w:b/>
+              </w:rPr>
+            </w:r>
+            <w:r>
+              <w:rPr>
+                <w:b/>
+              </w:rPr>
+              <w:t>Lãi</w:t>
+            </w:r>
+          </w:p>
+        </w:tc>
+        <w:tc>
+          <w:tcPr>
+            <w:tcW w:type="dxa" w:w="2880"/>
+          </w:tcPr>
+          <w:p>
+            <w:r>
+              <w:rPr>
+                <w:b/>
+              </w:rPr>
+            </w:r>
+            <w:r>
+              <w:rPr>
+                <w:b/>
+              </w:rPr>
+              <w:t>Vì sao</w:t>
+            </w:r>
+          </w:p>
+        </w:tc>
+      </w:tr>
+      <w:tr>
+        <w:tc>
+          <w:tcPr>
+            <w:tcW w:type="dxa" w:w="2880"/>
+          </w:tcPr>
+          <w:p>
+            <w:r/>
+            <w:r>
+              <w:t xml:space="preserve">Trên </w:t>
+            </w:r>
+            <w:r>
+              <w:rPr>
+                <w:b/>
+              </w:rPr>
+              <w:t>phiếu</w:t>
+            </w:r>
+            <w:r>
+              <w:t xml:space="preserve"> (trang điều xe, cuối trang)</w:t>
+            </w:r>
+          </w:p>
+        </w:tc>
+        <w:tc>
+          <w:tcPr>
+            <w:tcW w:type="dxa" w:w="2880"/>
+          </w:tcPr>
+          <w:p>
+            <w:r/>
+            <w:r>
+              <w:rPr>
+                <w:b/>
+              </w:rPr>
+              <w:t>7.105.200</w:t>
+            </w:r>
+          </w:p>
+        </w:tc>
+        <w:tc>
+          <w:tcPr>
+            <w:tcW w:type="dxa" w:w="2880"/>
+          </w:tcPr>
+          <w:p>
+            <w:r/>
+            <w:r>
+              <w:t xml:space="preserve">trừ </w:t>
+            </w:r>
+            <w:r>
+              <w:rPr>
+                <w:b/>
+              </w:rPr>
+              <w:t>mọi</w:t>
+            </w:r>
+            <w:r>
+              <w:t xml:space="preserve"> khoản chi của chuyến: dầu, tạm ứng, </w:t>
+            </w:r>
+            <w:r>
+              <w:rPr>
+                <w:b/>
+              </w:rPr>
+              <w:t>và cả</w:t>
+            </w:r>
+            <w:r>
+              <w:t xml:space="preserve"> tiền nước + tiền chuyến</w:t>
+            </w:r>
+          </w:p>
+        </w:tc>
+      </w:tr>
+      <w:tr>
+        <w:tc>
+          <w:tcPr>
+            <w:tcW w:type="dxa" w:w="2880"/>
+          </w:tcPr>
+          <w:p>
+            <w:r/>
+            <w:r>
+              <w:t xml:space="preserve">Màn </w:t>
+            </w:r>
+            <w:r>
+              <w:rPr>
+                <w:b/>
+              </w:rPr>
+              <w:t>Chuyến xe</w:t>
+            </w:r>
+            <w:r>
+              <w:t xml:space="preserve"> (trang kế toán)</w:t>
+            </w:r>
+          </w:p>
+        </w:tc>
+        <w:tc>
+          <w:tcPr>
+            <w:tcW w:type="dxa" w:w="2880"/>
+          </w:tcPr>
+          <w:p>
+            <w:r/>
+            <w:r>
+              <w:rPr>
+                <w:b/>
+              </w:rPr>
+              <w:t>8.965.200</w:t>
+            </w:r>
+          </w:p>
+        </w:tc>
+        <w:tc>
+          <w:tcPr>
+            <w:tcW w:type="dxa" w:w="2880"/>
+          </w:tcPr>
+          <w:p>
+            <w:r/>
+            <w:r>
+              <w:t xml:space="preserve">chỉ trừ khoản </w:t>
+            </w:r>
+            <w:r>
+              <w:rPr>
+                <w:b/>
+              </w:rPr>
+              <w:t>đã vào sổ</w:t>
+            </w:r>
+            <w:r>
+              <w:t>: dầu và tạm ứng</w:t>
+            </w:r>
+          </w:p>
+        </w:tc>
+      </w:tr>
+    </w:tbl>
+    <w:p/>
+    <w:p>
+      <w:pPr>
+        <w:jc w:val="both"/>
+      </w:pPr>
+      <w:r>
+        <w:t xml:space="preserve">Chênh </w:t>
+      </w:r>
+      <w:r>
+        <w:rPr>
+          <w:b/>
+        </w:rPr>
+        <w:t>1.860.000</w:t>
+      </w:r>
+      <w:r>
+        <w:t xml:space="preserve"> = tiền nước 60.000 + tiền chuyến 1.800.000. Hai khoản này </w:t>
+      </w:r>
+      <w:r>
+        <w:rPr>
+          <w:b/>
+        </w:rPr>
+        <w:t>trả cùng lương cuối tháng, gộp theo tài xế</w:t>
+      </w:r>
+      <w:r>
+        <w:t xml:space="preserve">, không gắn vào từng phiếu, nên sổ không trừ vào chuyến. (Phiếu gom chênh 2.480.000 — thêm chipping 620.000 nợ nhà cung cấp, trả theo đợt.) </w:t>
+      </w:r>
+      <w:r>
+        <w:rPr>
+          <w:b/>
+        </w:rPr>
+        <w:t>Nói với sếp: lãi thật của một chuyến xem ở phiếu.</w:t>
+      </w:r>
+    </w:p>
+    <w:p>
+      <w:pPr>
+        <w:jc w:val="both"/>
+      </w:pPr>
+      <w:r>
+        <w:rPr>
+          <w:b/>
+        </w:rPr>
+        <w:t>3. Ảnh trong phiếu mẫu là ảnh trống.</w:t>
+      </w:r>
+      <w:r>
+        <w:t xml:space="preserve"> Ảnh phiếu cân (phiếu gom), chữ ký người nhận và ảnh biên bản (phiếu giao) có trong phiếu, nhưng mở ra không có hình — công cụ lập phiếu không chụp ảnh, không ký tay được. Muốn cho sếp xem </w:t>
+      </w:r>
+      <w:r>
+        <w:rPr>
+          <w:b/>
+        </w:rPr>
+        <w:t>chữ ký thật, ảnh thật</w:t>
+      </w:r>
+      <w:r>
+        <w:t xml:space="preserve"> thì dùng phiếu anh tự bấm theo 10.0b (ký bằng tay trên điện thoại).</w:t>
+      </w:r>
+    </w:p>
+    <w:p>
+      <w:pPr>
+        <w:jc w:val="both"/>
+      </w:pPr>
+      <w:r>
+        <w:rPr>
+          <w:b/>
+        </w:rPr>
+        <w:t>4. Ai thấy giá cước, ai không.</w:t>
+      </w:r>
+      <w:r>
+        <w:t xml:space="preserve"> </w:t>
+      </w:r>
+      <w:r>
+        <w:rPr>
+          <w:b/>
+        </w:rPr>
+        <w:t>Không thấy</w:t>
+      </w:r>
+      <w:r>
+        <w:t xml:space="preserve"> giá cước, doanh thu, lãi: </w:t>
+      </w:r>
+      <w:r>
+        <w:rPr>
+          <w:b/>
+        </w:rPr>
+        <w:t>Bãi</w:t>
+      </w:r>
+      <w:r>
+        <w:t xml:space="preserve"> (</w:t>
+      </w:r>
+      <w:r>
+        <w:rPr>
+          <w:rFonts w:ascii="Consolas" w:hAnsi="Consolas"/>
+          <w:sz w:val="19"/>
+        </w:rPr>
+        <w:t>thabok</w:t>
+      </w:r>
+      <w:r>
+        <w:t xml:space="preserve">), </w:t>
+      </w:r>
+      <w:r>
+        <w:rPr>
+          <w:b/>
+        </w:rPr>
+        <w:t>tài xế</w:t>
+      </w:r>
+      <w:r>
+        <w:t xml:space="preserve"> (</w:t>
+      </w:r>
+      <w:r>
+        <w:rPr>
+          <w:rFonts w:ascii="Consolas" w:hAnsi="Consolas"/>
+          <w:sz w:val="19"/>
+        </w:rPr>
+        <w:t>tx01</w:t>
+      </w:r>
+      <w:r>
+        <w:t>…</w:t>
+      </w:r>
+      <w:r>
+        <w:rPr>
+          <w:rFonts w:ascii="Consolas" w:hAnsi="Consolas"/>
+          <w:sz w:val="19"/>
+        </w:rPr>
+        <w:t>tx03</w:t>
+      </w:r>
+      <w:r>
+        <w:t xml:space="preserve">), </w:t>
+      </w:r>
+      <w:r>
+        <w:rPr>
+          <w:b/>
+        </w:rPr>
+        <w:t>thủ kho dầu</w:t>
+      </w:r>
+      <w:r>
+        <w:t xml:space="preserve"> (</w:t>
+      </w:r>
+      <w:r>
+        <w:rPr>
+          <w:rFonts w:ascii="Consolas" w:hAnsi="Consolas"/>
+          <w:sz w:val="19"/>
+        </w:rPr>
+        <w:t>khotb</w:t>
+      </w:r>
+      <w:r>
+        <w:t xml:space="preserve">, </w:t>
+      </w:r>
+      <w:r>
+        <w:rPr>
+          <w:rFonts w:ascii="Consolas" w:hAnsi="Consolas"/>
+          <w:sz w:val="19"/>
+        </w:rPr>
+        <w:t>khovc</w:t>
+      </w:r>
+      <w:r>
+        <w:t xml:space="preserve">), </w:t>
+      </w:r>
+      <w:r>
+        <w:rPr>
+          <w:b/>
+        </w:rPr>
+        <w:t>thủ kho phụ tùng</w:t>
+      </w:r>
+      <w:r>
+        <w:t xml:space="preserve"> (</w:t>
+      </w:r>
+      <w:r>
+        <w:rPr>
+          <w:rFonts w:ascii="Consolas" w:hAnsi="Consolas"/>
+          <w:sz w:val="19"/>
+        </w:rPr>
+        <w:t>khopt</w:t>
+      </w:r>
+      <w:r>
+        <w:t xml:space="preserve">), </w:t>
+      </w:r>
+      <w:r>
+        <w:rPr>
+          <w:b/>
+        </w:rPr>
+        <w:t>tổ sửa chữa</w:t>
+      </w:r>
+      <w:r>
+        <w:t xml:space="preserve"> (</w:t>
+      </w:r>
+      <w:r>
+        <w:rPr>
+          <w:rFonts w:ascii="Consolas" w:hAnsi="Consolas"/>
+          <w:sz w:val="19"/>
+        </w:rPr>
+        <w:t>totsua</w:t>
+      </w:r>
+      <w:r>
+        <w:t xml:space="preserve">) — đó là phần lời của công ty (khách trả giá 2, thuê xe ngoài giá 1). </w:t>
+      </w:r>
+      <w:r>
+        <w:rPr>
+          <w:b/>
+        </w:rPr>
+        <w:t>Mọi vai kế toán và quỹ đều thấy</w:t>
+      </w:r>
+      <w:r>
+        <w:t xml:space="preserve">: </w:t>
+      </w:r>
+      <w:r>
+        <w:rPr>
+          <w:rFonts w:ascii="Consolas" w:hAnsi="Consolas"/>
+          <w:sz w:val="19"/>
+        </w:rPr>
+        <w:t>ketoan</w:t>
+      </w:r>
+      <w:r>
+        <w:t xml:space="preserve">, </w:t>
+      </w:r>
+      <w:r>
+        <w:rPr>
+          <w:rFonts w:ascii="Consolas" w:hAnsi="Consolas"/>
+          <w:sz w:val="19"/>
+        </w:rPr>
+        <w:t>ketoancp</w:t>
+      </w:r>
+      <w:r>
+        <w:t xml:space="preserve">, </w:t>
+      </w:r>
+      <w:r>
+        <w:rPr>
+          <w:rFonts w:ascii="Consolas" w:hAnsi="Consolas"/>
+          <w:sz w:val="19"/>
+        </w:rPr>
+        <w:t>khonl</w:t>
+      </w:r>
+      <w:r>
+        <w:t xml:space="preserve">, </w:t>
+      </w:r>
+      <w:r>
+        <w:rPr>
+          <w:rFonts w:ascii="Consolas" w:hAnsi="Consolas"/>
+          <w:sz w:val="19"/>
+        </w:rPr>
+        <w:t>quytb</w:t>
+      </w:r>
+      <w:r>
+        <w:t xml:space="preserve">, </w:t>
+      </w:r>
+      <w:r>
+        <w:rPr>
+          <w:rFonts w:ascii="Consolas" w:hAnsi="Consolas"/>
+          <w:sz w:val="19"/>
+        </w:rPr>
+        <w:t>quyvc</w:t>
+      </w:r>
+      <w:r>
+        <w:t xml:space="preserve">, </w:t>
+      </w:r>
+      <w:r>
+        <w:rPr>
+          <w:rFonts w:ascii="Consolas" w:hAnsi="Consolas"/>
+          <w:sz w:val="19"/>
+        </w:rPr>
+        <w:t>doanhthu</w:t>
+      </w:r>
+      <w:r>
+        <w:t xml:space="preserve">, và </w:t>
+      </w:r>
+      <w:r>
+        <w:rPr>
+          <w:rFonts w:ascii="Consolas" w:hAnsi="Consolas"/>
+          <w:sz w:val="19"/>
+        </w:rPr>
+        <w:t>admin</w:t>
+      </w:r>
+      <w:r>
+        <w:t xml:space="preserve">. Muốn cho sếp thấy chỗ khác nhau thì mở cùng một phiếu ở tab </w:t>
+      </w:r>
+      <w:r>
+        <w:rPr>
+          <w:rFonts w:ascii="Consolas" w:hAnsi="Consolas"/>
+          <w:sz w:val="19"/>
+        </w:rPr>
+        <w:t>thabok</w:t>
+      </w:r>
+      <w:r>
+        <w:t xml:space="preserve"> và tab </w:t>
+      </w:r>
+      <w:r>
+        <w:rPr>
+          <w:rFonts w:ascii="Consolas" w:hAnsi="Consolas"/>
+          <w:sz w:val="19"/>
+        </w:rPr>
+        <w:t>ketoan</w:t>
+      </w:r>
+      <w:r>
+        <w:t xml:space="preserve"> đặt cạnh nhau.</w:t>
+      </w:r>
+    </w:p>
+    <w:p>
+      <w:pPr>
+        <w:jc w:val="both"/>
+      </w:pPr>
+      <w:r>
         <w:t>#### Mở bao nhiêu tab, mỗi tab một tài khoản</w:t>
       </w:r>
     </w:p>
@@ -26710,7 +27546,16 @@
         <w:t>đã vào sổ</w:t>
       </w:r>
       <w:r>
-        <w:t xml:space="preserve"> 10.963.500 (dầu 8.550.000 + tạm ứng 2.413.500), 30 t hàng xuất kho bãi, 9 tờ chứng từ. Phiếu </w:t>
+        <w:t xml:space="preserve"> 10.963.500 (dầu 8.550.000 + tạm ứng 2.413.500), 30 t hàng xuất kho bãi, 9 tờ chứng từ. Lãi ở đây khác lãi trên phiếu — xem điều 2 ở mục </w:t>
+      </w:r>
+      <w:r>
+        <w:rPr>
+          <w:i/>
+        </w:rPr>
+        <w:t>Bốn điều cần biết trước khi demo</w:t>
+      </w:r>
+      <w:r>
+        <w:t xml:space="preserve"> (đầu 10.0c). Phiếu </w:t>
       </w:r>
       <w:r>
         <w:rPr>
@@ -26762,115 +27607,6 @@
       </w:r>
       <w:r>
         <w:t xml:space="preserve"> (30 t đã đi theo T4-0447-09).</w:t>
-      </w:r>
-    </w:p>
-    <w:p>
-      <w:pPr>
-        <w:jc w:val="both"/>
-      </w:pPr>
-      <w:r>
-        <w:rPr>
-          <w:b/>
-        </w:rPr>
-        <w:t>Lãi một chuyến có hai con số — nói trước với sếp.</w:t>
-      </w:r>
-      <w:r>
-        <w:t xml:space="preserve"> Trên phiếu (tab 2) lãi phiếu giao là </w:t>
-      </w:r>
-      <w:r>
-        <w:rPr>
-          <w:b/>
-        </w:rPr>
-        <w:t>7.105.200</w:t>
-      </w:r>
-      <w:r>
-        <w:t xml:space="preserve">, ở màn </w:t>
-      </w:r>
-      <w:r>
-        <w:rPr>
-          <w:b/>
-        </w:rPr>
-        <w:t>Chuyến xe</w:t>
-      </w:r>
-      <w:r>
-        <w:t xml:space="preserve"> (tab 10) là </w:t>
-      </w:r>
-      <w:r>
-        <w:rPr>
-          <w:b/>
-        </w:rPr>
-        <w:t>8.965.200</w:t>
-      </w:r>
-      <w:r>
-        <w:t xml:space="preserve">. Chênh đúng </w:t>
-      </w:r>
-      <w:r>
-        <w:rPr>
-          <w:b/>
-        </w:rPr>
-        <w:t>1.860.000</w:t>
-      </w:r>
-      <w:r>
-        <w:t xml:space="preserve"> = tiền nước + tiền chuyến </w:t>
-      </w:r>
-      <w:r>
-        <w:rPr>
-          <w:i/>
-        </w:rPr>
-        <w:t>trả cùng lương</w:t>
-      </w:r>
-      <w:r>
-        <w:t xml:space="preserve"> (phiếu gom chênh 2.480.000 = 1.860.000 + chipping 620.000 </w:t>
-      </w:r>
-      <w:r>
-        <w:rPr>
-          <w:i/>
-        </w:rPr>
-        <w:t>nợ nhà cung cấp</w:t>
-      </w:r>
-      <w:r>
-        <w:t xml:space="preserve">). Phiếu tính </w:t>
-      </w:r>
-      <w:r>
-        <w:rPr>
-          <w:b/>
-        </w:rPr>
-        <w:t>mọi khoản chi của chuyến</w:t>
-      </w:r>
-      <w:r>
-        <w:t xml:space="preserve">; màn Chuyến xe của sổ chỉ tính khoản </w:t>
-      </w:r>
-      <w:r>
-        <w:rPr>
-          <w:b/>
-        </w:rPr>
-        <w:t>đã vào sổ và gắn với phiếu</w:t>
-      </w:r>
-      <w:r>
-        <w:t xml:space="preserve"> (dầu, tạm ứng). Tiền trả cùng lương và tiền trả nhà cung cấp theo đợt được trả </w:t>
-      </w:r>
-      <w:r>
-        <w:rPr>
-          <w:b/>
-        </w:rPr>
-        <w:t>gộp theo tài xế, theo nhà cung cấp</w:t>
-      </w:r>
-      <w:r>
-        <w:t>, không gắn từng phiếu. Lãi thật của một chuyến: xem ở phiếu (trang điều xe).</w:t>
-      </w:r>
-    </w:p>
-    <w:p>
-      <w:pPr>
-        <w:jc w:val="both"/>
-      </w:pPr>
-      <w:r>
-        <w:rPr>
-          <w:b/>
-        </w:rPr>
-        <w:t>Ảnh trong phiếu mẫu là ảnh trống.</w:t>
-      </w:r>
-      <w:r>
-        <w:t xml:space="preserve"> Ảnh phiếu cân (phiếu gom), chữ ký và ảnh biên bản (phiếu giao) do công cụ gửi là ảnh trống một điểm ảnh — công cụ không chụp, không ký được. Muốn cho sếp xem chữ ký thật, ảnh thật thì dùng phiếu anh bấm tay theo 10.0b (ký bằng tay trên điện thoại).</w:t>
       </w:r>
     </w:p>
     <w:p>

</xml_diff>

<commit_message>
Tài liệu A → Z: gộp chỗ trùng, mỗi chuyện nói một chỗ; sửa câu sai về khoản chưa vào sổ
- 2.1 (mới) là chỗ duy nhất nói cách mở nhiều tab (bỏ tick Ghi nhớ đăng nhập, Ctrl+T, ẩn danh) và tab
  không tự tải lại; 10.0, 10.0b, 10.0c trỏ về 2.1.
- 10.0c: mã QR chỉ ở điều 1, lãi hai con số ở điều 2, khoản chưa vào sổ thành một bảng, lưu ý tất toán
  trỏ về T34; bỏ đoạn "tab khác có thấy ngay" và câu tồn dầu lặp lại.
- Sửa sai: tiền chuyến / tiền nước KHÔNG có tờ vào sổ (màn Tiền chuyến & tiền nước chỉ xem); chipping nợ
  NCC chỉ vào sổ lúc trả (PC_NCC). Trước đây ghi "ghi sổ khi trả lương".
- 10.0: 8020/8030 đã khởi động lại 13:59, chỉ cần Ctrl+F5; số hoá đơn có thêm hai phiếu mẫu; xe 345/346
  và tx03 đã dùng cho phiếu mẫu.

Co-Authored-By: Claude Opus 5.5 (1M context) <noreply@anthropic.com>
</commit_message>
<xml_diff>
--- a/DOCS/word/LUONG_A_Z_HAI_TRANG.docx
+++ b/DOCS/word/LUONG_A_Z_HAI_TRANG.docx
@@ -194,7 +194,16 @@
         <w:t>2.</w:t>
       </w:r>
       <w:r>
-        <w:t xml:space="preserve"> Tài khoản và đăng nhập</w:t>
+        <w:t xml:space="preserve"> Tài khoản và đăng nhập; </w:t>
+      </w:r>
+      <w:r>
+        <w:rPr>
+          <w:b/>
+        </w:rPr>
+        <w:t>2.1</w:t>
+      </w:r>
+      <w:r>
+        <w:t xml:space="preserve"> mở nhiều tab, mỗi tab một tài khoản</w:t>
       </w:r>
     </w:p>
     <w:p>
@@ -1123,16 +1132,16 @@
         <w:t>đăng nhập riêng từng trang</w:t>
       </w:r>
       <w:r>
-        <w:t xml:space="preserve">: vào trang điều xe không tự đăng nhập trang kế toán. Mẹo khi làm: mở trang điều xe ở một tab, trang kế toán ở tab bên cạnh. Muốn làm hai vai cùng lúc thì mở thêm một </w:t>
-      </w:r>
-      <w:r>
-        <w:rPr>
-          <w:b/>
-        </w:rPr>
-        <w:t>cửa sổ ẩn danh</w:t>
-      </w:r>
-      <w:r>
-        <w:t xml:space="preserve"> (Ctrl+Shift+N), mỗi cửa sổ một người.</w:t>
+        <w:t xml:space="preserve">: vào trang điều xe không tự đăng nhập trang kế toán. Muốn mở nhiều người cùng lúc, mỗi tab một tài khoản: xem </w:t>
+      </w:r>
+      <w:r>
+        <w:rPr>
+          <w:b/>
+        </w:rPr>
+        <w:t>2.1</w:t>
+      </w:r>
+      <w:r>
+        <w:t xml:space="preserve"> ngay dưới bảng.</w:t>
       </w:r>
     </w:p>
     <w:tbl>
@@ -2168,6 +2177,240 @@
       </w:r>
       <w:r>
         <w:t>, không thấy sổ.</w:t>
+      </w:r>
+    </w:p>
+    <w:p>
+      <w:pPr>
+        <w:pStyle w:val="Heading2"/>
+      </w:pPr>
+      <w:r>
+        <w:t>2.1. Mở nhiều tab, mỗi tab một tài khoản</w:t>
+      </w:r>
+    </w:p>
+    <w:p>
+      <w:pPr>
+        <w:jc w:val="both"/>
+      </w:pPr>
+      <w:r>
+        <w:t>*</w:t>
+      </w:r>
+      <w:r>
+        <w:rPr>
+          <w:i/>
+        </w:rPr>
+        <w:t xml:space="preserve">Mỗi lần đăng nhập, BỎ TICK ô </w:t>
+      </w:r>
+      <w:r>
+        <w:t>Ghi nhớ đăng nhập*</w:t>
+      </w:r>
+      <w:r>
+        <w:rPr>
+          <w:b/>
+        </w:rPr>
+        <w:t xml:space="preserve"> (ô này mặc định có tick, ở cả hai trang). Có tick thì phiên lưu chung cho cả trình duyệt: một tab đăng nhập tài khoản khác là </w:t>
+      </w:r>
+      <w:r>
+        <w:t>mọi tab của trang đó** chạy theo tài khoản mới — tab ghi tên "Bãi" bấm nút lại chạy bằng quyền kế toán. Bỏ tick thì mỗi tab giữ tài khoản của riêng nó.</w:t>
+      </w:r>
+    </w:p>
+    <w:p>
+      <w:pPr>
+        <w:pStyle w:val="ListBullet"/>
+      </w:pPr>
+      <w:r>
+        <w:t xml:space="preserve">Mở tab mới bằng </w:t>
+      </w:r>
+      <w:r>
+        <w:rPr>
+          <w:b/>
+        </w:rPr>
+        <w:t>Ctrl+T</w:t>
+      </w:r>
+      <w:r>
+        <w:t xml:space="preserve"> rồi gõ địa chỉ; *</w:t>
+      </w:r>
+      <w:r>
+        <w:rPr>
+          <w:i/>
+        </w:rPr>
+        <w:t xml:space="preserve">đừng dùng </w:t>
+      </w:r>
+      <w:r>
+        <w:t>Nhân đôi thẻ*** (nhân đôi chép luôn phiên của tab cũ).</w:t>
+      </w:r>
+    </w:p>
+    <w:p>
+      <w:pPr>
+        <w:pStyle w:val="ListBullet"/>
+      </w:pPr>
+      <w:r>
+        <w:t xml:space="preserve">Đổi người trong một tab: bấm tên người ở góc trên phải → </w:t>
+      </w:r>
+      <w:r>
+        <w:rPr>
+          <w:b/>
+        </w:rPr>
+        <w:t>Đổi tài khoản</w:t>
+      </w:r>
+      <w:r>
+        <w:t xml:space="preserve"> → đăng nhập lại, </w:t>
+      </w:r>
+      <w:r>
+        <w:rPr>
+          <w:b/>
+        </w:rPr>
+        <w:t>bỏ tick lại</w:t>
+      </w:r>
+      <w:r>
+        <w:t>.</w:t>
+      </w:r>
+    </w:p>
+    <w:p>
+      <w:pPr>
+        <w:pStyle w:val="ListBullet"/>
+      </w:pPr>
+      <w:r>
+        <w:t xml:space="preserve">Trang điều xe (8020) và trang kế toán (8030) là hai trang riêng: </w:t>
+      </w:r>
+      <w:r>
+        <w:rPr>
+          <w:rFonts w:ascii="Consolas" w:hAnsi="Consolas"/>
+          <w:sz w:val="19"/>
+        </w:rPr>
+        <w:t>ketoan</w:t>
+      </w:r>
+      <w:r>
+        <w:t xml:space="preserve"> ở 8020 và </w:t>
+      </w:r>
+      <w:r>
+        <w:rPr>
+          <w:rFonts w:ascii="Consolas" w:hAnsi="Consolas"/>
+          <w:sz w:val="19"/>
+        </w:rPr>
+        <w:t>ketoan</w:t>
+      </w:r>
+      <w:r>
+        <w:t xml:space="preserve"> ở 8030 là hai tab, không đụng nhau.</w:t>
+      </w:r>
+    </w:p>
+    <w:p>
+      <w:pPr>
+        <w:pStyle w:val="ListBullet"/>
+      </w:pPr>
+      <w:r>
+        <w:t>Tài xế: dùng điện thoại là gọn nhất; không có điện thoại thì một tab như trên.</w:t>
+      </w:r>
+    </w:p>
+    <w:p>
+      <w:pPr>
+        <w:pStyle w:val="ListBullet"/>
+      </w:pPr>
+      <w:r>
+        <w:t xml:space="preserve">Cách khác: mỗi người một </w:t>
+      </w:r>
+      <w:r>
+        <w:rPr>
+          <w:b/>
+        </w:rPr>
+        <w:t>cửa sổ ẩn danh</w:t>
+      </w:r>
+      <w:r>
+        <w:t xml:space="preserve"> (Ctrl+Shift+N) hoặc một trình duyệt khác.</w:t>
+      </w:r>
+    </w:p>
+    <w:p>
+      <w:pPr>
+        <w:jc w:val="both"/>
+      </w:pPr>
+      <w:r>
+        <w:rPr>
+          <w:b/>
+        </w:rPr>
+        <w:t>Tab này bấm, tab kia có thấy ngay không?</w:t>
+      </w:r>
+      <w:r>
+        <w:t xml:space="preserve"> Dữ liệu vào máy chủ </w:t>
+      </w:r>
+      <w:r>
+        <w:rPr>
+          <w:b/>
+        </w:rPr>
+        <w:t>ngay lúc bấm</w:t>
+      </w:r>
+      <w:r>
+        <w:t xml:space="preserve"> — ví dụ thủ kho bấm </w:t>
+      </w:r>
+      <w:r>
+        <w:rPr>
+          <w:b/>
+        </w:rPr>
+        <w:t>Cấp dầu</w:t>
+      </w:r>
+      <w:r>
+        <w:t xml:space="preserve"> ở 8030 thì phiếu ở 8020 đã có dầu đã cấp. Nhưng tab đang mở </w:t>
+      </w:r>
+      <w:r>
+        <w:rPr>
+          <w:b/>
+        </w:rPr>
+        <w:t>không tự vẽ lại</w:t>
+      </w:r>
+      <w:r>
+        <w:t xml:space="preserve">: sang tab kia bấm </w:t>
+      </w:r>
+      <w:r>
+        <w:rPr>
+          <w:b/>
+        </w:rPr>
+        <w:t>F5</w:t>
+      </w:r>
+      <w:r>
+        <w:t xml:space="preserve"> (hoặc bấm lại màn đó trên menu). Hai màn tự tải lại: </w:t>
+      </w:r>
+      <w:r>
+        <w:rPr>
+          <w:b/>
+        </w:rPr>
+        <w:t>Tổng quan</w:t>
+      </w:r>
+      <w:r>
+        <w:t xml:space="preserve"> (tick </w:t>
+      </w:r>
+      <w:r>
+        <w:rPr>
+          <w:b/>
+        </w:rPr>
+        <w:t>Tự cập nhật 60 s</w:t>
+      </w:r>
+      <w:r>
+        <w:t xml:space="preserve">) và </w:t>
+      </w:r>
+      <w:r>
+        <w:rPr>
+          <w:b/>
+        </w:rPr>
+        <w:t>Theo dõi tuyến</w:t>
+      </w:r>
+      <w:r>
+        <w:t xml:space="preserve"> (tick </w:t>
+      </w:r>
+      <w:r>
+        <w:rPr>
+          <w:b/>
+        </w:rPr>
+        <w:t>Tự cập nhật 30 giây</w:t>
+      </w:r>
+      <w:r>
+        <w:t xml:space="preserve">). Tờ chứng từ vào sổ lúc nào: xem hai đường ở </w:t>
+      </w:r>
+      <w:r>
+        <w:rPr>
+          <w:b/>
+        </w:rPr>
+        <w:t>1.3</w:t>
+      </w:r>
+      <w:r>
+        <w:t>.</w:t>
       </w:r>
     </w:p>
     <w:p>
@@ -19554,7 +19797,7 @@
         <w:t>doanhthu</w:t>
       </w:r>
       <w:r>
-        <w:t xml:space="preserve">) | 7 phiếu đã lập hoá đơn. Đã thu đủ: T4-0430-08, T4-0431-08, T4-0440-09, T4-0442-09, T4-0443-09. Thu một phần: </w:t>
+        <w:t xml:space="preserve">) | 7 phiếu đã lập hoá đơn (cộng hai phiếu mẫu 10.0c lập sau, đã thu đủ). Đã thu đủ: T4-0430-08, T4-0431-08, T4-0440-09, T4-0442-09, T4-0443-09. Thu một phần: </w:t>
       </w:r>
       <w:r>
         <w:rPr>
@@ -19699,10 +19942,10 @@
         <w:rPr>
           <w:b/>
         </w:rPr>
-        <w:t>Khởi động lại máy 8020</w:t>
-      </w:r>
-      <w:r>
-        <w:t xml:space="preserve"> (trang điều xe) để nhận bản có </w:t>
+        <w:t>Máy chủ đã chạy bản mới nhất:</w:t>
+      </w:r>
+      <w:r>
+        <w:t xml:space="preserve"> 8020 và 8030 khởi động lại lúc 13:59 ngày 29/09 — có </w:t>
       </w:r>
       <w:r>
         <w:rPr>
@@ -19729,7 +19972,7 @@
         <w:t>Lúc đi</w:t>
       </w:r>
       <w:r>
-        <w:t xml:space="preserve"> tự điền (bước 1) và ô </w:t>
+        <w:t xml:space="preserve"> tự điền (bước 1), ô </w:t>
       </w:r>
       <w:r>
         <w:rPr>
@@ -19738,7 +19981,7 @@
         <w:t>cách trả</w:t>
       </w:r>
       <w:r>
-        <w:t xml:space="preserve"> mục IV (bước 3), rồi </w:t>
+        <w:t xml:space="preserve"> mục IV (bước 3), tờ tạm ứng có mã QR và tờ chứng từ PTU theo đúng số quỹ chi. Chỉ cần </w:t>
       </w:r>
       <w:r>
         <w:rPr>
@@ -19747,16 +19990,7 @@
         <w:t>Ctrl+F5</w:t>
       </w:r>
       <w:r>
-        <w:t xml:space="preserve"> trên trình duyệt. Năm tuyến mẫu ở mục 5 dưới đây em thêm sau khi máy 8020 chạy bản mới. Máy </w:t>
-      </w:r>
-      <w:r>
-        <w:rPr>
-          <w:b/>
-        </w:rPr>
-        <w:t>8030</w:t>
-      </w:r>
-      <w:r>
-        <w:t xml:space="preserve"> không cần khởi động lại.</w:t>
+        <w:t xml:space="preserve"> trên trình duyệt. Sau này em sửa mã máy chủ thì em báo khởi động lại.</w:t>
       </w:r>
     </w:p>
     <w:p>
@@ -19870,25 +20104,25 @@
         <w:pStyle w:val="ListNumber"/>
       </w:pPr>
       <w:r>
-        <w:t xml:space="preserve">Mở </w:t>
-      </w:r>
-      <w:r>
-        <w:rPr>
-          <w:b/>
-        </w:rPr>
-        <w:t>trang điều xe ở một tab, trang kế toán ở tab bên cạnh</w:t>
-      </w:r>
-      <w:r>
-        <w:t xml:space="preserve">. Cần hai người cùng lúc (ví dụ Bãi lập phiếu, kế toán kiểm) thì mở thêm </w:t>
-      </w:r>
-      <w:r>
-        <w:rPr>
-          <w:b/>
-        </w:rPr>
-        <w:t>cửa sổ ẩn danh</w:t>
-      </w:r>
-      <w:r>
-        <w:t xml:space="preserve"> (Ctrl+Shift+N). Mật khẩu mọi tài khoản </w:t>
+        <w:t xml:space="preserve">Mở tab theo </w:t>
+      </w:r>
+      <w:r>
+        <w:rPr>
+          <w:b/>
+        </w:rPr>
+        <w:t>2.1</w:t>
+      </w:r>
+      <w:r>
+        <w:t>: mỗi tab một tài khoản, mỗi lần đăng nhập *</w:t>
+      </w:r>
+      <w:r>
+        <w:rPr>
+          <w:i/>
+        </w:rPr>
+        <w:t xml:space="preserve">bỏ tick </w:t>
+      </w:r>
+      <w:r>
+        <w:t xml:space="preserve">Ghi nhớ đăng nhập***. Mật khẩu mọi tài khoản </w:t>
       </w:r>
       <w:r>
         <w:rPr>
@@ -19948,7 +20182,25 @@
         <w:t>344</w:t>
       </w:r>
       <w:r>
-        <w:t xml:space="preserve">) và 12 đầu kéo thêm ngày 29/09 </w:t>
+        <w:t xml:space="preserve">; </w:t>
+      </w:r>
+      <w:r>
+        <w:rPr>
+          <w:b/>
+        </w:rPr>
+        <w:t>345</w:t>
+      </w:r>
+      <w:r>
+        <w:t xml:space="preserve">, </w:t>
+      </w:r>
+      <w:r>
+        <w:rPr>
+          <w:b/>
+        </w:rPr>
+        <w:t>346</w:t>
+      </w:r>
+      <w:r>
+        <w:t xml:space="preserve"> đã chạy cặp phiếu mẫu 10.0c) và 12 đầu kéo thêm ngày 29/09 </w:t>
       </w:r>
       <w:r>
         <w:rPr>
@@ -20113,7 +20365,7 @@
         <w:t>tx03</w:t>
       </w:r>
       <w:r>
-        <w:t xml:space="preserve"> = ທ້າວ ສົມພອນ (tài xế xe liên kết).</w:t>
+        <w:t xml:space="preserve"> = ທ້າວ ສົມພອນ (tài xế xe liên kết ở T27; cặp phiếu mẫu 10.0c cũng dùng tài xế này).</w:t>
       </w:r>
     </w:p>
     <w:p>
@@ -20498,7 +20750,25 @@
         <w:t>Chuẩn bị (một lần):</w:t>
       </w:r>
       <w:r>
-        <w:t xml:space="preserve"> Ctrl+F5 cả hai trang. Tab 1: trang điều xe </w:t>
+        <w:t xml:space="preserve"> Ctrl+F5 cả hai trang. Mở tab theo </w:t>
+      </w:r>
+      <w:r>
+        <w:rPr>
+          <w:b/>
+        </w:rPr>
+        <w:t>2.1</w:t>
+      </w:r>
+      <w:r>
+        <w:t xml:space="preserve"> (mỗi tab một tài khoản, bỏ tick </w:t>
+      </w:r>
+      <w:r>
+        <w:rPr>
+          <w:i/>
+        </w:rPr>
+        <w:t>Ghi nhớ đăng nhập</w:t>
+      </w:r>
+      <w:r>
+        <w:t xml:space="preserve">): trang điều xe </w:t>
       </w:r>
       <w:r>
         <w:rPr>
@@ -20508,7 +20778,7 @@
         <w:t>http://&lt;máy chủ&gt;:8020</w:t>
       </w:r>
       <w:r>
-        <w:t xml:space="preserve">. Tab 2: trang kế toán </w:t>
+        <w:t xml:space="preserve">, trang kế toán </w:t>
       </w:r>
       <w:r>
         <w:rPr>
@@ -20518,25 +20788,7 @@
         <w:t>http://&lt;máy chủ&gt;:8030</w:t>
       </w:r>
       <w:r>
-        <w:t xml:space="preserve">. Tài xế dùng </w:t>
-      </w:r>
-      <w:r>
-        <w:rPr>
-          <w:b/>
-        </w:rPr>
-        <w:t>điện thoại</w:t>
-      </w:r>
-      <w:r>
-        <w:t xml:space="preserve"> hoặc một </w:t>
-      </w:r>
-      <w:r>
-        <w:rPr>
-          <w:b/>
-        </w:rPr>
-        <w:t>cửa sổ ẩn danh</w:t>
-      </w:r>
-      <w:r>
-        <w:t xml:space="preserve"> (Ctrl+Shift+N) đăng nhập </w:t>
+        <w:t xml:space="preserve">. Tài xế </w:t>
       </w:r>
       <w:r>
         <w:rPr>
@@ -20546,7 +20798,7 @@
         <w:t>tx01</w:t>
       </w:r>
       <w:r>
-        <w:t xml:space="preserve">, sau này </w:t>
+        <w:t xml:space="preserve"> (sau này </w:t>
       </w:r>
       <w:r>
         <w:rPr>
@@ -20556,26 +20808,7 @@
         <w:t>tx02</w:t>
       </w:r>
       <w:r>
-        <w:t xml:space="preserve">. Mật khẩu mọi tài khoản </w:t>
-      </w:r>
-      <w:r>
-        <w:rPr>
-          <w:rFonts w:ascii="Consolas" w:hAnsi="Consolas"/>
-          <w:sz w:val="19"/>
-        </w:rPr>
-        <w:t>1234</w:t>
-      </w:r>
-      <w:r>
-        <w:t xml:space="preserve">. Đổi người: bấm tên người ở góc trên phải → </w:t>
-      </w:r>
-      <w:r>
-        <w:rPr>
-          <w:b/>
-        </w:rPr>
-        <w:t>Đổi tài khoản</w:t>
-      </w:r>
-      <w:r>
-        <w:t xml:space="preserve"> → đăng nhập tài khoản mới.</w:t>
+        <w:t>) dùng điện thoại hoặc một tab riêng.</w:t>
       </w:r>
     </w:p>
     <w:p>
@@ -24371,32 +24604,6 @@
         <w:jc w:val="both"/>
       </w:pPr>
       <w:r>
-        <w:t xml:space="preserve">Thủ kho xem dầu đã ra khỏi kho ở </w:t>
-      </w:r>
-      <w:r>
-        <w:rPr>
-          <w:b/>
-        </w:rPr>
-        <w:t>Kho → Kho nhiên liệu</w:t>
-      </w:r>
-      <w:r>
-        <w:t xml:space="preserve">: kho Thà Bốc còn </w:t>
-      </w:r>
-      <w:r>
-        <w:rPr>
-          <w:b/>
-        </w:rPr>
-        <w:t>2.720 L</w:t>
-      </w:r>
-      <w:r>
-        <w:t>.</w:t>
-      </w:r>
-    </w:p>
-    <w:p>
-      <w:pPr>
-        <w:jc w:val="both"/>
-      </w:pPr>
-      <w:r>
         <w:rPr>
           <w:b/>
         </w:rPr>
@@ -24610,16 +24817,25 @@
         <w:t>1.860.000</w:t>
       </w:r>
       <w:r>
-        <w:t xml:space="preserve"> = tiền nước 60.000 + tiền chuyến 1.800.000. Hai khoản này </w:t>
-      </w:r>
-      <w:r>
-        <w:rPr>
-          <w:b/>
-        </w:rPr>
-        <w:t>trả cùng lương cuối tháng, gộp theo tài xế</w:t>
-      </w:r>
-      <w:r>
-        <w:t xml:space="preserve">, không gắn vào từng phiếu, nên sổ không trừ vào chuyến. (Phiếu gom chênh 2.480.000 — thêm chipping 620.000 nợ nhà cung cấp, trả theo đợt.) </w:t>
+        <w:t xml:space="preserve"> = tiền nước + tiền chuyến </w:t>
+      </w:r>
+      <w:r>
+        <w:rPr>
+          <w:i/>
+        </w:rPr>
+        <w:t>trả cùng lương</w:t>
+      </w:r>
+      <w:r>
+        <w:t xml:space="preserve"> — khoản này chưa có tờ vào sổ (xem </w:t>
+      </w:r>
+      <w:r>
+        <w:rPr>
+          <w:b/>
+        </w:rPr>
+        <w:t>Khoản chưa vào sổ</w:t>
+      </w:r>
+      <w:r>
+        <w:t xml:space="preserve"> ở cuối 10.0c). </w:t>
       </w:r>
       <w:r>
         <w:rPr>
@@ -24901,13 +25117,22 @@
         <w:jc w:val="both"/>
       </w:pPr>
       <w:r>
-        <w:t>*</w:t>
+        <w:t xml:space="preserve">Cách mở tab ở </w:t>
+      </w:r>
+      <w:r>
+        <w:rPr>
+          <w:b/>
+        </w:rPr>
+        <w:t>2.1</w:t>
+      </w:r>
+      <w:r>
+        <w:t xml:space="preserve"> — quan trọng nhất: mỗi lần đăng nhập *</w:t>
       </w:r>
       <w:r>
         <w:rPr>
           <w:i/>
         </w:rPr>
-        <w:t xml:space="preserve">Điều bắt buộc: mỗi lần đăng nhập, BỎ TICK ô </w:t>
+        <w:t xml:space="preserve">bỏ tick </w:t>
       </w:r>
       <w:r>
         <w:t>Ghi nhớ đăng nhập*</w:t>
@@ -24916,63 +25141,10 @@
         <w:rPr>
           <w:b/>
         </w:rPr>
-        <w:t xml:space="preserve"> (ô này mặc định có tick, ở cả hai trang). Có tick thì phiên lưu chung cho cả trình duyệt: một tab đăng nhập tài khoản khác là </w:t>
-      </w:r>
-      <w:r>
-        <w:t>mọi tab của trang đó</w:t>
-      </w:r>
-      <w:r>
-        <w:rPr>
-          <w:b/>
-        </w:rPr>
-        <w:t xml:space="preserve"> chạy theo tài khoản mới — tab ghi tên "Bãi" bấm nút lại chạy bằng quyền kế toán. Bỏ tick thì mỗi tab giữ tài khoản của riêng nó. Mở tab mới bằng </w:t>
-      </w:r>
-      <w:r>
-        <w:t>Ctrl+T</w:t>
-      </w:r>
-      <w:r>
-        <w:rPr>
-          <w:b/>
-        </w:rPr>
-        <w:t xml:space="preserve"> rồi gõ địa chỉ, </w:t>
-      </w:r>
-      <w:r>
-        <w:t xml:space="preserve">đừng dùng </w:t>
-      </w:r>
-      <w:r>
-        <w:rPr>
-          <w:i/>
-        </w:rPr>
-        <w:t>Nhân đôi thẻ</w:t>
-      </w:r>
-      <w:r>
-        <w:rPr>
-          <w:b/>
-        </w:rPr>
-        <w:t xml:space="preserve"> (nhân đôi chép luôn phiên của tab cũ). Bấm </w:t>
-      </w:r>
-      <w:r>
-        <w:t xml:space="preserve">Đổi tài khoản** trong một tab thì cũng bỏ tick lại. Trang điều xe (8020) và trang kế toán (8030) là hai trang riêng: </w:t>
-      </w:r>
-      <w:r>
-        <w:rPr>
-          <w:rFonts w:ascii="Consolas" w:hAnsi="Consolas"/>
-          <w:sz w:val="19"/>
-        </w:rPr>
-        <w:t>ketoan</w:t>
-      </w:r>
-      <w:r>
-        <w:t xml:space="preserve"> ở 8020 và </w:t>
-      </w:r>
-      <w:r>
-        <w:rPr>
-          <w:rFonts w:ascii="Consolas" w:hAnsi="Consolas"/>
-          <w:sz w:val="19"/>
-        </w:rPr>
-        <w:t>ketoan</w:t>
-      </w:r>
-      <w:r>
-        <w:t xml:space="preserve"> ở 8030 là hai tab, không đụng nhau.</w:t>
+        <w:t xml:space="preserve">, không thì các tab dùng chung một tài khoản. Tab này bấm thì tab kia bấm </w:t>
+      </w:r>
+      <w:r>
+        <w:t>F5** mới thấy.</w:t>
       </w:r>
     </w:p>
     <w:p>
@@ -26996,83 +27168,179 @@
         <w:t>Nhập mã QR</w:t>
       </w:r>
       <w:r>
-        <w:t xml:space="preserve"> gõ mã in trên tờ rồi Enter — </w:t>
+        <w:t xml:space="preserve"> gõ mã phiếu lĩnh ở bảng </w:t>
+      </w:r>
+      <w:r>
+        <w:rPr>
+          <w:b/>
+        </w:rPr>
+        <w:t>điều 1</w:t>
+      </w:r>
+      <w:r>
+        <w:t xml:space="preserve"> rồi Enter → khung </w:t>
+      </w:r>
+      <w:r>
+        <w:rPr>
+          <w:b/>
+        </w:rPr>
+        <w:t>Đối chiếu trước khi cấp</w:t>
+      </w:r>
+      <w:r>
+        <w:t xml:space="preserve"> hiện đúng xe, biển đầu kéo, rơ-moóc, tài xế, trạng thái </w:t>
+      </w:r>
+      <w:r>
+        <w:rPr>
+          <w:i/>
+        </w:rPr>
+        <w:t>Đã cấp</w:t>
+      </w:r>
+      <w:r>
+        <w:t xml:space="preserve">, </w:t>
+      </w:r>
+      <w:r>
+        <w:rPr>
+          <w:b/>
+        </w:rPr>
+        <w:t>Người cấp</w:t>
+      </w:r>
+      <w:r>
+        <w:t xml:space="preserve"> ທ້າວ ບຸນມາ; không có nút cấp lần hai.</w:t>
+      </w:r>
+    </w:p>
+    <w:p>
+      <w:pPr>
+        <w:pStyle w:val="ListNumber"/>
+      </w:pPr>
+      <w:r>
+        <w:rPr>
+          <w:b/>
+        </w:rPr>
+        <w:t>Kho → Kho nhiên liệu</w:t>
+      </w:r>
+      <w:r>
+        <w:t xml:space="preserve"> → ô </w:t>
+      </w:r>
+      <w:r>
+        <w:rPr>
+          <w:b/>
+        </w:rPr>
+        <w:t>Kho</w:t>
+      </w:r>
+      <w:r>
+        <w:t xml:space="preserve"> chọn kho Thà Bốc: </w:t>
+      </w:r>
+      <w:r>
+        <w:rPr>
+          <w:b/>
+        </w:rPr>
+        <w:t>Tồn kho hiện tại</w:t>
+      </w:r>
+      <w:r>
+        <w:t xml:space="preserve"> </w:t>
+      </w:r>
+      <w:r>
+        <w:rPr>
+          <w:b/>
+        </w:rPr>
+        <w:t>2.720 L</w:t>
+      </w:r>
+      <w:r>
+        <w:t xml:space="preserve">; sổ dầu hai dòng mới nhất </w:t>
+      </w:r>
+      <w:r>
+        <w:rPr>
+          <w:i/>
+        </w:rPr>
+        <w:t>Xuất theo phiếu</w:t>
+      </w:r>
+      <w:r>
+        <w:t xml:space="preserve"> </w:t>
       </w:r>
       <w:r>
         <w:rPr>
           <w:rFonts w:ascii="Consolas" w:hAnsi="Consolas"/>
           <w:sz w:val="19"/>
         </w:rPr>
-        <w:t>W13LRwYrS0ft</w:t>
-      </w:r>
-      <w:r>
-        <w:t xml:space="preserve"> (PLNL-G4-0104-09/EPL-1, 200 L) hoặc </w:t>
+        <w:t>PLNL-T4-0447-09/EPL-1</w:t>
+      </w:r>
+      <w:r>
+        <w:t xml:space="preserve"> xe 346 (tồn còn 2.720) và </w:t>
       </w:r>
       <w:r>
         <w:rPr>
           <w:rFonts w:ascii="Consolas" w:hAnsi="Consolas"/>
           <w:sz w:val="19"/>
         </w:rPr>
-        <w:t>F5b6KJrQkqsg</w:t>
-      </w:r>
-      <w:r>
-        <w:t xml:space="preserve"> (PLNL-T4-0447-09/EPL-1, 300 L) → khung </w:t>
-      </w:r>
-      <w:r>
-        <w:rPr>
-          <w:b/>
-        </w:rPr>
-        <w:t>Đối chiếu trước khi cấp</w:t>
-      </w:r>
-      <w:r>
-        <w:t xml:space="preserve"> hiện đúng xe, biển đầu kéo, rơ-moóc, tài xế, trạng thái </w:t>
-      </w:r>
-      <w:r>
-        <w:rPr>
-          <w:i/>
-        </w:rPr>
-        <w:t>Đã cấp</w:t>
-      </w:r>
-      <w:r>
-        <w:t xml:space="preserve">, </w:t>
-      </w:r>
-      <w:r>
-        <w:rPr>
-          <w:b/>
-        </w:rPr>
-        <w:t>Người cấp</w:t>
-      </w:r>
-      <w:r>
-        <w:t xml:space="preserve"> ທ້າວ ບຸນມາ; không có nút cấp lần hai.</w:t>
+        <w:t>PLNL-G4-0104-09/EPL-1</w:t>
+      </w:r>
+      <w:r>
+        <w:t xml:space="preserve"> xe 345 (tồn còn 3.020), trước đó 3.220.</w:t>
       </w:r>
     </w:p>
     <w:p>
       <w:pPr>
+        <w:jc w:val="both"/>
+      </w:pPr>
+      <w:r>
+        <w:rPr>
+          <w:b/>
+        </w:rPr>
+        <w:t>Tab 8 · `quytb` — quỹ Thà Bốc (trang kế toán)</w:t>
+      </w:r>
+    </w:p>
+    <w:p>
+      <w:pPr>
         <w:pStyle w:val="ListNumber"/>
       </w:pPr>
       <w:r>
         <w:rPr>
           <w:b/>
         </w:rPr>
-        <w:t>Kho → Kho nhiên liệu</w:t>
-      </w:r>
-      <w:r>
-        <w:t xml:space="preserve"> → ô </w:t>
-      </w:r>
-      <w:r>
-        <w:rPr>
-          <w:b/>
-        </w:rPr>
-        <w:t>Kho</w:t>
-      </w:r>
-      <w:r>
-        <w:t xml:space="preserve"> chọn kho Thà Bốc: </w:t>
-      </w:r>
-      <w:r>
-        <w:rPr>
-          <w:b/>
-        </w:rPr>
-        <w:t>Tồn kho hiện tại</w:t>
+        <w:t>Kho → Cấp phát</w:t>
+      </w:r>
+      <w:r>
+        <w:t xml:space="preserve"> → tab </w:t>
+      </w:r>
+      <w:r>
+        <w:rPr>
+          <w:b/>
+        </w:rPr>
+        <w:t>Phiếu tạm ứng đi đường</w:t>
+      </w:r>
+      <w:r>
+        <w:t>: không còn tờ chờ của hai phiếu mẫu.</w:t>
+      </w:r>
+    </w:p>
+    <w:p>
+      <w:pPr>
+        <w:pStyle w:val="ListNumber"/>
+      </w:pPr>
+      <w:r>
+        <w:t xml:space="preserve">Ô </w:t>
+      </w:r>
+      <w:r>
+        <w:rPr>
+          <w:b/>
+        </w:rPr>
+        <w:t>Nhập mã QR</w:t>
+      </w:r>
+      <w:r>
+        <w:t xml:space="preserve"> gõ mã tạm ứng ở bảng </w:t>
+      </w:r>
+      <w:r>
+        <w:rPr>
+          <w:b/>
+        </w:rPr>
+        <w:t>điều 1</w:t>
+      </w:r>
+      <w:r>
+        <w:t xml:space="preserve"> → </w:t>
+      </w:r>
+      <w:r>
+        <w:rPr>
+          <w:b/>
+        </w:rPr>
+        <w:t>Số tiền</w:t>
       </w:r>
       <w:r>
         <w:t xml:space="preserve"> </w:t>
@@ -27081,39 +27349,214 @@
         <w:rPr>
           <w:b/>
         </w:rPr>
-        <w:t>2.720 L</w:t>
-      </w:r>
-      <w:r>
-        <w:t xml:space="preserve">; sổ dầu hai dòng mới nhất </w:t>
+        <w:t>580.000</w:t>
+      </w:r>
+      <w:r>
+        <w:t xml:space="preserve"> / </w:t>
+      </w:r>
+      <w:r>
+        <w:rPr>
+          <w:b/>
+        </w:rPr>
+        <w:t>2.413.500</w:t>
+      </w:r>
+      <w:r>
+        <w:t xml:space="preserve">, </w:t>
       </w:r>
       <w:r>
         <w:rPr>
           <w:i/>
         </w:rPr>
-        <w:t>Xuất theo phiếu</w:t>
-      </w:r>
-      <w:r>
-        <w:t xml:space="preserve"> </w:t>
+        <w:t>Đã cấp</w:t>
+      </w:r>
+      <w:r>
+        <w:t xml:space="preserve">, </w:t>
+      </w:r>
+      <w:r>
+        <w:rPr>
+          <w:b/>
+        </w:rPr>
+        <w:t>Người cấp</w:t>
+      </w:r>
+      <w:r>
+        <w:t xml:space="preserve"> ນາງ ດາວ; không chi lần hai được.</w:t>
+      </w:r>
+    </w:p>
+    <w:p>
+      <w:pPr>
+        <w:jc w:val="both"/>
+      </w:pPr>
+      <w:r>
+        <w:rPr>
+          <w:b/>
+        </w:rPr>
+        <w:t>Tab 9 · `doanhthu` — KT Doanh thu (trang kế toán)</w:t>
+      </w:r>
+    </w:p>
+    <w:p>
+      <w:pPr>
+        <w:pStyle w:val="ListNumber"/>
+      </w:pPr>
+      <w:r>
+        <w:rPr>
+          <w:b/>
+        </w:rPr>
+        <w:t>Tiền vận chuyển → Hóa đơn vận chuyển</w:t>
+      </w:r>
+      <w:r>
+        <w:t xml:space="preserve"> — màn mở ra chưa có phiếu (dòng </w:t>
+      </w:r>
+      <w:r>
+        <w:rPr>
+          <w:i/>
+        </w:rPr>
+        <w:t>Chọn một phiếu ở ô trên…</w:t>
+      </w:r>
+      <w:r>
+        <w:t xml:space="preserve">) → ô </w:t>
+      </w:r>
+      <w:r>
+        <w:rPr>
+          <w:b/>
+        </w:rPr>
+        <w:t>Chọn phiếu</w:t>
+      </w:r>
+      <w:r>
+        <w:t xml:space="preserve"> gõ </w:t>
       </w:r>
       <w:r>
         <w:rPr>
           <w:rFonts w:ascii="Consolas" w:hAnsi="Consolas"/>
           <w:sz w:val="19"/>
         </w:rPr>
-        <w:t>PLNL-T4-0447-09/EPL-1</w:t>
-      </w:r>
-      <w:r>
-        <w:t xml:space="preserve"> xe 346 (tồn còn 2.720) và </w:t>
+        <w:t>T4-0447</w:t>
+      </w:r>
+      <w:r>
+        <w:t xml:space="preserve"> → chọn phiếu.</w:t>
+      </w:r>
+    </w:p>
+    <w:p>
+      <w:pPr>
+        <w:pStyle w:val="ListNumber"/>
+      </w:pPr>
+      <w:r>
+        <w:t xml:space="preserve">Bản in hoá đơn: 29,7 t × 30,5 USD = </w:t>
+      </w:r>
+      <w:r>
+        <w:rPr>
+          <w:b/>
+        </w:rPr>
+        <w:t>905,85 USD</w:t>
+      </w:r>
+      <w:r>
+        <w:t xml:space="preserve">, </w:t>
+      </w:r>
+      <w:r>
+        <w:rPr>
+          <w:i/>
+        </w:rPr>
+        <w:t>Đã lập hóa đơn</w:t>
+      </w:r>
+      <w:r>
+        <w:t xml:space="preserve">. Khung </w:t>
+      </w:r>
+      <w:r>
+        <w:rPr>
+          <w:b/>
+        </w:rPr>
+        <w:t>Sổ thu tiền</w:t>
+      </w:r>
+      <w:r>
+        <w:t xml:space="preserve">: hai dòng thu </w:t>
+      </w:r>
+      <w:r>
+        <w:rPr>
+          <w:b/>
+        </w:rPr>
+        <w:t>400 USD</w:t>
+      </w:r>
+      <w:r>
+        <w:t xml:space="preserve"> (8.800.000 LAK) và </w:t>
+      </w:r>
+      <w:r>
+        <w:rPr>
+          <w:b/>
+        </w:rPr>
+        <w:t>505,85 USD</w:t>
+      </w:r>
+      <w:r>
+        <w:t xml:space="preserve"> (11.128.700 LAK), cách thu chuyển khoản, số UNC; trạng thái </w:t>
+      </w:r>
+      <w:r>
+        <w:rPr>
+          <w:b/>
+        </w:rPr>
+        <w:t>Đã thu đủ</w:t>
+      </w:r>
+      <w:r>
+        <w:t>, còn lại 0.</w:t>
+      </w:r>
+    </w:p>
+    <w:p>
+      <w:pPr>
+        <w:pStyle w:val="ListNumber"/>
+      </w:pPr>
+      <w:r>
+        <w:t xml:space="preserve">Bấm </w:t>
+      </w:r>
+      <w:r>
+        <w:rPr>
+          <w:b/>
+        </w:rPr>
+        <w:t>Phiếu thu</w:t>
+      </w:r>
+      <w:r>
+        <w:t xml:space="preserve"> → tờ phiếu thu tiền khách (định khoản 1211 / 70) mở trong hộp → </w:t>
+      </w:r>
+      <w:r>
+        <w:rPr>
+          <w:b/>
+        </w:rPr>
+        <w:t>In</w:t>
+      </w:r>
+      <w:r>
+        <w:t xml:space="preserve"> được.</w:t>
+      </w:r>
+    </w:p>
+    <w:p>
+      <w:pPr>
+        <w:pStyle w:val="ListNumber"/>
+      </w:pPr>
+      <w:r>
+        <w:t xml:space="preserve">Chọn phiếu </w:t>
       </w:r>
       <w:r>
         <w:rPr>
           <w:rFonts w:ascii="Consolas" w:hAnsi="Consolas"/>
           <w:sz w:val="19"/>
         </w:rPr>
-        <w:t>PLNL-G4-0104-09/EPL-1</w:t>
-      </w:r>
-      <w:r>
-        <w:t xml:space="preserve"> xe 345 (tồn còn 3.020), trước đó 3.220.</w:t>
+        <w:t>G4-0104</w:t>
+      </w:r>
+      <w:r>
+        <w:t xml:space="preserve"> → hoá đơn </w:t>
+      </w:r>
+      <w:r>
+        <w:rPr>
+          <w:b/>
+        </w:rPr>
+        <w:t>518,75 USD</w:t>
+      </w:r>
+      <w:r>
+        <w:t xml:space="preserve"> (41,5 t × 12,5), thu một lần, </w:t>
+      </w:r>
+      <w:r>
+        <w:rPr>
+          <w:i/>
+        </w:rPr>
+        <w:t>Đã thu đủ</w:t>
+      </w:r>
+      <w:r>
+        <w:t xml:space="preserve"> — phiếu gom cũng có cước riêng theo bảng giá khách × tuyến.</w:t>
       </w:r>
     </w:p>
     <w:p>
@@ -27124,7 +27567,7 @@
         <w:rPr>
           <w:b/>
         </w:rPr>
-        <w:t>Tab 8 · `quytb` — quỹ Thà Bốc (trang kế toán)</w:t>
+        <w:t>Tab 10 · `ketoan` — sổ (trang kế toán)</w:t>
       </w:r>
     </w:p>
     <w:p>
@@ -27135,19 +27578,57 @@
         <w:rPr>
           <w:b/>
         </w:rPr>
-        <w:t>Kho → Cấp phát</w:t>
-      </w:r>
-      <w:r>
-        <w:t xml:space="preserve"> → tab </w:t>
-      </w:r>
-      <w:r>
-        <w:rPr>
-          <w:b/>
-        </w:rPr>
-        <w:t>Phiếu tạm ứng đi đường</w:t>
-      </w:r>
-      <w:r>
-        <w:t>: không còn tờ chờ của hai phiếu mẫu.</w:t>
+        <w:t>Sổ sách → Kế toán</w:t>
+      </w:r>
+      <w:r>
+        <w:t xml:space="preserve"> → </w:t>
+      </w:r>
+      <w:r>
+        <w:rPr>
+          <w:b/>
+        </w:rPr>
+        <w:t>Nhật ký chung</w:t>
+      </w:r>
+      <w:r>
+        <w:t xml:space="preserve"> → ô </w:t>
+      </w:r>
+      <w:r>
+        <w:rPr>
+          <w:b/>
+        </w:rPr>
+        <w:t>Tìm kiếm…</w:t>
+      </w:r>
+      <w:r>
+        <w:t xml:space="preserve"> gõ </w:t>
+      </w:r>
+      <w:r>
+        <w:rPr>
+          <w:rFonts w:ascii="Consolas" w:hAnsi="Consolas"/>
+          <w:sz w:val="19"/>
+        </w:rPr>
+        <w:t>T4-0447</w:t>
+      </w:r>
+      <w:r>
+        <w:t xml:space="preserve"> → 5 bút toán: xuất dầu kho (Nợ 625 / Có 1371), hoá đơn (Nợ 1211 / Có 70), hai lần thu (Nợ 1022 / Có 1211), chi tạm ứng (Nợ 625 / Có 1011). Gõ </w:t>
+      </w:r>
+      <w:r>
+        <w:rPr>
+          <w:rFonts w:ascii="Consolas" w:hAnsi="Consolas"/>
+          <w:sz w:val="19"/>
+        </w:rPr>
+        <w:t>G4-0104</w:t>
+      </w:r>
+      <w:r>
+        <w:t xml:space="preserve"> → 4 bút toán. Bảng đủ số ở mục </w:t>
+      </w:r>
+      <w:r>
+        <w:rPr>
+          <w:i/>
+        </w:rPr>
+        <w:t>Ghi sổ như thế nào</w:t>
+      </w:r>
+      <w:r>
+        <w:t xml:space="preserve"> ngay dưới.</w:t>
       </w:r>
     </w:p>
     <w:p>
@@ -27155,13 +27636,45 @@
         <w:pStyle w:val="ListNumber"/>
       </w:pPr>
       <w:r>
-        <w:t xml:space="preserve">Ô </w:t>
-      </w:r>
-      <w:r>
-        <w:rPr>
-          <w:b/>
-        </w:rPr>
-        <w:t>Nhập mã QR</w:t>
+        <w:t xml:space="preserve">Cùng màn → </w:t>
+      </w:r>
+      <w:r>
+        <w:rPr>
+          <w:b/>
+        </w:rPr>
+        <w:t>Cân đối phát sinh</w:t>
+      </w:r>
+      <w:r>
+        <w:t xml:space="preserve"> → dòng cuối </w:t>
+      </w:r>
+      <w:r>
+        <w:rPr>
+          <w:b/>
+        </w:rPr>
+        <w:t>Nợ = Có, cân đối</w:t>
+      </w:r>
+      <w:r>
+        <w:t>.</w:t>
+      </w:r>
+    </w:p>
+    <w:p>
+      <w:pPr>
+        <w:pStyle w:val="ListNumber"/>
+      </w:pPr>
+      <w:r>
+        <w:rPr>
+          <w:b/>
+        </w:rPr>
+        <w:t>Chuyến &amp; kho → Chuyến xe</w:t>
+      </w:r>
+      <w:r>
+        <w:t xml:space="preserve"> → ô </w:t>
+      </w:r>
+      <w:r>
+        <w:rPr>
+          <w:b/>
+        </w:rPr>
+        <w:t>Tìm kiếm…</w:t>
       </w:r>
       <w:r>
         <w:t xml:space="preserve"> gõ </w:t>
@@ -27171,411 +27684,48 @@
           <w:rFonts w:ascii="Consolas" w:hAnsi="Consolas"/>
           <w:sz w:val="19"/>
         </w:rPr>
-        <w:t>mX0zV9urgYXJ</w:t>
-      </w:r>
-      <w:r>
-        <w:t xml:space="preserve"> (PTU-G4-0104-09/EPL) hoặc </w:t>
+        <w:t>T4-0447</w:t>
+      </w:r>
+      <w:r>
+        <w:t xml:space="preserve"> → phiếu: doanh thu 19.928.700, đã thu hết, còn phải thu 0, chi phí </w:t>
+      </w:r>
+      <w:r>
+        <w:rPr>
+          <w:b/>
+        </w:rPr>
+        <w:t>đã vào sổ</w:t>
+      </w:r>
+      <w:r>
+        <w:t xml:space="preserve"> 10.963.500 (dầu 8.550.000 + tạm ứng 2.413.500), 30 t hàng xuất kho bãi, 9 tờ chứng từ. Lãi ở đây khác lãi trên phiếu — xem </w:t>
+      </w:r>
+      <w:r>
+        <w:rPr>
+          <w:b/>
+        </w:rPr>
+        <w:t>điều 2</w:t>
+      </w:r>
+      <w:r>
+        <w:t xml:space="preserve">. Phiếu </w:t>
       </w:r>
       <w:r>
         <w:rPr>
           <w:rFonts w:ascii="Consolas" w:hAnsi="Consolas"/>
           <w:sz w:val="19"/>
         </w:rPr>
-        <w:t>y_gjm-_Yy2TM</w:t>
-      </w:r>
-      <w:r>
-        <w:t xml:space="preserve"> (PTU-T4-0447-09/EPL) → </w:t>
-      </w:r>
-      <w:r>
-        <w:rPr>
-          <w:b/>
-        </w:rPr>
-        <w:t>Số tiền</w:t>
-      </w:r>
-      <w:r>
-        <w:t xml:space="preserve"> </w:t>
-      </w:r>
-      <w:r>
-        <w:rPr>
-          <w:b/>
-        </w:rPr>
-        <w:t>580.000</w:t>
-      </w:r>
-      <w:r>
-        <w:t xml:space="preserve"> / </w:t>
-      </w:r>
-      <w:r>
-        <w:rPr>
-          <w:b/>
-        </w:rPr>
-        <w:t>2.413.500</w:t>
-      </w:r>
-      <w:r>
-        <w:t xml:space="preserve">, </w:t>
-      </w:r>
-      <w:r>
-        <w:rPr>
-          <w:i/>
-        </w:rPr>
-        <w:t>Đã cấp</w:t>
-      </w:r>
-      <w:r>
-        <w:t xml:space="preserve">, </w:t>
-      </w:r>
-      <w:r>
-        <w:rPr>
-          <w:b/>
-        </w:rPr>
-        <w:t>Người cấp</w:t>
-      </w:r>
-      <w:r>
-        <w:t xml:space="preserve"> ນາງ ດາວ; không chi lần hai được.</w:t>
+        <w:t>G4-0104</w:t>
+      </w:r>
+      <w:r>
+        <w:t>: doanh thu 11.412.500, chi phí đã vào sổ 6.280.000, 41,5 t hàng nhập kho bãi, 8 tờ.</w:t>
       </w:r>
     </w:p>
     <w:p>
       <w:pPr>
-        <w:jc w:val="both"/>
-      </w:pPr>
-      <w:r>
-        <w:rPr>
-          <w:b/>
-        </w:rPr>
-        <w:t>Tab 9 · `doanhthu` — KT Doanh thu (trang kế toán)</w:t>
-      </w:r>
-    </w:p>
-    <w:p>
-      <w:pPr>
         <w:pStyle w:val="ListNumber"/>
       </w:pPr>
       <w:r>
         <w:rPr>
           <w:b/>
         </w:rPr>
-        <w:t>Tiền vận chuyển → Hóa đơn vận chuyển</w:t>
-      </w:r>
-      <w:r>
-        <w:t xml:space="preserve"> — màn mở ra chưa có phiếu (dòng </w:t>
-      </w:r>
-      <w:r>
-        <w:rPr>
-          <w:i/>
-        </w:rPr>
-        <w:t>Chọn một phiếu ở ô trên…</w:t>
-      </w:r>
-      <w:r>
-        <w:t xml:space="preserve">) → ô </w:t>
-      </w:r>
-      <w:r>
-        <w:rPr>
-          <w:b/>
-        </w:rPr>
-        <w:t>Chọn phiếu</w:t>
-      </w:r>
-      <w:r>
-        <w:t xml:space="preserve"> gõ </w:t>
-      </w:r>
-      <w:r>
-        <w:rPr>
-          <w:rFonts w:ascii="Consolas" w:hAnsi="Consolas"/>
-          <w:sz w:val="19"/>
-        </w:rPr>
-        <w:t>T4-0447</w:t>
-      </w:r>
-      <w:r>
-        <w:t xml:space="preserve"> → chọn phiếu.</w:t>
-      </w:r>
-    </w:p>
-    <w:p>
-      <w:pPr>
-        <w:pStyle w:val="ListNumber"/>
-      </w:pPr>
-      <w:r>
-        <w:t xml:space="preserve">Bản in hoá đơn: 29,7 t × 30,5 USD = </w:t>
-      </w:r>
-      <w:r>
-        <w:rPr>
-          <w:b/>
-        </w:rPr>
-        <w:t>905,85 USD</w:t>
-      </w:r>
-      <w:r>
-        <w:t xml:space="preserve">, </w:t>
-      </w:r>
-      <w:r>
-        <w:rPr>
-          <w:i/>
-        </w:rPr>
-        <w:t>Đã lập hóa đơn</w:t>
-      </w:r>
-      <w:r>
-        <w:t xml:space="preserve">. Khung </w:t>
-      </w:r>
-      <w:r>
-        <w:rPr>
-          <w:b/>
-        </w:rPr>
-        <w:t>Sổ thu tiền</w:t>
-      </w:r>
-      <w:r>
-        <w:t xml:space="preserve">: hai dòng thu </w:t>
-      </w:r>
-      <w:r>
-        <w:rPr>
-          <w:b/>
-        </w:rPr>
-        <w:t>400 USD</w:t>
-      </w:r>
-      <w:r>
-        <w:t xml:space="preserve"> (8.800.000 LAK) và </w:t>
-      </w:r>
-      <w:r>
-        <w:rPr>
-          <w:b/>
-        </w:rPr>
-        <w:t>505,85 USD</w:t>
-      </w:r>
-      <w:r>
-        <w:t xml:space="preserve"> (11.128.700 LAK), cách thu chuyển khoản, số UNC; trạng thái </w:t>
-      </w:r>
-      <w:r>
-        <w:rPr>
-          <w:b/>
-        </w:rPr>
-        <w:t>Đã thu đủ</w:t>
-      </w:r>
-      <w:r>
-        <w:t>, còn lại 0.</w:t>
-      </w:r>
-    </w:p>
-    <w:p>
-      <w:pPr>
-        <w:pStyle w:val="ListNumber"/>
-      </w:pPr>
-      <w:r>
-        <w:t xml:space="preserve">Bấm </w:t>
-      </w:r>
-      <w:r>
-        <w:rPr>
-          <w:b/>
-        </w:rPr>
-        <w:t>Phiếu thu</w:t>
-      </w:r>
-      <w:r>
-        <w:t xml:space="preserve"> → tờ phiếu thu tiền khách (định khoản 1211 / 70) mở trong hộp → </w:t>
-      </w:r>
-      <w:r>
-        <w:rPr>
-          <w:b/>
-        </w:rPr>
-        <w:t>In</w:t>
-      </w:r>
-      <w:r>
-        <w:t xml:space="preserve"> được.</w:t>
-      </w:r>
-    </w:p>
-    <w:p>
-      <w:pPr>
-        <w:pStyle w:val="ListNumber"/>
-      </w:pPr>
-      <w:r>
-        <w:t xml:space="preserve">Chọn phiếu </w:t>
-      </w:r>
-      <w:r>
-        <w:rPr>
-          <w:rFonts w:ascii="Consolas" w:hAnsi="Consolas"/>
-          <w:sz w:val="19"/>
-        </w:rPr>
-        <w:t>G4-0104</w:t>
-      </w:r>
-      <w:r>
-        <w:t xml:space="preserve"> → hoá đơn </w:t>
-      </w:r>
-      <w:r>
-        <w:rPr>
-          <w:b/>
-        </w:rPr>
-        <w:t>518,75 USD</w:t>
-      </w:r>
-      <w:r>
-        <w:t xml:space="preserve"> (41,5 t × 12,5), thu một lần, </w:t>
-      </w:r>
-      <w:r>
-        <w:rPr>
-          <w:i/>
-        </w:rPr>
-        <w:t>Đã thu đủ</w:t>
-      </w:r>
-      <w:r>
-        <w:t xml:space="preserve"> — phiếu gom cũng có cước riêng theo bảng giá khách × tuyến.</w:t>
-      </w:r>
-    </w:p>
-    <w:p>
-      <w:pPr>
-        <w:jc w:val="both"/>
-      </w:pPr>
-      <w:r>
-        <w:rPr>
-          <w:b/>
-        </w:rPr>
-        <w:t>Tab 10 · `ketoan` — sổ (trang kế toán)</w:t>
-      </w:r>
-    </w:p>
-    <w:p>
-      <w:pPr>
-        <w:pStyle w:val="ListNumber"/>
-      </w:pPr>
-      <w:r>
-        <w:rPr>
-          <w:b/>
-        </w:rPr>
-        <w:t>Sổ sách → Kế toán</w:t>
-      </w:r>
-      <w:r>
-        <w:t xml:space="preserve"> → </w:t>
-      </w:r>
-      <w:r>
-        <w:rPr>
-          <w:b/>
-        </w:rPr>
-        <w:t>Nhật ký chung</w:t>
-      </w:r>
-      <w:r>
-        <w:t xml:space="preserve"> → ô </w:t>
-      </w:r>
-      <w:r>
-        <w:rPr>
-          <w:b/>
-        </w:rPr>
-        <w:t>Tìm kiếm…</w:t>
-      </w:r>
-      <w:r>
-        <w:t xml:space="preserve"> gõ </w:t>
-      </w:r>
-      <w:r>
-        <w:rPr>
-          <w:rFonts w:ascii="Consolas" w:hAnsi="Consolas"/>
-          <w:sz w:val="19"/>
-        </w:rPr>
-        <w:t>T4-0447</w:t>
-      </w:r>
-      <w:r>
-        <w:t xml:space="preserve"> → 5 bút toán: xuất dầu kho (Nợ 625 / Có 1371), hoá đơn (Nợ 1211 / Có 70), hai lần thu (Nợ 1022 / Có 1211), chi tạm ứng (Nợ 625 / Có 1011). Gõ </w:t>
-      </w:r>
-      <w:r>
-        <w:rPr>
-          <w:rFonts w:ascii="Consolas" w:hAnsi="Consolas"/>
-          <w:sz w:val="19"/>
-        </w:rPr>
-        <w:t>G4-0104</w:t>
-      </w:r>
-      <w:r>
-        <w:t xml:space="preserve"> → 4 bút toán. Bảng đủ số ở mục </w:t>
-      </w:r>
-      <w:r>
-        <w:rPr>
-          <w:i/>
-        </w:rPr>
-        <w:t>Ghi sổ như thế nào</w:t>
-      </w:r>
-      <w:r>
-        <w:t xml:space="preserve"> ngay dưới.</w:t>
-      </w:r>
-    </w:p>
-    <w:p>
-      <w:pPr>
-        <w:pStyle w:val="ListNumber"/>
-      </w:pPr>
-      <w:r>
-        <w:t xml:space="preserve">Cùng màn → </w:t>
-      </w:r>
-      <w:r>
-        <w:rPr>
-          <w:b/>
-        </w:rPr>
-        <w:t>Cân đối phát sinh</w:t>
-      </w:r>
-      <w:r>
-        <w:t xml:space="preserve"> → dòng cuối </w:t>
-      </w:r>
-      <w:r>
-        <w:rPr>
-          <w:b/>
-        </w:rPr>
-        <w:t>Nợ = Có, cân đối</w:t>
-      </w:r>
-      <w:r>
-        <w:t>.</w:t>
-      </w:r>
-    </w:p>
-    <w:p>
-      <w:pPr>
-        <w:pStyle w:val="ListNumber"/>
-      </w:pPr>
-      <w:r>
-        <w:rPr>
-          <w:b/>
-        </w:rPr>
-        <w:t>Chuyến &amp; kho → Chuyến xe</w:t>
-      </w:r>
-      <w:r>
-        <w:t xml:space="preserve"> → ô </w:t>
-      </w:r>
-      <w:r>
-        <w:rPr>
-          <w:b/>
-        </w:rPr>
-        <w:t>Tìm kiếm…</w:t>
-      </w:r>
-      <w:r>
-        <w:t xml:space="preserve"> gõ </w:t>
-      </w:r>
-      <w:r>
-        <w:rPr>
-          <w:rFonts w:ascii="Consolas" w:hAnsi="Consolas"/>
-          <w:sz w:val="19"/>
-        </w:rPr>
-        <w:t>T4-0447</w:t>
-      </w:r>
-      <w:r>
-        <w:t xml:space="preserve"> → phiếu: doanh thu 19.928.700, đã thu hết, còn phải thu 0, chi phí </w:t>
-      </w:r>
-      <w:r>
-        <w:rPr>
-          <w:b/>
-        </w:rPr>
-        <w:t>đã vào sổ</w:t>
-      </w:r>
-      <w:r>
-        <w:t xml:space="preserve"> 10.963.500 (dầu 8.550.000 + tạm ứng 2.413.500), 30 t hàng xuất kho bãi, 9 tờ chứng từ. Lãi ở đây khác lãi trên phiếu — xem điều 2 ở mục </w:t>
-      </w:r>
-      <w:r>
-        <w:rPr>
-          <w:i/>
-        </w:rPr>
-        <w:t>Bốn điều cần biết trước khi demo</w:t>
-      </w:r>
-      <w:r>
-        <w:t xml:space="preserve"> (đầu 10.0c). Phiếu </w:t>
-      </w:r>
-      <w:r>
-        <w:rPr>
-          <w:rFonts w:ascii="Consolas" w:hAnsi="Consolas"/>
-          <w:sz w:val="19"/>
-        </w:rPr>
-        <w:t>G4-0104</w:t>
-      </w:r>
-      <w:r>
-        <w:t>: doanh thu 11.412.500, chi phí đã vào sổ 6.280.000, 41,5 t hàng nhập kho bãi, 8 tờ.</w:t>
-      </w:r>
-    </w:p>
-    <w:p>
-      <w:pPr>
-        <w:pStyle w:val="ListNumber"/>
-      </w:pPr>
-      <w:r>
-        <w:rPr>
-          <w:b/>
-        </w:rPr>
         <w:t>Kho → Kho hàng</w:t>
       </w:r>
       <w:r>
@@ -27607,147 +27757,6 @@
       </w:r>
       <w:r>
         <w:t xml:space="preserve"> (30 t đã đi theo T4-0447-09).</w:t>
-      </w:r>
-    </w:p>
-    <w:p>
-      <w:pPr>
-        <w:jc w:val="both"/>
-      </w:pPr>
-      <w:r>
-        <w:rPr>
-          <w:b/>
-        </w:rPr>
-        <w:t>Có cập nhật ngay sang tab khác không?</w:t>
-      </w:r>
-      <w:r>
-        <w:t xml:space="preserve"> Dữ liệu dùng chung </w:t>
-      </w:r>
-      <w:r>
-        <w:rPr>
-          <w:b/>
-        </w:rPr>
-        <w:t>ngay trên máy chủ</w:t>
-      </w:r>
-      <w:r>
-        <w:t xml:space="preserve"> — bấm xong ở tab này là hai trang đã ghi (ví dụ thủ kho bấm </w:t>
-      </w:r>
-      <w:r>
-        <w:rPr>
-          <w:b/>
-        </w:rPr>
-        <w:t>Cấp dầu</w:t>
-      </w:r>
-      <w:r>
-        <w:t xml:space="preserve"> ở 8030 thì phiếu ở 8020 đã có dầu đã cấp). Nhưng tab đang mở </w:t>
-      </w:r>
-      <w:r>
-        <w:rPr>
-          <w:b/>
-        </w:rPr>
-        <w:t>không tự vẽ lại</w:t>
-      </w:r>
-      <w:r>
-        <w:t xml:space="preserve">: sang tab kia bấm </w:t>
-      </w:r>
-      <w:r>
-        <w:rPr>
-          <w:b/>
-        </w:rPr>
-        <w:t>F5</w:t>
-      </w:r>
-      <w:r>
-        <w:t xml:space="preserve"> (hoặc bấm lại màn đó trên menu) là thấy. Hai màn tự tải lại: </w:t>
-      </w:r>
-      <w:r>
-        <w:rPr>
-          <w:b/>
-        </w:rPr>
-        <w:t>Tổng quan</w:t>
-      </w:r>
-      <w:r>
-        <w:t xml:space="preserve"> (tick </w:t>
-      </w:r>
-      <w:r>
-        <w:rPr>
-          <w:b/>
-        </w:rPr>
-        <w:t>Tự cập nhật 60 s</w:t>
-      </w:r>
-      <w:r>
-        <w:t xml:space="preserve">) và </w:t>
-      </w:r>
-      <w:r>
-        <w:rPr>
-          <w:b/>
-        </w:rPr>
-        <w:t>Theo dõi tuyến</w:t>
-      </w:r>
-      <w:r>
-        <w:t xml:space="preserve"> (tick </w:t>
-      </w:r>
-      <w:r>
-        <w:rPr>
-          <w:b/>
-        </w:rPr>
-        <w:t>Tự cập nhật 30 giây</w:t>
-      </w:r>
-      <w:r>
-        <w:t xml:space="preserve">). Riêng </w:t>
-      </w:r>
-      <w:r>
-        <w:rPr>
-          <w:b/>
-        </w:rPr>
-        <w:t>sổ kế toán</w:t>
-      </w:r>
-      <w:r>
-        <w:t xml:space="preserve">: tờ sinh ở trang kế toán (cấp dầu, hoá đơn, thu tiền, nhập / xuất kho hàng) vào sổ ngay lúc bấm; tờ sinh ở trang điều xe (phiếu chi tạm ứng, phiếu xuất xe, phiếu lĩnh) vào sổ khi </w:t>
-      </w:r>
-      <w:r>
-        <w:rPr>
-          <w:rFonts w:ascii="Consolas" w:hAnsi="Consolas"/>
-          <w:sz w:val="19"/>
-        </w:rPr>
-        <w:t>ketoan</w:t>
-      </w:r>
-      <w:r>
-        <w:t xml:space="preserve"> bấm </w:t>
-      </w:r>
-      <w:r>
-        <w:rPr>
-          <w:b/>
-        </w:rPr>
-        <w:t>Đẩy</w:t>
-      </w:r>
-      <w:r>
-        <w:t xml:space="preserve"> (</w:t>
-      </w:r>
-      <w:r>
-        <w:rPr>
-          <w:b/>
-        </w:rPr>
-        <w:t>Vận tải → Phiếu chi · Phiếu thu</w:t>
-      </w:r>
-      <w:r>
-        <w:t xml:space="preserve"> → tab </w:t>
-      </w:r>
-      <w:r>
-        <w:rPr>
-          <w:b/>
-        </w:rPr>
-        <w:t>Sổ chứng từ</w:t>
-      </w:r>
-      <w:r>
-        <w:t xml:space="preserve"> → </w:t>
-      </w:r>
-      <w:r>
-        <w:rPr>
-          <w:b/>
-        </w:rPr>
-        <w:t>Đẩy hết tờ chưa đẩy</w:t>
-      </w:r>
-      <w:r>
-        <w:t>). Tờ của cặp phiếu mẫu đã đẩy rồi.</w:t>
       </w:r>
     </w:p>
     <w:p>
@@ -28439,7 +28448,16 @@
         <w:t>Nợ = Có</w:t>
       </w:r>
       <w:r>
-        <w:t>.</w:t>
+        <w:t xml:space="preserve">. Tờ sinh ở trang kế toán vào sổ ngay; tờ sinh ở trang điều xe phải </w:t>
+      </w:r>
+      <w:r>
+        <w:rPr>
+          <w:b/>
+        </w:rPr>
+        <w:t>đẩy</w:t>
+      </w:r>
+      <w:r>
+        <w:t xml:space="preserve"> (1.3) — tờ của cặp phiếu mẫu đã đẩy rồi.</w:t>
       </w:r>
     </w:p>
     <w:p>
@@ -28450,10 +28468,10 @@
         <w:rPr>
           <w:b/>
         </w:rPr>
-        <w:t>Chưa vào sổ, đúng luật cách trả</w:t>
-      </w:r>
-      <w:r>
-        <w:t xml:space="preserve"> (bước 3): trong mục IV, chỉ dòng </w:t>
+        <w:t>Khoản chưa vào sổ.</w:t>
+      </w:r>
+      <w:r>
+        <w:t xml:space="preserve"> Mục IV chia theo cách trả (bước 3); chỉ dòng </w:t>
       </w:r>
       <w:r>
         <w:rPr>
@@ -28462,52 +28480,287 @@
         <w:t>Chi ngay khi xe đi</w:t>
       </w:r>
       <w:r>
-        <w:t xml:space="preserve"> đi qua quỹ lúc xe đi. </w:t>
-      </w:r>
-      <w:r>
-        <w:rPr>
-          <w:b/>
-        </w:rPr>
-        <w:t>Tiền nước + tiền chuyến</w:t>
-      </w:r>
-      <w:r>
-        <w:t xml:space="preserve"> (1.860.000 mỗi phiếu) là </w:t>
-      </w:r>
-      <w:r>
-        <w:rPr>
-          <w:i/>
-        </w:rPr>
-        <w:t>Trả theo chuyến cùng lương</w:t>
-      </w:r>
-      <w:r>
-        <w:t xml:space="preserve">: hiện ở </w:t>
-      </w:r>
-      <w:r>
-        <w:rPr>
-          <w:b/>
-        </w:rPr>
-        <w:t>Tiền vận chuyển → Tiền chuyến &amp; tiền nước tài xế</w:t>
-      </w:r>
-      <w:r>
-        <w:t xml:space="preserve"> tháng 09 của ທ້າວ ສົມພອນ, ghi sổ khi trả lương. </w:t>
-      </w:r>
-      <w:r>
-        <w:rPr>
-          <w:b/>
-        </w:rPr>
-        <w:t>Chipping Lào</w:t>
-      </w:r>
-      <w:r>
-        <w:t xml:space="preserve"> 620.000 (phiếu gom) là </w:t>
-      </w:r>
-      <w:r>
-        <w:rPr>
-          <w:i/>
-        </w:rPr>
-        <w:t>Nợ NCC / trả theo đợt</w:t>
-      </w:r>
-      <w:r>
-        <w:t xml:space="preserve">: vào công nợ nhà cung cấp, ghi sổ khi kế toán trả đợt (6.6). Cộng lại đúng tổng mục IV: phiếu gom 580.000 + 1.860.000 + 620.000 = </w:t>
+        <w:t xml:space="preserve"> qua quỹ lúc xe đi nên có tờ PC_TU. Hai loại còn lại:</w:t>
+      </w:r>
+    </w:p>
+    <w:tbl>
+      <w:tblPr>
+        <w:tblStyle w:val="LightGrid-Accent1"/>
+        <w:tblW w:type="auto" w:w="0"/>
+        <w:tblLook w:firstColumn="1" w:firstRow="1" w:lastColumn="0" w:lastRow="0" w:noHBand="0" w:noVBand="1" w:val="04A0"/>
+      </w:tblPr>
+      <w:tblGrid>
+        <w:gridCol w:w="1728"/>
+        <w:gridCol w:w="1728"/>
+        <w:gridCol w:w="1728"/>
+        <w:gridCol w:w="1728"/>
+        <w:gridCol w:w="1728"/>
+      </w:tblGrid>
+      <w:tr>
+        <w:tc>
+          <w:tcPr>
+            <w:tcW w:type="dxa" w:w="1728"/>
+          </w:tcPr>
+          <w:p>
+            <w:r>
+              <w:rPr>
+                <w:b/>
+              </w:rPr>
+            </w:r>
+            <w:r>
+              <w:rPr>
+                <w:b/>
+              </w:rPr>
+              <w:t>Khoản</w:t>
+            </w:r>
+          </w:p>
+        </w:tc>
+        <w:tc>
+          <w:tcPr>
+            <w:tcW w:type="dxa" w:w="1728"/>
+          </w:tcPr>
+          <w:p>
+            <w:r>
+              <w:rPr>
+                <w:b/>
+              </w:rPr>
+            </w:r>
+            <w:r>
+              <w:rPr>
+                <w:b/>
+              </w:rPr>
+              <w:t>Phiếu gom</w:t>
+            </w:r>
+          </w:p>
+        </w:tc>
+        <w:tc>
+          <w:tcPr>
+            <w:tcW w:type="dxa" w:w="1728"/>
+          </w:tcPr>
+          <w:p>
+            <w:r>
+              <w:rPr>
+                <w:b/>
+              </w:rPr>
+            </w:r>
+            <w:r>
+              <w:rPr>
+                <w:b/>
+              </w:rPr>
+              <w:t>Phiếu giao</w:t>
+            </w:r>
+          </w:p>
+        </w:tc>
+        <w:tc>
+          <w:tcPr>
+            <w:tcW w:type="dxa" w:w="1728"/>
+          </w:tcPr>
+          <w:p>
+            <w:r>
+              <w:rPr>
+                <w:b/>
+              </w:rPr>
+            </w:r>
+            <w:r>
+              <w:rPr>
+                <w:b/>
+              </w:rPr>
+              <w:t>Đi đâu</w:t>
+            </w:r>
+          </w:p>
+        </w:tc>
+        <w:tc>
+          <w:tcPr>
+            <w:tcW w:type="dxa" w:w="1728"/>
+          </w:tcPr>
+          <w:p>
+            <w:r>
+              <w:rPr>
+                <w:b/>
+              </w:rPr>
+            </w:r>
+            <w:r>
+              <w:rPr>
+                <w:b/>
+              </w:rPr>
+              <w:t>Vào sổ lúc nào</w:t>
+            </w:r>
+          </w:p>
+        </w:tc>
+      </w:tr>
+      <w:tr>
+        <w:tc>
+          <w:tcPr>
+            <w:tcW w:type="dxa" w:w="1728"/>
+          </w:tcPr>
+          <w:p>
+            <w:r/>
+            <w:r>
+              <w:t>Tiền nước + tiền chuyến (</w:t>
+            </w:r>
+            <w:r>
+              <w:rPr>
+                <w:i/>
+              </w:rPr>
+              <w:t>Trả theo chuyến cùng lương</w:t>
+            </w:r>
+            <w:r>
+              <w:t>)</w:t>
+            </w:r>
+          </w:p>
+        </w:tc>
+        <w:tc>
+          <w:tcPr>
+            <w:tcW w:type="dxa" w:w="1728"/>
+          </w:tcPr>
+          <w:p>
+            <w:r/>
+            <w:r>
+              <w:t>1.860.000</w:t>
+            </w:r>
+          </w:p>
+        </w:tc>
+        <w:tc>
+          <w:tcPr>
+            <w:tcW w:type="dxa" w:w="1728"/>
+          </w:tcPr>
+          <w:p>
+            <w:r/>
+            <w:r>
+              <w:t>1.860.000</w:t>
+            </w:r>
+          </w:p>
+        </w:tc>
+        <w:tc>
+          <w:tcPr>
+            <w:tcW w:type="dxa" w:w="1728"/>
+          </w:tcPr>
+          <w:p>
+            <w:r/>
+            <w:r>
+              <w:t xml:space="preserve">cộng lên </w:t>
+            </w:r>
+            <w:r>
+              <w:rPr>
+                <w:b/>
+              </w:rPr>
+              <w:t>Tiền vận chuyển → Tiền chuyến &amp; tiền nước tài xế</w:t>
+            </w:r>
+            <w:r>
+              <w:t>, tháng 09, dòng ທ້າວ ສົມພອນ</w:t>
+            </w:r>
+          </w:p>
+        </w:tc>
+        <w:tc>
+          <w:tcPr>
+            <w:tcW w:type="dxa" w:w="1728"/>
+          </w:tcPr>
+          <w:p>
+            <w:r/>
+            <w:r>
+              <w:rPr>
+                <w:b/>
+              </w:rPr>
+              <w:t>chưa có tờ nào</w:t>
+            </w:r>
+            <w:r>
+              <w:t xml:space="preserve"> — màn đó chỉ cộng số để trả lương, không sinh bút toán</w:t>
+            </w:r>
+          </w:p>
+        </w:tc>
+      </w:tr>
+      <w:tr>
+        <w:tc>
+          <w:tcPr>
+            <w:tcW w:type="dxa" w:w="1728"/>
+          </w:tcPr>
+          <w:p>
+            <w:r/>
+            <w:r>
+              <w:t>Chipping Lào (</w:t>
+            </w:r>
+            <w:r>
+              <w:rPr>
+                <w:i/>
+              </w:rPr>
+              <w:t>Nợ NCC / trả theo đợt</w:t>
+            </w:r>
+            <w:r>
+              <w:t>)</w:t>
+            </w:r>
+          </w:p>
+        </w:tc>
+        <w:tc>
+          <w:tcPr>
+            <w:tcW w:type="dxa" w:w="1728"/>
+          </w:tcPr>
+          <w:p>
+            <w:r/>
+            <w:r>
+              <w:t>620.000</w:t>
+            </w:r>
+          </w:p>
+        </w:tc>
+        <w:tc>
+          <w:tcPr>
+            <w:tcW w:type="dxa" w:w="1728"/>
+          </w:tcPr>
+          <w:p>
+            <w:r/>
+            <w:r>
+              <w:t>—</w:t>
+            </w:r>
+          </w:p>
+        </w:tc>
+        <w:tc>
+          <w:tcPr>
+            <w:tcW w:type="dxa" w:w="1728"/>
+          </w:tcPr>
+          <w:p>
+            <w:r/>
+            <w:r>
+              <w:t xml:space="preserve">cộng vào phát sinh ở </w:t>
+            </w:r>
+            <w:r>
+              <w:rPr>
+                <w:b/>
+              </w:rPr>
+              <w:t>Tiền vận chuyển → Theo dõi nhà cung cấp</w:t>
+            </w:r>
+            <w:r>
+              <w:t xml:space="preserve"> (6.6)</w:t>
+            </w:r>
+          </w:p>
+        </w:tc>
+        <w:tc>
+          <w:tcPr>
+            <w:tcW w:type="dxa" w:w="1728"/>
+          </w:tcPr>
+          <w:p>
+            <w:r/>
+            <w:r>
+              <w:t xml:space="preserve">chỉ khi kế toán bấm </w:t>
+            </w:r>
+            <w:r>
+              <w:rPr>
+                <w:b/>
+              </w:rPr>
+              <w:t>Trả nhà cung cấp</w:t>
+            </w:r>
+            <w:r>
+              <w:t>: tờ PC_NCC (Nợ 4021 / Có 1011)</w:t>
+            </w:r>
+          </w:p>
+        </w:tc>
+      </w:tr>
+    </w:tbl>
+    <w:p/>
+    <w:p>
+      <w:pPr>
+        <w:jc w:val="both"/>
+      </w:pPr>
+      <w:r>
+        <w:t xml:space="preserve">Cộng lại đúng tổng mục IV: phiếu gom 580.000 + 1.860.000 + 620.000 = </w:t>
       </w:r>
       <w:r>
         <w:rPr>
@@ -28525,7 +28778,25 @@
         <w:t>4.273.500</w:t>
       </w:r>
       <w:r>
-        <w:t>.</w:t>
+        <w:t xml:space="preserve">. Đây cũng là lý do lãi ở màn </w:t>
+      </w:r>
+      <w:r>
+        <w:rPr>
+          <w:b/>
+        </w:rPr>
+        <w:t>Chuyến xe</w:t>
+      </w:r>
+      <w:r>
+        <w:t xml:space="preserve"> cao hơn lãi trên phiếu (</w:t>
+      </w:r>
+      <w:r>
+        <w:rPr>
+          <w:b/>
+        </w:rPr>
+        <w:t>điều 2</w:t>
+      </w:r>
+      <w:r>
+        <w:t>).</w:t>
       </w:r>
     </w:p>
     <w:p>
@@ -28536,10 +28807,10 @@
         <w:rPr>
           <w:b/>
         </w:rPr>
-        <w:t>Lưu ý khi mở Tất toán tài xế</w:t>
-      </w:r>
-      <w:r>
-        <w:t xml:space="preserve"> cho ທ້າວ ສົມພອນ: dòng của hai phiếu mẫu </w:t>
+        <w:t>Tất toán tài xế</w:t>
+      </w:r>
+      <w:r>
+        <w:t xml:space="preserve"> của ທ້າວ ສົມພອນ: hai phiếu mẫu </w:t>
       </w:r>
       <w:r>
         <w:rPr>
@@ -28557,7 +28828,7 @@
         <w:t>chênh 0</w:t>
       </w:r>
       <w:r>
-        <w:t xml:space="preserve">; nhưng dòng tổng của tài xế còn gộp phiếu mẫu cũ tháng 8–9 (chi tạm ứng theo luật cũ) nên có thể hiện </w:t>
+        <w:t xml:space="preserve">; dòng tổng của tài xế có thể còn </w:t>
       </w:r>
       <w:r>
         <w:rPr>
@@ -28566,7 +28837,16 @@
         <w:t>Tài xế nộp lại</w:t>
       </w:r>
       <w:r>
-        <w:t xml:space="preserve"> — xem lưu ý ở ca T34.</w:t>
+        <w:t xml:space="preserve"> vì phiếu mẫu cũ — lý do ở ca </w:t>
+      </w:r>
+      <w:r>
+        <w:rPr>
+          <w:b/>
+        </w:rPr>
+        <w:t>T34</w:t>
+      </w:r>
+      <w:r>
+        <w:t>.</w:t>
       </w:r>
     </w:p>
     <w:p>

</xml_diff>

<commit_message>
Phiếu của trang điều xe là phiếu ĐỀ NGHỊ: đổi tên hai phiếu, cả bốn ngôn ngữ (chủ dự án chốt 29/09)
- Phiếu lĩnh nhiên liệu → Phiếu đề nghị xuất nhiên liệu · ໃບສະເໜີເບີກນໍ້າມັນ · Fuel issue request
- Phiếu chi tạm ứng (nút) / Phiếu tạm ứng đi đường (tờ) → Phiếu đề nghị tạm ứng · ໃບສະເໜີເບີກເງິນລ່ວງໜ້າ ·
  Advance request. Lào ráp từ tên họ đang dùng (ໃບເບີກ…) + ສະເໜີ.
- Đổi ở bảng chữ (16 khoá), tiêu đề và dòng phụ tờ in, màn Quy trình, mô tả vai, tên loại chứng từ
  PLNL / PTU, câu báo lỗi. Giữ: PC_TU "Phiếu chi tạm ứng" (tờ quỹ chi tiền thật), mã PLNL-… / PTU-….
- Trang kế toán (Cấp phát) không đổi — phần kho, tiền là của anh Toàn / anh Tune.
- Tài liệu A → Z theo tên mới, có dòng ghi chú đổi tên ở phần quy ước.

Co-Authored-By: Claude Opus 5.5 (1M context) <noreply@anthropic.com>
</commit_message>
<xml_diff>
--- a/DOCS/word/LUONG_A_Z_HAI_TRANG.docx
+++ b/DOCS/word/LUONG_A_Z_HAI_TRANG.docx
@@ -156,6 +156,148 @@
       </w:r>
       <w:r>
         <w:t>.</w:t>
+      </w:r>
+    </w:p>
+    <w:p>
+      <w:pPr>
+        <w:jc w:val="both"/>
+      </w:pPr>
+      <w:r>
+        <w:rPr>
+          <w:b/>
+        </w:rPr>
+        <w:t>Đổi tên hai phiếu (29/09/2026):</w:t>
+      </w:r>
+      <w:r>
+        <w:t xml:space="preserve"> phiếu của trang điều xe chỉ là phiếu </w:t>
+      </w:r>
+      <w:r>
+        <w:rPr>
+          <w:b/>
+        </w:rPr>
+        <w:t>đề nghị</w:t>
+      </w:r>
+      <w:r>
+        <w:t xml:space="preserve"> — </w:t>
+      </w:r>
+      <w:r>
+        <w:rPr>
+          <w:i/>
+        </w:rPr>
+        <w:t>Phiếu lĩnh nhiên liệu</w:t>
+      </w:r>
+      <w:r>
+        <w:t xml:space="preserve"> nay là </w:t>
+      </w:r>
+      <w:r>
+        <w:rPr>
+          <w:b/>
+        </w:rPr>
+        <w:t>Phiếu đề nghị xuất nhiên liệu</w:t>
+      </w:r>
+      <w:r>
+        <w:t xml:space="preserve"> (ໃບສະເໜີເບີກນໍ້າມັນ · Fuel issue request); nút </w:t>
+      </w:r>
+      <w:r>
+        <w:rPr>
+          <w:i/>
+        </w:rPr>
+        <w:t>Phiếu chi tạm ứng</w:t>
+      </w:r>
+      <w:r>
+        <w:t xml:space="preserve"> và tờ </w:t>
+      </w:r>
+      <w:r>
+        <w:rPr>
+          <w:i/>
+        </w:rPr>
+        <w:t>Phiếu tạm ứng đi đường</w:t>
+      </w:r>
+      <w:r>
+        <w:t xml:space="preserve"> nay là </w:t>
+      </w:r>
+      <w:r>
+        <w:rPr>
+          <w:b/>
+        </w:rPr>
+        <w:t>Phiếu đề nghị tạm ứng</w:t>
+      </w:r>
+      <w:r>
+        <w:t xml:space="preserve"> (ໃບສະເໜີເບີກເງິນລ່ວງໜ້າ · Advance request). Mã trên tờ giữ nguyên (</w:t>
+      </w:r>
+      <w:r>
+        <w:rPr>
+          <w:rFonts w:ascii="Consolas" w:hAnsi="Consolas"/>
+          <w:sz w:val="19"/>
+        </w:rPr>
+        <w:t>PLNL-…</w:t>
+      </w:r>
+      <w:r>
+        <w:t xml:space="preserve">, </w:t>
+      </w:r>
+      <w:r>
+        <w:rPr>
+          <w:rFonts w:ascii="Consolas" w:hAnsi="Consolas"/>
+          <w:sz w:val="19"/>
+        </w:rPr>
+        <w:t>PTU-…</w:t>
+      </w:r>
+      <w:r>
+        <w:t xml:space="preserve">). Trang kế toán (màn </w:t>
+      </w:r>
+      <w:r>
+        <w:rPr>
+          <w:b/>
+        </w:rPr>
+        <w:t>Cấp phát</w:t>
+      </w:r>
+      <w:r>
+        <w:t xml:space="preserve">) </w:t>
+      </w:r>
+      <w:r>
+        <w:rPr>
+          <w:b/>
+        </w:rPr>
+        <w:t>chưa đổi</w:t>
+      </w:r>
+      <w:r>
+        <w:t xml:space="preserve">, vẫn ghi tab </w:t>
+      </w:r>
+      <w:r>
+        <w:rPr>
+          <w:i/>
+        </w:rPr>
+        <w:t>Phiếu lĩnh nhiên liệu</w:t>
+      </w:r>
+      <w:r>
+        <w:t xml:space="preserve">, </w:t>
+      </w:r>
+      <w:r>
+        <w:rPr>
+          <w:i/>
+        </w:rPr>
+        <w:t>Phiếu tạm ứng đi đường</w:t>
+      </w:r>
+      <w:r>
+        <w:t xml:space="preserve"> — phần kho, tiền là của anh Toàn, anh Tune. Tờ </w:t>
+      </w:r>
+      <w:r>
+        <w:rPr>
+          <w:b/>
+        </w:rPr>
+        <w:t>PC_TU</w:t>
+      </w:r>
+      <w:r>
+        <w:t xml:space="preserve"> </w:t>
+      </w:r>
+      <w:r>
+        <w:rPr>
+          <w:i/>
+        </w:rPr>
+        <w:t>Phiếu chi tạm ứng</w:t>
+      </w:r>
+      <w:r>
+        <w:t xml:space="preserve"> là tờ quỹ chi tiền thật, giữ tên.</w:t>
       </w:r>
     </w:p>
     <w:p>
@@ -542,7 +684,7 @@
               <w:t>Phiếu chi · Phiếu thu</w:t>
             </w:r>
             <w:r>
-              <w:t xml:space="preserve"> còn in phiếu chi tạm ứng, phiếu lĩnh và giữ sổ chứng từ của phiếu. Màn </w:t>
+              <w:t xml:space="preserve"> còn in phiếu đề nghị tạm ứng, phiếu đề nghị xuất nhiên liệu và giữ sổ chứng từ của phiếu. Màn </w:t>
             </w:r>
             <w:r>
               <w:rPr>
@@ -763,7 +905,7 @@
         <w:t>Admin Thà Bốc</w:t>
       </w:r>
       <w:r>
-        <w:t xml:space="preserve"> lập phiếu xuất xe (gom hoặc giao), ghi dầu, tiền đi đường, in phiếu lĩnh dầu và phiếu tạm ứng, gửi kiểm.</w:t>
+        <w:t xml:space="preserve"> lập phiếu xuất xe (gom hoặc giao), ghi dầu, tiền đi đường, in phiếu đề nghị xuất nhiên liệu và phiếu đề nghị tạm ứng, gửi kiểm.</w:t>
       </w:r>
     </w:p>
     <w:p>
@@ -791,7 +933,7 @@
         <w:t>Thủ kho</w:t>
       </w:r>
       <w:r>
-        <w:t xml:space="preserve"> cấp dầu theo phiếu lĩnh; </w:t>
+        <w:t xml:space="preserve"> cấp dầu theo phiếu đề nghị xuất nhiên liệu; </w:t>
       </w:r>
       <w:r>
         <w:rPr>
@@ -982,7 +1124,7 @@
         <w:t>Đường 1 — tờ sinh ở trang điều xe</w:t>
       </w:r>
       <w:r>
-        <w:t xml:space="preserve"> (DO, phiếu lĩnh, phiếu tạm ứng, phiếu chi mục IV–VI): nằm ở màn </w:t>
+        <w:t xml:space="preserve"> (DO, phiếu đề nghị xuất nhiên liệu, phiếu đề nghị tạm ứng, phiếu chi mục IV–VI): nằm ở màn </w:t>
       </w:r>
       <w:r>
         <w:rPr>
@@ -1568,7 +1710,7 @@
           <w:p>
             <w:r/>
             <w:r>
-              <w:t>Cấp phát (chỉ phiếu lĩnh của kho mình), Kho nhiên liệu (xem)</w:t>
+              <w:t>Cấp phát (chỉ phiếu đề nghị xuất nhiên liệu của kho mình), Kho nhiên liệu (xem)</w:t>
             </w:r>
           </w:p>
         </w:tc>
@@ -2594,7 +2736,7 @@
           <w:p>
             <w:r/>
             <w:r>
-              <w:t>Ô việc thuộc trang kế toán (ví dụ phiếu lĩnh chờ cấp)</w:t>
+              <w:t>Ô việc thuộc trang kế toán (ví dụ phiếu đề nghị xuất nhiên liệu chờ cấp)</w:t>
             </w:r>
           </w:p>
         </w:tc>
@@ -2641,7 +2783,7 @@
               <w:rPr>
                 <w:b/>
               </w:rPr>
-              <w:t>Cấp phiếu lĩnh nhiên liệu</w:t>
+              <w:t>Cấp dầu theo phiếu đề nghị</w:t>
             </w:r>
           </w:p>
         </w:tc>
@@ -2730,7 +2872,7 @@
               <w:t>Kho → Cấp phát</w:t>
             </w:r>
             <w:r>
-              <w:t xml:space="preserve"> → chọn một phiếu lĩnh</w:t>
+              <w:t xml:space="preserve"> → chọn một phiếu đề nghị xuất nhiên liệu</w:t>
             </w:r>
           </w:p>
         </w:tc>
@@ -3944,7 +4086,7 @@
           <w:p>
             <w:r/>
             <w:r>
-              <w:t>Đọc phiếu lĩnh, ghi "đã cấp" lên phiếu bên điều xe</w:t>
+              <w:t>Đọc phiếu đề nghị xuất nhiên liệu, ghi "đã cấp" lên phiếu bên điều xe</w:t>
             </w:r>
           </w:p>
         </w:tc>
@@ -4639,7 +4781,7 @@
           <w:p>
             <w:r/>
             <w:r>
-              <w:t>Đọc số từ phiếu (phiếu tạm ứng đã cấp, dòng chi tài xế ứng, mục IV) — tính ở trang điều xe</w:t>
+              <w:t>Đọc số từ phiếu (phiếu đề nghị tạm ứng đã cấp, dòng chi tài xế ứng, mục IV) — tính ở trang điều xe</w:t>
             </w:r>
           </w:p>
         </w:tc>
@@ -4929,7 +5071,7 @@
         <w:t>Địa chỉ mở trang kế toán (trình duyệt · mã QR)</w:t>
       </w:r>
       <w:r>
-        <w:t>: địa chỉ mà điện thoại, máy thủ kho mở được. Để trống thì dùng ô trên. Mã QR in trên phiếu lĩnh dẫn tới địa chỉ này.</w:t>
+        <w:t>: địa chỉ mà điện thoại, máy thủ kho mở được. Để trống thì dùng ô trên. Mã QR in trên phiếu đề nghị xuất nhiên liệu dẫn tới địa chỉ này.</w:t>
       </w:r>
     </w:p>
     <w:p>
@@ -6754,7 +6896,7 @@
         <w:pStyle w:val="Heading2"/>
       </w:pPr>
       <w:r>
-        <w:t>Bước 2. Mục III — dầu, và in phiếu lĩnh nhiên liệu</w:t>
+        <w:t>Bước 2. Mục III — dầu, và in phiếu đề nghị xuất nhiên liệu</w:t>
       </w:r>
     </w:p>
     <w:p>
@@ -6934,10 +7076,10 @@
         <w:rPr>
           <w:b/>
         </w:rPr>
-        <w:t>Phiếu lĩnh nhiên liệu</w:t>
-      </w:r>
-      <w:r>
-        <w:t xml:space="preserve"> (thanh nút trên cùng của phiếu). Máy lập mỗi kho một tờ phiếu lĩnh có </w:t>
+        <w:t>Phiếu đề nghị xuất nhiên liệu</w:t>
+      </w:r>
+      <w:r>
+        <w:t xml:space="preserve"> (thanh nút trên cùng của phiếu). Máy lập mỗi kho một tờ phiếu đề nghị xuất nhiên liệu có </w:t>
       </w:r>
       <w:r>
         <w:rPr>
@@ -7005,7 +7147,7 @@
         <w:t>PLNL</w:t>
       </w:r>
       <w:r>
-        <w:t xml:space="preserve"> sinh lúc bấm phiếu lĩnh.</w:t>
+        <w:t xml:space="preserve"> sinh lúc bấm phiếu đề nghị xuất nhiên liệu.</w:t>
       </w:r>
     </w:p>
     <w:p>
@@ -7033,7 +7175,7 @@
         <w:t>Ai làm tiếp:</w:t>
       </w:r>
       <w:r>
-        <w:t xml:space="preserve"> tài xế cầm phiếu lĩnh tới kho → </w:t>
+        <w:t xml:space="preserve"> tài xế cầm phiếu đề nghị xuất nhiên liệu tới kho → </w:t>
       </w:r>
       <w:r>
         <w:rPr>
@@ -7050,7 +7192,7 @@
         <w:pStyle w:val="Heading2"/>
       </w:pPr>
       <w:r>
-        <w:t>Bước 3. Mục IV đi đường, mục VI chi khác, và in phiếu tạm ứng</w:t>
+        <w:t>Bước 3. Mục IV đi đường, mục VI chi khác, và in phiếu đề nghị tạm ứng</w:t>
       </w:r>
     </w:p>
     <w:p>
@@ -7257,7 +7399,7 @@
         <w:rPr>
           <w:b/>
         </w:rPr>
-        <w:t>Phiếu chi tạm ứng</w:t>
+        <w:t>Phiếu đề nghị tạm ứng</w:t>
       </w:r>
       <w:r>
         <w:t xml:space="preserve"> (thanh nút trên cùng): máy </w:t>
@@ -7266,7 +7408,7 @@
         <w:rPr>
           <w:b/>
         </w:rPr>
-        <w:t>lập tờ tạm ứng có mã QR</w:t>
+        <w:t>lập tờ đề nghị tạm ứng có mã QR</w:t>
       </w:r>
       <w:r>
         <w:t xml:space="preserve"> (</w:t>
@@ -8291,7 +8433,7 @@
               <w:rPr>
                 <w:b/>
               </w:rPr>
-              <w:t>Phiếu tạm ứng</w:t>
+              <w:t>Phiếu đề nghị tạm ứng</w:t>
             </w:r>
             <w:r>
               <w:t>: quỹ đưa tiền mặt lúc xe đi (bước 9); tất toán so với đúng những dòng này (bước 20)</w:t>
@@ -8498,7 +8640,7 @@
         <w:t>580.000 LAK</w:t>
       </w:r>
       <w:r>
-        <w:t xml:space="preserve"> tiền mặt (sang VN 430.000 + điện thoại 150.000); tiền nước + tiền chuyến 1.860.000 trả cùng lương; chipping 2.120.000 là nợ nhà cung cấp; phí cao tốc 1.833.500 trừ thẻ. Dầu mục III: dầu kho lĩnh theo phiếu lĩnh, dầu trạm </w:t>
+        <w:t xml:space="preserve"> tiền mặt (sang VN 430.000 + điện thoại 150.000); tiền nước + tiền chuyến 1.860.000 trả cùng lương; chipping 2.120.000 là nợ nhà cung cấp; phí cao tốc 1.833.500 trừ thẻ. Dầu mục III: dầu kho lĩnh theo phiếu đề nghị xuất nhiên liệu, dầu trạm </w:t>
       </w:r>
       <w:r>
         <w:rPr>
@@ -8567,7 +8709,7 @@
         <w:t>Ai làm tiếp:</w:t>
       </w:r>
       <w:r>
-        <w:t xml:space="preserve"> tài xế cầm phiếu tạm ứng tới </w:t>
+        <w:t xml:space="preserve"> tài xế cầm phiếu đề nghị tạm ứng tới </w:t>
       </w:r>
       <w:r>
         <w:rPr>
@@ -9163,7 +9305,7 @@
         <w:t>kho</w:t>
       </w:r>
       <w:r>
-        <w:t xml:space="preserve"> nào chưa được thủ kho cấp theo phiếu lĩnh thì </w:t>
+        <w:t xml:space="preserve"> nào chưa được thủ kho cấp theo phiếu đề nghị xuất nhiên liệu thì </w:t>
       </w:r>
       <w:r>
         <w:rPr>
@@ -9358,7 +9500,7 @@
         <w:pStyle w:val="Heading2"/>
       </w:pPr>
       <w:r>
-        <w:t>Bước 8. Thủ kho cấp dầu theo phiếu lĩnh — trang kế toán</w:t>
+        <w:t>Bước 8. Thủ kho cấp dầu theo phiếu đề nghị xuất nhiên liệu — trang kế toán</w:t>
       </w:r>
     </w:p>
     <w:p>
@@ -9372,7 +9514,7 @@
         <w:t>Ai:</w:t>
       </w:r>
       <w:r>
-        <w:t xml:space="preserve"> thủ kho của đúng kho ghi trên phiếu lĩnh (</w:t>
+        <w:t xml:space="preserve"> thủ kho của đúng kho ghi trên phiếu đề nghị xuất nhiên liệu (</w:t>
       </w:r>
       <w:r>
         <w:rPr>
@@ -9455,7 +9597,7 @@
         <w:t>Chờ cấp</w:t>
       </w:r>
       <w:r>
-        <w:t xml:space="preserve"> chỉ có phiếu lĩnh của kho mình.</w:t>
+        <w:t xml:space="preserve"> chỉ có phiếu đề nghị xuất nhiên liệu của kho mình.</w:t>
       </w:r>
     </w:p>
     <w:p>
@@ -9463,7 +9605,7 @@
         <w:pStyle w:val="ListNumber"/>
       </w:pPr>
       <w:r>
-        <w:t xml:space="preserve">Tài xế đưa tờ phiếu lĩnh: bấm vào ô </w:t>
+        <w:t xml:space="preserve">Tài xế đưa tờ phiếu đề nghị xuất nhiên liệu: bấm vào ô </w:t>
       </w:r>
       <w:r>
         <w:rPr>
@@ -9591,7 +9733,7 @@
         <w:t>giá bình quân của kho lúc cấp</w:t>
       </w:r>
       <w:r>
-        <w:t xml:space="preserve">; trang điều xe ghi phiếu lĩnh </w:t>
+        <w:t xml:space="preserve">; trang điều xe ghi phiếu đề nghị xuất nhiên liệu </w:t>
       </w:r>
       <w:r>
         <w:rPr>
@@ -9774,7 +9916,7 @@
         <w:t>Phiếu tạm ứng đi đường</w:t>
       </w:r>
       <w:r>
-        <w:t xml:space="preserve"> → quét QR phiếu tạm ứng (hoặc bấm dòng) → đối chiếu → </w:t>
+        <w:t xml:space="preserve"> → quét QR phiếu đề nghị tạm ứng (hoặc bấm dòng) → đối chiếu → </w:t>
       </w:r>
       <w:r>
         <w:rPr>
@@ -9829,7 +9971,7 @@
         <w:t>Đã chi</w:t>
       </w:r>
       <w:r>
-        <w:t xml:space="preserve">; tờ tạm ứng có mã QR thành </w:t>
+        <w:t xml:space="preserve">; tờ đề nghị tạm ứng có mã QR thành </w:t>
       </w:r>
       <w:r>
         <w:rPr>
@@ -9856,7 +9998,7 @@
         <w:t>Chi ngay khi xe đi</w:t>
       </w:r>
       <w:r>
-        <w:t>, đúng số trên phiếu tạm ứng; khoản cùng lương, nợ nhà cung cấp, trừ thẻ không qua tay quỹ lúc này. Tài xế ký nhận tiền trên tờ phiếu tạm ứng.</w:t>
+        <w:t>, đúng số trên phiếu đề nghị tạm ứng; khoản cùng lương, nợ nhà cung cấp, trừ thẻ không qua tay quỹ lúc này. Tài xế ký nhận tiền trên tờ phiếu đề nghị tạm ứng.</w:t>
       </w:r>
     </w:p>
     <w:p>
@@ -10753,7 +10895,7 @@
         <w:t>kho</w:t>
       </w:r>
       <w:r>
-        <w:t xml:space="preserve"> của EPL thì máy bảo dùng phiếu lĩnh.</w:t>
+        <w:t xml:space="preserve"> của EPL thì máy bảo dùng phiếu đề nghị xuất nhiên liệu.</w:t>
       </w:r>
     </w:p>
     <w:p>
@@ -11615,7 +11757,7 @@
         <w:pStyle w:val="ListNumber"/>
       </w:pPr>
       <w:r>
-        <w:t>Làm tiếp y như phiếu gom: dầu và phiếu lĩnh (bước 2), đi đường và tạm ứng (bước 3), gửi kiểm (4), kiểm (5–7), cấp dầu (8), chi tạm ứng (9), xuất phát (10), dọc đường (11).</w:t>
+        <w:t>Làm tiếp y như phiếu gom: dầu và phiếu đề nghị xuất nhiên liệu (bước 2), đi đường và tạm ứng (bước 3), gửi kiểm (4), kiểm (5–7), cấp dầu (8), chi tạm ứng (9), xuất phát (10), dọc đường (11).</w:t>
       </w:r>
     </w:p>
     <w:p>
@@ -14002,7 +14144,7 @@
         <w:t>Đã ứng</w:t>
       </w:r>
       <w:r>
-        <w:t xml:space="preserve"> là các phiếu tạm ứng </w:t>
+        <w:t xml:space="preserve"> là các phiếu đề nghị tạm ứng </w:t>
       </w:r>
       <w:r>
         <w:rPr>
@@ -14038,7 +14180,7 @@
         <w:t>Chi ngay khi xe đi</w:t>
       </w:r>
       <w:r>
-        <w:t xml:space="preserve"> ở mục IV, VI và dầu mua dọc đường trả tiền mặt (một luật với phiếu tạm ứng, bước 3); khoản cùng lương, nợ nhà cung cấp, trừ thẻ không tính. Số tính từ phiếu bên trang điều xe, không gõ tay. (Trước 29/09 hai bên tính hai luật khác nhau: 11 phiếu trên máy thật lệch, có phiếu báo tài xế phải nộp lại ~27 triệu — nay hết.) Chênh dương → tờ </w:t>
+        <w:t xml:space="preserve"> ở mục IV, VI và dầu mua dọc đường trả tiền mặt (một luật với phiếu đề nghị tạm ứng, bước 3); khoản cùng lương, nợ nhà cung cấp, trừ thẻ không tính. Số tính từ phiếu bên trang điều xe, không gõ tay. (Trước 29/09 hai bên tính hai luật khác nhau: 11 phiếu trên máy thật lệch, có phiếu báo tài xế phải nộp lại ~27 triệu — nay hết.) Chênh dương → tờ </w:t>
       </w:r>
       <w:r>
         <w:rPr>
@@ -14394,7 +14536,7 @@
         <w:t>Đẩy từ EPL_LAO_REAL</w:t>
       </w:r>
       <w:r>
-        <w:t xml:space="preserve">); tờ chỉ có một vế (ngoài bảng, chờ mã) thì ghi đơn; tờ không có tiền (DO, phiếu lĩnh…) chỉ lưu. Muốn sửa bút toán sinh từ tờ thì </w:t>
+        <w:t xml:space="preserve">); tờ chỉ có một vế (ngoài bảng, chờ mã) thì ghi đơn; tờ không có tiền (DO, phiếu đề nghị xuất nhiên liệu…) chỉ lưu. Muốn sửa bút toán sinh từ tờ thì </w:t>
       </w:r>
       <w:r>
         <w:rPr>
@@ -14944,7 +15086,7 @@
           <w:p>
             <w:r/>
             <w:r>
-              <w:t>Bãi in phiếu lĩnh</w:t>
+              <w:t>Bãi in phiếu đề nghị xuất nhiên liệu</w:t>
             </w:r>
           </w:p>
         </w:tc>
@@ -14955,7 +15097,7 @@
           <w:p>
             <w:r/>
             <w:r>
-              <w:t xml:space="preserve">Phiếu lĩnh </w:t>
+              <w:t xml:space="preserve">Phiếu đề nghị xuất nhiên liệu </w:t>
             </w:r>
             <w:r>
               <w:rPr>
@@ -15388,7 +15530,7 @@
           <w:p>
             <w:r/>
             <w:r>
-              <w:t>Quỹ chi mục IV–VI, phiếu có tờ DO, phiếu lĩnh, tạm ứng</w:t>
+              <w:t>Quỹ chi mục IV–VI, phiếu có tờ DO, phiếu đề nghị xuất nhiên liệu, tạm ứng</w:t>
             </w:r>
           </w:p>
         </w:tc>
@@ -17128,7 +17270,7 @@
           <w:p>
             <w:r/>
             <w:r>
-              <w:t>Phiếu lĩnh nhiên liệu</w:t>
+              <w:t>Phiếu đề nghị xuất nhiên liệu</w:t>
             </w:r>
           </w:p>
         </w:tc>
@@ -17139,7 +17281,7 @@
           <w:p>
             <w:r/>
             <w:r>
-              <w:t>Bấm Phiếu lĩnh nhiên liệu</w:t>
+              <w:t>Bấm Phiếu đề nghị xuất nhiên liệu</w:t>
             </w:r>
           </w:p>
         </w:tc>
@@ -17196,7 +17338,7 @@
           <w:p>
             <w:r/>
             <w:r>
-              <w:t>Phiếu tạm ứng đi đường</w:t>
+              <w:t>Phiếu đề nghị tạm ứng</w:t>
             </w:r>
           </w:p>
         </w:tc>
@@ -17207,7 +17349,7 @@
           <w:p>
             <w:r/>
             <w:r>
-              <w:t>Bấm Phiếu chi tạm ứng</w:t>
+              <w:t>Bấm Phiếu đề nghị tạm ứng</w:t>
             </w:r>
           </w:p>
         </w:tc>
@@ -19328,7 +19470,7 @@
           <w:p>
             <w:r/>
             <w:r>
-              <w:t>Sổ dầu ở kế toán; phiếu lĩnh vẫn ở điều xe</w:t>
+              <w:t>Sổ dầu ở kế toán; phiếu đề nghị xuất nhiên liệu vẫn ở điều xe</w:t>
             </w:r>
           </w:p>
         </w:tc>
@@ -19609,7 +19751,7 @@
         <w:t>Ở lại trang điều xe</w:t>
       </w:r>
       <w:r>
-        <w:t xml:space="preserve"> đúng như anh chốt: kiểm và duyệt từng mục ngay trên phiếu xuất xe; in phiếu chi tạm ứng, phiếu lĩnh; </w:t>
+        <w:t xml:space="preserve"> đúng như anh chốt: kiểm và duyệt từng mục ngay trên phiếu xuất xe; in phiếu đề nghị tạm ứng, phiếu đề nghị xuất nhiên liệu; </w:t>
       </w:r>
       <w:r>
         <w:rPr>
@@ -19981,7 +20123,7 @@
         <w:t>cách trả</w:t>
       </w:r>
       <w:r>
-        <w:t xml:space="preserve"> mục IV (bước 3), tờ tạm ứng có mã QR và tờ chứng từ PTU theo đúng số quỹ chi. Chỉ cần </w:t>
+        <w:t xml:space="preserve"> mục IV (bước 3), tờ đề nghị tạm ứng có mã QR và tờ chứng từ PTU theo đúng số quỹ chi. Chỉ cần </w:t>
       </w:r>
       <w:r>
         <w:rPr>
@@ -21436,7 +21578,7 @@
         <w:rPr>
           <w:b/>
         </w:rPr>
-        <w:t>Phiếu lĩnh nhiên liệu</w:t>
+        <w:t>Phiếu đề nghị xuất nhiên liệu</w:t>
       </w:r>
       <w:r>
         <w:t xml:space="preserve"> → màn </w:t>
@@ -21487,7 +21629,7 @@
         <w:rPr>
           <w:b/>
         </w:rPr>
-        <w:t>Phiếu chi tạm ứng</w:t>
+        <w:t>Phiếu đề nghị tạm ứng</w:t>
       </w:r>
       <w:r>
         <w:t xml:space="preserve"> → tờ </w:t>
@@ -21700,7 +21842,7 @@
         <w:rPr>
           <w:b/>
         </w:rPr>
-        <w:t>Phiếu chi tạm ứng</w:t>
+        <w:t>Phiếu đề nghị tạm ứng</w:t>
       </w:r>
       <w:r>
         <w:t xml:space="preserve">: tổng </w:t>
@@ -22932,7 +23074,7 @@
         <w:rPr>
           <w:b/>
         </w:rPr>
-        <w:t>Phiếu chi tạm ứng</w:t>
+        <w:t>Phiếu đề nghị tạm ứng</w:t>
       </w:r>
       <w:r>
         <w:t xml:space="preserve">: </w:t>
@@ -24409,7 +24551,7 @@
           <w:p>
             <w:r/>
             <w:r>
-              <w:t>Phiếu lĩnh dầu phiếu gom (200 L)</w:t>
+              <w:t>Đề nghị xuất nhiên liệu — phiếu gom (200 L)</w:t>
             </w:r>
           </w:p>
         </w:tc>
@@ -24452,7 +24594,7 @@
           <w:p>
             <w:r/>
             <w:r>
-              <w:t>Phiếu lĩnh dầu phiếu giao (300 L)</w:t>
+              <w:t>Đề nghị xuất nhiên liệu — phiếu giao (300 L)</w:t>
             </w:r>
           </w:p>
         </w:tc>
@@ -24495,7 +24637,7 @@
           <w:p>
             <w:r/>
             <w:r>
-              <w:t>Tạm ứng phiếu gom (580.000)</w:t>
+              <w:t>Đề nghị tạm ứng — phiếu gom (580.000)</w:t>
             </w:r>
           </w:p>
         </w:tc>
@@ -24550,7 +24692,7 @@
           <w:p>
             <w:r/>
             <w:r>
-              <w:t>Tạm ứng phiếu giao (2.413.500)</w:t>
+              <w:t>Đề nghị tạm ứng — phiếu giao (2.413.500)</w:t>
             </w:r>
           </w:p>
         </w:tc>
@@ -25427,7 +25569,7 @@
           <w:p>
             <w:r/>
             <w:r>
-              <w:t>đơn giá mục IV, cách trả từng dòng, tờ tạm ứng</w:t>
+              <w:t>đơn giá mục IV, cách trả từng dòng, tờ đề nghị tạm ứng</w:t>
             </w:r>
           </w:p>
         </w:tc>
@@ -26692,7 +26834,7 @@
         <w:rPr>
           <w:b/>
         </w:rPr>
-        <w:t>Phiếu chi tạm ứng</w:t>
+        <w:t>Phiếu đề nghị tạm ứng</w:t>
       </w:r>
       <w:r>
         <w:t xml:space="preserve"> (thanh nút trên cùng) → tờ </w:t>
@@ -26776,7 +26918,7 @@
         <w:t>4.273.500</w:t>
       </w:r>
       <w:r>
-        <w:t xml:space="preserve">; tờ tạm ứng </w:t>
+        <w:t xml:space="preserve">; tờ đề nghị tạm ứng </w:t>
       </w:r>
       <w:r>
         <w:rPr>
@@ -26886,7 +27028,7 @@
         <w:rPr>
           <w:b/>
         </w:rPr>
-        <w:t>Phiếu lĩnh nhiên liệu</w:t>
+        <w:t>Phiếu đề nghị xuất nhiên liệu</w:t>
       </w:r>
       <w:r>
         <w:t xml:space="preserve"> → tờ </w:t>
@@ -27168,7 +27310,7 @@
         <w:t>Nhập mã QR</w:t>
       </w:r>
       <w:r>
-        <w:t xml:space="preserve"> gõ mã phiếu lĩnh ở bảng </w:t>
+        <w:t xml:space="preserve"> gõ mã phiếu đề nghị xuất nhiên liệu ở bảng </w:t>
       </w:r>
       <w:r>
         <w:rPr>
@@ -27997,7 +28139,7 @@
           <w:p>
             <w:r/>
             <w:r>
-              <w:t>Bãi in phiếu lĩnh (</w:t>
+              <w:t>Bãi in phiếu đề nghị xuất nhiên liệu (</w:t>
             </w:r>
             <w:r>
               <w:rPr>
@@ -28115,7 +28257,7 @@
           <w:p>
             <w:r/>
             <w:r>
-              <w:t>Bãi in tờ tạm ứng (</w:t>
+              <w:t>Bãi in tờ đề nghị tạm ứng (</w:t>
             </w:r>
             <w:r>
               <w:rPr>
@@ -29648,7 +29790,7 @@
               <w:rPr>
                 <w:b/>
               </w:rPr>
-              <w:t>Phiếu lĩnh nhiên liệu</w:t>
+              <w:t>Phiếu đề nghị xuất nhiên liệu</w:t>
             </w:r>
             <w:r>
               <w:t xml:space="preserve"> → </w:t>
@@ -29668,7 +29810,7 @@
           <w:p>
             <w:r/>
             <w:r>
-              <w:t>Mở màn Phiếu chi · Phiếu thu ở tờ phiếu lĩnh có mã QR; không có cột tiền</w:t>
+              <w:t>Mở màn Phiếu chi · Phiếu thu ở tờ phiếu đề nghị xuất nhiên liệu có mã QR; không có cột tiền</w:t>
             </w:r>
           </w:p>
         </w:tc>
@@ -29753,7 +29895,7 @@
               <w:rPr>
                 <w:b/>
               </w:rPr>
-              <w:t>Phiếu chi tạm ứng</w:t>
+              <w:t>Phiếu đề nghị tạm ứng</w:t>
             </w:r>
             <w:r>
               <w:t xml:space="preserve"> → </w:t>
@@ -29800,7 +29942,7 @@
               <w:t>Nợ NCC / trả theo đợt</w:t>
             </w:r>
             <w:r>
-              <w:t>. Tờ tạm ứng có mã QR; Bãi không nhập được đơn giá</w:t>
+              <w:t>. Tờ đề nghị tạm ứng có mã QR; Bãi không nhập được đơn giá</w:t>
             </w:r>
           </w:p>
         </w:tc>
@@ -29876,7 +30018,7 @@
               <w:rPr>
                 <w:b/>
               </w:rPr>
-              <w:t>Phiếu chi tạm ứng</w:t>
+              <w:t>Phiếu đề nghị tạm ứng</w:t>
             </w:r>
           </w:p>
         </w:tc>
@@ -29887,7 +30029,7 @@
           <w:p>
             <w:r/>
             <w:r>
-              <w:t xml:space="preserve">Tờ tạm ứng </w:t>
+              <w:t xml:space="preserve">Tờ đề nghị tạm ứng </w:t>
             </w:r>
             <w:r>
               <w:rPr>
@@ -30347,7 +30489,7 @@
               <w:t>Kho → Cấp phát</w:t>
             </w:r>
             <w:r>
-              <w:t xml:space="preserve"> → quét / gõ mã QR phiếu lĩnh T02 (hoặc bấm dòng ở bảng </w:t>
+              <w:t xml:space="preserve"> → quét / gõ mã QR phiếu đề nghị xuất nhiên liệu T02 (hoặc bấm dòng ở bảng </w:t>
             </w:r>
             <w:r>
               <w:rPr>
@@ -30382,7 +30524,7 @@
           <w:p>
             <w:r/>
             <w:r>
-              <w:t xml:space="preserve">Tồn kho Thà Bốc giảm 200 L; bên điều xe phiếu lĩnh </w:t>
+              <w:t xml:space="preserve">Tồn kho Thà Bốc giảm 200 L; bên điều xe phiếu đề nghị xuất nhiên liệu </w:t>
             </w:r>
             <w:r>
               <w:rPr>
@@ -30683,7 +30825,7 @@
               <w:t>Phiếu tạm ứng đi đường</w:t>
             </w:r>
             <w:r>
-              <w:t xml:space="preserve"> → quét QR tờ tạm ứng T03 → </w:t>
+              <w:t xml:space="preserve"> → quét QR tờ đề nghị tạm ứng T03 → </w:t>
             </w:r>
             <w:r>
               <w:rPr>
@@ -35874,7 +36016,7 @@
           <w:p>
             <w:r/>
             <w:r>
-              <w:t>Chỉ phiếu lĩnh của kho Viêng Chăn; quét phiếu lĩnh kho Thà Bốc → bị chặn</w:t>
+              <w:t>Chỉ phiếu đề nghị xuất nhiên liệu của kho Viêng Chăn; quét phiếu đề nghị xuất nhiên liệu kho Thà Bốc → bị chặn</w:t>
             </w:r>
           </w:p>
         </w:tc>

</xml_diff>

<commit_message>
Tài liệu A → Z: màn Cấp phát trang kế toán cũng dùng tên phiếu đề nghị
Co-Authored-By: Claude Opus 5.5 (1M context) <noreply@anthropic.com>
</commit_message>
<xml_diff>
--- a/DOCS/word/LUONG_A_Z_HAI_TRANG.docx
+++ b/DOCS/word/LUONG_A_Z_HAI_TRANG.docx
@@ -243,7 +243,7 @@
         <w:t>PTU-…</w:t>
       </w:r>
       <w:r>
-        <w:t xml:space="preserve">). Trang kế toán (màn </w:t>
+        <w:t xml:space="preserve">). Trang kế toán đổi chữ theo (màn </w:t>
       </w:r>
       <w:r>
         <w:rPr>
@@ -252,34 +252,25 @@
         <w:t>Cấp phát</w:t>
       </w:r>
       <w:r>
-        <w:t xml:space="preserve">) </w:t>
-      </w:r>
-      <w:r>
-        <w:rPr>
-          <w:b/>
-        </w:rPr>
-        <w:t>chưa đổi</w:t>
-      </w:r>
-      <w:r>
-        <w:t xml:space="preserve">, vẫn ghi tab </w:t>
-      </w:r>
-      <w:r>
-        <w:rPr>
-          <w:i/>
-        </w:rPr>
-        <w:t>Phiếu lĩnh nhiên liệu</w:t>
+        <w:t xml:space="preserve">: tab </w:t>
+      </w:r>
+      <w:r>
+        <w:rPr>
+          <w:b/>
+        </w:rPr>
+        <w:t>Phiếu đề nghị xuất nhiên liệu</w:t>
       </w:r>
       <w:r>
         <w:t xml:space="preserve">, </w:t>
       </w:r>
       <w:r>
         <w:rPr>
-          <w:i/>
-        </w:rPr>
-        <w:t>Phiếu tạm ứng đi đường</w:t>
-      </w:r>
-      <w:r>
-        <w:t xml:space="preserve"> — phần kho, tiền là của anh Toàn, anh Tune. Tờ </w:t>
+          <w:b/>
+        </w:rPr>
+        <w:t>Phiếu đề nghị tạm ứng</w:t>
+      </w:r>
+      <w:r>
+        <w:t xml:space="preserve">); tờ đã đẩy sang sổ trước ngày đổi vẫn mang tên cũ. Tờ </w:t>
       </w:r>
       <w:r>
         <w:rPr>
@@ -9913,7 +9904,7 @@
         <w:rPr>
           <w:b/>
         </w:rPr>
-        <w:t>Phiếu tạm ứng đi đường</w:t>
+        <w:t>Phiếu đề nghị tạm ứng</w:t>
       </w:r>
       <w:r>
         <w:t xml:space="preserve"> → quét QR phiếu đề nghị tạm ứng (hoặc bấm dòng) → đối chiếu → </w:t>
@@ -22040,7 +22031,7 @@
         <w:rPr>
           <w:b/>
         </w:rPr>
-        <w:t>Phiếu tạm ứng đi đường</w:t>
+        <w:t>Phiếu đề nghị tạm ứng</w:t>
       </w:r>
       <w:r>
         <w:t xml:space="preserve"> → dòng </w:t>
@@ -24676,7 +24667,7 @@
               <w:rPr>
                 <w:b/>
               </w:rPr>
-              <w:t>Phiếu tạm ứng đi đường</w:t>
+              <w:t>Phiếu đề nghị tạm ứng</w:t>
             </w:r>
             <w:r>
               <w:t>)</w:t>
@@ -24731,7 +24722,7 @@
               <w:rPr>
                 <w:b/>
               </w:rPr>
-              <w:t>Phiếu tạm ứng đi đường</w:t>
+              <w:t>Phiếu đề nghị tạm ứng</w:t>
             </w:r>
             <w:r>
               <w:t>)</w:t>
@@ -27447,7 +27438,7 @@
         <w:rPr>
           <w:b/>
         </w:rPr>
-        <w:t>Phiếu tạm ứng đi đường</w:t>
+        <w:t>Phiếu đề nghị tạm ứng</w:t>
       </w:r>
       <w:r>
         <w:t>: không còn tờ chờ của hai phiếu mẫu.</w:t>
@@ -30822,7 +30813,7 @@
               <w:rPr>
                 <w:b/>
               </w:rPr>
-              <w:t>Phiếu tạm ứng đi đường</w:t>
+              <w:t>Phiếu đề nghị tạm ứng</w:t>
             </w:r>
             <w:r>
               <w:t xml:space="preserve"> → quét QR tờ đề nghị tạm ứng T03 → </w:t>

</xml_diff>

<commit_message>
Chi thật gọi theo phiếu đề nghị: PC_TU là "Phiếu chi theo đề nghị tạm ứng" (chủ dự án chốt 29/09)
Tên loại chứng từ PC_TU (Việt · Lào) và mô tả tờ "Chi theo đề nghị tạm ứng <PTU-…>". Tài liệu A → Z theo tên
mới (ghi chú đổi tên, bước 9, danh mục chứng từ, 10.0c).

Co-Authored-By: Claude Opus 5.5 (1M context) <noreply@anthropic.com>
</commit_message>
<xml_diff>
--- a/DOCS/word/LUONG_A_Z_HAI_TRANG.docx
+++ b/DOCS/word/LUONG_A_Z_HAI_TRANG.docx
@@ -270,7 +270,16 @@
         <w:t>Phiếu đề nghị tạm ứng</w:t>
       </w:r>
       <w:r>
-        <w:t xml:space="preserve">); tờ đã đẩy sang sổ trước ngày đổi vẫn mang tên cũ. Tờ </w:t>
+        <w:t xml:space="preserve">); tờ đã đẩy sang sổ trước ngày đổi vẫn mang tên cũ. Tiền </w:t>
+      </w:r>
+      <w:r>
+        <w:rPr>
+          <w:b/>
+        </w:rPr>
+        <w:t>chi thật</w:t>
+      </w:r>
+      <w:r>
+        <w:t xml:space="preserve"> cũng gọi theo phiếu đề nghị của nó: tờ quỹ chi </w:t>
       </w:r>
       <w:r>
         <w:rPr>
@@ -279,16 +288,43 @@
         <w:t>PC_TU</w:t>
       </w:r>
       <w:r>
-        <w:t xml:space="preserve"> </w:t>
-      </w:r>
-      <w:r>
-        <w:rPr>
-          <w:i/>
-        </w:rPr>
-        <w:t>Phiếu chi tạm ứng</w:t>
-      </w:r>
-      <w:r>
-        <w:t xml:space="preserve"> là tờ quỹ chi tiền thật, giữ tên.</w:t>
+        <w:t xml:space="preserve"> là </w:t>
+      </w:r>
+      <w:r>
+        <w:rPr>
+          <w:b/>
+        </w:rPr>
+        <w:t>Phiếu chi theo đề nghị tạm ứng</w:t>
+      </w:r>
+      <w:r>
+        <w:t xml:space="preserve">; ở màn </w:t>
+      </w:r>
+      <w:r>
+        <w:rPr>
+          <w:b/>
+        </w:rPr>
+        <w:t>Chuyến xe</w:t>
+      </w:r>
+      <w:r>
+        <w:t xml:space="preserve"> (trang kế toán) hai nhóm chi phí là </w:t>
+      </w:r>
+      <w:r>
+        <w:rPr>
+          <w:b/>
+        </w:rPr>
+        <w:t>Chi theo đề nghị tạm ứng</w:t>
+      </w:r>
+      <w:r>
+        <w:t xml:space="preserve"> và </w:t>
+      </w:r>
+      <w:r>
+        <w:rPr>
+          <w:b/>
+        </w:rPr>
+        <w:t>Dầu cấp theo đề nghị xuất nhiên liệu</w:t>
+      </w:r>
+      <w:r>
+        <w:t>.</w:t>
       </w:r>
     </w:p>
     <w:p>
@@ -9980,7 +10016,7 @@
         <w:t>PC_TU</w:t>
       </w:r>
       <w:r>
-        <w:t xml:space="preserve"> (phiếu chi tạm ứng, ở trang điều xe, chờ đẩy sổ) — chỉ gồm dòng cách trả </w:t>
+        <w:t xml:space="preserve"> (phiếu chi theo đề nghị tạm ứng, ở trang điều xe, chờ đẩy sổ) — chỉ gồm dòng cách trả </w:t>
       </w:r>
       <w:r>
         <w:rPr>
@@ -17397,7 +17433,7 @@
           <w:p>
             <w:r/>
             <w:r>
-              <w:t>Phiếu chi tạm ứng</w:t>
+              <w:t>Phiếu chi theo đề nghị tạm ứng</w:t>
             </w:r>
           </w:p>
         </w:tc>
@@ -27829,7 +27865,25 @@
         <w:t>đã vào sổ</w:t>
       </w:r>
       <w:r>
-        <w:t xml:space="preserve"> 10.963.500 (dầu 8.550.000 + tạm ứng 2.413.500), 30 t hàng xuất kho bãi, 9 tờ chứng từ. Lãi ở đây khác lãi trên phiếu — xem </w:t>
+        <w:t xml:space="preserve"> 10.963.500 (</w:t>
+      </w:r>
+      <w:r>
+        <w:rPr>
+          <w:b/>
+        </w:rPr>
+        <w:t>Dầu cấp theo đề nghị xuất nhiên liệu</w:t>
+      </w:r>
+      <w:r>
+        <w:t xml:space="preserve"> 8.550.000 + </w:t>
+      </w:r>
+      <w:r>
+        <w:rPr>
+          <w:b/>
+        </w:rPr>
+        <w:t>Chi theo đề nghị tạm ứng</w:t>
+      </w:r>
+      <w:r>
+        <w:t xml:space="preserve"> 2.413.500), 30 t hàng xuất kho bãi, 9 tờ chứng từ. Lãi ở đây khác lãi trên phiếu — xem </w:t>
       </w:r>
       <w:r>
         <w:rPr>

</xml_diff>

<commit_message>
Quy trình & trách nhiệm: nút sang màn theo quyền vai; chứng từ ghi rõ phiếu đề nghị hay bên kho / kế toán lập (sếp 30/09)
- Nút "màn … ↗" chỉ bấm được với vai vào được màn đó (EPL.manCuaVai); vai khác thấy chữ xám "không thuộc vai của bạn".
- Thẻ chứng từ ghi bên lập: phiếu đề nghị · trang điều xe lập (DO, PLNL, PTU) · bên kho / bên kế toán lập theo đề nghị.
- DO mang cả hai tên: Phiếu xuất xe · đề nghị xuất xe (Việt · Lào).
- Tài liệu A → Z: danh mục chứng từ, ca T47c.

Co-Authored-By: Claude Opus 5.5 (1M context) <noreply@anthropic.com>
</commit_message>
<xml_diff>
--- a/DOCS/word/LUONG_A_Z_HAI_TRANG.docx
+++ b/DOCS/word/LUONG_A_Z_HAI_TRANG.docx
@@ -502,7 +502,7 @@
         <w:t>10.0c hai phiếu mẫu đã đi trọn để xem bằng nhiều vai và xem sổ</w:t>
       </w:r>
       <w:r>
-        <w:t>, rồi 62 ca theo thứ tự luồng</w:t>
+        <w:t>, rồi 63 ca theo thứ tự luồng</w:t>
       </w:r>
     </w:p>
     <w:p>
@@ -17844,7 +17844,7 @@
           <w:p>
             <w:r/>
             <w:r>
-              <w:t>Phiếu xuất xe</w:t>
+              <w:t>Phiếu xuất xe · đề nghị xuất xe</w:t>
             </w:r>
           </w:p>
         </w:tc>
@@ -37011,6 +37011,125 @@
                 <w:i/>
               </w:rPr>
               <w:t>Chưa nhận tiền tạm ứng thì chưa xuất phát</w:t>
+            </w:r>
+          </w:p>
+        </w:tc>
+        <w:tc>
+          <w:tcPr>
+            <w:tcW w:type="dxa" w:w="1728"/>
+          </w:tcPr>
+          <w:p>
+            <w:r/>
+          </w:p>
+        </w:tc>
+      </w:tr>
+      <w:tr>
+        <w:tc>
+          <w:tcPr>
+            <w:tcW w:type="dxa" w:w="1728"/>
+          </w:tcPr>
+          <w:p>
+            <w:r/>
+            <w:r>
+              <w:t>T47c</w:t>
+            </w:r>
+          </w:p>
+        </w:tc>
+        <w:tc>
+          <w:tcPr>
+            <w:tcW w:type="dxa" w:w="1728"/>
+          </w:tcPr>
+          <w:p>
+            <w:r/>
+            <w:r>
+              <w:rPr>
+                <w:rFonts w:ascii="Consolas" w:hAnsi="Consolas"/>
+                <w:sz w:val="19"/>
+              </w:rPr>
+              <w:t>thabok</w:t>
+            </w:r>
+            <w:r>
+              <w:t xml:space="preserve"> rồi </w:t>
+            </w:r>
+            <w:r>
+              <w:rPr>
+                <w:rFonts w:ascii="Consolas" w:hAnsi="Consolas"/>
+                <w:sz w:val="19"/>
+              </w:rPr>
+              <w:t>ketoan</w:t>
+            </w:r>
+            <w:r>
+              <w:t xml:space="preserve"> · điều xe</w:t>
+            </w:r>
+          </w:p>
+        </w:tc>
+        <w:tc>
+          <w:tcPr>
+            <w:tcW w:type="dxa" w:w="1728"/>
+          </w:tcPr>
+          <w:p>
+            <w:r/>
+            <w:r>
+              <w:rPr>
+                <w:b/>
+              </w:rPr>
+              <w:t>Hệ thống → Quy trình &amp; trách nhiệm</w:t>
+            </w:r>
+            <w:r>
+              <w:t xml:space="preserve"> → xem nút </w:t>
+            </w:r>
+            <w:r>
+              <w:rPr>
+                <w:i/>
+              </w:rPr>
+              <w:t>màn … ↗</w:t>
+            </w:r>
+            <w:r>
+              <w:t xml:space="preserve"> ở từng bước và các thẻ chứng từ</w:t>
+            </w:r>
+          </w:p>
+        </w:tc>
+        <w:tc>
+          <w:tcPr>
+            <w:tcW w:type="dxa" w:w="1728"/>
+          </w:tcPr>
+          <w:p>
+            <w:r/>
+            <w:r>
+              <w:t xml:space="preserve">Vai không vào được màn nào thì chỗ đó là chữ xám </w:t>
+            </w:r>
+            <w:r>
+              <w:rPr>
+                <w:i/>
+              </w:rPr>
+              <w:t>màn … · không thuộc vai của bạn</w:t>
+            </w:r>
+            <w:r>
+              <w:t xml:space="preserve">, không bấm được (sếp 30/09). Thẻ chứng từ ghi rõ </w:t>
+            </w:r>
+            <w:r>
+              <w:rPr>
+                <w:i/>
+              </w:rPr>
+              <w:t>phiếu đề nghị · trang điều xe lập</w:t>
+            </w:r>
+            <w:r>
+              <w:t xml:space="preserve"> (DO, PLNL, PTU) hay </w:t>
+            </w:r>
+            <w:r>
+              <w:rPr>
+                <w:i/>
+              </w:rPr>
+              <w:t>bên kho / bên kế toán lập theo đề nghị</w:t>
+            </w:r>
+            <w:r>
+              <w:t xml:space="preserve">; DO tên </w:t>
+            </w:r>
+            <w:r>
+              <w:rPr>
+                <w:b/>
+              </w:rPr>
+              <w:t>Phiếu xuất xe · đề nghị xuất xe</w:t>
             </w:r>
           </w:p>
         </w:tc>

</xml_diff>